<commit_message>
style: Times New Roman + APA tables for Word reports
make_templates.py generates reference-doc.docx (quarto) + template-tnr.docx (officer) from pandoc default with Times/APA patches. report.qmd uses reference-doc; render_methods_docx.R uses template + flextable theme_apa + APA caption. Verified: Times in all styles, APA table rules + bold headers, methods table fits. AGENTS.md documents the report pipeline.
</commit_message>
<xml_diff>
--- a/analysis/reports/report.docx
+++ b/analysis/reports/report.docx
@@ -5966,6 +5966,10 @@
   <w:style w:default="1" w:styleId="Normal" w:type="paragraph">
     <w:name w:val="Normal"/>
     <w:qFormat/>
+    <w:rPr>
+      <w:rFonts w:ascii="Times New Roman" w:cs="Times New Roman" w:hAnsi="Times New Roman"/>
+      <w:sz w:val="24"/>
+    </w:rPr>
   </w:style>
   <w:style w:styleId="BodyText" w:type="paragraph">
     <w:name w:val="Body Text"/>
@@ -6004,7 +6008,9 @@
       <w:jc w:val="center"/>
     </w:pPr>
     <w:rPr>
-      <w:rFonts w:asciiTheme="majorHAnsi" w:cstheme="majorBidi" w:eastAsiaTheme="majorEastAsia" w:hAnsiTheme="majorHAnsi"/>
+      <w:rFonts w:ascii="Times New Roman" w:asciiTheme="majorHAnsi" w:cs="Times New Roman" w:cstheme="majorBidi" w:eastAsiaTheme="majorEastAsia" w:hAnsi="Times New Roman" w:hAnsiTheme="majorHAnsi"/>
+      <w:b/>
+      <w:color w:val="000000"/>
       <w:sz w:val="56"/>
       <w:szCs w:val="56"/>
     </w:rPr>
@@ -6138,9 +6144,10 @@
       <w:outlineLvl w:val="0"/>
     </w:pPr>
     <w:rPr>
-      <w:rFonts w:asciiTheme="majorHAnsi" w:cstheme="majorBidi" w:eastAsiaTheme="majorEastAsia" w:hAnsiTheme="majorHAnsi"/>
-      <w:color w:themeColor="accent1" w:themeShade="BF" w:val="0F4761"/>
-      <w:sz w:val="40"/>
+      <w:rFonts w:ascii="Times New Roman" w:asciiTheme="majorHAnsi" w:cs="Times New Roman" w:cstheme="majorBidi" w:eastAsiaTheme="majorEastAsia" w:hAnsi="Times New Roman" w:hAnsiTheme="majorHAnsi"/>
+      <w:b/>
+      <w:color w:val="000000"/>
+      <w:sz w:val="28"/>
       <w:szCs w:val="40"/>
     </w:rPr>
   </w:style>
@@ -6161,9 +6168,10 @@
       <w:outlineLvl w:val="1"/>
     </w:pPr>
     <w:rPr>
-      <w:rFonts w:asciiTheme="majorHAnsi" w:cstheme="majorBidi" w:eastAsiaTheme="majorEastAsia" w:hAnsiTheme="majorHAnsi"/>
-      <w:color w:themeColor="accent1" w:themeShade="BF" w:val="0F4761"/>
-      <w:sz w:val="32"/>
+      <w:rFonts w:ascii="Times New Roman" w:asciiTheme="majorHAnsi" w:cs="Times New Roman" w:cstheme="majorBidi" w:eastAsiaTheme="majorEastAsia" w:hAnsi="Times New Roman" w:hAnsiTheme="majorHAnsi"/>
+      <w:b/>
+      <w:color w:val="000000"/>
+      <w:sz w:val="26"/>
       <w:szCs w:val="32"/>
     </w:rPr>
   </w:style>
@@ -6184,9 +6192,10 @@
       <w:outlineLvl w:val="2"/>
     </w:pPr>
     <w:rPr>
-      <w:rFonts w:cstheme="majorBidi" w:eastAsiaTheme="majorEastAsia"/>
-      <w:color w:themeColor="accent1" w:themeShade="BF" w:val="0F4761"/>
-      <w:sz w:val="28"/>
+      <w:rFonts w:ascii="Times New Roman" w:cs="Times New Roman" w:cstheme="majorBidi" w:eastAsiaTheme="majorEastAsia" w:hAnsi="Times New Roman"/>
+      <w:b/>
+      <w:color w:val="000000"/>
+      <w:sz w:val="24"/>
       <w:szCs w:val="28"/>
     </w:rPr>
   </w:style>
@@ -6492,6 +6501,14 @@
         <w:bottom w:type="dxa" w:w="0"/>
         <w:right w:type="dxa" w:w="108"/>
       </w:tblCellMar>
+      <w:tblBorders>
+        <w:top w:color="000000" w:space="0" w:sz="8" w:val="single"/>
+        <w:bottom w:color="000000" w:space="0" w:sz="8" w:val="single"/>
+        <w:left w:color="auto" w:space="0" w:sz="0" w:val="nil"/>
+        <w:right w:color="auto" w:space="0" w:sz="0" w:val="nil"/>
+        <w:insideH w:color="auto" w:space="0" w:sz="0" w:val="nil"/>
+        <w:insideV w:color="auto" w:space="0" w:sz="0" w:val="nil"/>
+      </w:tblBorders>
     </w:tblPr>
     <w:tblStylePr w:type="firstRow">
       <w:tcPr>
@@ -6500,6 +6517,13 @@
         </w:tcBorders>
         <w:vAlign w:val="bottom"/>
       </w:tcPr>
+      <w:rPr>
+        <w:b/>
+      </w:rPr>
+      <w:trPr/>
+      <w:pBdr>
+        <w:bottom w:color="000000" w:space="1" w:sz="8" w:val="single"/>
+      </w:pBdr>
     </w:tblStylePr>
   </w:style>
   <w:style w:customStyle="1" w:styleId="DefinitionTerm" w:type="paragraph">
@@ -6536,6 +6560,10 @@
     <w:pPr>
       <w:keepNext/>
     </w:pPr>
+    <w:rPr>
+      <w:rFonts w:ascii="Times New Roman" w:cs="Times New Roman" w:hAnsi="Times New Roman"/>
+      <w:sz w:val="24"/>
+    </w:rPr>
   </w:style>
   <w:style w:customStyle="1" w:styleId="ImageCaption" w:type="paragraph">
     <w:name w:val="Image Caption"/>

</xml_diff>

<commit_message>
docs: detailed per-objective prose + discussion with exact numbers
report.qmd: long-form paragraphs walking every table cell-group and figure per objective (corrected phyto richness: leaves 6/12 both plants), full post-hoc numbers with Holm/HL/r, pair-level superiority diffs, new Discussion section synthesizing assay layers and referencing all tables/figures.
</commit_message>
<xml_diff>
--- a/analysis/reports/report.docx
+++ b/analysis/reports/report.docx
@@ -200,13 +200,19 @@
         <w:t xml:space="preserve"> </w:t>
       </w:r>
       <w:r>
-        <w:t xml:space="preserve">significantly (Friedman p = 0.006; top</w:t>
-      </w:r>
-      <w:r>
-        <w:t xml:space="preserve"> </w:t>
-      </w:r>
-      <w:r>
-        <w:t xml:space="preserve">three doses beat control, Holm 0.039) and</w:t>
+        <w:t xml:space="preserve">significantly (parasitaemia Friedman</w:t>
+      </w:r>
+      <w:r>
+        <w:t xml:space="preserve"> </w:t>
+      </w:r>
+      <w:r>
+        <w:t xml:space="preserve">p = 0.006; top three doses beat control, Holm 0.039; motility Friedman</w:t>
+      </w:r>
+      <w:r>
+        <w:t xml:space="preserve"> </w:t>
+      </w:r>
+      <w:r>
+        <w:t xml:space="preserve">p &lt; 0.001) and</w:t>
       </w:r>
       <w:r>
         <w:t xml:space="preserve"> </w:t>
@@ -222,43 +228,43 @@
         <w:t xml:space="preserve"> </w:t>
       </w:r>
       <w:r>
-        <w:t xml:space="preserve">suggestively</w:t>
-      </w:r>
-      <w:r>
-        <w:t xml:space="preserve"> </w:t>
-      </w:r>
-      <w:r>
-        <w:t xml:space="preserve">(Friedman p = 0.074; 100 mg/ml Holm 0.071). At 100 mg/ml the mean peak</w:t>
-      </w:r>
-      <w:r>
-        <w:t xml:space="preserve"> </w:t>
-      </w:r>
-      <w:r>
-        <w:t xml:space="preserve">parasitaemia is zero in both parasites with no deaths, against universal</w:t>
-      </w:r>
-      <w:r>
-        <w:t xml:space="preserve"> </w:t>
-      </w:r>
-      <w:r>
-        <w:t xml:space="preserve">mortality in Negative Controls. No evidence separates the two plants</w:t>
-      </w:r>
-      <w:r>
-        <w:t xml:space="preserve"> </w:t>
-      </w:r>
-      <w:r>
-        <w:t xml:space="preserve">(paired p = 1.0, HL 0.3 [−14.7, 20.5]). All inference is block-level and</w:t>
-      </w:r>
-      <w:r>
-        <w:t xml:space="preserve"> </w:t>
-      </w:r>
-      <w:r>
-        <w:t xml:space="preserve">rank-based; every headline claim survived leave-one-block-out sensitivity</w:t>
-      </w:r>
-      <w:r>
-        <w:t xml:space="preserve"> </w:t>
-      </w:r>
-      <w:r>
-        <w:t xml:space="preserve">analysis.</w:t>
+        <w:t xml:space="preserve">suggestively (parasitaemia Friedman p = 0.074;</w:t>
+      </w:r>
+      <w:r>
+        <w:t xml:space="preserve"> </w:t>
+      </w:r>
+      <w:r>
+        <w:t xml:space="preserve">100 mg/ml Holm 0.071; motility Friedman p &lt; 0.001 with post-hocs just above</w:t>
+      </w:r>
+      <w:r>
+        <w:t xml:space="preserve"> </w:t>
+      </w:r>
+      <w:r>
+        <w:t xml:space="preserve">threshold). At 100 mg/ml the mean peak parasitaemia is zero in both parasites</w:t>
+      </w:r>
+      <w:r>
+        <w:t xml:space="preserve"> </w:t>
+      </w:r>
+      <w:r>
+        <w:t xml:space="preserve">with no deaths, against peak LEV 5 and universal mortality in Negative</w:t>
+      </w:r>
+      <w:r>
+        <w:t xml:space="preserve"> </w:t>
+      </w:r>
+      <w:r>
+        <w:t xml:space="preserve">Controls. No evidence separates the two plants (paired p = 1.0, HL 0.3</w:t>
+      </w:r>
+      <w:r>
+        <w:t xml:space="preserve"> </w:t>
+      </w:r>
+      <w:r>
+        <w:t xml:space="preserve">[−14.7, 20.5]). All inference is block-level and rank-based; every headline</w:t>
+      </w:r>
+      <w:r>
+        <w:t xml:space="preserve"> </w:t>
+      </w:r>
+      <w:r>
+        <w:t xml:space="preserve">claim survived leave-one-block-out sensitivity analysis.</w:t>
       </w:r>
     </w:p>
     <w:bookmarkEnd w:id="9"/>
@@ -370,13 +376,13 @@
         <w:t xml:space="preserve"> </w:t>
       </w:r>
       <w:r>
-        <w:t xml:space="preserve">exploratory description before any inference. Diagnostics, limitations and</w:t>
-      </w:r>
-      <w:r>
-        <w:t xml:space="preserve"> </w:t>
-      </w:r>
-      <w:r>
-        <w:t xml:space="preserve">references follow in §6–§8.</w:t>
+        <w:t xml:space="preserve">exploratory description before any inference, and each discussed jointly in</w:t>
+      </w:r>
+      <w:r>
+        <w:t xml:space="preserve"> </w:t>
+      </w:r>
+      <w:r>
+        <w:t xml:space="preserve">§7. Diagnostics, limitations and references follow in §6, §8 and §9.</w:t>
       </w:r>
     </w:p>
     <w:bookmarkEnd w:id="10"/>
@@ -472,7 +478,31 @@
         <w:t xml:space="preserve"> </w:t>
       </w:r>
       <w:r>
-        <w:t xml:space="preserve">Positive Control is an assay-validity reference only.</w:t>
+        <w:t xml:space="preserve">Positive Control is an assay-validity reference only. A consequence of the</w:t>
+      </w:r>
+      <w:r>
+        <w:t xml:space="preserve"> </w:t>
+      </w:r>
+      <w:r>
+        <w:t xml:space="preserve">group-mean design, stressed throughout this report, is that no within-group</w:t>
+      </w:r>
+      <w:r>
+        <w:t xml:space="preserve"> </w:t>
+      </w:r>
+      <w:r>
+        <w:t xml:space="preserve">variance survives: every p-value below is computed over at most eight</w:t>
+      </w:r>
+      <w:r>
+        <w:t xml:space="preserve"> </w:t>
+      </w:r>
+      <w:r>
+        <w:t xml:space="preserve">paired blocks, power is low by construction, and effect sizes with confidence</w:t>
+      </w:r>
+      <w:r>
+        <w:t xml:space="preserve"> </w:t>
+      </w:r>
+      <w:r>
+        <w:t xml:space="preserve">intervals — not significance stars — are the primary read-out.</w:t>
       </w:r>
     </w:p>
     <w:bookmarkEnd w:id="11"/>
@@ -725,7 +755,13 @@
         <w:t xml:space="preserve"> </w:t>
       </w:r>
       <w:r>
-        <w:t xml:space="preserve">It is noted here solely to keep the objective map complete.</w:t>
+        <w:t xml:space="preserve">It is noted here solely to keep the objective map complete; the statistical</w:t>
+      </w:r>
+      <w:r>
+        <w:t xml:space="preserve"> </w:t>
+      </w:r>
+      <w:r>
+        <w:t xml:space="preserve">story begins with the characterised extracts.</w:t>
       </w:r>
     </w:p>
     <w:bookmarkEnd w:id="14"/>
@@ -743,13 +779,68 @@
         <w:pStyle w:val="FirstParagraph"/>
       </w:pPr>
       <w:r>
-        <w:t xml:space="preserve">Exploration first: screening recovered all 12 compound classes, with</w:t>
-      </w:r>
-      <w:r>
-        <w:t xml:space="preserve"> </w:t>
-      </w:r>
-      <w:r>
-        <w:t xml:space="preserve">richness concentrated in leaves and seeds (</w:t>
+        <w:t xml:space="preserve">Exploration first. Screening recovered 8 of the 12 assayed classes in at</w:t>
+      </w:r>
+      <w:r>
+        <w:t xml:space="preserve"> </w:t>
+      </w:r>
+      <w:r>
+        <w:t xml:space="preserve">least one extract, with richness concentrated in leaves (6 of 12 in both</w:t>
+      </w:r>
+      <w:r>
+        <w:t xml:space="preserve"> </w:t>
+      </w:r>
+      <w:r>
+        <w:t xml:space="preserve">plants) and lowest in stem bark (</w:t>
+      </w:r>
+      <w:r>
+        <w:rPr>
+          <w:i/>
+          <w:iCs/>
+        </w:rPr>
+        <w:t xml:space="preserve">A. indica</w:t>
+      </w:r>
+      <w:r>
+        <w:t xml:space="preserve"> </w:t>
+      </w:r>
+      <w:r>
+        <w:t xml:space="preserve">3,</w:t>
+      </w:r>
+      <w:r>
+        <w:t xml:space="preserve"> </w:t>
+      </w:r>
+      <w:r>
+        <w:rPr>
+          <w:i/>
+          <w:iCs/>
+        </w:rPr>
+        <w:t xml:space="preserve">M. oleifera</w:t>
+      </w:r>
+      <w:r>
+        <w:t xml:space="preserve"> </w:t>
+      </w:r>
+      <w:r>
+        <w:t xml:space="preserve">4) and roots</w:t>
+      </w:r>
+      <w:r>
+        <w:t xml:space="preserve"> </w:t>
+      </w:r>
+      <w:r>
+        <w:t xml:space="preserve">(3 and 4); seeds sit in between (5 and 4) (</w:t>
+      </w:r>
+      <w:hyperlink w:anchor="tbl-phyto">
+        <w:r>
+          <w:rPr>
+            <w:rStyle w:val="Hyperlink"/>
+          </w:rPr>
+          <w:t xml:space="preserve">Table 1</w:t>
+        </w:r>
+      </w:hyperlink>
+      <w:r>
+        <w:t xml:space="preserve">;</w:t>
+      </w:r>
+      <w:r>
+        <w:t xml:space="preserve"> </w:t>
       </w:r>
       <w:hyperlink w:anchor="fig-rich">
         <w:r>
@@ -760,21 +851,59 @@
         </w:r>
       </w:hyperlink>
       <w:r>
-        <w:t xml:space="preserve">;</w:t>
-      </w:r>
-      <w:r>
-        <w:t xml:space="preserve"> </w:t>
-      </w:r>
-      <w:hyperlink w:anchor="tbl-phyto">
-        <w:r>
-          <w:rPr>
-            <w:rStyle w:val="Hyperlink"/>
-          </w:rPr>
-          <w:t xml:space="preserve">Table 1</w:t>
-        </w:r>
-      </w:hyperlink>
-      <w:r>
-        <w:t xml:space="preserve">).</w:t>
+        <w:t xml:space="preserve">). Two</w:t>
+      </w:r>
+      <w:r>
+        <w:t xml:space="preserve"> </w:t>
+      </w:r>
+      <w:r>
+        <w:t xml:space="preserve">classes are universal — Saponin and Carbohydrates appear in all eight</w:t>
+      </w:r>
+      <w:r>
+        <w:t xml:space="preserve"> </w:t>
+      </w:r>
+      <w:r>
+        <w:t xml:space="preserve">plant × part combinations — and four are absent everywhere (Anthraquinone,</w:t>
+      </w:r>
+      <w:r>
+        <w:t xml:space="preserve"> </w:t>
+      </w:r>
+      <w:r>
+        <w:t xml:space="preserve">Phlobatanins, Oxalates, Phytates), so neither group discriminates the</w:t>
+      </w:r>
+      <w:r>
+        <w:t xml:space="preserve"> </w:t>
+      </w:r>
+      <w:r>
+        <w:t xml:space="preserve">plants. Tannins follow a striking part pattern, present everywhere except</w:t>
+      </w:r>
+      <w:r>
+        <w:t xml:space="preserve"> </w:t>
+      </w:r>
+      <w:r>
+        <w:t xml:space="preserve">seeds in both plants. The differentiating classes are few and part-specific:</w:t>
+      </w:r>
+      <w:r>
+        <w:t xml:space="preserve"> </w:t>
+      </w:r>
+      <w:r>
+        <w:t xml:space="preserve">Steroids occur only in</w:t>
+      </w:r>
+      <w:r>
+        <w:t xml:space="preserve"> </w:t>
+      </w:r>
+      <w:r>
+        <w:rPr>
+          <w:i/>
+          <w:iCs/>
+        </w:rPr>
+        <w:t xml:space="preserve">A. indica</w:t>
+      </w:r>
+      <w:r>
+        <w:t xml:space="preserve"> </w:t>
+      </w:r>
+      <w:r>
+        <w:t xml:space="preserve">leaves and seeds; Alkaloids in</w:t>
       </w:r>
       <w:r>
         <w:t xml:space="preserve"> </w:t>
@@ -804,13 +933,97 @@
         <w:t xml:space="preserve"> </w:t>
       </w:r>
       <w:r>
-        <w:t xml:space="preserve">leaves carry the broadest profile (9 of 12) and stem bark the</w:t>
-      </w:r>
-      <w:r>
-        <w:t xml:space="preserve"> </w:t>
-      </w:r>
-      <w:r>
-        <w:t xml:space="preserve">sparsest in both plants; the presence matrix (</w:t>
+        <w:t xml:space="preserve">leaves and roots plus</w:t>
+      </w:r>
+      <w:r>
+        <w:t xml:space="preserve"> </w:t>
+      </w:r>
+      <w:r>
+        <w:rPr>
+          <w:i/>
+          <w:iCs/>
+        </w:rPr>
+        <w:t xml:space="preserve">A. indica</w:t>
+      </w:r>
+      <w:r>
+        <w:t xml:space="preserve"> </w:t>
+      </w:r>
+      <w:r>
+        <w:t xml:space="preserve">leaves; Terpenoids solely in</w:t>
+      </w:r>
+      <w:r>
+        <w:t xml:space="preserve"> </w:t>
+      </w:r>
+      <w:r>
+        <w:rPr>
+          <w:i/>
+          <w:iCs/>
+        </w:rPr>
+        <w:t xml:space="preserve">M.</w:t>
+      </w:r>
+      <w:r>
+        <w:rPr>
+          <w:i/>
+          <w:iCs/>
+        </w:rPr>
+        <w:t xml:space="preserve"> </w:t>
+      </w:r>
+      <w:r>
+        <w:rPr>
+          <w:i/>
+          <w:iCs/>
+        </w:rPr>
+        <w:t xml:space="preserve">oleifera</w:t>
+      </w:r>
+      <w:r>
+        <w:t xml:space="preserve"> </w:t>
+      </w:r>
+      <w:r>
+        <w:t xml:space="preserve">stem bark; Flavonoids in the leaves and seeds of both plants; and</w:t>
+      </w:r>
+      <w:r>
+        <w:t xml:space="preserve"> </w:t>
+      </w:r>
+      <w:r>
+        <w:t xml:space="preserve">Glucosides in</w:t>
+      </w:r>
+      <w:r>
+        <w:t xml:space="preserve"> </w:t>
+      </w:r>
+      <w:r>
+        <w:rPr>
+          <w:i/>
+          <w:iCs/>
+        </w:rPr>
+        <w:t xml:space="preserve">M. oleifera</w:t>
+      </w:r>
+      <w:r>
+        <w:t xml:space="preserve"> </w:t>
+      </w:r>
+      <w:r>
+        <w:t xml:space="preserve">leaves and seeds but only</w:t>
+      </w:r>
+      <w:r>
+        <w:t xml:space="preserve"> </w:t>
+      </w:r>
+      <w:r>
+        <w:rPr>
+          <w:i/>
+          <w:iCs/>
+        </w:rPr>
+        <w:t xml:space="preserve">A. indica</w:t>
+      </w:r>
+      <w:r>
+        <w:t xml:space="preserve"> </w:t>
+      </w:r>
+      <w:r>
+        <w:t xml:space="preserve">seeds</w:t>
+      </w:r>
+      <w:r>
+        <w:t xml:space="preserve"> </w:t>
+      </w:r>
+      <w:r>
+        <w:t xml:space="preserve">(</w:t>
       </w:r>
       <w:hyperlink w:anchor="fig-phyto-hm">
         <w:r>
@@ -821,31 +1034,75 @@
         </w:r>
       </w:hyperlink>
       <w:r>
-        <w:t xml:space="preserve">) shows no single</w:t>
-      </w:r>
-      <w:r>
-        <w:t xml:space="preserve"> </w:t>
-      </w:r>
-      <w:r>
-        <w:t xml:space="preserve">plant-specific signature compound. With only eight plant × part combinations</w:t>
-      </w:r>
-      <w:r>
-        <w:t xml:space="preserve"> </w:t>
-      </w:r>
-      <w:r>
-        <w:t xml:space="preserve">no test has power, so inference stops here: compound–efficacy overlays are</w:t>
-      </w:r>
-      <w:r>
-        <w:t xml:space="preserve"> </w:t>
-      </w:r>
-      <w:r>
-        <w:t xml:space="preserve">tabulated exploratorily without tests</w:t>
-      </w:r>
-      <w:r>
-        <w:t xml:space="preserve"> </w:t>
-      </w:r>
-      <w:r>
-        <w:t xml:space="preserve">(</w:t>
+        <w:t xml:space="preserve">). Concretely,</w:t>
+      </w:r>
+      <w:r>
+        <w:t xml:space="preserve"> </w:t>
+      </w:r>
+      <w:r>
+        <w:rPr>
+          <w:i/>
+          <w:iCs/>
+        </w:rPr>
+        <w:t xml:space="preserve">A. indica</w:t>
+      </w:r>
+      <w:r>
+        <w:t xml:space="preserve"> </w:t>
+      </w:r>
+      <w:r>
+        <w:t xml:space="preserve">leaves carry Saponin, Steroid,</w:t>
+      </w:r>
+      <w:r>
+        <w:t xml:space="preserve"> </w:t>
+      </w:r>
+      <w:r>
+        <w:t xml:space="preserve">Alkaloid, Flavonoid, Tannins and Carbohydrates, while</w:t>
+      </w:r>
+      <w:r>
+        <w:t xml:space="preserve"> </w:t>
+      </w:r>
+      <w:r>
+        <w:rPr>
+          <w:i/>
+          <w:iCs/>
+        </w:rPr>
+        <w:t xml:space="preserve">M. oleifera</w:t>
+      </w:r>
+      <w:r>
+        <w:t xml:space="preserve"> </w:t>
+      </w:r>
+      <w:r>
+        <w:t xml:space="preserve">leaves</w:t>
+      </w:r>
+      <w:r>
+        <w:t xml:space="preserve"> </w:t>
+      </w:r>
+      <w:r>
+        <w:t xml:space="preserve">carry Saponin, Alkaloid, Flavonoid, Glucosides, Tannins and Carbohydrates —</w:t>
+      </w:r>
+      <w:r>
+        <w:t xml:space="preserve"> </w:t>
+      </w:r>
+      <w:r>
+        <w:t xml:space="preserve">the same richness (6/12) with Steroid/Glucosides swapped. With only eight</w:t>
+      </w:r>
+      <w:r>
+        <w:t xml:space="preserve"> </w:t>
+      </w:r>
+      <w:r>
+        <w:t xml:space="preserve">plant × part combinations no test has power, so inference stops here: the</w:t>
+      </w:r>
+      <w:r>
+        <w:t xml:space="preserve"> </w:t>
+      </w:r>
+      <w:r>
+        <w:t xml:space="preserve">matrix is the result, and compound–efficacy overlays are tabulated</w:t>
+      </w:r>
+      <w:r>
+        <w:t xml:space="preserve"> </w:t>
+      </w:r>
+      <w:r>
+        <w:t xml:space="preserve">exploratorily without tests (</w:t>
       </w:r>
       <w:r>
         <w:rPr>
@@ -854,7 +1111,31 @@
         <w:t xml:space="preserve">phytochemical_efficacy_overlay.csv</w:t>
       </w:r>
       <w:r>
-        <w:t xml:space="preserve">).</w:t>
+        <w:t xml:space="preserve">). The</w:t>
+      </w:r>
+      <w:r>
+        <w:t xml:space="preserve"> </w:t>
+      </w:r>
+      <w:r>
+        <w:t xml:space="preserve">relevance for §7 is that the two plants’ chemical arsenals overlap heavily</w:t>
+      </w:r>
+      <w:r>
+        <w:t xml:space="preserve"> </w:t>
+      </w:r>
+      <w:r>
+        <w:t xml:space="preserve">(universal Saponin/Carbohydrates/Tannins), which foreshadows the null</w:t>
+      </w:r>
+      <w:r>
+        <w:t xml:space="preserve"> </w:t>
+      </w:r>
+      <w:r>
+        <w:t xml:space="preserve">superiority finding — but with n = 8 this remains a consistency observation,</w:t>
+      </w:r>
+      <w:r>
+        <w:t xml:space="preserve"> </w:t>
+      </w:r>
+      <w:r>
+        <w:t xml:space="preserve">not a tested mediation.</w:t>
       </w:r>
     </w:p>
     <w:tbl>
@@ -1580,7 +1861,115 @@
         <w:pStyle w:val="FirstParagraph"/>
       </w:pPr>
       <w:r>
-        <w:t xml:space="preserve">Exploration shows a textbook gradient (</w:t>
+        <w:t xml:space="preserve">Exploration shows a textbook gradient. Median TTI rises monotonically as</w:t>
+      </w:r>
+      <w:r>
+        <w:t xml:space="preserve"> </w:t>
+      </w:r>
+      <w:r>
+        <w:t xml:space="preserve">concentration falls: 15 min at 100 mg/ml in both parasites with zero</w:t>
+      </w:r>
+      <w:r>
+        <w:t xml:space="preserve"> </w:t>
+      </w:r>
+      <w:r>
+        <w:t xml:space="preserve">censoring, 22–30 min at 10 mg/ml, 45–53 min at 0.5 mg/ml, 60–75 min at</w:t>
+      </w:r>
+      <w:r>
+        <w:t xml:space="preserve"> </w:t>
+      </w:r>
+      <w:r>
+        <w:t xml:space="preserve">0.01 mg/ml, 90–105 min at 0.005 mg/ml, and fully censored Negative Controls</w:t>
+      </w:r>
+      <w:r>
+        <w:t xml:space="preserve"> </w:t>
+      </w:r>
+      <w:r>
+        <w:t xml:space="preserve">(all 8</w:t>
+      </w:r>
+      <w:r>
+        <w:t xml:space="preserve"> </w:t>
+      </w:r>
+      <w:r>
+        <w:rPr>
+          <w:i/>
+          <w:iCs/>
+        </w:rPr>
+        <w:t xml:space="preserve">evansi</w:t>
+      </w:r>
+      <w:r>
+        <w:t xml:space="preserve"> </w:t>
+      </w:r>
+      <w:r>
+        <w:t xml:space="preserve">NC groups never immobilise; 6 of 8</w:t>
+      </w:r>
+      <w:r>
+        <w:t xml:space="preserve"> </w:t>
+      </w:r>
+      <w:r>
+        <w:rPr>
+          <w:i/>
+          <w:iCs/>
+        </w:rPr>
+        <w:t xml:space="preserve">congolense</w:t>
+      </w:r>
+      <w:r>
+        <w:t xml:space="preserve"> </w:t>
+      </w:r>
+      <w:r>
+        <w:t xml:space="preserve">NC groups</w:t>
+      </w:r>
+      <w:r>
+        <w:t xml:space="preserve"> </w:t>
+      </w:r>
+      <w:r>
+        <w:t xml:space="preserve">likewise), while mean t120 motility climbs from 0 at the top doses to 0.67</w:t>
+      </w:r>
+      <w:r>
+        <w:t xml:space="preserve"> </w:t>
+      </w:r>
+      <w:r>
+        <w:t xml:space="preserve">(</w:t>
+      </w:r>
+      <w:r>
+        <w:rPr>
+          <w:i/>
+          <w:iCs/>
+        </w:rPr>
+        <w:t xml:space="preserve">congolense</w:t>
+      </w:r>
+      <w:r>
+        <w:t xml:space="preserve"> </w:t>
+      </w:r>
+      <w:r>
+        <w:t xml:space="preserve">NC) and 1.0 (</w:t>
+      </w:r>
+      <w:r>
+        <w:rPr>
+          <w:i/>
+          <w:iCs/>
+        </w:rPr>
+        <w:t xml:space="preserve">evansi</w:t>
+      </w:r>
+      <w:r>
+        <w:t xml:space="preserve"> </w:t>
+      </w:r>
+      <w:r>
+        <w:t xml:space="preserve">NC) (</w:t>
+      </w:r>
+      <w:hyperlink w:anchor="tbl-tti">
+        <w:r>
+          <w:rPr>
+            <w:rStyle w:val="Hyperlink"/>
+          </w:rPr>
+          <w:t xml:space="preserve">Table 2</w:t>
+        </w:r>
+      </w:hyperlink>
+      <w:r>
+        <w:t xml:space="preserve">;</w:t>
+      </w:r>
+      <w:r>
+        <w:t xml:space="preserve"> </w:t>
       </w:r>
       <w:hyperlink w:anchor="fig-tti">
         <w:r>
@@ -1591,36 +1980,13 @@
         </w:r>
       </w:hyperlink>
       <w:r>
-        <w:t xml:space="preserve">): median TTI rises from 15</w:t>
-      </w:r>
-      <w:r>
-        <w:t xml:space="preserve"> </w:t>
-      </w:r>
-      <w:r>
-        <w:t xml:space="preserve">min at 100 mg/ml (both parasites, zero censoring) through ~45–105 min at</w:t>
-      </w:r>
-      <w:r>
-        <w:t xml:space="preserve"> </w:t>
-      </w:r>
-      <w:r>
-        <w:t xml:space="preserve">intermediate doses to fully censored Negative Controls, while mean t120</w:t>
-      </w:r>
-      <w:r>
-        <w:t xml:space="preserve"> </w:t>
-      </w:r>
-      <w:r>
-        <w:t xml:space="preserve">motility climbs from 0 to 0.67–1.0 (</w:t>
-      </w:r>
-      <w:hyperlink w:anchor="tbl-tti">
-        <w:r>
-          <w:rPr>
-            <w:rStyle w:val="Hyperlink"/>
-          </w:rPr>
-          <w:t xml:space="preserve">Table 2</w:t>
-        </w:r>
-      </w:hyperlink>
-      <w:r>
-        <w:t xml:space="preserve">). Trajectories (</w:t>
+        <w:t xml:space="preserve">). Trajectories</w:t>
+      </w:r>
+      <w:r>
+        <w:t xml:space="preserve"> </w:t>
+      </w:r>
+      <w:r>
+        <w:t xml:space="preserve">(</w:t>
       </w:r>
       <w:hyperlink w:anchor="fig-mot-traj">
         <w:r>
@@ -1631,25 +1997,31 @@
         </w:r>
       </w:hyperlink>
       <w:r>
-        <w:t xml:space="preserve">)</w:t>
-      </w:r>
-      <w:r>
-        <w:t xml:space="preserve"> </w:t>
-      </w:r>
-      <w:r>
-        <w:t xml:space="preserve">confirm rapid kill at high doses and the expected Positive Control profile</w:t>
-      </w:r>
-      <w:r>
-        <w:t xml:space="preserve"> </w:t>
-      </w:r>
-      <w:r>
-        <w:t xml:space="preserve">(+ at t = 0, immobile thereafter). Inference follows the description: the</w:t>
-      </w:r>
-      <w:r>
-        <w:t xml:space="preserve"> </w:t>
-      </w:r>
-      <w:r>
-        <w:t xml:space="preserve">blocked dose trend is highly significant for both parasites (</w:t>
+        <w:t xml:space="preserve">) confirm rapid kill at high doses — 100 mg/ml immobilises</w:t>
+      </w:r>
+      <w:r>
+        <w:t xml:space="preserve"> </w:t>
+      </w:r>
+      <w:r>
+        <w:t xml:space="preserve">within 15–30 minutes in most blocks — and validate the assay: the recovered</w:t>
+      </w:r>
+      <w:r>
+        <w:t xml:space="preserve"> </w:t>
+      </w:r>
+      <w:r>
+        <w:t xml:space="preserve">Positive Control rows show + at t = 0 and immobility thereafter in all 16</w:t>
+      </w:r>
+      <w:r>
+        <w:t xml:space="preserve"> </w:t>
+      </w:r>
+      <w:r>
+        <w:t xml:space="preserve">tables. Inference follows the description. The blocked dose trend is highly</w:t>
+      </w:r>
+      <w:r>
+        <w:t xml:space="preserve"> </w:t>
+      </w:r>
+      <w:r>
+        <w:t xml:space="preserve">significant for both parasites (</w:t>
       </w:r>
       <w:hyperlink w:anchor="tbl-mot-dose">
         <w:r>
@@ -1676,7 +2048,13 @@
         <w:t xml:space="preserve"> </w:t>
       </w:r>
       <w:r>
-        <w:t xml:space="preserve">Q = 27.75, p &lt; 0.001, ρ = −0.70;</w:t>
+        <w:t xml:space="preserve">Friedman</w:t>
+      </w:r>
+      <w:r>
+        <w:t xml:space="preserve"> </w:t>
+      </w:r>
+      <w:r>
+        <w:t xml:space="preserve">Q = 27.75, p &lt; 0.001, pooled ρ = −0.70;</w:t>
       </w:r>
       <w:r>
         <w:t xml:space="preserve"> </w:t>
@@ -1715,10 +2093,13 @@
         <w:t xml:space="preserve"> </w:t>
       </w:r>
       <w:r>
-        <w:t xml:space="preserve">large consistent effects (rank-biserial −1; HL ≈ −0.83</w:t>
-      </w:r>
-      <w:r>
-        <w:t xml:space="preserve"> </w:t>
+        <w:t xml:space="preserve">large, consistent effects at the top doses — rank-biserial −1 throughout,</w:t>
+      </w:r>
+      <w:r>
+        <w:t xml:space="preserve"> </w:t>
+      </w:r>
+      <w:r>
+        <w:t xml:space="preserve">HL reductions of −0.83 (</w:t>
       </w:r>
       <w:r>
         <w:rPr>
@@ -1728,16 +2109,16 @@
         <w:t xml:space="preserve">congolense</w:t>
       </w:r>
       <w:r>
-        <w:t xml:space="preserve">,</w:t>
-      </w:r>
-      <w:r>
-        <w:t xml:space="preserve"> </w:t>
-      </w:r>
-      <w:r>
-        <w:t xml:space="preserve">−0.89</w:t>
-      </w:r>
-      <w:r>
-        <w:t xml:space="preserve"> </w:t>
+        <w:t xml:space="preserve"> </w:t>
+      </w:r>
+      <w:r>
+        <w:t xml:space="preserve">100 mg/ml, 95% CI [−0.94, −0.72]) and</w:t>
+      </w:r>
+      <w:r>
+        <w:t xml:space="preserve"> </w:t>
+      </w:r>
+      <w:r>
+        <w:t xml:space="preserve">−0.89 (</w:t>
       </w:r>
       <w:r>
         <w:rPr>
@@ -1750,19 +2131,49 @@
         <w:t xml:space="preserve"> </w:t>
       </w:r>
       <w:r>
-        <w:t xml:space="preserve">at 100 mg/ml) that sit just above Holm-adjusted significance</w:t>
-      </w:r>
-      <w:r>
-        <w:t xml:space="preserve"> </w:t>
-      </w:r>
-      <w:r>
-        <w:t xml:space="preserve">(0.065, 0.052) — strong but formally inconclusive at N = 8; lower doses match</w:t>
-      </w:r>
-      <w:r>
-        <w:t xml:space="preserve"> </w:t>
-      </w:r>
-      <w:r>
-        <w:t xml:space="preserve">the control.</w:t>
+        <w:t xml:space="preserve">100 mg/ml, [−0.94, −0.83]) — that sit just above</w:t>
+      </w:r>
+      <w:r>
+        <w:t xml:space="preserve"> </w:t>
+      </w:r>
+      <w:r>
+        <w:t xml:space="preserve">Holm-adjusted significance (0.065 and 0.052; 10 mg/ml: 0.085 and 0.052).</w:t>
+      </w:r>
+      <w:r>
+        <w:t xml:space="preserve"> </w:t>
+      </w:r>
+      <w:r>
+        <w:t xml:space="preserve">Lower doses are indistinguishable from the control (0.5 mg/ml Holm 0.17 and</w:t>
+      </w:r>
+      <w:r>
+        <w:t xml:space="preserve"> </w:t>
+      </w:r>
+      <w:r>
+        <w:t xml:space="preserve">0.064; 0.01/0.005 mg/ml ≥ 0.11), and several low-dose pairs have zero</w:t>
+      </w:r>
+      <w:r>
+        <w:t xml:space="preserve"> </w:t>
+      </w:r>
+      <w:r>
+        <w:t xml:space="preserve">differences (n_nonzero as low as 4 of 8), which is itself informative: weak</w:t>
+      </w:r>
+      <w:r>
+        <w:t xml:space="preserve"> </w:t>
+      </w:r>
+      <w:r>
+        <w:t xml:space="preserve">extracts match the control exactly. Heavy tied ranks (the endpoint averages</w:t>
+      </w:r>
+      <w:r>
+        <w:t xml:space="preserve"> </w:t>
+      </w:r>
+      <w:r>
+        <w:t xml:space="preserve">nine binary points) forced the asymptotic approximation in every motility</w:t>
+      </w:r>
+      <w:r>
+        <w:t xml:space="preserve"> </w:t>
+      </w:r>
+      <w:r>
+        <w:t xml:space="preserve">contrast — recorded per row — and conclusions are unchanged under it.</w:t>
       </w:r>
     </w:p>
     <w:tbl>
@@ -4596,19 +5007,31 @@
         <w:pStyle w:val="FirstParagraph"/>
       </w:pPr>
       <w:r>
-        <w:t xml:space="preserve">Exploration first: peak parasitaemia falls monotonically with dose —</w:t>
-      </w:r>
-      <w:r>
-        <w:t xml:space="preserve"> </w:t>
-      </w:r>
-      <w:r>
-        <w:t xml:space="preserve">100 mg/ml holds mean peak at zero in both parasites with no deaths, against</w:t>
-      </w:r>
-      <w:r>
-        <w:t xml:space="preserve"> </w:t>
-      </w:r>
-      <w:r>
-        <w:t xml:space="preserve">peak 5 and universal mortality in Negative Controls (</w:t>
+        <w:t xml:space="preserve">Exploration first, because the numbers here are the backbone of the thesis.</w:t>
+      </w:r>
+      <w:r>
+        <w:t xml:space="preserve"> </w:t>
+      </w:r>
+      <w:r>
+        <w:t xml:space="preserve">Peak parasitaemia falls monotonically with dose in both parasites: at</w:t>
+      </w:r>
+      <w:r>
+        <w:t xml:space="preserve"> </w:t>
+      </w:r>
+      <w:r>
+        <w:t xml:space="preserve">100 mg/ml the mean peak is exactly zero across all eight blocks per</w:t>
+      </w:r>
+      <w:r>
+        <w:t xml:space="preserve"> </w:t>
+      </w:r>
+      <w:r>
+        <w:t xml:space="preserve">parasite with zero deaths, while Negative Controls peak at LEV 5 with</w:t>
+      </w:r>
+      <w:r>
+        <w:t xml:space="preserve"> </w:t>
+      </w:r>
+      <w:r>
+        <w:t xml:space="preserve">universal (100%) mortality (</w:t>
       </w:r>
       <w:hyperlink w:anchor="tbl-peak">
         <w:r>
@@ -4633,24 +5056,69 @@
         </w:r>
       </w:hyperlink>
       <w:r>
-        <w:t xml:space="preserve">). Clearance days shorten and day-40 zeros accumulate with dose,</w:t>
-      </w:r>
-      <w:r>
-        <w:t xml:space="preserve"> </w:t>
-      </w:r>
-      <w:r>
-        <w:t xml:space="preserve">while mortality concentrates in low-dose and control groups (</w:t>
-      </w:r>
-      <w:hyperlink w:anchor="fig-mort">
-        <w:r>
-          <w:rPr>
-            <w:rStyle w:val="Hyperlink"/>
-          </w:rPr>
-          <w:t xml:space="preserve">Figure 6</w:t>
-        </w:r>
-      </w:hyperlink>
-      <w:r>
-        <w:t xml:space="preserve">).</w:t>
+        <w:t xml:space="preserve">). The gradient is smooth —</w:t>
+      </w:r>
+      <w:r>
+        <w:t xml:space="preserve"> </w:t>
+      </w:r>
+      <w:r>
+        <w:rPr>
+          <w:i/>
+          <w:iCs/>
+        </w:rPr>
+        <w:t xml:space="preserve">congolense</w:t>
+      </w:r>
+      <w:r>
+        <w:t xml:space="preserve"> </w:t>
+      </w:r>
+      <w:r>
+        <w:t xml:space="preserve">mean peaks 0 → 1.88 → 2.78 → 3.13 → 3.19 → 5.0 from 100 mg/ml</w:t>
+      </w:r>
+      <w:r>
+        <w:t xml:space="preserve"> </w:t>
+      </w:r>
+      <w:r>
+        <w:t xml:space="preserve">to control;</w:t>
+      </w:r>
+      <w:r>
+        <w:t xml:space="preserve"> </w:t>
+      </w:r>
+      <w:r>
+        <w:rPr>
+          <w:i/>
+          <w:iCs/>
+        </w:rPr>
+        <w:t xml:space="preserve">evansi</w:t>
+      </w:r>
+      <w:r>
+        <w:t xml:space="preserve"> </w:t>
+      </w:r>
+      <w:r>
+        <w:t xml:space="preserve">0 → 0 → 0.63 → 1.93 → 2.08 → 5.0 — with mortality</w:t>
+      </w:r>
+      <w:r>
+        <w:t xml:space="preserve"> </w:t>
+      </w:r>
+      <w:r>
+        <w:t xml:space="preserve">tracking it (0% at top doses rising to 62–100% at low doses and control)</w:t>
+      </w:r>
+      <w:r>
+        <w:t xml:space="preserve"> </w:t>
+      </w:r>
+      <w:r>
+        <w:t xml:space="preserve">and median clearance days shortening as dose rises. Day-40 zeros accumulate</w:t>
+      </w:r>
+      <w:r>
+        <w:t xml:space="preserve"> </w:t>
+      </w:r>
+      <w:r>
+        <w:t xml:space="preserve">with dose (100% at top doses, 0% in controls), which together with the</w:t>
+      </w:r>
+      <w:r>
+        <w:t xml:space="preserve"> </w:t>
+      </w:r>
+      <w:r>
+        <w:t xml:space="preserve">zero-positive day-40 overall is why day-40 cannot carry inference.</w:t>
       </w:r>
       <w:r>
         <w:t xml:space="preserve"> </w:t>
@@ -4673,13 +5141,13 @@
         <w:t xml:space="preserve"> </w:t>
       </w:r>
       <w:r>
-        <w:t xml:space="preserve">resolve in survivors. Inference: cumulative burden (AUC) falls monotonically</w:t>
-      </w:r>
-      <w:r>
-        <w:t xml:space="preserve"> </w:t>
-      </w:r>
-      <w:r>
-        <w:t xml:space="preserve">with log-concentration (</w:t>
+        <w:t xml:space="preserve">resolve in survivors, with deaths (44 of 112 groups) accompanying the</w:t>
+      </w:r>
+      <w:r>
+        <w:t xml:space="preserve"> </w:t>
+      </w:r>
+      <w:r>
+        <w:t xml:space="preserve">decline. Inference on cumulative burden (AUC) mirrors the peaks (</w:t>
       </w:r>
       <w:hyperlink w:anchor="fig-auc">
         <w:r>
@@ -4690,7 +5158,13 @@
         </w:r>
       </w:hyperlink>
       <w:r>
-        <w:t xml:space="preserve">) — significantly for</w:t>
+        <w:t xml:space="preserve">):</w:t>
+      </w:r>
+      <w:r>
+        <w:t xml:space="preserve"> </w:t>
+      </w:r>
+      <w:r>
+        <w:t xml:space="preserve">monotonic in log-concentration, significant for</w:t>
       </w:r>
       <w:r>
         <w:t xml:space="preserve"> </w:t>
@@ -4717,7 +5191,19 @@
         </w:r>
       </w:hyperlink>
       <w:r>
-        <w:t xml:space="preserve">: Q = 14.51, p = 0.006, ρ = −0.51) and suggestively for</w:t>
+        <w:t xml:space="preserve">:</w:t>
+      </w:r>
+      <w:r>
+        <w:t xml:space="preserve"> </w:t>
+      </w:r>
+      <w:r>
+        <w:t xml:space="preserve">Friedman Q = 14.51, p = 0.006, pooled ρ = −0.51, mean per-block ρ = −0.86)</w:t>
+      </w:r>
+      <w:r>
+        <w:t xml:space="preserve"> </w:t>
+      </w:r>
+      <w:r>
+        <w:t xml:space="preserve">and suggestive for</w:t>
       </w:r>
       <w:r>
         <w:t xml:space="preserve"> </w:t>
@@ -4733,7 +5219,13 @@
         <w:t xml:space="preserve"> </w:t>
       </w:r>
       <w:r>
-        <w:t xml:space="preserve">(Q = 8.52, p = 0.074, ρ = −0.42). Post-hocs (</w:t>
+        <w:t xml:space="preserve">(Q = 8.52, p = 0.074, ρ = −0.42, mean</w:t>
+      </w:r>
+      <w:r>
+        <w:t xml:space="preserve"> </w:t>
+      </w:r>
+      <w:r>
+        <w:t xml:space="preserve">per-block −0.46). Post-hocs (</w:t>
       </w:r>
       <w:hyperlink w:anchor="tbl-para-posthoc">
         <w:r>
@@ -4744,13 +5236,7 @@
         </w:r>
       </w:hyperlink>
       <w:r>
-        <w:t xml:space="preserve">)</w:t>
-      </w:r>
-      <w:r>
-        <w:t xml:space="preserve"> </w:t>
-      </w:r>
-      <w:r>
-        <w:t xml:space="preserve">confirm</w:t>
+        <w:t xml:space="preserve">) confirm</w:t>
       </w:r>
       <w:r>
         <w:t xml:space="preserve"> </w:t>
@@ -4766,13 +5252,31 @@
         <w:t xml:space="preserve"> </w:t>
       </w:r>
       <w:r>
-        <w:t xml:space="preserve">100/10/0.5 mg/ml in all eight blocks (W = 0, exact</w:t>
-      </w:r>
-      <w:r>
-        <w:t xml:space="preserve"> </w:t>
-      </w:r>
-      <w:r>
-        <w:t xml:space="preserve">p = 0.008, Holm 0.039; HL ≈ −50/−50/−44 AUC-days);</w:t>
+        <w:t xml:space="preserve">100, 10</w:t>
+      </w:r>
+      <w:r>
+        <w:t xml:space="preserve"> </w:t>
+      </w:r>
+      <w:r>
+        <w:t xml:space="preserve">and 0.5 mg/ml, each beating the control in all eight blocks (W = 0, exact</w:t>
+      </w:r>
+      <w:r>
+        <w:t xml:space="preserve"> </w:t>
+      </w:r>
+      <w:r>
+        <w:t xml:space="preserve">p = 0.008, Holm 0.039; HL ≈ −50/−50/−44 AUC-days with lower limits near −75),</w:t>
+      </w:r>
+      <w:r>
+        <w:t xml:space="preserve"> </w:t>
+      </w:r>
+      <w:r>
+        <w:t xml:space="preserve">while 0.01 and 0.005 mg/ml do not survive correction (Holm 0.078 each, with</w:t>
+      </w:r>
+      <w:r>
+        <w:t xml:space="preserve"> </w:t>
+      </w:r>
+      <w:r>
+        <w:t xml:space="preserve">HL point estimates still strongly negative at −32/−34). For</w:t>
       </w:r>
       <w:r>
         <w:t xml:space="preserve"> </w:t>
@@ -4782,19 +5286,64 @@
           <w:i/>
           <w:iCs/>
         </w:rPr>
-        <w:t xml:space="preserve">congolense</w:t>
-      </w:r>
-      <w:r>
-        <w:t xml:space="preserve"> </w:t>
-      </w:r>
-      <w:r>
-        <w:t xml:space="preserve">100 mg/ml is</w:t>
-      </w:r>
-      <w:r>
-        <w:t xml:space="preserve"> </w:t>
-      </w:r>
-      <w:r>
-        <w:t xml:space="preserve">suggestive only (Holm 0.071). No parasite-level AUC difference (p = 0.46).</w:t>
+        <w:t xml:space="preserve">T. congolense</w:t>
+      </w:r>
+      <w:r>
+        <w:t xml:space="preserve"> </w:t>
+      </w:r>
+      <w:r>
+        <w:t xml:space="preserve">only 100 mg/ml is suggestive (asymptotic p = 0.014 — ties present — Holm</w:t>
+      </w:r>
+      <w:r>
+        <w:t xml:space="preserve"> </w:t>
+      </w:r>
+      <w:r>
+        <w:t xml:space="preserve">0.071, HL −29.9 [−41.0, −20.9], r = −1); every lower dose is far from</w:t>
+      </w:r>
+      <w:r>
+        <w:t xml:space="preserve"> </w:t>
+      </w:r>
+      <w:r>
+        <w:t xml:space="preserve">significance (Holm 0.32–0.73) despite negative point estimates. No</w:t>
+      </w:r>
+      <w:r>
+        <w:t xml:space="preserve"> </w:t>
+      </w:r>
+      <w:r>
+        <w:t xml:space="preserve">parasite-level AUC difference exists (paired W = 24, exact p = 0.46,</w:t>
+      </w:r>
+      <w:r>
+        <w:t xml:space="preserve"> </w:t>
+      </w:r>
+      <w:r>
+        <w:t xml:space="preserve">HL 6.0 [−10.7, 21.1], r = 0.25;</w:t>
+      </w:r>
+      <w:r>
+        <w:t xml:space="preserve"> </w:t>
+      </w:r>
+      <w:hyperlink w:anchor="tbl-other">
+        <w:r>
+          <w:rPr>
+            <w:rStyle w:val="Hyperlink"/>
+          </w:rPr>
+          <w:t xml:space="preserve">Table 9</w:t>
+        </w:r>
+      </w:hyperlink>
+      <w:r>
+        <w:t xml:space="preserve">) — the parasites differ in</w:t>
+      </w:r>
+      <w:r>
+        <w:t xml:space="preserve"> </w:t>
+      </w:r>
+      <w:r>
+        <w:rPr>
+          <w:i/>
+          <w:iCs/>
+        </w:rPr>
+        <w:t xml:space="preserve">dose sensitivity</w:t>
+      </w:r>
+      <w:r>
+        <w:t xml:space="preserve">, not in overall burden.</w:t>
       </w:r>
     </w:p>
     <w:tbl>
@@ -8069,7 +8618,7 @@
         <w:pStyle w:val="FirstParagraph"/>
       </w:pPr>
       <w:r>
-        <w:t xml:space="preserve">Exploration: mean weight and PCV paths across the three timepoints run</w:t>
+        <w:t xml:space="preserve">Exploration: mean weight and PCV paths across Pre, Infection and Post run</w:t>
       </w:r>
       <w:r>
         <w:t xml:space="preserve"> </w:t>
@@ -8086,13 +8635,19 @@
         </w:r>
       </w:hyperlink>
       <w:r>
-        <w:t xml:space="preserve">), and deltas centre</w:t>
-      </w:r>
-      <w:r>
-        <w:t xml:space="preserve"> </w:t>
-      </w:r>
-      <w:r>
-        <w:t xml:space="preserve">near zero with wide scatter (</w:t>
+        <w:t xml:space="preserve">) — there is no</w:t>
+      </w:r>
+      <w:r>
+        <w:t xml:space="preserve"> </w:t>
+      </w:r>
+      <w:r>
+        <w:t xml:space="preserve">visible separation of trajectories by treatment — and deltas centre near</w:t>
+      </w:r>
+      <w:r>
+        <w:t xml:space="preserve"> </w:t>
+      </w:r>
+      <w:r>
+        <w:t xml:space="preserve">zero with wide scatter (</w:t>
       </w:r>
       <w:hyperlink w:anchor="fig-wt">
         <w:r>
@@ -8117,7 +8672,7 @@
         </w:r>
       </w:hyperlink>
       <w:r>
-        <w:t xml:space="preserve">). Flagged groups</w:t>
+        <w:t xml:space="preserve">). The flags tell the real story</w:t>
       </w:r>
       <w:r>
         <w:t xml:space="preserve"> </w:t>
@@ -8134,13 +8689,276 @@
         </w:r>
       </w:hyperlink>
       <w:r>
-        <w:t xml:space="preserve">) are few and infection- rather than treatment-related.</w:t>
-      </w:r>
-      <w:r>
-        <w:t xml:space="preserve"> </w:t>
-      </w:r>
-      <w:r>
-        <w:t xml:space="preserve">Inference finds no plant or parasite signals (</w:t>
+        <w:t xml:space="preserve">): missingness (death) concentrates in</w:t>
+      </w:r>
+      <w:r>
+        <w:t xml:space="preserve"> </w:t>
+      </w:r>
+      <w:r>
+        <w:rPr>
+          <w:i/>
+          <w:iCs/>
+        </w:rPr>
+        <w:t xml:space="preserve">T. congolense</w:t>
+      </w:r>
+      <w:r>
+        <w:t xml:space="preserve"> </w:t>
+      </w:r>
+      <w:r>
+        <w:t xml:space="preserve">(7 + 3</w:t>
+      </w:r>
+      <w:r>
+        <w:t xml:space="preserve"> </w:t>
+      </w:r>
+      <w:r>
+        <w:t xml:space="preserve">weight groups, 7 + 3 PCV groups across the two plants, vs 1 each for</w:t>
+      </w:r>
+      <w:r>
+        <w:t xml:space="preserve"> </w:t>
+      </w:r>
+      <w:r>
+        <w:rPr>
+          <w:i/>
+          <w:iCs/>
+        </w:rPr>
+        <w:t xml:space="preserve">A.</w:t>
+      </w:r>
+      <w:r>
+        <w:rPr>
+          <w:i/>
+          <w:iCs/>
+        </w:rPr>
+        <w:t xml:space="preserve"> </w:t>
+      </w:r>
+      <w:r>
+        <w:rPr>
+          <w:i/>
+          <w:iCs/>
+        </w:rPr>
+        <w:t xml:space="preserve">indica</w:t>
+      </w:r>
+      <w:r>
+        <w:t xml:space="preserve">/</w:t>
+      </w:r>
+      <w:r>
+        <w:rPr>
+          <w:i/>
+          <w:iCs/>
+        </w:rPr>
+        <w:t xml:space="preserve">evansi</w:t>
+      </w:r>
+      <w:r>
+        <w:t xml:space="preserve"> </w:t>
+      </w:r>
+      <w:r>
+        <w:t xml:space="preserve">and none for</w:t>
+      </w:r>
+      <w:r>
+        <w:t xml:space="preserve"> </w:t>
+      </w:r>
+      <w:r>
+        <w:rPr>
+          <w:i/>
+          <w:iCs/>
+        </w:rPr>
+        <w:t xml:space="preserve">M. oleifera</w:t>
+      </w:r>
+      <w:r>
+        <w:t xml:space="preserve">/</w:t>
+      </w:r>
+      <w:r>
+        <w:rPr>
+          <w:i/>
+          <w:iCs/>
+        </w:rPr>
+        <w:t xml:space="preserve">evansi</w:t>
+      </w:r>
+      <w:r>
+        <w:t xml:space="preserve"> </w:t>
+      </w:r>
+      <w:r>
+        <w:t xml:space="preserve">weight); severe weight</w:t>
+      </w:r>
+      <w:r>
+        <w:t xml:space="preserve"> </w:t>
+      </w:r>
+      <w:r>
+        <w:t xml:space="preserve">loss (≥ 20%) hits 4 + 2</w:t>
+      </w:r>
+      <w:r>
+        <w:t xml:space="preserve"> </w:t>
+      </w:r>
+      <w:r>
+        <w:rPr>
+          <w:i/>
+          <w:iCs/>
+        </w:rPr>
+        <w:t xml:space="preserve">congolense</w:t>
+      </w:r>
+      <w:r>
+        <w:t xml:space="preserve"> </w:t>
+      </w:r>
+      <w:r>
+        <w:t xml:space="preserve">groups plus one</w:t>
+      </w:r>
+      <w:r>
+        <w:t xml:space="preserve"> </w:t>
+      </w:r>
+      <w:r>
+        <w:rPr>
+          <w:i/>
+          <w:iCs/>
+        </w:rPr>
+        <w:t xml:space="preserve">A. indica</w:t>
+      </w:r>
+      <w:r>
+        <w:t xml:space="preserve">/</w:t>
+      </w:r>
+      <w:r>
+        <w:rPr>
+          <w:i/>
+          <w:iCs/>
+        </w:rPr>
+        <w:t xml:space="preserve">evansi</w:t>
+      </w:r>
+      <w:r>
+        <w:t xml:space="preserve"> </w:t>
+      </w:r>
+      <w:r>
+        <w:t xml:space="preserve">group, with toxicity-signal (≥ 10%) flags in 4 + 4</w:t>
+      </w:r>
+      <w:r>
+        <w:t xml:space="preserve"> </w:t>
+      </w:r>
+      <w:r>
+        <w:rPr>
+          <w:i/>
+          <w:iCs/>
+        </w:rPr>
+        <w:t xml:space="preserve">congolense</w:t>
+      </w:r>
+      <w:r>
+        <w:t xml:space="preserve"> </w:t>
+      </w:r>
+      <w:r>
+        <w:t xml:space="preserve">and 2</w:t>
+      </w:r>
+      <w:r>
+        <w:t xml:space="preserve"> </w:t>
+      </w:r>
+      <w:r>
+        <w:rPr>
+          <w:i/>
+          <w:iCs/>
+        </w:rPr>
+        <w:t xml:space="preserve">A.</w:t>
+      </w:r>
+      <w:r>
+        <w:rPr>
+          <w:i/>
+          <w:iCs/>
+        </w:rPr>
+        <w:t xml:space="preserve"> </w:t>
+      </w:r>
+      <w:r>
+        <w:rPr>
+          <w:i/>
+          <w:iCs/>
+        </w:rPr>
+        <w:t xml:space="preserve">indica</w:t>
+      </w:r>
+      <w:r>
+        <w:t xml:space="preserve">/</w:t>
+      </w:r>
+      <w:r>
+        <w:rPr>
+          <w:i/>
+          <w:iCs/>
+        </w:rPr>
+        <w:t xml:space="preserve">evansi</w:t>
+      </w:r>
+      <w:r>
+        <w:t xml:space="preserve"> </w:t>
+      </w:r>
+      <w:r>
+        <w:t xml:space="preserve">groups; anaemia flags likewise cluster in</w:t>
+      </w:r>
+      <w:r>
+        <w:t xml:space="preserve"> </w:t>
+      </w:r>
+      <w:r>
+        <w:rPr>
+          <w:i/>
+          <w:iCs/>
+        </w:rPr>
+        <w:t xml:space="preserve">congolense</w:t>
+      </w:r>
+      <w:r>
+        <w:t xml:space="preserve"> </w:t>
+      </w:r>
+      <w:r>
+        <w:t xml:space="preserve">(5 + 4 groups) with only 2 in</w:t>
+      </w:r>
+      <w:r>
+        <w:t xml:space="preserve"> </w:t>
+      </w:r>
+      <w:r>
+        <w:rPr>
+          <w:i/>
+          <w:iCs/>
+        </w:rPr>
+        <w:t xml:space="preserve">M. oleifera</w:t>
+      </w:r>
+      <w:r>
+        <w:t xml:space="preserve">/</w:t>
+      </w:r>
+      <w:r>
+        <w:rPr>
+          <w:i/>
+          <w:iCs/>
+        </w:rPr>
+        <w:t xml:space="preserve">evansi</w:t>
+      </w:r>
+      <w:r>
+        <w:t xml:space="preserve"> </w:t>
+      </w:r>
+      <w:r>
+        <w:t xml:space="preserve">and 2 severe-anaemia</w:t>
+      </w:r>
+      <w:r>
+        <w:t xml:space="preserve"> </w:t>
+      </w:r>
+      <w:r>
+        <w:t xml:space="preserve">flags in</w:t>
+      </w:r>
+      <w:r>
+        <w:t xml:space="preserve"> </w:t>
+      </w:r>
+      <w:r>
+        <w:rPr>
+          <w:i/>
+          <w:iCs/>
+        </w:rPr>
+        <w:t xml:space="preserve">A. indica</w:t>
+      </w:r>
+      <w:r>
+        <w:t xml:space="preserve">/</w:t>
+      </w:r>
+      <w:r>
+        <w:rPr>
+          <w:i/>
+          <w:iCs/>
+        </w:rPr>
+        <w:t xml:space="preserve">evansi</w:t>
+      </w:r>
+      <w:r>
+        <w:t xml:space="preserve">. Inference finds no plant or parasite signals</w:t>
+      </w:r>
+      <w:r>
+        <w:t xml:space="preserve"> </w:t>
+      </w:r>
+      <w:r>
+        <w:t xml:space="preserve">in the deltas (</w:t>
       </w:r>
       <w:hyperlink w:anchor="tbl-other">
         <w:r>
@@ -8151,19 +8969,75 @@
         </w:r>
       </w:hyperlink>
       <w:r>
-        <w:t xml:space="preserve">: weight p = 0.31 /</w:t>
-      </w:r>
-      <w:r>
-        <w:t xml:space="preserve"> </w:t>
-      </w:r>
-      <w:r>
-        <w:t xml:space="preserve">0.15; PCV p = 0.74 / 0.95) — efficacy here is parasitological, not confounded</w:t>
-      </w:r>
-      <w:r>
-        <w:t xml:space="preserve"> </w:t>
-      </w:r>
-      <w:r>
-        <w:t xml:space="preserve">by differential toxicity.</w:t>
+        <w:t xml:space="preserve">: weight plant W = 10, exact p = 0.31, HL −0.81</w:t>
+      </w:r>
+      <w:r>
+        <w:t xml:space="preserve"> </w:t>
+      </w:r>
+      <w:r>
+        <w:t xml:space="preserve">[−2.29, 0.44], r = 0; weight parasite W = 7, p = 0.15, HL −1.34</w:t>
+      </w:r>
+      <w:r>
+        <w:t xml:space="preserve"> </w:t>
+      </w:r>
+      <w:r>
+        <w:t xml:space="preserve">[−3.90, 0.29], r = −0.50; PCV plant W = 21, p = 0.74, HL 0.48</w:t>
+      </w:r>
+      <w:r>
+        <w:t xml:space="preserve"> </w:t>
+      </w:r>
+      <w:r>
+        <w:t xml:space="preserve">[−3.70, 4.38], r = 0.25; PCV parasite W = 19, p = 0.95, HL 0.40</w:t>
+      </w:r>
+      <w:r>
+        <w:t xml:space="preserve"> </w:t>
+      </w:r>
+      <w:r>
+        <w:t xml:space="preserve">[−3.62, 3.48], r = 0). Read together — flat trajectories, null delta tests,</w:t>
+      </w:r>
+      <w:r>
+        <w:t xml:space="preserve"> </w:t>
+      </w:r>
+      <w:r>
+        <w:t xml:space="preserve">but flags concentrated in</w:t>
+      </w:r>
+      <w:r>
+        <w:t xml:space="preserve"> </w:t>
+      </w:r>
+      <w:r>
+        <w:rPr>
+          <w:i/>
+          <w:iCs/>
+        </w:rPr>
+        <w:t xml:space="preserve">congolense</w:t>
+      </w:r>
+      <w:r>
+        <w:t xml:space="preserve"> </w:t>
+      </w:r>
+      <w:r>
+        <w:t xml:space="preserve">— efficacy in this study is</w:t>
+      </w:r>
+      <w:r>
+        <w:t xml:space="preserve"> </w:t>
+      </w:r>
+      <w:r>
+        <w:t xml:space="preserve">parasitological rather than confounded by differential toxicity, while</w:t>
+      </w:r>
+      <w:r>
+        <w:t xml:space="preserve"> </w:t>
+      </w:r>
+      <w:r>
+        <w:rPr>
+          <w:i/>
+          <w:iCs/>
+        </w:rPr>
+        <w:t xml:space="preserve">T. congolense</w:t>
+      </w:r>
+      <w:r>
+        <w:t xml:space="preserve"> </w:t>
+      </w:r>
+      <w:r>
+        <w:t xml:space="preserve">remains the more pathogenic organism regardless of extract.</w:t>
       </w:r>
     </w:p>
     <w:tbl>
@@ -10386,7 +11260,113 @@
         <w:t xml:space="preserve"> </w:t>
       </w:r>
       <w:r>
-        <w:t xml:space="preserve">sides of zero in both parasites — some pairs favour</w:t>
+        <w:t xml:space="preserve">sides of zero in both parasites — leaves/</w:t>
+      </w:r>
+      <w:r>
+        <w:rPr>
+          <w:i/>
+          <w:iCs/>
+        </w:rPr>
+        <w:t xml:space="preserve">congolense</w:t>
+      </w:r>
+      <w:r>
+        <w:t xml:space="preserve"> </w:t>
+      </w:r>
+      <w:r>
+        <w:t xml:space="preserve">−21.5 and</w:t>
+      </w:r>
+      <w:r>
+        <w:t xml:space="preserve"> </w:t>
+      </w:r>
+      <w:r>
+        <w:t xml:space="preserve">seeds/</w:t>
+      </w:r>
+      <w:r>
+        <w:rPr>
+          <w:i/>
+          <w:iCs/>
+        </w:rPr>
+        <w:t xml:space="preserve">evansi</w:t>
+      </w:r>
+      <w:r>
+        <w:t xml:space="preserve"> </w:t>
+      </w:r>
+      <w:r>
+        <w:t xml:space="preserve">−19.6 favour</w:t>
+      </w:r>
+      <w:r>
+        <w:t xml:space="preserve"> </w:t>
+      </w:r>
+      <w:r>
+        <w:rPr>
+          <w:i/>
+          <w:iCs/>
+        </w:rPr>
+        <w:t xml:space="preserve">M. oleifera</w:t>
+      </w:r>
+      <w:r>
+        <w:t xml:space="preserve"> </w:t>
+      </w:r>
+      <w:r>
+        <w:t xml:space="preserve">(negative = lower burden under</w:t>
+      </w:r>
+      <w:r>
+        <w:t xml:space="preserve"> </w:t>
+      </w:r>
+      <w:r>
+        <w:rPr>
+          <w:i/>
+          <w:iCs/>
+        </w:rPr>
+        <w:t xml:space="preserve">M. oleifera</w:t>
+      </w:r>
+      <w:r>
+        <w:t xml:space="preserve">), while stem bark/</w:t>
+      </w:r>
+      <w:r>
+        <w:rPr>
+          <w:i/>
+          <w:iCs/>
+        </w:rPr>
+        <w:t xml:space="preserve">evansi</w:t>
+      </w:r>
+      <w:r>
+        <w:t xml:space="preserve"> </w:t>
+      </w:r>
+      <w:r>
+        <w:t xml:space="preserve">+18.1, roots/</w:t>
+      </w:r>
+      <w:r>
+        <w:rPr>
+          <w:i/>
+          <w:iCs/>
+        </w:rPr>
+        <w:t xml:space="preserve">evansi</w:t>
+      </w:r>
+      <w:r>
+        <w:t xml:space="preserve"> </w:t>
+      </w:r>
+      <w:r>
+        <w:t xml:space="preserve">+11.3 and</w:t>
+      </w:r>
+      <w:r>
+        <w:t xml:space="preserve"> </w:t>
+      </w:r>
+      <w:r>
+        <w:t xml:space="preserve">leaves/</w:t>
+      </w:r>
+      <w:r>
+        <w:rPr>
+          <w:i/>
+          <w:iCs/>
+        </w:rPr>
+        <w:t xml:space="preserve">evansi</w:t>
+      </w:r>
+      <w:r>
+        <w:t xml:space="preserve"> </w:t>
+      </w:r>
+      <w:r>
+        <w:t xml:space="preserve">+9.9 favour</w:t>
       </w:r>
       <w:r>
         <w:t xml:space="preserve"> </w:t>
@@ -10399,32 +11379,87 @@
         <w:t xml:space="preserve">A. indica</w:t>
       </w:r>
       <w:r>
-        <w:t xml:space="preserve">, others</w:t>
-      </w:r>
-      <w:r>
-        <w:t xml:space="preserve"> </w:t>
+        <w:t xml:space="preserve">; roots/</w:t>
       </w:r>
       <w:r>
         <w:rPr>
           <w:i/>
           <w:iCs/>
         </w:rPr>
-        <w:t xml:space="preserve">M. oleifera</w:t>
-      </w:r>
-      <w:r>
-        <w:t xml:space="preserve">, with no pattern by part or parasite. Inference confirms the</w:t>
-      </w:r>
-      <w:r>
-        <w:t xml:space="preserve"> </w:t>
-      </w:r>
-      <w:r>
-        <w:t xml:space="preserve">visual: paired W = 14, exact p = 1.0, HL ≈ 0.3 with 95% CI (−14.7, +20.5),</w:t>
-      </w:r>
-      <w:r>
-        <w:t xml:space="preserve"> </w:t>
-      </w:r>
-      <w:r>
-        <w:t xml:space="preserve">rank-biserial −0.14 (</w:t>
+        <w:t xml:space="preserve">congolense</w:t>
+      </w:r>
+      <w:r>
+        <w:t xml:space="preserve"> </w:t>
+      </w:r>
+      <w:r>
+        <w:t xml:space="preserve">(+4.0), stem</w:t>
+      </w:r>
+      <w:r>
+        <w:t xml:space="preserve"> </w:t>
+      </w:r>
+      <w:r>
+        <w:t xml:space="preserve">bark/</w:t>
+      </w:r>
+      <w:r>
+        <w:rPr>
+          <w:i/>
+          <w:iCs/>
+        </w:rPr>
+        <w:t xml:space="preserve">congolense</w:t>
+      </w:r>
+      <w:r>
+        <w:t xml:space="preserve"> </w:t>
+      </w:r>
+      <w:r>
+        <w:t xml:space="preserve">(−3.6) and seeds/</w:t>
+      </w:r>
+      <w:r>
+        <w:rPr>
+          <w:i/>
+          <w:iCs/>
+        </w:rPr>
+        <w:t xml:space="preserve">congolense</w:t>
+      </w:r>
+      <w:r>
+        <w:t xml:space="preserve"> </w:t>
+      </w:r>
+      <w:r>
+        <w:t xml:space="preserve">(exactly 0.0) sit near zero.</w:t>
+      </w:r>
+      <w:r>
+        <w:t xml:space="preserve"> </w:t>
+      </w:r>
+      <w:r>
+        <w:t xml:space="preserve">No pattern by part or parasite emerges, and the scatter (</w:t>
+      </w:r>
+      <w:hyperlink w:anchor="fig-paired">
+        <w:r>
+          <w:rPr>
+            <w:rStyle w:val="Hyperlink"/>
+          </w:rPr>
+          <w:t xml:space="preserve">Figure 13</w:t>
+        </w:r>
+      </w:hyperlink>
+      <w:r>
+        <w:t xml:space="preserve">)</w:t>
+      </w:r>
+      <w:r>
+        <w:t xml:space="preserve"> </w:t>
+      </w:r>
+      <w:r>
+        <w:t xml:space="preserve">straddles identity. Inference confirms the visual: paired W = 14 on seven</w:t>
+      </w:r>
+      <w:r>
+        <w:t xml:space="preserve"> </w:t>
+      </w:r>
+      <w:r>
+        <w:t xml:space="preserve">non-zero differences (one exact tie dropped), exact p = 1.0, HL ≈ 0.3 with</w:t>
+      </w:r>
+      <w:r>
+        <w:t xml:space="preserve"> </w:t>
+      </w:r>
+      <w:r>
+        <w:t xml:space="preserve">95% CI (−14.7, +20.5), rank-biserial −0.14 (</w:t>
       </w:r>
       <w:hyperlink w:anchor="tbl-sup">
         <w:r>
@@ -10435,25 +11470,37 @@
         </w:r>
       </w:hyperlink>
       <w:r>
-        <w:t xml:space="preserve">); the motility cross-check agrees (p = 0.15).</w:t>
-      </w:r>
-      <w:r>
-        <w:t xml:space="preserve"> </w:t>
-      </w:r>
-      <w:r>
-        <w:t xml:space="preserve">With eight pairs the interval spans meaningful effects in both directions,</w:t>
-      </w:r>
-      <w:r>
-        <w:t xml:space="preserve"> </w:t>
-      </w:r>
-      <w:r>
-        <w:t xml:space="preserve">so the data cannot support a superiority claim — the honest conclusion is</w:t>
-      </w:r>
-      <w:r>
-        <w:t xml:space="preserve"> </w:t>
-      </w:r>
-      <w:r>
-        <w:t xml:space="preserve">the null, stated with its interval.</w:t>
+        <w:t xml:space="preserve">); the motility</w:t>
+      </w:r>
+      <w:r>
+        <w:t xml:space="preserve"> </w:t>
+      </w:r>
+      <w:r>
+        <w:t xml:space="preserve">cross-check agrees (W = 29, exact p = 0.15, HL 0.11 [−0.08, 0.24],</w:t>
+      </w:r>
+      <w:r>
+        <w:t xml:space="preserve"> </w:t>
+      </w:r>
+      <w:r>
+        <w:t xml:space="preserve">r = 0.25). With eight pairs the interval spans meaningful effects in both</w:t>
+      </w:r>
+      <w:r>
+        <w:t xml:space="preserve"> </w:t>
+      </w:r>
+      <w:r>
+        <w:t xml:space="preserve">directions, so the data cannot support a superiority claim for either agent</w:t>
+      </w:r>
+      <w:r>
+        <w:t xml:space="preserve"> </w:t>
+      </w:r>
+      <w:r>
+        <w:t xml:space="preserve">— the honest conclusion is the null, stated with its interval rather than</w:t>
+      </w:r>
+      <w:r>
+        <w:t xml:space="preserve"> </w:t>
+      </w:r>
+      <w:r>
+        <w:t xml:space="preserve">as a bare p-value, and it is LOO-stable (sensitivity p-range 0.53–1.0, §6).</w:t>
       </w:r>
     </w:p>
     <w:tbl>
@@ -11063,19 +12110,25 @@
         <w:t xml:space="preserve"> </w:t>
       </w:r>
       <w:r>
-        <w:t xml:space="preserve">most motility contrasts) or dropped zero differences (superiority: one of</w:t>
-      </w:r>
-      <w:r>
-        <w:t xml:space="preserve"> </w:t>
-      </w:r>
-      <w:r>
-        <w:t xml:space="preserve">eight pairs). Because the exact Wilcoxon distribution is invalid with tied</w:t>
-      </w:r>
-      <w:r>
-        <w:t xml:space="preserve"> </w:t>
-      </w:r>
-      <w:r>
-        <w:t xml:space="preserve">ranks, every contrast records</w:t>
+        <w:t xml:space="preserve">most motility contrasts, whose endpoint averages nine binary points) or</w:t>
+      </w:r>
+      <w:r>
+        <w:t xml:space="preserve"> </w:t>
+      </w:r>
+      <w:r>
+        <w:t xml:space="preserve">dropped zero differences (superiority: one of eight pairs; several low-dose</w:t>
+      </w:r>
+      <w:r>
+        <w:t xml:space="preserve"> </w:t>
+      </w:r>
+      <w:r>
+        <w:t xml:space="preserve">motility pairs with n_nonzero as low as 4). Because the exact Wilcoxon</w:t>
+      </w:r>
+      <w:r>
+        <w:t xml:space="preserve"> </w:t>
+      </w:r>
+      <w:r>
+        <w:t xml:space="preserve">distribution is invalid with tied ranks, every contrast records</w:t>
       </w:r>
       <w:r>
         <w:t xml:space="preserve"> </w:t>
@@ -11114,25 +12167,19 @@
         <w:t xml:space="preserve">p_method</w:t>
       </w:r>
       <w:r>
-        <w:t xml:space="preserve">, using</w:t>
-      </w:r>
-      <w:r>
-        <w:t xml:space="preserve"> </w:t>
-      </w:r>
-      <w:r>
-        <w:t xml:space="preserve">exact p-values only when clean and the continuity-corrected normal</w:t>
-      </w:r>
-      <w:r>
-        <w:t xml:space="preserve"> </w:t>
-      </w:r>
-      <w:r>
-        <w:t xml:space="preserve">approximation otherwise — this refit left all conclusions unchanged.</w:t>
-      </w:r>
-      <w:r>
-        <w:t xml:space="preserve"> </w:t>
-      </w:r>
-      <w:r>
-        <w:t xml:space="preserve">Second, paired-difference symmetry (</w:t>
+        <w:t xml:space="preserve">, using exact p-values only when clean and the</w:t>
+      </w:r>
+      <w:r>
+        <w:t xml:space="preserve"> </w:t>
+      </w:r>
+      <w:r>
+        <w:t xml:space="preserve">continuity-corrected normal approximation otherwise — this refit left all</w:t>
+      </w:r>
+      <w:r>
+        <w:t xml:space="preserve"> </w:t>
+      </w:r>
+      <w:r>
+        <w:t xml:space="preserve">conclusions unchanged. Second, paired-difference symmetry (</w:t>
       </w:r>
       <w:hyperlink w:anchor="fig-sym">
         <w:r>
@@ -11159,25 +12206,19 @@
         <w:t xml:space="preserve"> </w:t>
       </w:r>
       <w:r>
-        <w:t xml:space="preserve">differences sit</w:t>
-      </w:r>
-      <w:r>
-        <w:t xml:space="preserve"> </w:t>
-      </w:r>
-      <w:r>
-        <w:t xml:space="preserve">entirely below zero (a location shift, unproblematic); superiority</w:t>
-      </w:r>
-      <w:r>
-        <w:t xml:space="preserve"> </w:t>
-      </w:r>
-      <w:r>
-        <w:t xml:space="preserve">differences spread symmetrically around zero, matching its null. Third,</w:t>
-      </w:r>
-      <w:r>
-        <w:t xml:space="preserve"> </w:t>
-      </w:r>
-      <w:r>
-        <w:t xml:space="preserve">leave-one-block-out sensitivity (</w:t>
+        <w:t xml:space="preserve">differences sit entirely below zero (a location shift,</w:t>
+      </w:r>
+      <w:r>
+        <w:t xml:space="preserve"> </w:t>
+      </w:r>
+      <w:r>
+        <w:t xml:space="preserve">unproblematic); superiority differences spread symmetrically around zero,</w:t>
+      </w:r>
+      <w:r>
+        <w:t xml:space="preserve"> </w:t>
+      </w:r>
+      <w:r>
+        <w:t xml:space="preserve">matching its null. Third, leave-one-block-out sensitivity (</w:t>
       </w:r>
       <w:hyperlink w:anchor="tbl-loo">
         <w:r>
@@ -11188,25 +12229,25 @@
         </w:r>
       </w:hyperlink>
       <w:r>
-        <w:t xml:space="preserve">): no single block flips any</w:t>
-      </w:r>
-      <w:r>
-        <w:t xml:space="preserve"> </w:t>
-      </w:r>
-      <w:r>
-        <w:t xml:space="preserve">conclusion (evansi top doses LOO p = 0.016 throughout; superiority LOO p</w:t>
-      </w:r>
-      <w:r>
-        <w:t xml:space="preserve"> </w:t>
-      </w:r>
-      <w:r>
-        <w:t xml:space="preserve">0.53–1.0). Completeness is enforced structurally at build (row counts and</w:t>
-      </w:r>
-      <w:r>
-        <w:t xml:space="preserve"> </w:t>
-      </w:r>
-      <w:r>
-        <w:t xml:space="preserve">part levels asserted).</w:t>
+        <w:t xml:space="preserve">): no</w:t>
+      </w:r>
+      <w:r>
+        <w:t xml:space="preserve"> </w:t>
+      </w:r>
+      <w:r>
+        <w:t xml:space="preserve">single block flips any conclusion (evansi top doses LOO p = 0.016</w:t>
+      </w:r>
+      <w:r>
+        <w:t xml:space="preserve"> </w:t>
+      </w:r>
+      <w:r>
+        <w:t xml:space="preserve">throughout; superiority LOO p 0.53–1.0). Completeness is enforced</w:t>
+      </w:r>
+      <w:r>
+        <w:t xml:space="preserve"> </w:t>
+      </w:r>
+      <w:r>
+        <w:t xml:space="preserve">structurally at build (row counts and part levels asserted).</w:t>
       </w:r>
     </w:p>
     <w:tbl>
@@ -11907,13 +12948,13 @@
       </w:tr>
     </w:tbl>
     <w:bookmarkEnd w:id="88"/>
-    <w:bookmarkStart w:id="89" w:name="limitations"/>
+    <w:bookmarkStart w:id="89" w:name="discussion"/>
     <w:p>
       <w:pPr>
         <w:pStyle w:val="Heading2"/>
       </w:pPr>
       <w:r>
-        <w:t xml:space="preserve">12 7. Limitations</w:t>
+        <w:t xml:space="preserve">12 7. Discussion</w:t>
       </w:r>
     </w:p>
     <w:p>
@@ -11921,47 +12962,373 @@
         <w:pStyle w:val="FirstParagraph"/>
       </w:pPr>
       <w:r>
-        <w:t xml:space="preserve">Group means of n = 3 mice erase within-group variance, so inference rests on</w:t>
-      </w:r>
-      <w:r>
-        <w:t xml:space="preserve"> </w:t>
-      </w:r>
-      <w:r>
-        <w:t xml:space="preserve">N = 16 blocks — power is low, intervals wide, description carries the</w:t>
-      </w:r>
-      <w:r>
-        <w:t xml:space="preserve"> </w:t>
-      </w:r>
-      <w:r>
-        <w:t xml:space="preserve">weight. Control identities/doses are unknown; Positive Control is a validity</w:t>
-      </w:r>
-      <w:r>
-        <w:t xml:space="preserve"> </w:t>
-      </w:r>
-      <w:r>
-        <w:t xml:space="preserve">reference only. Death-censored AUC flatters early-death groups, hence AUC is</w:t>
-      </w:r>
-      <w:r>
-        <w:t xml:space="preserve"> </w:t>
-      </w:r>
-      <w:r>
-        <w:t xml:space="preserve">always read with mortality. NA = death is conventional, worth confirming</w:t>
-      </w:r>
-      <w:r>
-        <w:t xml:space="preserve"> </w:t>
-      </w:r>
-      <w:r>
-        <w:t xml:space="preserve">against animal records. All results are exploratory, not confirmatory.</w:t>
+        <w:t xml:space="preserve">The three assay layers tell one coherent story. In-vitro, both plants kill in</w:t>
+      </w:r>
+      <w:r>
+        <w:t xml:space="preserve"> </w:t>
+      </w:r>
+      <w:r>
+        <w:t xml:space="preserve">a strictly ordered, concentration-dependent manner (</w:t>
+      </w:r>
+      <w:hyperlink w:anchor="fig-tti">
+        <w:r>
+          <w:rPr>
+            <w:rStyle w:val="Hyperlink"/>
+          </w:rPr>
+          <w:t xml:space="preserve">Figure 3</w:t>
+        </w:r>
+      </w:hyperlink>
+      <w:r>
+        <w:t xml:space="preserve">,</w:t>
+      </w:r>
+      <w:r>
+        <w:t xml:space="preserve"> </w:t>
+      </w:r>
+      <w:hyperlink w:anchor="tbl-mot-dose">
+        <w:r>
+          <w:rPr>
+            <w:rStyle w:val="Hyperlink"/>
+          </w:rPr>
+          <w:t xml:space="preserve">Table 3</w:t>
+        </w:r>
+      </w:hyperlink>
+      <w:r>
+        <w:t xml:space="preserve">);</w:t>
+      </w:r>
+      <w:r>
+        <w:t xml:space="preserve"> </w:t>
+      </w:r>
+      <w:r>
+        <w:t xml:space="preserve">in-vivo, the same ordering reappears in peak parasitaemia (</w:t>
+      </w:r>
+      <w:hyperlink w:anchor="tbl-peak">
+        <w:r>
+          <w:rPr>
+            <w:rStyle w:val="Hyperlink"/>
+          </w:rPr>
+          <w:t xml:space="preserve">Table 5</w:t>
+        </w:r>
+      </w:hyperlink>
+      <w:r>
+        <w:t xml:space="preserve">),</w:t>
+      </w:r>
+      <w:r>
+        <w:t xml:space="preserve"> </w:t>
+      </w:r>
+      <w:r>
+        <w:t xml:space="preserve">mortality (</w:t>
+      </w:r>
+      <w:hyperlink w:anchor="fig-mort">
+        <w:r>
+          <w:rPr>
+            <w:rStyle w:val="Hyperlink"/>
+          </w:rPr>
+          <w:t xml:space="preserve">Figure 6</w:t>
+        </w:r>
+      </w:hyperlink>
+      <w:r>
+        <w:t xml:space="preserve">) and cumulative burden (</w:t>
+      </w:r>
+      <w:hyperlink w:anchor="fig-auc">
+        <w:r>
+          <w:rPr>
+            <w:rStyle w:val="Hyperlink"/>
+          </w:rPr>
+          <w:t xml:space="preserve">Figure 7</w:t>
+        </w:r>
+      </w:hyperlink>
+      <w:r>
+        <w:t xml:space="preserve">), with 100 mg/ml</w:t>
+      </w:r>
+      <w:r>
+        <w:t xml:space="preserve"> </w:t>
+      </w:r>
+      <w:r>
+        <w:t xml:space="preserve">suppressing peaks to zero and eliminating deaths in both parasites. The</w:t>
+      </w:r>
+      <w:r>
+        <w:t xml:space="preserve"> </w:t>
+      </w:r>
+      <w:r>
+        <w:t xml:space="preserve">convergence of motility TTI gradients and AUC gradients is the study’s</w:t>
+      </w:r>
+      <w:r>
+        <w:t xml:space="preserve"> </w:t>
+      </w:r>
+      <w:r>
+        <w:t xml:space="preserve">strongest internal replication: fast kill in the dish predicts low burden in</w:t>
+      </w:r>
+      <w:r>
+        <w:t xml:space="preserve"> </w:t>
+      </w:r>
+      <w:r>
+        <w:t xml:space="preserve">the mouse. Against this consistency stand two nulls. First, the plants are</w:t>
+      </w:r>
+      <w:r>
+        <w:t xml:space="preserve"> </w:t>
+      </w:r>
+      <w:r>
+        <w:t xml:space="preserve">interchangeable: superiority pairs split 4–3 with one exact tie across</w:t>
+      </w:r>
+      <w:r>
+        <w:t xml:space="preserve"> </w:t>
+      </w:r>
+      <w:r>
+        <w:t xml:space="preserve">parasites and parts (</w:t>
+      </w:r>
+      <w:hyperlink w:anchor="fig-forest">
+        <w:r>
+          <w:rPr>
+            <w:rStyle w:val="Hyperlink"/>
+          </w:rPr>
+          <w:t xml:space="preserve">Figure 12</w:t>
+        </w:r>
+      </w:hyperlink>
+      <w:r>
+        <w:t xml:space="preserve">), chemistry overlaps heavily (universal</w:t>
+      </w:r>
+      <w:r>
+        <w:t xml:space="preserve"> </w:t>
+      </w:r>
+      <w:r>
+        <w:t xml:space="preserve">Saponin/Carbohydrates/Tannins, equal leaf richness of 6/12; §5.2), and</w:t>
+      </w:r>
+      <w:r>
+        <w:t xml:space="preserve"> </w:t>
+      </w:r>
+      <w:r>
+        <w:t xml:space="preserve">neither endpoint separates them — so objective v is answered negatively, and</w:t>
+      </w:r>
+      <w:r>
+        <w:t xml:space="preserve"> </w:t>
+      </w:r>
+      <w:r>
+        <w:t xml:space="preserve">the part-specific differentiating compounds (Steroids, Terpenoids and the</w:t>
+      </w:r>
+      <w:r>
+        <w:t xml:space="preserve"> </w:t>
+      </w:r>
+      <w:r>
+        <w:t xml:space="preserve">like) show no efficacy signature at this resolution. Second, weight and PCV</w:t>
+      </w:r>
+      <w:r>
+        <w:t xml:space="preserve"> </w:t>
+      </w:r>
+      <w:r>
+        <w:t xml:space="preserve">carry no treatment signal at all (</w:t>
+      </w:r>
+      <w:hyperlink w:anchor="tbl-other">
+        <w:r>
+          <w:rPr>
+            <w:rStyle w:val="Hyperlink"/>
+          </w:rPr>
+          <w:t xml:space="preserve">Table 9</w:t>
+        </w:r>
+      </w:hyperlink>
+      <w:r>
+        <w:t xml:space="preserve">), which exonerates the</w:t>
+      </w:r>
+      <w:r>
+        <w:t xml:space="preserve"> </w:t>
+      </w:r>
+      <w:r>
+        <w:t xml:space="preserve">parasitaemia findings from toxicity confounding while confirming</w:t>
+      </w:r>
+      <w:r>
+        <w:t xml:space="preserve"> </w:t>
+      </w:r>
+      <w:r>
+        <w:rPr>
+          <w:i/>
+          <w:iCs/>
+        </w:rPr>
+        <w:t xml:space="preserve">T.</w:t>
+      </w:r>
+      <w:r>
+        <w:rPr>
+          <w:i/>
+          <w:iCs/>
+        </w:rPr>
+        <w:t xml:space="preserve"> </w:t>
+      </w:r>
+      <w:r>
+        <w:rPr>
+          <w:i/>
+          <w:iCs/>
+        </w:rPr>
+        <w:t xml:space="preserve">congolense</w:t>
+      </w:r>
+      <w:r>
+        <w:t xml:space="preserve"> </w:t>
+      </w:r>
+      <w:r>
+        <w:t xml:space="preserve">as the more pathogenic parasite (all flag categories concentrate</w:t>
+      </w:r>
+      <w:r>
+        <w:t xml:space="preserve"> </w:t>
+      </w:r>
+      <w:r>
+        <w:t xml:space="preserve">there). The main asymmetry is parasite dose sensitivity:</w:t>
+      </w:r>
+      <w:r>
+        <w:t xml:space="preserve"> </w:t>
+      </w:r>
+      <w:r>
+        <w:rPr>
+          <w:i/>
+          <w:iCs/>
+        </w:rPr>
+        <w:t xml:space="preserve">T. evansi</w:t>
+      </w:r>
+      <w:r>
+        <w:t xml:space="preserve"> </w:t>
+      </w:r>
+      <w:r>
+        <w:t xml:space="preserve">yields</w:t>
+      </w:r>
+      <w:r>
+        <w:t xml:space="preserve"> </w:t>
+      </w:r>
+      <w:r>
+        <w:t xml:space="preserve">to 0.5 mg/ml (Holm 0.039) where</w:t>
+      </w:r>
+      <w:r>
+        <w:t xml:space="preserve"> </w:t>
+      </w:r>
+      <w:r>
+        <w:rPr>
+          <w:i/>
+          <w:iCs/>
+        </w:rPr>
+        <w:t xml:space="preserve">T. congolense</w:t>
+      </w:r>
+      <w:r>
+        <w:t xml:space="preserve"> </w:t>
+      </w:r>
+      <w:r>
+        <w:t xml:space="preserve">responds only at 100 mg/ml</w:t>
+      </w:r>
+      <w:r>
+        <w:t xml:space="preserve"> </w:t>
+      </w:r>
+      <w:r>
+        <w:t xml:space="preserve">and suggestively (Holm 0.071) — yet overall burdens do not differ</w:t>
+      </w:r>
+      <w:r>
+        <w:t xml:space="preserve"> </w:t>
+      </w:r>
+      <w:r>
+        <w:t xml:space="preserve">(p = 0.46), so this is a threshold difference, not a virulence difference.</w:t>
+      </w:r>
+      <w:r>
+        <w:t xml:space="preserve"> </w:t>
+      </w:r>
+      <w:r>
+        <w:t xml:space="preserve">The caveats from §2 and §6 bound every claim: group-mean data, N = 8 per</w:t>
+      </w:r>
+      <w:r>
+        <w:t xml:space="preserve"> </w:t>
+      </w:r>
+      <w:r>
+        <w:t xml:space="preserve">contrast, unknown controls, and death-censored AUCs read strictly alongside</w:t>
+      </w:r>
+      <w:r>
+        <w:t xml:space="preserve"> </w:t>
+      </w:r>
+      <w:r>
+        <w:t xml:space="preserve">mortality. Within those bounds, the supported thesis statement is narrow and</w:t>
+      </w:r>
+      <w:r>
+        <w:t xml:space="preserve"> </w:t>
+      </w:r>
+      <w:r>
+        <w:t xml:space="preserve">firm: both extracts are active in a dose-dependent manner with 100 mg/ml</w:t>
+      </w:r>
+      <w:r>
+        <w:t xml:space="preserve"> </w:t>
+      </w:r>
+      <w:r>
+        <w:t xml:space="preserve">fully suppressive,</w:t>
+      </w:r>
+      <w:r>
+        <w:t xml:space="preserve"> </w:t>
+      </w:r>
+      <w:r>
+        <w:rPr>
+          <w:i/>
+          <w:iCs/>
+        </w:rPr>
+        <w:t xml:space="preserve">T. evansi</w:t>
+      </w:r>
+      <w:r>
+        <w:t xml:space="preserve"> </w:t>
+      </w:r>
+      <w:r>
+        <w:t xml:space="preserve">the more sensitive parasite, and neither</w:t>
+      </w:r>
+      <w:r>
+        <w:t xml:space="preserve"> </w:t>
+      </w:r>
+      <w:r>
+        <w:t xml:space="preserve">plant demonstrably superior.</w:t>
       </w:r>
     </w:p>
     <w:bookmarkEnd w:id="89"/>
-    <w:bookmarkStart w:id="90" w:name="references-methods"/>
+    <w:bookmarkStart w:id="90" w:name="limitations"/>
     <w:p>
       <w:pPr>
         <w:pStyle w:val="Heading2"/>
       </w:pPr>
       <w:r>
-        <w:t xml:space="preserve">13 8. References (methods)</w:t>
+        <w:t xml:space="preserve">13 8. Limitations</w:t>
+      </w:r>
+    </w:p>
+    <w:p>
+      <w:pPr>
+        <w:pStyle w:val="FirstParagraph"/>
+      </w:pPr>
+      <w:r>
+        <w:t xml:space="preserve">Group means of n = 3 mice erase within-group variance, so inference rests on</w:t>
+      </w:r>
+      <w:r>
+        <w:t xml:space="preserve"> </w:t>
+      </w:r>
+      <w:r>
+        <w:t xml:space="preserve">N = 16 blocks — power is low, intervals wide, description carries the</w:t>
+      </w:r>
+      <w:r>
+        <w:t xml:space="preserve"> </w:t>
+      </w:r>
+      <w:r>
+        <w:t xml:space="preserve">weight. Control identities/doses are unknown; Positive Control is a validity</w:t>
+      </w:r>
+      <w:r>
+        <w:t xml:space="preserve"> </w:t>
+      </w:r>
+      <w:r>
+        <w:t xml:space="preserve">reference only. Death-censored AUC flatters early-death groups, hence AUC is</w:t>
+      </w:r>
+      <w:r>
+        <w:t xml:space="preserve"> </w:t>
+      </w:r>
+      <w:r>
+        <w:t xml:space="preserve">always read with mortality. NA = death is conventional, worth confirming</w:t>
+      </w:r>
+      <w:r>
+        <w:t xml:space="preserve"> </w:t>
+      </w:r>
+      <w:r>
+        <w:t xml:space="preserve">against animal records. All results are exploratory, not confirmatory.</w:t>
+      </w:r>
+    </w:p>
+    <w:bookmarkEnd w:id="90"/>
+    <w:bookmarkStart w:id="91" w:name="references-methods"/>
+    <w:p>
+      <w:pPr>
+        <w:pStyle w:val="Heading2"/>
+      </w:pPr>
+      <w:r>
+        <w:t xml:space="preserve">14 9. References (methods)</w:t>
       </w:r>
     </w:p>
     <w:p>
@@ -12200,7 +13567,7 @@
         <w:t xml:space="preserve">84(1): a1412.</w:t>
       </w:r>
     </w:p>
-    <w:bookmarkEnd w:id="90"/>
+    <w:bookmarkEnd w:id="91"/>
     <w:sectPr>
       <w:footnotePr>
         <w:numRestart w:val="eachSect"/>

</xml_diff>

<commit_message>
docs: journal-style rewrite of results + interpretive discussion
Critique-driven rewrite: findings lead with table-cited evidence instead of cell transcription; test mechanics consolidated into methods/diagnostics; neutral academic tone; new Discussion interpreting cross-assay coherence, the in-vitro/in-vivo threshold discordance, Positive Control as benchmark, chemistry-efficacy consistency, and follow-up design.
</commit_message>
<xml_diff>
--- a/analysis/reports/report.docx
+++ b/analysis/reports/report.docx
@@ -178,13 +178,13 @@
         <w:t xml:space="preserve"> </w:t>
       </w:r>
       <w:r>
-        <w:t xml:space="preserve">parasite blocks; group means of n = 3 mice). Both parasites show a clear,</w:t>
-      </w:r>
-      <w:r>
-        <w:t xml:space="preserve"> </w:t>
-      </w:r>
-      <w:r>
-        <w:t xml:space="preserve">monotonic dose response:</w:t>
+        <w:t xml:space="preserve">parasite blocks; group means of n = 3 mice). Both parasites responded in a</w:t>
+      </w:r>
+      <w:r>
+        <w:t xml:space="preserve"> </w:t>
+      </w:r>
+      <w:r>
+        <w:t xml:space="preserve">monotonic, concentration-dependent manner.</w:t>
       </w:r>
       <w:r>
         <w:t xml:space="preserve"> </w:t>
@@ -200,19 +200,19 @@
         <w:t xml:space="preserve"> </w:t>
       </w:r>
       <w:r>
-        <w:t xml:space="preserve">significantly (parasitaemia Friedman</w:t>
-      </w:r>
-      <w:r>
-        <w:t xml:space="preserve"> </w:t>
-      </w:r>
-      <w:r>
-        <w:t xml:space="preserve">p = 0.006; top three doses beat control, Holm 0.039; motility Friedman</w:t>
-      </w:r>
-      <w:r>
-        <w:t xml:space="preserve"> </w:t>
-      </w:r>
-      <w:r>
-        <w:t xml:space="preserve">p &lt; 0.001) and</w:t>
+        <w:t xml:space="preserve">responded</w:t>
+      </w:r>
+      <w:r>
+        <w:t xml:space="preserve"> </w:t>
+      </w:r>
+      <w:r>
+        <w:t xml:space="preserve">significantly (parasitaemia Friedman p = 0.006; 100, 10 and 0.5 mg/ml each</w:t>
+      </w:r>
+      <w:r>
+        <w:t xml:space="preserve"> </w:t>
+      </w:r>
+      <w:r>
+        <w:t xml:space="preserve">superior to control, Holm 0.039);</w:t>
       </w:r>
       <w:r>
         <w:t xml:space="preserve"> </w:t>
@@ -228,53 +228,53 @@
         <w:t xml:space="preserve"> </w:t>
       </w:r>
       <w:r>
-        <w:t xml:space="preserve">suggestively (parasitaemia Friedman p = 0.074;</w:t>
-      </w:r>
-      <w:r>
-        <w:t xml:space="preserve"> </w:t>
-      </w:r>
-      <w:r>
-        <w:t xml:space="preserve">100 mg/ml Holm 0.071; motility Friedman p &lt; 0.001 with post-hocs just above</w:t>
-      </w:r>
-      <w:r>
-        <w:t xml:space="preserve"> </w:t>
-      </w:r>
-      <w:r>
-        <w:t xml:space="preserve">threshold). At 100 mg/ml the mean peak parasitaemia is zero in both parasites</w:t>
-      </w:r>
-      <w:r>
-        <w:t xml:space="preserve"> </w:t>
-      </w:r>
-      <w:r>
-        <w:t xml:space="preserve">with no deaths, against peak LEV 5 and universal mortality in Negative</w:t>
-      </w:r>
-      <w:r>
-        <w:t xml:space="preserve"> </w:t>
-      </w:r>
-      <w:r>
-        <w:t xml:space="preserve">Controls. No evidence separates the two plants (paired p = 1.0, HL 0.3</w:t>
-      </w:r>
-      <w:r>
-        <w:t xml:space="preserve"> </w:t>
-      </w:r>
-      <w:r>
-        <w:t xml:space="preserve">[−14.7, 20.5]). All inference is block-level and rank-based; every headline</w:t>
-      </w:r>
-      <w:r>
-        <w:t xml:space="preserve"> </w:t>
-      </w:r>
-      <w:r>
-        <w:t xml:space="preserve">claim survived leave-one-block-out sensitivity analysis.</w:t>
+        <w:t xml:space="preserve">responded suggestively</w:t>
+      </w:r>
+      <w:r>
+        <w:t xml:space="preserve"> </w:t>
+      </w:r>
+      <w:r>
+        <w:t xml:space="preserve">(Friedman p = 0.074; 100 mg/ml Holm 0.071). At 100 mg/ml, mean peak</w:t>
+      </w:r>
+      <w:r>
+        <w:t xml:space="preserve"> </w:t>
+      </w:r>
+      <w:r>
+        <w:t xml:space="preserve">parasitaemia was zero with no mortality in either parasite, against peak</w:t>
+      </w:r>
+      <w:r>
+        <w:t xml:space="preserve"> </w:t>
+      </w:r>
+      <w:r>
+        <w:t xml:space="preserve">LEV 5 with universal mortality in Negative Controls. The two plants were</w:t>
+      </w:r>
+      <w:r>
+        <w:t xml:space="preserve"> </w:t>
+      </w:r>
+      <w:r>
+        <w:t xml:space="preserve">indistinguishable (paired p = 1.0; HL 0.3, 95% CI −14.7 to 20.5). Inference</w:t>
+      </w:r>
+      <w:r>
+        <w:t xml:space="preserve"> </w:t>
+      </w:r>
+      <w:r>
+        <w:t xml:space="preserve">is block-level and rank-based throughout, and all headline claims withstood</w:t>
+      </w:r>
+      <w:r>
+        <w:t xml:space="preserve"> </w:t>
+      </w:r>
+      <w:r>
+        <w:t xml:space="preserve">leave-one-block-out sensitivity analysis.</w:t>
       </w:r>
     </w:p>
     <w:bookmarkEnd w:id="9"/>
-    <w:bookmarkStart w:id="10" w:name="aim-objectives-and-section-map"/>
+    <w:bookmarkStart w:id="10" w:name="aim-and-structure-of-this-report"/>
     <w:p>
       <w:pPr>
         <w:pStyle w:val="Heading2"/>
       </w:pPr>
       <w:r>
-        <w:t xml:space="preserve">2 1. Aim, objectives and section map</w:t>
+        <w:t xml:space="preserve">2 1. Aim and structure of this report</w:t>
       </w:r>
     </w:p>
     <w:p>
@@ -282,13 +282,13 @@
         <w:pStyle w:val="FirstParagraph"/>
       </w:pPr>
       <w:r>
-        <w:t xml:space="preserve">The aim of this study is to comparatively evaluate the anti-trypanosomal</w:t>
-      </w:r>
-      <w:r>
-        <w:t xml:space="preserve"> </w:t>
-      </w:r>
-      <w:r>
-        <w:t xml:space="preserve">activity of methanolic extracts of the leaves, stem bark, roots and seeds of</w:t>
+        <w:t xml:space="preserve">The aim of the study is to compare the anti-trypanosomal activity of</w:t>
+      </w:r>
+      <w:r>
+        <w:t xml:space="preserve"> </w:t>
+      </w:r>
+      <w:r>
+        <w:t xml:space="preserve">methanolic extracts of</w:t>
       </w:r>
       <w:r>
         <w:t xml:space="preserve"> </w:t>
@@ -298,7 +298,7 @@
           <w:i/>
           <w:iCs/>
         </w:rPr>
-        <w:t xml:space="preserve">Azadirachta indica</w:t>
+        <w:t xml:space="preserve">A. indica</w:t>
       </w:r>
       <w:r>
         <w:t xml:space="preserve"> </w:t>
@@ -314,13 +314,19 @@
           <w:i/>
           <w:iCs/>
         </w:rPr>
-        <w:t xml:space="preserve">Moringa oleifera</w:t>
-      </w:r>
-      <w:r>
-        <w:t xml:space="preserve"> </w:t>
-      </w:r>
-      <w:r>
-        <w:t xml:space="preserve">against</w:t>
+        <w:t xml:space="preserve">M. oleifera</w:t>
+      </w:r>
+      <w:r>
+        <w:t xml:space="preserve"> </w:t>
+      </w:r>
+      <w:r>
+        <w:t xml:space="preserve">(leaves, stem bark,</w:t>
+      </w:r>
+      <w:r>
+        <w:t xml:space="preserve"> </w:t>
+      </w:r>
+      <w:r>
+        <w:t xml:space="preserve">roots, seeds) against</w:t>
       </w:r>
       <w:r>
         <w:t xml:space="preserve"> </w:t>
@@ -330,7 +336,7 @@
           <w:i/>
           <w:iCs/>
         </w:rPr>
-        <w:t xml:space="preserve">Trypanosoma congolense</w:t>
+        <w:t xml:space="preserve">T. congolense</w:t>
       </w:r>
       <w:r>
         <w:t xml:space="preserve"> </w:t>
@@ -352,47 +358,53 @@
         <w:t xml:space="preserve"> </w:t>
       </w:r>
       <w:r>
-        <w:t xml:space="preserve">(thesis §1.8.1). Each specific objective (§1.8.2) is addressed</w:t>
-      </w:r>
-      <w:r>
-        <w:t xml:space="preserve"> </w:t>
-      </w:r>
-      <w:r>
-        <w:t xml:space="preserve">in a dedicated results section — extraction (i) in §5.1, phytochemical</w:t>
-      </w:r>
-      <w:r>
-        <w:t xml:space="preserve"> </w:t>
-      </w:r>
-      <w:r>
-        <w:t xml:space="preserve">characterisation (ii) in §5.2, the motility assay (iii) in §5.3, in-vivo</w:t>
-      </w:r>
-      <w:r>
-        <w:t xml:space="preserve"> </w:t>
-      </w:r>
-      <w:r>
-        <w:t xml:space="preserve">infectivity (iv) in §5.4, superiority (v) in §5.5 — each opening with</w:t>
-      </w:r>
-      <w:r>
-        <w:t xml:space="preserve"> </w:t>
-      </w:r>
-      <w:r>
-        <w:t xml:space="preserve">exploratory description before any inference, and each discussed jointly in</w:t>
-      </w:r>
-      <w:r>
-        <w:t xml:space="preserve"> </w:t>
-      </w:r>
-      <w:r>
-        <w:t xml:space="preserve">§7. Diagnostics, limitations and references follow in §6, §8 and §9.</w:t>
+        <w:t xml:space="preserve">(thesis §1.8.1). This</w:t>
+      </w:r>
+      <w:r>
+        <w:t xml:space="preserve"> </w:t>
+      </w:r>
+      <w:r>
+        <w:t xml:space="preserve">report presents the statistical analysis for specific objectives ii–v</w:t>
+      </w:r>
+      <w:r>
+        <w:t xml:space="preserve"> </w:t>
+      </w:r>
+      <w:r>
+        <w:t xml:space="preserve">(§1.8.2): phytochemical characterisation (§5.2), the in-vitro motility assay</w:t>
+      </w:r>
+      <w:r>
+        <w:t xml:space="preserve"> </w:t>
+      </w:r>
+      <w:r>
+        <w:t xml:space="preserve">(§5.3), in-vivo infectivity (§5.4) and the superiority assessment (§5.5),</w:t>
+      </w:r>
+      <w:r>
+        <w:t xml:space="preserve"> </w:t>
+      </w:r>
+      <w:r>
+        <w:t xml:space="preserve">followed by diagnostics (§6), an integrative discussion (§7) and limitations</w:t>
+      </w:r>
+      <w:r>
+        <w:t xml:space="preserve"> </w:t>
+      </w:r>
+      <w:r>
+        <w:t xml:space="preserve">(§8). Objective i (extraction) is a laboratory procedure without recorded</w:t>
+      </w:r>
+      <w:r>
+        <w:t xml:space="preserve"> </w:t>
+      </w:r>
+      <w:r>
+        <w:t xml:space="preserve">replicates and carries no statistical component (§5.1).</w:t>
       </w:r>
     </w:p>
     <w:bookmarkEnd w:id="10"/>
-    <w:bookmarkStart w:id="11" w:name="data-and-experimental-design"/>
+    <w:bookmarkStart w:id="11" w:name="design-and-analytical-approach"/>
     <w:p>
       <w:pPr>
         <w:pStyle w:val="Heading2"/>
       </w:pPr>
       <w:r>
-        <w:t xml:space="preserve">3 2. Data and experimental design</w:t>
+        <w:t xml:space="preserve">3 2. Design and analytical approach</w:t>
       </w:r>
     </w:p>
     <w:p>
@@ -400,109 +412,61 @@
         <w:pStyle w:val="FirstParagraph"/>
       </w:pPr>
       <w:r>
-        <w:t xml:space="preserve">Source data are group means of n = 3 mice per group, parsed from Sheet 2 of</w:t>
-      </w:r>
-      <w:r>
-        <w:t xml:space="preserve"> </w:t>
-      </w:r>
-      <w:r>
-        <w:t xml:space="preserve">the study workbook into tidy CSVs (</w:t>
-      </w:r>
-      <w:r>
-        <w:rPr>
-          <w:rStyle w:val="VerbatimChar"/>
-        </w:rPr>
-        <w:t xml:space="preserve">analysis/data/</w:t>
-      </w:r>
-      <w:r>
-        <w:t xml:space="preserve">, builder</w:t>
-      </w:r>
-      <w:r>
-        <w:t xml:space="preserve"> </w:t>
-      </w:r>
-      <w:r>
-        <w:rPr>
-          <w:rStyle w:val="VerbatimChar"/>
-        </w:rPr>
-        <w:t xml:space="preserve">analysis/R/01_build_datasets.R</w:t>
-      </w:r>
-      <w:r>
-        <w:t xml:space="preserve">). Within any block each of the 7 groups is</w:t>
-      </w:r>
-      <w:r>
-        <w:t xml:space="preserve"> </w:t>
-      </w:r>
-      <w:r>
-        <w:t xml:space="preserve">therefore n = 1 (descriptive only); the analytical unit is the</w:t>
-      </w:r>
-      <w:r>
-        <w:t xml:space="preserve"> </w:t>
-      </w:r>
-      <w:r>
-        <w:rPr>
-          <w:b/>
-          <w:bCs/>
-        </w:rPr>
-        <w:t xml:space="preserve">block</w:t>
-      </w:r>
-      <w:r>
-        <w:rPr>
-          <w:b/>
-          <w:bCs/>
-        </w:rPr>
-        <w:t xml:space="preserve"> </w:t>
-      </w:r>
-      <w:r>
-        <w:rPr>
-          <w:b/>
-          <w:bCs/>
-        </w:rPr>
-        <w:t xml:space="preserve">(N = 16; 8 per plant, 8 per parasite)</w:t>
-      </w:r>
-      <w:r>
-        <w:t xml:space="preserve">. Plant contrasts pair by part ×</w:t>
-      </w:r>
-      <w:r>
-        <w:t xml:space="preserve"> </w:t>
-      </w:r>
-      <w:r>
-        <w:t xml:space="preserve">parasite (8 pairs); parasite contrasts pair by plant × part (8 pairs).</w:t>
-      </w:r>
-      <w:r>
-        <w:t xml:space="preserve"> </w:t>
-      </w:r>
-      <w:r>
-        <w:t xml:space="preserve">Controls appear as labelled in the source (identities/doses unstated), so the</w:t>
-      </w:r>
-      <w:r>
-        <w:t xml:space="preserve"> </w:t>
-      </w:r>
-      <w:r>
-        <w:t xml:space="preserve">Positive Control is an assay-validity reference only. A consequence of the</w:t>
-      </w:r>
-      <w:r>
-        <w:t xml:space="preserve"> </w:t>
-      </w:r>
-      <w:r>
-        <w:t xml:space="preserve">group-mean design, stressed throughout this report, is that no within-group</w:t>
-      </w:r>
-      <w:r>
-        <w:t xml:space="preserve"> </w:t>
-      </w:r>
-      <w:r>
-        <w:t xml:space="preserve">variance survives: every p-value below is computed over at most eight</w:t>
-      </w:r>
-      <w:r>
-        <w:t xml:space="preserve"> </w:t>
-      </w:r>
-      <w:r>
-        <w:t xml:space="preserve">paired blocks, power is low by construction, and effect sizes with confidence</w:t>
-      </w:r>
-      <w:r>
-        <w:t xml:space="preserve"> </w:t>
-      </w:r>
-      <w:r>
-        <w:t xml:space="preserve">intervals — not significance stars — are the primary read-out.</w:t>
+        <w:t xml:space="preserve">The source data are group means of three mice per group. Consequently, each</w:t>
+      </w:r>
+      <w:r>
+        <w:t xml:space="preserve"> </w:t>
+      </w:r>
+      <w:r>
+        <w:t xml:space="preserve">treatment group within a plant × part × parasite block is a single</w:t>
+      </w:r>
+      <w:r>
+        <w:t xml:space="preserve"> </w:t>
+      </w:r>
+      <w:r>
+        <w:t xml:space="preserve">observation, and the block (N = 16; eight per plant and per parasite) is the</w:t>
+      </w:r>
+      <w:r>
+        <w:t xml:space="preserve"> </w:t>
+      </w:r>
+      <w:r>
+        <w:t xml:space="preserve">unit of analysis. Plant effects are estimated from eight part × parasite</w:t>
+      </w:r>
+      <w:r>
+        <w:t xml:space="preserve"> </w:t>
+      </w:r>
+      <w:r>
+        <w:t xml:space="preserve">pairs; parasite effects from eight plant × part pairs. Controls are reported</w:t>
+      </w:r>
+      <w:r>
+        <w:t xml:space="preserve"> </w:t>
+      </w:r>
+      <w:r>
+        <w:t xml:space="preserve">as labelled in the source, their identities and doses being unstated, so the</w:t>
+      </w:r>
+      <w:r>
+        <w:t xml:space="preserve"> </w:t>
+      </w:r>
+      <w:r>
+        <w:t xml:space="preserve">Positive Control functions as an assay-validity reference rather than a</w:t>
+      </w:r>
+      <w:r>
+        <w:t xml:space="preserve"> </w:t>
+      </w:r>
+      <w:r>
+        <w:t xml:space="preserve">comparator. With at most eight pairs per test, the design has low power by</w:t>
+      </w:r>
+      <w:r>
+        <w:t xml:space="preserve"> </w:t>
+      </w:r>
+      <w:r>
+        <w:t xml:space="preserve">construction; effect sizes with confidence intervals are therefore reported</w:t>
+      </w:r>
+      <w:r>
+        <w:t xml:space="preserve"> </w:t>
+      </w:r>
+      <w:r>
+        <w:t xml:space="preserve">throughout and p-values treated as supplementary.</w:t>
       </w:r>
     </w:p>
     <w:bookmarkEnd w:id="11"/>
@@ -520,41 +484,37 @@
         <w:pStyle w:val="FirstParagraph"/>
       </w:pPr>
       <w:r>
-        <w:t xml:space="preserve">Parasitaemia (LEV 0–5 ordinal): primary</w:t>
-      </w:r>
-      <w:r>
-        <w:t xml:space="preserve"> </w:t>
-      </w:r>
-      <w:r>
-        <w:rPr>
-          <w:b/>
-          <w:bCs/>
-        </w:rPr>
-        <w:t xml:space="preserve">AUC</w:t>
-      </w:r>
-      <w:r>
-        <w:t xml:space="preserve"> </w:t>
-      </w:r>
-      <w:r>
-        <w:t xml:space="preserve">(death-censored trapezoid,</w:t>
-      </w:r>
-      <w:r>
-        <w:t xml:space="preserve"> </w:t>
-      </w:r>
-      <w:r>
-        <w:t xml:space="preserve">always with mortality), supported by peak LEV, clearance day and day-40</w:t>
-      </w:r>
-      <w:r>
-        <w:t xml:space="preserve"> </w:t>
-      </w:r>
-      <w:r>
-        <w:t xml:space="preserve">status — day-40 alone is degenerate (0/112 positive; positivity peaks ~30%</w:t>
-      </w:r>
-      <w:r>
-        <w:t xml:space="preserve"> </w:t>
-      </w:r>
-      <w:r>
-        <w:t xml:space="preserve">at days 9–14). Motility: TTI, t120, mean proportion motile (key:</w:t>
+        <w:t xml:space="preserve">The primary parasitaemia endpoint is the death-censored AUC (trapezoidal sum</w:t>
+      </w:r>
+      <w:r>
+        <w:t xml:space="preserve"> </w:t>
+      </w:r>
+      <w:r>
+        <w:t xml:space="preserve">over observed days), interpreted strictly alongside mortality; peak LEV,</w:t>
+      </w:r>
+      <w:r>
+        <w:t xml:space="preserve"> </w:t>
+      </w:r>
+      <w:r>
+        <w:t xml:space="preserve">clearance day and day-40 status are supporting. Day-40 LEV alone is</w:t>
+      </w:r>
+      <w:r>
+        <w:t xml:space="preserve"> </w:t>
+      </w:r>
+      <w:r>
+        <w:t xml:space="preserve">uninformative (no group positive at day 40 against ~30% positivity at days</w:t>
+      </w:r>
+      <w:r>
+        <w:t xml:space="preserve"> </w:t>
+      </w:r>
+      <w:r>
+        <w:t xml:space="preserve">9–14). Motility is summarised as time-to-immobilisation, t120 motility and</w:t>
+      </w:r>
+      <w:r>
+        <w:t xml:space="preserve"> </w:t>
+      </w:r>
+      <w:r>
+        <w:t xml:space="preserve">mean proportion motile (source key:</w:t>
       </w:r>
       <w:r>
         <w:t xml:space="preserve"> </w:t>
@@ -578,7 +538,7 @@
         <w:t xml:space="preserve">− No motility</w:t>
       </w:r>
       <w:r>
-        <w:t xml:space="preserve">;</w:t>
+        <w:t xml:space="preserve">; the two</w:t>
       </w:r>
       <w:r>
         <w:t xml:space="preserve"> </w:t>
@@ -593,46 +553,31 @@
         <w:t xml:space="preserve"> </w:t>
       </w:r>
       <w:r>
-        <w:t xml:space="preserve">→ NA, 2 cells). Weight/PCV: Δ = Post − Pre with</w:t>
-      </w:r>
-      <w:r>
-        <w:t xml:space="preserve"> </w:t>
-      </w:r>
-      <w:r>
-        <w:t xml:space="preserve">literature flags (anaemia: Post &lt; 35% or ≥ 25% drop, severe &lt; 30%/≥ 40%;</w:t>
-      </w:r>
-      <w:r>
-        <w:t xml:space="preserve"> </w:t>
-      </w:r>
-      <w:r>
-        <w:t xml:space="preserve">weight signal ≥ 10% loss, severe ≥ 20%). Raw LEV &gt; 5 (42 cells) capped to 5</w:t>
-      </w:r>
-      <w:r>
-        <w:t xml:space="preserve"> </w:t>
-      </w:r>
-      <w:r>
-        <w:t xml:space="preserve">with</w:t>
-      </w:r>
-      <w:r>
-        <w:t xml:space="preserve"> </w:t>
-      </w:r>
-      <w:r>
-        <w:rPr>
-          <w:rStyle w:val="VerbatimChar"/>
-        </w:rPr>
-        <w:t xml:space="preserve">lev_raw</w:t>
-      </w:r>
-      <w:r>
-        <w:t xml:space="preserve"> </w:t>
-      </w:r>
-      <w:r>
-        <w:t xml:space="preserve">preserved and flagged. Missing in-vivo values = death</w:t>
-      </w:r>
-      <w:r>
-        <w:t xml:space="preserve"> </w:t>
-      </w:r>
-      <w:r>
-        <w:t xml:space="preserve">(adopted convention, never imputed).</w:t>
+        <w:t xml:space="preserve">cells set to NA). Weight and PCV enter as Post-minus-Pre differences</w:t>
+      </w:r>
+      <w:r>
+        <w:t xml:space="preserve"> </w:t>
+      </w:r>
+      <w:r>
+        <w:t xml:space="preserve">with literature-based anaemia and weight-loss flags. LEV readings above the</w:t>
+      </w:r>
+      <w:r>
+        <w:t xml:space="preserve"> </w:t>
+      </w:r>
+      <w:r>
+        <w:t xml:space="preserve">0–5 scale (42 cells) were capped at 5 with raw values preserved and flagged;</w:t>
+      </w:r>
+      <w:r>
+        <w:t xml:space="preserve"> </w:t>
+      </w:r>
+      <w:r>
+        <w:t xml:space="preserve">missing in-vivo values were taken as deaths (an adopted convention, never</w:t>
+      </w:r>
+      <w:r>
+        <w:t xml:space="preserve"> </w:t>
+      </w:r>
+      <w:r>
+        <w:t xml:space="preserve">imputed).</w:t>
       </w:r>
     </w:p>
     <w:bookmarkEnd w:id="12"/>
@@ -650,67 +595,67 @@
         <w:pStyle w:val="FirstParagraph"/>
       </w:pPr>
       <w:r>
-        <w:t xml:space="preserve">Description first (trajectories, endpoint tables, flags), then rank-based</w:t>
-      </w:r>
-      <w:r>
-        <w:t xml:space="preserve"> </w:t>
-      </w:r>
-      <w:r>
-        <w:t xml:space="preserve">inference: Friedman blocked by block for dose trends with pooled Spearman ρ</w:t>
-      </w:r>
-      <w:r>
-        <w:t xml:space="preserve"> </w:t>
-      </w:r>
-      <w:r>
-        <w:t xml:space="preserve">on log10 dose; paired Wilcoxon signed-rank (exact when tie-free, otherwise</w:t>
-      </w:r>
-      <w:r>
-        <w:t xml:space="preserve"> </w:t>
-      </w:r>
-      <w:r>
-        <w:t xml:space="preserve">the continuity-corrected normal approximation — §6) for dose-vs-control</w:t>
-      </w:r>
-      <w:r>
-        <w:t xml:space="preserve"> </w:t>
-      </w:r>
-      <w:r>
-        <w:t xml:space="preserve">post-hocs and plant/parasite contrasts, with matched-pairs rank-biserial</w:t>
-      </w:r>
-      <w:r>
-        <w:t xml:space="preserve"> </w:t>
-      </w:r>
-      <w:r>
-        <w:t xml:space="preserve">effect size (|r| ≥ 0.11/0.28/0.43) and Hodges–Lehmann median difference with</w:t>
-      </w:r>
-      <w:r>
-        <w:t xml:space="preserve"> </w:t>
-      </w:r>
-      <w:r>
-        <w:t xml:space="preserve">95% CI. Dose-vs-control families are Holm-adjusted per parasite; plant and</w:t>
-      </w:r>
-      <w:r>
-        <w:t xml:space="preserve"> </w:t>
-      </w:r>
-      <w:r>
-        <w:t xml:space="preserve">parasite questions are independent and uncorrected across questions.</w:t>
-      </w:r>
-      <w:r>
-        <w:t xml:space="preserve"> </w:t>
-      </w:r>
-      <w:r>
-        <w:t xml:space="preserve">Per-block trend tests at n = 1 lack power, so only the blocked Friedman is</w:t>
-      </w:r>
-      <w:r>
-        <w:t xml:space="preserve"> </w:t>
-      </w:r>
-      <w:r>
-        <w:t xml:space="preserve">inferential. Significance p &lt; 0.05, p-values supplementary to effects.</w:t>
-      </w:r>
-      <w:r>
-        <w:t xml:space="preserve"> </w:t>
-      </w:r>
-      <w:r>
-        <w:t xml:space="preserve">Script:</w:t>
+        <w:t xml:space="preserve">All inference is rank-based: Friedman tests blocked by block for ordered dose</w:t>
+      </w:r>
+      <w:r>
+        <w:t xml:space="preserve"> </w:t>
+      </w:r>
+      <w:r>
+        <w:t xml:space="preserve">trends with pooled Spearman correlations on log10 dose, and paired Wilcoxon</w:t>
+      </w:r>
+      <w:r>
+        <w:t xml:space="preserve"> </w:t>
+      </w:r>
+      <w:r>
+        <w:t xml:space="preserve">signed-rank tests for dose-versus-control post-hoc families (Holm-adjusted</w:t>
+      </w:r>
+      <w:r>
+        <w:t xml:space="preserve"> </w:t>
+      </w:r>
+      <w:r>
+        <w:t xml:space="preserve">per parasite) and for plant and parasite contrasts, each accompanied by the</w:t>
+      </w:r>
+      <w:r>
+        <w:t xml:space="preserve"> </w:t>
+      </w:r>
+      <w:r>
+        <w:t xml:space="preserve">matched-pairs rank-biserial effect (|r| ≥ 0.11/0.28/0.43 as small/medium/</w:t>
+      </w:r>
+      <w:r>
+        <w:t xml:space="preserve"> </w:t>
+      </w:r>
+      <w:r>
+        <w:t xml:space="preserve">large) and the Hodges–Lehmann median difference with 95% confidence</w:t>
+      </w:r>
+      <w:r>
+        <w:t xml:space="preserve"> </w:t>
+      </w:r>
+      <w:r>
+        <w:t xml:space="preserve">interval. Exact p-values are used wherever the data permit; where tied ranks</w:t>
+      </w:r>
+      <w:r>
+        <w:t xml:space="preserve"> </w:t>
+      </w:r>
+      <w:r>
+        <w:t xml:space="preserve">or zero differences occur, the continuity-corrected normal approximation is</w:t>
+      </w:r>
+      <w:r>
+        <w:t xml:space="preserve"> </w:t>
+      </w:r>
+      <w:r>
+        <w:t xml:space="preserve">substituted and the substitution recorded per contrast (§6). Per-block trend</w:t>
+      </w:r>
+      <w:r>
+        <w:t xml:space="preserve"> </w:t>
+      </w:r>
+      <w:r>
+        <w:t xml:space="preserve">tests at n = 1 lack power, so only the blocked tests are inferential.</w:t>
+      </w:r>
+      <w:r>
+        <w:t xml:space="preserve"> </w:t>
+      </w:r>
+      <w:r>
+        <w:t xml:space="preserve">Computations are in</w:t>
       </w:r>
       <w:r>
         <w:t xml:space="preserve"> </w:t>
@@ -722,10 +667,7 @@
         <w:t xml:space="preserve">analysis/R/02_analysis.R</w:t>
       </w:r>
       <w:r>
-        <w:t xml:space="preserve"> </w:t>
-      </w:r>
-      <w:r>
-        <w:t xml:space="preserve">(statistics only, no ML).</w:t>
+        <w:t xml:space="preserve">; no machine learning was used.</w:t>
       </w:r>
     </w:p>
     <w:bookmarkEnd w:id="13"/>
@@ -743,25 +685,13 @@
         <w:pStyle w:val="FirstParagraph"/>
       </w:pPr>
       <w:r>
-        <w:t xml:space="preserve">Objective i is a laboratory procedure with no statistical component — no</w:t>
-      </w:r>
-      <w:r>
-        <w:t xml:space="preserve"> </w:t>
-      </w:r>
-      <w:r>
-        <w:t xml:space="preserve">yields or replicates are recorded — so there is nothing to estimate or test.</w:t>
-      </w:r>
-      <w:r>
-        <w:t xml:space="preserve"> </w:t>
-      </w:r>
-      <w:r>
-        <w:t xml:space="preserve">It is noted here solely to keep the objective map complete; the statistical</w:t>
-      </w:r>
-      <w:r>
-        <w:t xml:space="preserve"> </w:t>
-      </w:r>
-      <w:r>
-        <w:t xml:space="preserve">story begins with the characterised extracts.</w:t>
+        <w:t xml:space="preserve">No yields or replicates were recorded for the extraction step, so objective i</w:t>
+      </w:r>
+      <w:r>
+        <w:t xml:space="preserve"> </w:t>
+      </w:r>
+      <w:r>
+        <w:t xml:space="preserve">contributes no data to the analysis and is noted here only for completeness.</w:t>
       </w:r>
     </w:p>
     <w:bookmarkEnd w:id="14"/>
@@ -779,54 +709,28 @@
         <w:pStyle w:val="FirstParagraph"/>
       </w:pPr>
       <w:r>
-        <w:t xml:space="preserve">Exploration first. Screening recovered 8 of the 12 assayed classes in at</w:t>
-      </w:r>
-      <w:r>
-        <w:t xml:space="preserve"> </w:t>
-      </w:r>
-      <w:r>
-        <w:t xml:space="preserve">least one extract, with richness concentrated in leaves (6 of 12 in both</w:t>
-      </w:r>
-      <w:r>
-        <w:t xml:space="preserve"> </w:t>
-      </w:r>
-      <w:r>
-        <w:t xml:space="preserve">plants) and lowest in stem bark (</w:t>
-      </w:r>
-      <w:r>
-        <w:rPr>
-          <w:i/>
-          <w:iCs/>
-        </w:rPr>
-        <w:t xml:space="preserve">A. indica</w:t>
-      </w:r>
-      <w:r>
-        <w:t xml:space="preserve"> </w:t>
-      </w:r>
-      <w:r>
-        <w:t xml:space="preserve">3,</w:t>
-      </w:r>
-      <w:r>
-        <w:t xml:space="preserve"> </w:t>
-      </w:r>
-      <w:r>
-        <w:rPr>
-          <w:i/>
-          <w:iCs/>
-        </w:rPr>
-        <w:t xml:space="preserve">M. oleifera</w:t>
-      </w:r>
-      <w:r>
-        <w:t xml:space="preserve"> </w:t>
-      </w:r>
-      <w:r>
-        <w:t xml:space="preserve">4) and roots</w:t>
-      </w:r>
-      <w:r>
-        <w:t xml:space="preserve"> </w:t>
-      </w:r>
-      <w:r>
-        <w:t xml:space="preserve">(3 and 4); seeds sit in between (5 and 4) (</w:t>
+        <w:t xml:space="preserve">The screening panel resolved eight of twelve compound classes in at least one</w:t>
+      </w:r>
+      <w:r>
+        <w:t xml:space="preserve"> </w:t>
+      </w:r>
+      <w:r>
+        <w:t xml:space="preserve">extract, distributed along a part axis rather than a plant axis. Leaves were</w:t>
+      </w:r>
+      <w:r>
+        <w:t xml:space="preserve"> </w:t>
+      </w:r>
+      <w:r>
+        <w:t xml:space="preserve">the richest fraction in both species (6 of 12 classes each), stem bark and</w:t>
+      </w:r>
+      <w:r>
+        <w:t xml:space="preserve"> </w:t>
+      </w:r>
+      <w:r>
+        <w:t xml:space="preserve">roots the sparsest (3–4), and seeds intermediate (4–5;</w:t>
+      </w:r>
+      <w:r>
+        <w:t xml:space="preserve"> </w:t>
       </w:r>
       <w:hyperlink w:anchor="tbl-phyto">
         <w:r>
@@ -837,7 +741,7 @@
         </w:r>
       </w:hyperlink>
       <w:r>
-        <w:t xml:space="preserve">;</w:t>
+        <w:t xml:space="preserve">,</w:t>
       </w:r>
       <w:r>
         <w:t xml:space="preserve"> </w:t>
@@ -851,179 +755,31 @@
         </w:r>
       </w:hyperlink>
       <w:r>
-        <w:t xml:space="preserve">). Two</w:t>
-      </w:r>
-      <w:r>
-        <w:t xml:space="preserve"> </w:t>
-      </w:r>
-      <w:r>
-        <w:t xml:space="preserve">classes are universal — Saponin and Carbohydrates appear in all eight</w:t>
-      </w:r>
-      <w:r>
-        <w:t xml:space="preserve"> </w:t>
-      </w:r>
-      <w:r>
-        <w:t xml:space="preserve">plant × part combinations — and four are absent everywhere (Anthraquinone,</w:t>
-      </w:r>
-      <w:r>
-        <w:t xml:space="preserve"> </w:t>
-      </w:r>
-      <w:r>
-        <w:t xml:space="preserve">Phlobatanins, Oxalates, Phytates), so neither group discriminates the</w:t>
-      </w:r>
-      <w:r>
-        <w:t xml:space="preserve"> </w:t>
-      </w:r>
-      <w:r>
-        <w:t xml:space="preserve">plants. Tannins follow a striking part pattern, present everywhere except</w:t>
-      </w:r>
-      <w:r>
-        <w:t xml:space="preserve"> </w:t>
-      </w:r>
-      <w:r>
-        <w:t xml:space="preserve">seeds in both plants. The differentiating classes are few and part-specific:</w:t>
-      </w:r>
-      <w:r>
-        <w:t xml:space="preserve"> </w:t>
-      </w:r>
-      <w:r>
-        <w:t xml:space="preserve">Steroids occur only in</w:t>
-      </w:r>
-      <w:r>
-        <w:t xml:space="preserve"> </w:t>
-      </w:r>
-      <w:r>
-        <w:rPr>
-          <w:i/>
-          <w:iCs/>
-        </w:rPr>
-        <w:t xml:space="preserve">A. indica</w:t>
-      </w:r>
-      <w:r>
-        <w:t xml:space="preserve"> </w:t>
-      </w:r>
-      <w:r>
-        <w:t xml:space="preserve">leaves and seeds; Alkaloids in</w:t>
-      </w:r>
-      <w:r>
-        <w:t xml:space="preserve"> </w:t>
-      </w:r>
-      <w:r>
-        <w:rPr>
-          <w:i/>
-          <w:iCs/>
-        </w:rPr>
-        <w:t xml:space="preserve">M.</w:t>
-      </w:r>
-      <w:r>
-        <w:rPr>
-          <w:i/>
-          <w:iCs/>
-        </w:rPr>
-        <w:t xml:space="preserve"> </w:t>
-      </w:r>
-      <w:r>
-        <w:rPr>
-          <w:i/>
-          <w:iCs/>
-        </w:rPr>
-        <w:t xml:space="preserve">oleifera</w:t>
-      </w:r>
-      <w:r>
-        <w:t xml:space="preserve"> </w:t>
-      </w:r>
-      <w:r>
-        <w:t xml:space="preserve">leaves and roots plus</w:t>
-      </w:r>
-      <w:r>
-        <w:t xml:space="preserve"> </w:t>
-      </w:r>
-      <w:r>
-        <w:rPr>
-          <w:i/>
-          <w:iCs/>
-        </w:rPr>
-        <w:t xml:space="preserve">A. indica</w:t>
-      </w:r>
-      <w:r>
-        <w:t xml:space="preserve"> </w:t>
-      </w:r>
-      <w:r>
-        <w:t xml:space="preserve">leaves; Terpenoids solely in</w:t>
-      </w:r>
-      <w:r>
-        <w:t xml:space="preserve"> </w:t>
-      </w:r>
-      <w:r>
-        <w:rPr>
-          <w:i/>
-          <w:iCs/>
-        </w:rPr>
-        <w:t xml:space="preserve">M.</w:t>
-      </w:r>
-      <w:r>
-        <w:rPr>
-          <w:i/>
-          <w:iCs/>
-        </w:rPr>
-        <w:t xml:space="preserve"> </w:t>
-      </w:r>
-      <w:r>
-        <w:rPr>
-          <w:i/>
-          <w:iCs/>
-        </w:rPr>
-        <w:t xml:space="preserve">oleifera</w:t>
-      </w:r>
-      <w:r>
-        <w:t xml:space="preserve"> </w:t>
-      </w:r>
-      <w:r>
-        <w:t xml:space="preserve">stem bark; Flavonoids in the leaves and seeds of both plants; and</w:t>
-      </w:r>
-      <w:r>
-        <w:t xml:space="preserve"> </w:t>
-      </w:r>
-      <w:r>
-        <w:t xml:space="preserve">Glucosides in</w:t>
-      </w:r>
-      <w:r>
-        <w:t xml:space="preserve"> </w:t>
-      </w:r>
-      <w:r>
-        <w:rPr>
-          <w:i/>
-          <w:iCs/>
-        </w:rPr>
-        <w:t xml:space="preserve">M. oleifera</w:t>
-      </w:r>
-      <w:r>
-        <w:t xml:space="preserve"> </w:t>
-      </w:r>
-      <w:r>
-        <w:t xml:space="preserve">leaves and seeds but only</w:t>
-      </w:r>
-      <w:r>
-        <w:t xml:space="preserve"> </w:t>
-      </w:r>
-      <w:r>
-        <w:rPr>
-          <w:i/>
-          <w:iCs/>
-        </w:rPr>
-        <w:t xml:space="preserve">A. indica</w:t>
-      </w:r>
-      <w:r>
-        <w:t xml:space="preserve"> </w:t>
-      </w:r>
-      <w:r>
-        <w:t xml:space="preserve">seeds</w:t>
-      </w:r>
-      <w:r>
-        <w:t xml:space="preserve"> </w:t>
-      </w:r>
-      <w:r>
-        <w:t xml:space="preserve">(</w:t>
+        <w:t xml:space="preserve">).</w:t>
+      </w:r>
+      <w:r>
+        <w:t xml:space="preserve"> </w:t>
+      </w:r>
+      <w:r>
+        <w:t xml:space="preserve">Saponins and carbohydrates were ubiquitous (8 of 8 combinations) while</w:t>
+      </w:r>
+      <w:r>
+        <w:t xml:space="preserve"> </w:t>
+      </w:r>
+      <w:r>
+        <w:t xml:space="preserve">anthraquinones, phlobatannins, oxalates and phytates were uniformly absent,</w:t>
+      </w:r>
+      <w:r>
+        <w:t xml:space="preserve"> </w:t>
+      </w:r>
+      <w:r>
+        <w:t xml:space="preserve">so neither group discriminates the plants; tannins showed the sharpest part</w:t>
+      </w:r>
+      <w:r>
+        <w:t xml:space="preserve"> </w:t>
+      </w:r>
+      <w:r>
+        <w:t xml:space="preserve">pattern, present everywhere except seeds in both species (</w:t>
       </w:r>
       <w:hyperlink w:anchor="fig-phyto-hm">
         <w:r>
@@ -1034,7 +790,19 @@
         </w:r>
       </w:hyperlink>
       <w:r>
-        <w:t xml:space="preserve">). Concretely,</w:t>
+        <w:t xml:space="preserve">). The</w:t>
+      </w:r>
+      <w:r>
+        <w:t xml:space="preserve"> </w:t>
+      </w:r>
+      <w:r>
+        <w:t xml:space="preserve">few differentiating classes were part-specific rather than species-specific:</w:t>
+      </w:r>
+      <w:r>
+        <w:t xml:space="preserve"> </w:t>
+      </w:r>
+      <w:r>
+        <w:t xml:space="preserve">steroids (only</w:t>
       </w:r>
       <w:r>
         <w:t xml:space="preserve"> </w:t>
@@ -1050,13 +818,7 @@
         <w:t xml:space="preserve"> </w:t>
       </w:r>
       <w:r>
-        <w:t xml:space="preserve">leaves carry Saponin, Steroid,</w:t>
-      </w:r>
-      <w:r>
-        <w:t xml:space="preserve"> </w:t>
-      </w:r>
-      <w:r>
-        <w:t xml:space="preserve">Alkaloid, Flavonoid, Tannins and Carbohydrates, while</w:t>
+        <w:t xml:space="preserve">leaves and seeds), terpenoids (only</w:t>
       </w:r>
       <w:r>
         <w:t xml:space="preserve"> </w:t>
@@ -1072,70 +834,43 @@
         <w:t xml:space="preserve"> </w:t>
       </w:r>
       <w:r>
-        <w:t xml:space="preserve">leaves</w:t>
-      </w:r>
-      <w:r>
-        <w:t xml:space="preserve"> </w:t>
-      </w:r>
-      <w:r>
-        <w:t xml:space="preserve">carry Saponin, Alkaloid, Flavonoid, Glucosides, Tannins and Carbohydrates —</w:t>
-      </w:r>
-      <w:r>
-        <w:t xml:space="preserve"> </w:t>
-      </w:r>
-      <w:r>
-        <w:t xml:space="preserve">the same richness (6/12) with Steroid/Glucosides swapped. With only eight</w:t>
-      </w:r>
-      <w:r>
-        <w:t xml:space="preserve"> </w:t>
-      </w:r>
-      <w:r>
-        <w:t xml:space="preserve">plant × part combinations no test has power, so inference stops here: the</w:t>
-      </w:r>
-      <w:r>
-        <w:t xml:space="preserve"> </w:t>
-      </w:r>
-      <w:r>
-        <w:t xml:space="preserve">matrix is the result, and compound–efficacy overlays are tabulated</w:t>
-      </w:r>
-      <w:r>
-        <w:t xml:space="preserve"> </w:t>
-      </w:r>
-      <w:r>
-        <w:t xml:space="preserve">exploratorily without tests (</w:t>
-      </w:r>
-      <w:r>
-        <w:rPr>
-          <w:rStyle w:val="VerbatimChar"/>
-        </w:rPr>
-        <w:t xml:space="preserve">phytochemical_efficacy_overlay.csv</w:t>
-      </w:r>
-      <w:r>
-        <w:t xml:space="preserve">). The</w:t>
-      </w:r>
-      <w:r>
-        <w:t xml:space="preserve"> </w:t>
-      </w:r>
-      <w:r>
-        <w:t xml:space="preserve">relevance for §7 is that the two plants’ chemical arsenals overlap heavily</w:t>
-      </w:r>
-      <w:r>
-        <w:t xml:space="preserve"> </w:t>
-      </w:r>
-      <w:r>
-        <w:t xml:space="preserve">(universal Saponin/Carbohydrates/Tannins), which foreshadows the null</w:t>
-      </w:r>
-      <w:r>
-        <w:t xml:space="preserve"> </w:t>
-      </w:r>
-      <w:r>
-        <w:t xml:space="preserve">superiority finding — but with n = 8 this remains a consistency observation,</w:t>
-      </w:r>
-      <w:r>
-        <w:t xml:space="preserve"> </w:t>
-      </w:r>
-      <w:r>
-        <w:t xml:space="preserve">not a tested mediation.</w:t>
+        <w:t xml:space="preserve">stem bark), alkaloids, flavonoids and glucosides in asymmetric but</w:t>
+      </w:r>
+      <w:r>
+        <w:t xml:space="preserve"> </w:t>
+      </w:r>
+      <w:r>
+        <w:t xml:space="preserve">overlapping distributions — e.g. the two leaf profiles share six classes</w:t>
+      </w:r>
+      <w:r>
+        <w:t xml:space="preserve"> </w:t>
+      </w:r>
+      <w:r>
+        <w:t xml:space="preserve">apiece with only the steroid/glucoside entries swapped. With eight</w:t>
+      </w:r>
+      <w:r>
+        <w:t xml:space="preserve"> </w:t>
+      </w:r>
+      <w:r>
+        <w:t xml:space="preserve">combinations, these data admit description only; compound–efficacy overlays</w:t>
+      </w:r>
+      <w:r>
+        <w:t xml:space="preserve"> </w:t>
+      </w:r>
+      <w:r>
+        <w:t xml:space="preserve">are tabulated without tests. The substantive point for §7 is the extent of</w:t>
+      </w:r>
+      <w:r>
+        <w:t xml:space="preserve"> </w:t>
+      </w:r>
+      <w:r>
+        <w:t xml:space="preserve">chemical overlap between the species, which leaves little phytochemical basis</w:t>
+      </w:r>
+      <w:r>
+        <w:t xml:space="preserve"> </w:t>
+      </w:r>
+      <w:r>
+        <w:t xml:space="preserve">for expecting divergent efficacy.</w:t>
       </w:r>
     </w:p>
     <w:tbl>
@@ -1847,13 +1582,13 @@
       </w:tr>
     </w:tbl>
     <w:bookmarkEnd w:id="24"/>
-    <w:bookmarkStart w:id="36" w:name="X6aa15a9a3061acaa265f726b06ec49122a5cdd2"/>
+    <w:bookmarkStart w:id="36" w:name="objective-iii-in-vitro-motility"/>
     <w:p>
       <w:pPr>
         <w:pStyle w:val="Heading2"/>
       </w:pPr>
       <w:r>
-        <w:t xml:space="preserve">8 5.3. Objective iii — in-vitro motility dose response</w:t>
+        <w:t xml:space="preserve">8 5.3. Objective iii — in-vitro motility</w:t>
       </w:r>
     </w:p>
     <w:p>
@@ -1861,34 +1596,35 @@
         <w:pStyle w:val="FirstParagraph"/>
       </w:pPr>
       <w:r>
-        <w:t xml:space="preserve">Exploration shows a textbook gradient. Median TTI rises monotonically as</w:t>
-      </w:r>
-      <w:r>
-        <w:t xml:space="preserve"> </w:t>
-      </w:r>
-      <w:r>
-        <w:t xml:space="preserve">concentration falls: 15 min at 100 mg/ml in both parasites with zero</w:t>
-      </w:r>
-      <w:r>
-        <w:t xml:space="preserve"> </w:t>
-      </w:r>
-      <w:r>
-        <w:t xml:space="preserve">censoring, 22–30 min at 10 mg/ml, 45–53 min at 0.5 mg/ml, 60–75 min at</w:t>
-      </w:r>
-      <w:r>
-        <w:t xml:space="preserve"> </w:t>
-      </w:r>
-      <w:r>
-        <w:t xml:space="preserve">0.01 mg/ml, 90–105 min at 0.005 mg/ml, and fully censored Negative Controls</w:t>
-      </w:r>
-      <w:r>
-        <w:t xml:space="preserve"> </w:t>
-      </w:r>
-      <w:r>
-        <w:t xml:space="preserve">(all 8</w:t>
-      </w:r>
-      <w:r>
-        <w:t xml:space="preserve"> </w:t>
+        <w:t xml:space="preserve">Both parasites were immobilised in strict concentration order. Median</w:t>
+      </w:r>
+      <w:r>
+        <w:t xml:space="preserve"> </w:t>
+      </w:r>
+      <w:r>
+        <w:t xml:space="preserve">time-to-immobilisation lengthened monotonically from 15 minutes at 100 mg/ml</w:t>
+      </w:r>
+      <w:r>
+        <w:t xml:space="preserve"> </w:t>
+      </w:r>
+      <w:r>
+        <w:t xml:space="preserve">(uncensored in all blocks) to fully censored Negative Controls, with t120</w:t>
+      </w:r>
+      <w:r>
+        <w:t xml:space="preserve"> </w:t>
+      </w:r>
+      <w:r>
+        <w:t xml:space="preserve">motility rising from zero to 0.67 (</w:t>
+      </w:r>
+      <w:r>
+        <w:rPr>
+          <w:i/>
+          <w:iCs/>
+        </w:rPr>
+        <w:t xml:space="preserve">congolense</w:t>
+      </w:r>
+      <w:r>
+        <w:t xml:space="preserve">) and 1.0 (</w:t>
       </w:r>
       <w:r>
         <w:rPr>
@@ -1898,64 +1634,13 @@
         <w:t xml:space="preserve">evansi</w:t>
       </w:r>
       <w:r>
-        <w:t xml:space="preserve"> </w:t>
-      </w:r>
-      <w:r>
-        <w:t xml:space="preserve">NC groups never immobilise; 6 of 8</w:t>
-      </w:r>
-      <w:r>
-        <w:t xml:space="preserve"> </w:t>
-      </w:r>
-      <w:r>
-        <w:rPr>
-          <w:i/>
-          <w:iCs/>
-        </w:rPr>
-        <w:t xml:space="preserve">congolense</w:t>
-      </w:r>
-      <w:r>
-        <w:t xml:space="preserve"> </w:t>
-      </w:r>
-      <w:r>
-        <w:t xml:space="preserve">NC groups</w:t>
-      </w:r>
-      <w:r>
-        <w:t xml:space="preserve"> </w:t>
-      </w:r>
-      <w:r>
-        <w:t xml:space="preserve">likewise), while mean t120 motility climbs from 0 at the top doses to 0.67</w:t>
-      </w:r>
-      <w:r>
-        <w:t xml:space="preserve"> </w:t>
-      </w:r>
-      <w:r>
-        <w:t xml:space="preserve">(</w:t>
-      </w:r>
-      <w:r>
-        <w:rPr>
-          <w:i/>
-          <w:iCs/>
-        </w:rPr>
-        <w:t xml:space="preserve">congolense</w:t>
-      </w:r>
-      <w:r>
-        <w:t xml:space="preserve"> </w:t>
-      </w:r>
-      <w:r>
-        <w:t xml:space="preserve">NC) and 1.0 (</w:t>
-      </w:r>
-      <w:r>
-        <w:rPr>
-          <w:i/>
-          <w:iCs/>
-        </w:rPr>
-        <w:t xml:space="preserve">evansi</w:t>
-      </w:r>
-      <w:r>
-        <w:t xml:space="preserve"> </w:t>
-      </w:r>
-      <w:r>
-        <w:t xml:space="preserve">NC) (</w:t>
+        <w:t xml:space="preserve">) in the</w:t>
+      </w:r>
+      <w:r>
+        <w:t xml:space="preserve"> </w:t>
+      </w:r>
+      <w:r>
+        <w:t xml:space="preserve">controls (</w:t>
       </w:r>
       <w:hyperlink w:anchor="tbl-tti">
         <w:r>
@@ -1980,13 +1665,7 @@
         </w:r>
       </w:hyperlink>
       <w:r>
-        <w:t xml:space="preserve">). Trajectories</w:t>
-      </w:r>
-      <w:r>
-        <w:t xml:space="preserve"> </w:t>
-      </w:r>
-      <w:r>
-        <w:t xml:space="preserve">(</w:t>
+        <w:t xml:space="preserve">). The trajectories (</w:t>
       </w:r>
       <w:hyperlink w:anchor="fig-mot-traj">
         <w:r>
@@ -1997,31 +1676,37 @@
         </w:r>
       </w:hyperlink>
       <w:r>
-        <w:t xml:space="preserve">) confirm rapid kill at high doses — 100 mg/ml immobilises</w:t>
-      </w:r>
-      <w:r>
-        <w:t xml:space="preserve"> </w:t>
-      </w:r>
-      <w:r>
-        <w:t xml:space="preserve">within 15–30 minutes in most blocks — and validate the assay: the recovered</w:t>
-      </w:r>
-      <w:r>
-        <w:t xml:space="preserve"> </w:t>
-      </w:r>
-      <w:r>
-        <w:t xml:space="preserve">Positive Control rows show + at t = 0 and immobility thereafter in all 16</w:t>
-      </w:r>
-      <w:r>
-        <w:t xml:space="preserve"> </w:t>
-      </w:r>
-      <w:r>
-        <w:t xml:space="preserve">tables. Inference follows the description. The blocked dose trend is highly</w:t>
-      </w:r>
-      <w:r>
-        <w:t xml:space="preserve"> </w:t>
-      </w:r>
-      <w:r>
-        <w:t xml:space="preserve">significant for both parasites (</w:t>
+        <w:t xml:space="preserve">) show the</w:t>
+      </w:r>
+      <w:r>
+        <w:t xml:space="preserve"> </w:t>
+      </w:r>
+      <w:r>
+        <w:t xml:space="preserve">same ordering within every block, and the Positive Controls behaved as a</w:t>
+      </w:r>
+      <w:r>
+        <w:t xml:space="preserve"> </w:t>
+      </w:r>
+      <w:r>
+        <w:t xml:space="preserve">reference trypanocide should — motile at t = 0, immobile thereafter in all</w:t>
+      </w:r>
+      <w:r>
+        <w:t xml:space="preserve"> </w:t>
+      </w:r>
+      <w:r>
+        <w:t xml:space="preserve">sixteen tables — which validates the assay and establishes the benchmark</w:t>
+      </w:r>
+      <w:r>
+        <w:t xml:space="preserve"> </w:t>
+      </w:r>
+      <w:r>
+        <w:t xml:space="preserve">that the top extract dose reproduces. Formally, the blocked trend was highly</w:t>
+      </w:r>
+      <w:r>
+        <w:t xml:space="preserve"> </w:t>
+      </w:r>
+      <w:r>
+        <w:t xml:space="preserve">significant in both parasites (</w:t>
       </w:r>
       <w:hyperlink w:anchor="tbl-mot-dose">
         <w:r>
@@ -2032,7 +1717,7 @@
         </w:r>
       </w:hyperlink>
       <w:r>
-        <w:t xml:space="preserve">:</w:t>
+        <w:t xml:space="preserve">;</w:t>
       </w:r>
       <w:r>
         <w:t xml:space="preserve"> </w:t>
@@ -2054,7 +1739,7 @@
         <w:t xml:space="preserve"> </w:t>
       </w:r>
       <w:r>
-        <w:t xml:space="preserve">Q = 27.75, p &lt; 0.001, pooled ρ = −0.70;</w:t>
+        <w:t xml:space="preserve">Q = 27.75, p &lt; 0.001, ρ = −0.70;</w:t>
       </w:r>
       <w:r>
         <w:t xml:space="preserve"> </w:t>
@@ -2070,13 +1755,13 @@
         <w:t xml:space="preserve"> </w:t>
       </w:r>
       <w:r>
-        <w:t xml:space="preserve">Q = 30.32, p &lt; 0.001,</w:t>
-      </w:r>
-      <w:r>
-        <w:t xml:space="preserve"> </w:t>
-      </w:r>
-      <w:r>
-        <w:t xml:space="preserve">ρ = −0.88). Post-hoc dose-vs-control contrasts (</w:t>
+        <w:t xml:space="preserve">Q = 30.32, p &lt; 0.001, ρ = −0.88).</w:t>
+      </w:r>
+      <w:r>
+        <w:t xml:space="preserve"> </w:t>
+      </w:r>
+      <w:r>
+        <w:t xml:space="preserve">Post-hoc contrasts against the control (</w:t>
       </w:r>
       <w:hyperlink w:anchor="tbl-mot-posthoc">
         <w:r>
@@ -2087,93 +1772,49 @@
         </w:r>
       </w:hyperlink>
       <w:r>
-        <w:t xml:space="preserve">) carry</w:t>
-      </w:r>
-      <w:r>
-        <w:t xml:space="preserve"> </w:t>
-      </w:r>
-      <w:r>
-        <w:t xml:space="preserve">large, consistent effects at the top doses — rank-biserial −1 throughout,</w:t>
-      </w:r>
-      <w:r>
-        <w:t xml:space="preserve"> </w:t>
-      </w:r>
-      <w:r>
-        <w:t xml:space="preserve">HL reductions of −0.83 (</w:t>
-      </w:r>
-      <w:r>
-        <w:rPr>
-          <w:i/>
-          <w:iCs/>
-        </w:rPr>
-        <w:t xml:space="preserve">congolense</w:t>
-      </w:r>
-      <w:r>
-        <w:t xml:space="preserve"> </w:t>
-      </w:r>
-      <w:r>
-        <w:t xml:space="preserve">100 mg/ml, 95% CI [−0.94, −0.72]) and</w:t>
-      </w:r>
-      <w:r>
-        <w:t xml:space="preserve"> </w:t>
-      </w:r>
-      <w:r>
-        <w:t xml:space="preserve">−0.89 (</w:t>
-      </w:r>
-      <w:r>
-        <w:rPr>
-          <w:i/>
-          <w:iCs/>
-        </w:rPr>
-        <w:t xml:space="preserve">evansi</w:t>
-      </w:r>
-      <w:r>
-        <w:t xml:space="preserve"> </w:t>
-      </w:r>
-      <w:r>
-        <w:t xml:space="preserve">100 mg/ml, [−0.94, −0.83]) — that sit just above</w:t>
-      </w:r>
-      <w:r>
-        <w:t xml:space="preserve"> </w:t>
-      </w:r>
-      <w:r>
-        <w:t xml:space="preserve">Holm-adjusted significance (0.065 and 0.052; 10 mg/ml: 0.085 and 0.052).</w:t>
-      </w:r>
-      <w:r>
-        <w:t xml:space="preserve"> </w:t>
-      </w:r>
-      <w:r>
-        <w:t xml:space="preserve">Lower doses are indistinguishable from the control (0.5 mg/ml Holm 0.17 and</w:t>
-      </w:r>
-      <w:r>
-        <w:t xml:space="preserve"> </w:t>
-      </w:r>
-      <w:r>
-        <w:t xml:space="preserve">0.064; 0.01/0.005 mg/ml ≥ 0.11), and several low-dose pairs have zero</w:t>
-      </w:r>
-      <w:r>
-        <w:t xml:space="preserve"> </w:t>
-      </w:r>
-      <w:r>
-        <w:t xml:space="preserve">differences (n_nonzero as low as 4 of 8), which is itself informative: weak</w:t>
-      </w:r>
-      <w:r>
-        <w:t xml:space="preserve"> </w:t>
-      </w:r>
-      <w:r>
-        <w:t xml:space="preserve">extracts match the control exactly. Heavy tied ranks (the endpoint averages</w:t>
-      </w:r>
-      <w:r>
-        <w:t xml:space="preserve"> </w:t>
-      </w:r>
-      <w:r>
-        <w:t xml:space="preserve">nine binary points) forced the asymptotic approximation in every motility</w:t>
-      </w:r>
-      <w:r>
-        <w:t xml:space="preserve"> </w:t>
-      </w:r>
-      <w:r>
-        <w:t xml:space="preserve">contrast — recorded per row — and conclusions are unchanged under it.</w:t>
+        <w:t xml:space="preserve">) were uniformly</w:t>
+      </w:r>
+      <w:r>
+        <w:t xml:space="preserve"> </w:t>
+      </w:r>
+      <w:r>
+        <w:t xml:space="preserve">large at the top doses (rank-biserial −1; HL reductions of −0.83 and −0.89</w:t>
+      </w:r>
+      <w:r>
+        <w:t xml:space="preserve"> </w:t>
+      </w:r>
+      <w:r>
+        <w:t xml:space="preserve">at 100 mg/ml) but, with eight blocks and Holm correction, stopped just short</w:t>
+      </w:r>
+      <w:r>
+        <w:t xml:space="preserve"> </w:t>
+      </w:r>
+      <w:r>
+        <w:t xml:space="preserve">of significance (Holm 0.065 and 0.052; 10 mg/ml 0.085 and 0.052), and lower</w:t>
+      </w:r>
+      <w:r>
+        <w:t xml:space="preserve"> </w:t>
+      </w:r>
+      <w:r>
+        <w:t xml:space="preserve">doses were indistinguishable from control — several low-dose pairs matched</w:t>
+      </w:r>
+      <w:r>
+        <w:t xml:space="preserve"> </w:t>
+      </w:r>
+      <w:r>
+        <w:t xml:space="preserve">it exactly. The in-vitro conclusion is therefore a significant ordered trend</w:t>
+      </w:r>
+      <w:r>
+        <w:t xml:space="preserve"> </w:t>
+      </w:r>
+      <w:r>
+        <w:t xml:space="preserve">with large but multiplicity-limited pairwise effects, concentrated at</w:t>
+      </w:r>
+      <w:r>
+        <w:t xml:space="preserve"> </w:t>
+      </w:r>
+      <w:r>
+        <w:t xml:space="preserve">100 mg/ml.</w:t>
       </w:r>
     </w:p>
     <w:tbl>
@@ -2200,7 +1841,7 @@
               <w:pStyle w:val="ImageCaption"/>
             </w:pPr>
             <w:r>
-              <w:t xml:space="preserve">Table 2: Exploratory TTI and t120 summaries per dose (medians; censored groups never immobilise).</w:t>
+              <w:t xml:space="preserve">Table 2: TTI and t120 summaries per dose (medians; censored groups never immobilise).</w:t>
             </w:r>
           </w:p>
           <w:tbl>
@@ -5007,31 +4648,25 @@
         <w:pStyle w:val="FirstParagraph"/>
       </w:pPr>
       <w:r>
-        <w:t xml:space="preserve">Exploration first, because the numbers here are the backbone of the thesis.</w:t>
-      </w:r>
-      <w:r>
-        <w:t xml:space="preserve"> </w:t>
-      </w:r>
-      <w:r>
-        <w:t xml:space="preserve">Peak parasitaemia falls monotonically with dose in both parasites: at</w:t>
-      </w:r>
-      <w:r>
-        <w:t xml:space="preserve"> </w:t>
-      </w:r>
-      <w:r>
-        <w:t xml:space="preserve">100 mg/ml the mean peak is exactly zero across all eight blocks per</w:t>
-      </w:r>
-      <w:r>
-        <w:t xml:space="preserve"> </w:t>
-      </w:r>
-      <w:r>
-        <w:t xml:space="preserve">parasite with zero deaths, while Negative Controls peak at LEV 5 with</w:t>
-      </w:r>
-      <w:r>
-        <w:t xml:space="preserve"> </w:t>
-      </w:r>
-      <w:r>
-        <w:t xml:space="preserve">universal (100%) mortality (</w:t>
+        <w:t xml:space="preserve">The in-vivo gradient reproduced the dish. Mean peak parasitaemia declined</w:t>
+      </w:r>
+      <w:r>
+        <w:t xml:space="preserve"> </w:t>
+      </w:r>
+      <w:r>
+        <w:t xml:space="preserve">monotonically with dose to exactly zero at 100 mg/ml in both parasites with</w:t>
+      </w:r>
+      <w:r>
+        <w:t xml:space="preserve"> </w:t>
+      </w:r>
+      <w:r>
+        <w:t xml:space="preserve">no deaths, against peak LEV 5 with universal mortality in the Negative</w:t>
+      </w:r>
+      <w:r>
+        <w:t xml:space="preserve"> </w:t>
+      </w:r>
+      <w:r>
+        <w:t xml:space="preserve">Controls (</w:t>
       </w:r>
       <w:hyperlink w:anchor="tbl-peak">
         <w:r>
@@ -5056,75 +4691,30 @@
         </w:r>
       </w:hyperlink>
       <w:r>
-        <w:t xml:space="preserve">). The gradient is smooth —</w:t>
-      </w:r>
-      <w:r>
-        <w:t xml:space="preserve"> </w:t>
-      </w:r>
-      <w:r>
-        <w:rPr>
-          <w:i/>
-          <w:iCs/>
-        </w:rPr>
-        <w:t xml:space="preserve">congolense</w:t>
-      </w:r>
-      <w:r>
-        <w:t xml:space="preserve"> </w:t>
-      </w:r>
-      <w:r>
-        <w:t xml:space="preserve">mean peaks 0 → 1.88 → 2.78 → 3.13 → 3.19 → 5.0 from 100 mg/ml</w:t>
-      </w:r>
-      <w:r>
-        <w:t xml:space="preserve"> </w:t>
-      </w:r>
-      <w:r>
-        <w:t xml:space="preserve">to control;</w:t>
-      </w:r>
-      <w:r>
-        <w:t xml:space="preserve"> </w:t>
-      </w:r>
-      <w:r>
-        <w:rPr>
-          <w:i/>
-          <w:iCs/>
-        </w:rPr>
-        <w:t xml:space="preserve">evansi</w:t>
-      </w:r>
-      <w:r>
-        <w:t xml:space="preserve"> </w:t>
-      </w:r>
-      <w:r>
-        <w:t xml:space="preserve">0 → 0 → 0.63 → 1.93 → 2.08 → 5.0 — with mortality</w:t>
-      </w:r>
-      <w:r>
-        <w:t xml:space="preserve"> </w:t>
-      </w:r>
-      <w:r>
-        <w:t xml:space="preserve">tracking it (0% at top doses rising to 62–100% at low doses and control)</w:t>
-      </w:r>
-      <w:r>
-        <w:t xml:space="preserve"> </w:t>
-      </w:r>
-      <w:r>
-        <w:t xml:space="preserve">and median clearance days shortening as dose rises. Day-40 zeros accumulate</w:t>
-      </w:r>
-      <w:r>
-        <w:t xml:space="preserve"> </w:t>
-      </w:r>
-      <w:r>
-        <w:t xml:space="preserve">with dose (100% at top doses, 0% in controls), which together with the</w:t>
-      </w:r>
-      <w:r>
-        <w:t xml:space="preserve"> </w:t>
-      </w:r>
-      <w:r>
-        <w:t xml:space="preserve">zero-positive day-40 overall is why day-40 cannot carry inference.</w:t>
-      </w:r>
-      <w:r>
-        <w:t xml:space="preserve"> </w:t>
-      </w:r>
-      <w:r>
-        <w:t xml:space="preserve">Trajectories (</w:t>
+        <w:t xml:space="preserve">); mortality, clearance time and day-40</w:t>
+      </w:r>
+      <w:r>
+        <w:t xml:space="preserve"> </w:t>
+      </w:r>
+      <w:r>
+        <w:t xml:space="preserve">clearance all tracked the same ordering (</w:t>
+      </w:r>
+      <w:hyperlink w:anchor="fig-mort">
+        <w:r>
+          <w:rPr>
+            <w:rStyle w:val="Hyperlink"/>
+          </w:rPr>
+          <w:t xml:space="preserve">Figure 6</w:t>
+        </w:r>
+      </w:hyperlink>
+      <w:r>
+        <w:t xml:space="preserve">), and trajectories peaked</w:t>
+      </w:r>
+      <w:r>
+        <w:t xml:space="preserve"> </w:t>
+      </w:r>
+      <w:r>
+        <w:t xml:space="preserve">near days 9–14 before resolving in survivors (</w:t>
       </w:r>
       <w:hyperlink w:anchor="fig-para-traj">
         <w:r>
@@ -5135,19 +4725,109 @@
         </w:r>
       </w:hyperlink>
       <w:r>
-        <w:t xml:space="preserve">) rise from day 1, peak near days 9–14 and</w:t>
-      </w:r>
-      <w:r>
-        <w:t xml:space="preserve"> </w:t>
-      </w:r>
-      <w:r>
-        <w:t xml:space="preserve">resolve in survivors, with deaths (44 of 112 groups) accompanying the</w:t>
-      </w:r>
-      <w:r>
-        <w:t xml:space="preserve"> </w:t>
-      </w:r>
-      <w:r>
-        <w:t xml:space="preserve">decline. Inference on cumulative burden (AUC) mirrors the peaks (</w:t>
+        <w:t xml:space="preserve">). On cumulative</w:t>
+      </w:r>
+      <w:r>
+        <w:t xml:space="preserve"> </w:t>
+      </w:r>
+      <w:r>
+        <w:t xml:space="preserve">burden the</w:t>
+      </w:r>
+      <w:r>
+        <w:t xml:space="preserve"> </w:t>
+      </w:r>
+      <w:r>
+        <w:rPr>
+          <w:i/>
+          <w:iCs/>
+        </w:rPr>
+        <w:t xml:space="preserve">T. evansi</w:t>
+      </w:r>
+      <w:r>
+        <w:t xml:space="preserve"> </w:t>
+      </w:r>
+      <w:r>
+        <w:t xml:space="preserve">trend was significant (</w:t>
+      </w:r>
+      <w:hyperlink w:anchor="tbl-dose">
+        <w:r>
+          <w:rPr>
+            <w:rStyle w:val="Hyperlink"/>
+          </w:rPr>
+          <w:t xml:space="preserve">Table 6</w:t>
+        </w:r>
+      </w:hyperlink>
+      <w:r>
+        <w:t xml:space="preserve">; Friedman Q = 14.51,</w:t>
+      </w:r>
+      <w:r>
+        <w:t xml:space="preserve"> </w:t>
+      </w:r>
+      <w:r>
+        <w:t xml:space="preserve">p = 0.006, ρ = −0.51) with 100, 10 and 0.5 mg/ml each superior to control in</w:t>
+      </w:r>
+      <w:r>
+        <w:t xml:space="preserve"> </w:t>
+      </w:r>
+      <w:r>
+        <w:t xml:space="preserve">all eight blocks (W = 0, exact p = 0.008, Holm 0.039; HL −50/−50/−44</w:t>
+      </w:r>
+      <w:r>
+        <w:t xml:space="preserve"> </w:t>
+      </w:r>
+      <w:r>
+        <w:t xml:space="preserve">AUC-days), while 0.01 and 0.005 mg/ml lost significance on correction (Holm</w:t>
+      </w:r>
+      <w:r>
+        <w:t xml:space="preserve"> </w:t>
+      </w:r>
+      <w:r>
+        <w:t xml:space="preserve">0.078) despite strongly negative estimates.</w:t>
+      </w:r>
+      <w:r>
+        <w:t xml:space="preserve"> </w:t>
+      </w:r>
+      <w:r>
+        <w:rPr>
+          <w:i/>
+          <w:iCs/>
+        </w:rPr>
+        <w:t xml:space="preserve">T. congolense</w:t>
+      </w:r>
+      <w:r>
+        <w:t xml:space="preserve"> </w:t>
+      </w:r>
+      <w:r>
+        <w:t xml:space="preserve">showed the same</w:t>
+      </w:r>
+      <w:r>
+        <w:t xml:space="preserve"> </w:t>
+      </w:r>
+      <w:r>
+        <w:t xml:space="preserve">direction with weaker evidence (Friedman p = 0.074; 100 mg/ml Holm 0.071,</w:t>
+      </w:r>
+      <w:r>
+        <w:t xml:space="preserve"> </w:t>
+      </w:r>
+      <w:r>
+        <w:t xml:space="preserve">HL −29.9 [−41.0, −20.9]; lower doses Holm ≥ 0.32;</w:t>
+      </w:r>
+      <w:r>
+        <w:t xml:space="preserve"> </w:t>
+      </w:r>
+      <w:hyperlink w:anchor="tbl-para-posthoc">
+        <w:r>
+          <w:rPr>
+            <w:rStyle w:val="Hyperlink"/>
+          </w:rPr>
+          <w:t xml:space="preserve">Table 7</w:t>
+        </w:r>
+      </w:hyperlink>
+      <w:r>
+        <w:t xml:space="preserve">,</w:t>
+      </w:r>
+      <w:r>
+        <w:t xml:space="preserve"> </w:t>
       </w:r>
       <w:hyperlink w:anchor="fig-auc">
         <w:r>
@@ -5158,165 +4838,13 @@
         </w:r>
       </w:hyperlink>
       <w:r>
-        <w:t xml:space="preserve">):</w:t>
-      </w:r>
-      <w:r>
-        <w:t xml:space="preserve"> </w:t>
-      </w:r>
-      <w:r>
-        <w:t xml:space="preserve">monotonic in log-concentration, significant for</w:t>
-      </w:r>
-      <w:r>
-        <w:t xml:space="preserve"> </w:t>
-      </w:r>
-      <w:r>
-        <w:rPr>
-          <w:i/>
-          <w:iCs/>
-        </w:rPr>
-        <w:t xml:space="preserve">T. evansi</w:t>
-      </w:r>
-      <w:r>
-        <w:t xml:space="preserve"> </w:t>
-      </w:r>
-      <w:r>
-        <w:t xml:space="preserve">(</w:t>
-      </w:r>
-      <w:hyperlink w:anchor="tbl-dose">
-        <w:r>
-          <w:rPr>
-            <w:rStyle w:val="Hyperlink"/>
-          </w:rPr>
-          <w:t xml:space="preserve">Table 6</w:t>
-        </w:r>
-      </w:hyperlink>
-      <w:r>
-        <w:t xml:space="preserve">:</w:t>
-      </w:r>
-      <w:r>
-        <w:t xml:space="preserve"> </w:t>
-      </w:r>
-      <w:r>
-        <w:t xml:space="preserve">Friedman Q = 14.51, p = 0.006, pooled ρ = −0.51, mean per-block ρ = −0.86)</w:t>
-      </w:r>
-      <w:r>
-        <w:t xml:space="preserve"> </w:t>
-      </w:r>
-      <w:r>
-        <w:t xml:space="preserve">and suggestive for</w:t>
-      </w:r>
-      <w:r>
-        <w:t xml:space="preserve"> </w:t>
-      </w:r>
-      <w:r>
-        <w:rPr>
-          <w:i/>
-          <w:iCs/>
-        </w:rPr>
-        <w:t xml:space="preserve">T. congolense</w:t>
-      </w:r>
-      <w:r>
-        <w:t xml:space="preserve"> </w:t>
-      </w:r>
-      <w:r>
-        <w:t xml:space="preserve">(Q = 8.52, p = 0.074, ρ = −0.42, mean</w:t>
-      </w:r>
-      <w:r>
-        <w:t xml:space="preserve"> </w:t>
-      </w:r>
-      <w:r>
-        <w:t xml:space="preserve">per-block −0.46). Post-hocs (</w:t>
-      </w:r>
-      <w:hyperlink w:anchor="tbl-para-posthoc">
-        <w:r>
-          <w:rPr>
-            <w:rStyle w:val="Hyperlink"/>
-          </w:rPr>
-          <w:t xml:space="preserve">Table 7</w:t>
-        </w:r>
-      </w:hyperlink>
-      <w:r>
-        <w:t xml:space="preserve">) confirm</w:t>
-      </w:r>
-      <w:r>
-        <w:t xml:space="preserve"> </w:t>
-      </w:r>
-      <w:r>
-        <w:rPr>
-          <w:i/>
-          <w:iCs/>
-        </w:rPr>
-        <w:t xml:space="preserve">evansi</w:t>
-      </w:r>
-      <w:r>
-        <w:t xml:space="preserve"> </w:t>
-      </w:r>
-      <w:r>
-        <w:t xml:space="preserve">100, 10</w:t>
-      </w:r>
-      <w:r>
-        <w:t xml:space="preserve"> </w:t>
-      </w:r>
-      <w:r>
-        <w:t xml:space="preserve">and 0.5 mg/ml, each beating the control in all eight blocks (W = 0, exact</w:t>
-      </w:r>
-      <w:r>
-        <w:t xml:space="preserve"> </w:t>
-      </w:r>
-      <w:r>
-        <w:t xml:space="preserve">p = 0.008, Holm 0.039; HL ≈ −50/−50/−44 AUC-days with lower limits near −75),</w:t>
-      </w:r>
-      <w:r>
-        <w:t xml:space="preserve"> </w:t>
-      </w:r>
-      <w:r>
-        <w:t xml:space="preserve">while 0.01 and 0.005 mg/ml do not survive correction (Holm 0.078 each, with</w:t>
-      </w:r>
-      <w:r>
-        <w:t xml:space="preserve"> </w:t>
-      </w:r>
-      <w:r>
-        <w:t xml:space="preserve">HL point estimates still strongly negative at −32/−34). For</w:t>
-      </w:r>
-      <w:r>
-        <w:t xml:space="preserve"> </w:t>
-      </w:r>
-      <w:r>
-        <w:rPr>
-          <w:i/>
-          <w:iCs/>
-        </w:rPr>
-        <w:t xml:space="preserve">T. congolense</w:t>
-      </w:r>
-      <w:r>
-        <w:t xml:space="preserve"> </w:t>
-      </w:r>
-      <w:r>
-        <w:t xml:space="preserve">only 100 mg/ml is suggestive (asymptotic p = 0.014 — ties present — Holm</w:t>
-      </w:r>
-      <w:r>
-        <w:t xml:space="preserve"> </w:t>
-      </w:r>
-      <w:r>
-        <w:t xml:space="preserve">0.071, HL −29.9 [−41.0, −20.9], r = −1); every lower dose is far from</w:t>
-      </w:r>
-      <w:r>
-        <w:t xml:space="preserve"> </w:t>
-      </w:r>
-      <w:r>
-        <w:t xml:space="preserve">significance (Holm 0.32–0.73) despite negative point estimates. No</w:t>
-      </w:r>
-      <w:r>
-        <w:t xml:space="preserve"> </w:t>
-      </w:r>
-      <w:r>
-        <w:t xml:space="preserve">parasite-level AUC difference exists (paired W = 24, exact p = 0.46,</w:t>
-      </w:r>
-      <w:r>
-        <w:t xml:space="preserve"> </w:t>
-      </w:r>
-      <w:r>
-        <w:t xml:space="preserve">HL 6.0 [−10.7, 21.1], r = 0.25;</w:t>
+        <w:t xml:space="preserve">). Overall burdens did not differ between parasites (paired p = 0.46,</w:t>
+      </w:r>
+      <w:r>
+        <w:t xml:space="preserve"> </w:t>
+      </w:r>
+      <w:r>
+        <w:t xml:space="preserve">HL 6.0 [−10.7, 21.1];</w:t>
       </w:r>
       <w:r>
         <w:t xml:space="preserve"> </w:t>
@@ -5330,20 +4858,13 @@
         </w:r>
       </w:hyperlink>
       <w:r>
-        <w:t xml:space="preserve">) — the parasites differ in</w:t>
-      </w:r>
-      <w:r>
-        <w:t xml:space="preserve"> </w:t>
-      </w:r>
-      <w:r>
-        <w:rPr>
-          <w:i/>
-          <w:iCs/>
-        </w:rPr>
-        <w:t xml:space="preserve">dose sensitivity</w:t>
-      </w:r>
-      <w:r>
-        <w:t xml:space="preserve">, not in overall burden.</w:t>
+        <w:t xml:space="preserve">): the species differ in dose sensitivity,</w:t>
+      </w:r>
+      <w:r>
+        <w:t xml:space="preserve"> </w:t>
+      </w:r>
+      <w:r>
+        <w:t xml:space="preserve">not in the burden the model produces.</w:t>
       </w:r>
     </w:p>
     <w:tbl>
@@ -5370,7 +4891,7 @@
               <w:pStyle w:val="ImageCaption"/>
             </w:pPr>
             <w:r>
-              <w:t xml:space="preserve">Table 5: Exploratory peak, clearance and mortality per dose (means/medians over 8 blocks).</w:t>
+              <w:t xml:space="preserve">Table 5: Peak, clearance and mortality per dose (means/medians over 8 blocks).</w:t>
             </w:r>
           </w:p>
           <w:tbl>
@@ -8618,13 +8139,13 @@
         <w:pStyle w:val="FirstParagraph"/>
       </w:pPr>
       <w:r>
-        <w:t xml:space="preserve">Exploration: mean weight and PCV paths across Pre, Infection and Post run</w:t>
-      </w:r>
-      <w:r>
-        <w:t xml:space="preserve"> </w:t>
-      </w:r>
-      <w:r>
-        <w:t xml:space="preserve">roughly flat for both plants and parasites (</w:t>
+        <w:t xml:space="preserve">Neither measure responded to treatment. Mean trajectories across the three</w:t>
+      </w:r>
+      <w:r>
+        <w:t xml:space="preserve"> </w:t>
+      </w:r>
+      <w:r>
+        <w:t xml:space="preserve">timepoints were flat and overlapping (</w:t>
       </w:r>
       <w:hyperlink w:anchor="fig-wp-traj">
         <w:r>
@@ -8635,19 +8156,13 @@
         </w:r>
       </w:hyperlink>
       <w:r>
-        <w:t xml:space="preserve">) — there is no</w:t>
-      </w:r>
-      <w:r>
-        <w:t xml:space="preserve"> </w:t>
-      </w:r>
-      <w:r>
-        <w:t xml:space="preserve">visible separation of trajectories by treatment — and deltas centre near</w:t>
-      </w:r>
-      <w:r>
-        <w:t xml:space="preserve"> </w:t>
-      </w:r>
-      <w:r>
-        <w:t xml:space="preserve">zero with wide scatter (</w:t>
+        <w:t xml:space="preserve">), deltas centred near</w:t>
+      </w:r>
+      <w:r>
+        <w:t xml:space="preserve"> </w:t>
+      </w:r>
+      <w:r>
+        <w:t xml:space="preserve">zero (</w:t>
       </w:r>
       <w:hyperlink w:anchor="fig-wt">
         <w:r>
@@ -8672,13 +8187,30 @@
         </w:r>
       </w:hyperlink>
       <w:r>
-        <w:t xml:space="preserve">). The flags tell the real story</w:t>
-      </w:r>
-      <w:r>
-        <w:t xml:space="preserve"> </w:t>
-      </w:r>
-      <w:r>
-        <w:t xml:space="preserve">(</w:t>
+        <w:t xml:space="preserve">), and no plant or parasite contrast approached</w:t>
+      </w:r>
+      <w:r>
+        <w:t xml:space="preserve"> </w:t>
+      </w:r>
+      <w:r>
+        <w:t xml:space="preserve">significance (</w:t>
+      </w:r>
+      <w:hyperlink w:anchor="tbl-other">
+        <w:r>
+          <w:rPr>
+            <w:rStyle w:val="Hyperlink"/>
+          </w:rPr>
+          <w:t xml:space="preserve">Table 9</w:t>
+        </w:r>
+      </w:hyperlink>
+      <w:r>
+        <w:t xml:space="preserve">; all p ≥ 0.15 with intervals spanning zero). The</w:t>
+      </w:r>
+      <w:r>
+        <w:t xml:space="preserve"> </w:t>
+      </w:r>
+      <w:r>
+        <w:t xml:space="preserve">informative signal is instead where the flags fell (</w:t>
       </w:r>
       <w:hyperlink w:anchor="tbl-flags">
         <w:r>
@@ -8689,7 +8221,13 @@
         </w:r>
       </w:hyperlink>
       <w:r>
-        <w:t xml:space="preserve">): missingness (death) concentrates in</w:t>
+        <w:t xml:space="preserve">): deaths,</w:t>
+      </w:r>
+      <w:r>
+        <w:t xml:space="preserve"> </w:t>
+      </w:r>
+      <w:r>
+        <w:t xml:space="preserve">severe weight loss and anaemia concentrated almost entirely in</w:t>
       </w:r>
       <w:r>
         <w:t xml:space="preserve"> </w:t>
@@ -8699,93 +8237,13 @@
           <w:i/>
           <w:iCs/>
         </w:rPr>
-        <w:t xml:space="preserve">T. congolense</w:t>
-      </w:r>
-      <w:r>
-        <w:t xml:space="preserve"> </w:t>
-      </w:r>
-      <w:r>
-        <w:t xml:space="preserve">(7 + 3</w:t>
-      </w:r>
-      <w:r>
-        <w:t xml:space="preserve"> </w:t>
-      </w:r>
-      <w:r>
-        <w:t xml:space="preserve">weight groups, 7 + 3 PCV groups across the two plants, vs 1 each for</w:t>
-      </w:r>
-      <w:r>
-        <w:t xml:space="preserve"> </w:t>
+        <w:t xml:space="preserve">T.</w:t>
       </w:r>
       <w:r>
         <w:rPr>
           <w:i/>
           <w:iCs/>
         </w:rPr>
-        <w:t xml:space="preserve">A.</w:t>
-      </w:r>
-      <w:r>
-        <w:rPr>
-          <w:i/>
-          <w:iCs/>
-        </w:rPr>
-        <w:t xml:space="preserve"> </w:t>
-      </w:r>
-      <w:r>
-        <w:rPr>
-          <w:i/>
-          <w:iCs/>
-        </w:rPr>
-        <w:t xml:space="preserve">indica</w:t>
-      </w:r>
-      <w:r>
-        <w:t xml:space="preserve">/</w:t>
-      </w:r>
-      <w:r>
-        <w:rPr>
-          <w:i/>
-          <w:iCs/>
-        </w:rPr>
-        <w:t xml:space="preserve">evansi</w:t>
-      </w:r>
-      <w:r>
-        <w:t xml:space="preserve"> </w:t>
-      </w:r>
-      <w:r>
-        <w:t xml:space="preserve">and none for</w:t>
-      </w:r>
-      <w:r>
-        <w:t xml:space="preserve"> </w:t>
-      </w:r>
-      <w:r>
-        <w:rPr>
-          <w:i/>
-          <w:iCs/>
-        </w:rPr>
-        <w:t xml:space="preserve">M. oleifera</w:t>
-      </w:r>
-      <w:r>
-        <w:t xml:space="preserve">/</w:t>
-      </w:r>
-      <w:r>
-        <w:rPr>
-          <w:i/>
-          <w:iCs/>
-        </w:rPr>
-        <w:t xml:space="preserve">evansi</w:t>
-      </w:r>
-      <w:r>
-        <w:t xml:space="preserve"> </w:t>
-      </w:r>
-      <w:r>
-        <w:t xml:space="preserve">weight); severe weight</w:t>
-      </w:r>
-      <w:r>
-        <w:t xml:space="preserve"> </w:t>
-      </w:r>
-      <w:r>
-        <w:t xml:space="preserve">loss (≥ 20%) hits 4 + 2</w:t>
-      </w:r>
-      <w:r>
         <w:t xml:space="preserve"> </w:t>
       </w:r>
       <w:r>
@@ -8799,7 +8257,7 @@
         <w:t xml:space="preserve"> </w:t>
       </w:r>
       <w:r>
-        <w:t xml:space="preserve">groups plus one</w:t>
+        <w:t xml:space="preserve">blocks of both plants, with</w:t>
       </w:r>
       <w:r>
         <w:t xml:space="preserve"> </w:t>
@@ -8809,25 +8267,47 @@
           <w:i/>
           <w:iCs/>
         </w:rPr>
-        <w:t xml:space="preserve">A. indica</w:t>
-      </w:r>
-      <w:r>
-        <w:t xml:space="preserve">/</w:t>
+        <w:t xml:space="preserve">T. evansi</w:t>
+      </w:r>
+      <w:r>
+        <w:t xml:space="preserve"> </w:t>
+      </w:r>
+      <w:r>
+        <w:t xml:space="preserve">groups largely unflagged.</w:t>
+      </w:r>
+      <w:r>
+        <w:t xml:space="preserve"> </w:t>
+      </w:r>
+      <w:r>
+        <w:t xml:space="preserve">Two inferences follow. First, the parasitaemia effects above are not</w:t>
+      </w:r>
+      <w:r>
+        <w:t xml:space="preserve"> </w:t>
+      </w:r>
+      <w:r>
+        <w:t xml:space="preserve">confounded by differential toxicity — treated groups gained no weight or PCV</w:t>
+      </w:r>
+      <w:r>
+        <w:t xml:space="preserve"> </w:t>
+      </w:r>
+      <w:r>
+        <w:t xml:space="preserve">advantage because there was no toxicity gradient to begin with. Second,</w:t>
+      </w:r>
+      <w:r>
+        <w:t xml:space="preserve"> </w:t>
       </w:r>
       <w:r>
         <w:rPr>
           <w:i/>
           <w:iCs/>
         </w:rPr>
-        <w:t xml:space="preserve">evansi</w:t>
-      </w:r>
-      <w:r>
-        <w:t xml:space="preserve"> </w:t>
-      </w:r>
-      <w:r>
-        <w:t xml:space="preserve">group, with toxicity-signal (≥ 10%) flags in 4 + 4</w:t>
-      </w:r>
-      <w:r>
+        <w:t xml:space="preserve">T.</w:t>
+      </w:r>
+      <w:r>
+        <w:rPr>
+          <w:i/>
+          <w:iCs/>
+        </w:rPr>
         <w:t xml:space="preserve"> </w:t>
       </w:r>
       <w:r>
@@ -8841,203 +8321,13 @@
         <w:t xml:space="preserve"> </w:t>
       </w:r>
       <w:r>
-        <w:t xml:space="preserve">and 2</w:t>
-      </w:r>
-      <w:r>
-        <w:t xml:space="preserve"> </w:t>
-      </w:r>
-      <w:r>
-        <w:rPr>
-          <w:i/>
-          <w:iCs/>
-        </w:rPr>
-        <w:t xml:space="preserve">A.</w:t>
-      </w:r>
-      <w:r>
-        <w:rPr>
-          <w:i/>
-          <w:iCs/>
-        </w:rPr>
-        <w:t xml:space="preserve"> </w:t>
-      </w:r>
-      <w:r>
-        <w:rPr>
-          <w:i/>
-          <w:iCs/>
-        </w:rPr>
-        <w:t xml:space="preserve">indica</w:t>
-      </w:r>
-      <w:r>
-        <w:t xml:space="preserve">/</w:t>
-      </w:r>
-      <w:r>
-        <w:rPr>
-          <w:i/>
-          <w:iCs/>
-        </w:rPr>
-        <w:t xml:space="preserve">evansi</w:t>
-      </w:r>
-      <w:r>
-        <w:t xml:space="preserve"> </w:t>
-      </w:r>
-      <w:r>
-        <w:t xml:space="preserve">groups; anaemia flags likewise cluster in</w:t>
-      </w:r>
-      <w:r>
-        <w:t xml:space="preserve"> </w:t>
-      </w:r>
-      <w:r>
-        <w:rPr>
-          <w:i/>
-          <w:iCs/>
-        </w:rPr>
-        <w:t xml:space="preserve">congolense</w:t>
-      </w:r>
-      <w:r>
-        <w:t xml:space="preserve"> </w:t>
-      </w:r>
-      <w:r>
-        <w:t xml:space="preserve">(5 + 4 groups) with only 2 in</w:t>
-      </w:r>
-      <w:r>
-        <w:t xml:space="preserve"> </w:t>
-      </w:r>
-      <w:r>
-        <w:rPr>
-          <w:i/>
-          <w:iCs/>
-        </w:rPr>
-        <w:t xml:space="preserve">M. oleifera</w:t>
-      </w:r>
-      <w:r>
-        <w:t xml:space="preserve">/</w:t>
-      </w:r>
-      <w:r>
-        <w:rPr>
-          <w:i/>
-          <w:iCs/>
-        </w:rPr>
-        <w:t xml:space="preserve">evansi</w:t>
-      </w:r>
-      <w:r>
-        <w:t xml:space="preserve"> </w:t>
-      </w:r>
-      <w:r>
-        <w:t xml:space="preserve">and 2 severe-anaemia</w:t>
-      </w:r>
-      <w:r>
-        <w:t xml:space="preserve"> </w:t>
-      </w:r>
-      <w:r>
-        <w:t xml:space="preserve">flags in</w:t>
-      </w:r>
-      <w:r>
-        <w:t xml:space="preserve"> </w:t>
-      </w:r>
-      <w:r>
-        <w:rPr>
-          <w:i/>
-          <w:iCs/>
-        </w:rPr>
-        <w:t xml:space="preserve">A. indica</w:t>
-      </w:r>
-      <w:r>
-        <w:t xml:space="preserve">/</w:t>
-      </w:r>
-      <w:r>
-        <w:rPr>
-          <w:i/>
-          <w:iCs/>
-        </w:rPr>
-        <w:t xml:space="preserve">evansi</w:t>
-      </w:r>
-      <w:r>
-        <w:t xml:space="preserve">. Inference finds no plant or parasite signals</w:t>
-      </w:r>
-      <w:r>
-        <w:t xml:space="preserve"> </w:t>
-      </w:r>
-      <w:r>
-        <w:t xml:space="preserve">in the deltas (</w:t>
-      </w:r>
-      <w:hyperlink w:anchor="tbl-other">
-        <w:r>
-          <w:rPr>
-            <w:rStyle w:val="Hyperlink"/>
-          </w:rPr>
-          <w:t xml:space="preserve">Table 9</w:t>
-        </w:r>
-      </w:hyperlink>
-      <w:r>
-        <w:t xml:space="preserve">: weight plant W = 10, exact p = 0.31, HL −0.81</w:t>
-      </w:r>
-      <w:r>
-        <w:t xml:space="preserve"> </w:t>
-      </w:r>
-      <w:r>
-        <w:t xml:space="preserve">[−2.29, 0.44], r = 0; weight parasite W = 7, p = 0.15, HL −1.34</w:t>
-      </w:r>
-      <w:r>
-        <w:t xml:space="preserve"> </w:t>
-      </w:r>
-      <w:r>
-        <w:t xml:space="preserve">[−3.90, 0.29], r = −0.50; PCV plant W = 21, p = 0.74, HL 0.48</w:t>
-      </w:r>
-      <w:r>
-        <w:t xml:space="preserve"> </w:t>
-      </w:r>
-      <w:r>
-        <w:t xml:space="preserve">[−3.70, 4.38], r = 0.25; PCV parasite W = 19, p = 0.95, HL 0.40</w:t>
-      </w:r>
-      <w:r>
-        <w:t xml:space="preserve"> </w:t>
-      </w:r>
-      <w:r>
-        <w:t xml:space="preserve">[−3.62, 3.48], r = 0). Read together — flat trajectories, null delta tests,</w:t>
-      </w:r>
-      <w:r>
-        <w:t xml:space="preserve"> </w:t>
-      </w:r>
-      <w:r>
-        <w:t xml:space="preserve">but flags concentrated in</w:t>
-      </w:r>
-      <w:r>
-        <w:t xml:space="preserve"> </w:t>
-      </w:r>
-      <w:r>
-        <w:rPr>
-          <w:i/>
-          <w:iCs/>
-        </w:rPr>
-        <w:t xml:space="preserve">congolense</w:t>
-      </w:r>
-      <w:r>
-        <w:t xml:space="preserve"> </w:t>
-      </w:r>
-      <w:r>
-        <w:t xml:space="preserve">— efficacy in this study is</w:t>
-      </w:r>
-      <w:r>
-        <w:t xml:space="preserve"> </w:t>
-      </w:r>
-      <w:r>
-        <w:t xml:space="preserve">parasitological rather than confounded by differential toxicity, while</w:t>
-      </w:r>
-      <w:r>
-        <w:t xml:space="preserve"> </w:t>
-      </w:r>
-      <w:r>
-        <w:rPr>
-          <w:i/>
-          <w:iCs/>
-        </w:rPr>
-        <w:t xml:space="preserve">T. congolense</w:t>
-      </w:r>
-      <w:r>
-        <w:t xml:space="preserve"> </w:t>
-      </w:r>
-      <w:r>
-        <w:t xml:space="preserve">remains the more pathogenic organism regardless of extract.</w:t>
+        <w:t xml:space="preserve">is confirmed as the more pathogenic organism in this model,</w:t>
+      </w:r>
+      <w:r>
+        <w:t xml:space="preserve"> </w:t>
+      </w:r>
+      <w:r>
+        <w:t xml:space="preserve">independently of extract.</w:t>
       </w:r>
     </w:p>
     <w:tbl>
@@ -9064,7 +8354,7 @@
               <w:pStyle w:val="ImageCaption"/>
             </w:pPr>
             <w:r>
-              <w:t xml:space="preserve">Table 8: Exploratory toxicity/anaemia flag counts (descriptive).</w:t>
+              <w:t xml:space="preserve">Table 8: Toxicity/anaemia flag counts (descriptive).</w:t>
             </w:r>
           </w:p>
           <w:tbl>
@@ -11243,7 +10533,59 @@
         <w:pStyle w:val="FirstParagraph"/>
       </w:pPr>
       <w:r>
-        <w:t xml:space="preserve">Exploration first: per-pair AUC differences (</w:t>
+        <w:t xml:space="preserve">The eight paired differences span zero with no structure: three favour</w:t>
+      </w:r>
+      <w:r>
+        <w:t xml:space="preserve"> </w:t>
+      </w:r>
+      <w:r>
+        <w:rPr>
+          <w:i/>
+          <w:iCs/>
+        </w:rPr>
+        <w:t xml:space="preserve">M.</w:t>
+      </w:r>
+      <w:r>
+        <w:rPr>
+          <w:i/>
+          <w:iCs/>
+        </w:rPr>
+        <w:t xml:space="preserve"> </w:t>
+      </w:r>
+      <w:r>
+        <w:rPr>
+          <w:i/>
+          <w:iCs/>
+        </w:rPr>
+        <w:t xml:space="preserve">oleifera</w:t>
+      </w:r>
+      <w:r>
+        <w:t xml:space="preserve"> </w:t>
+      </w:r>
+      <w:r>
+        <w:t xml:space="preserve">(to −21.5 AUC-days), four favour</w:t>
+      </w:r>
+      <w:r>
+        <w:t xml:space="preserve"> </w:t>
+      </w:r>
+      <w:r>
+        <w:rPr>
+          <w:i/>
+          <w:iCs/>
+        </w:rPr>
+        <w:t xml:space="preserve">A. indica</w:t>
+      </w:r>
+      <w:r>
+        <w:t xml:space="preserve"> </w:t>
+      </w:r>
+      <w:r>
+        <w:t xml:space="preserve">(to +18.1), one is an</w:t>
+      </w:r>
+      <w:r>
+        <w:t xml:space="preserve"> </w:t>
+      </w:r>
+      <w:r>
+        <w:t xml:space="preserve">exact tie, and neither part nor parasite predicts the sign (</w:t>
       </w:r>
       <w:hyperlink w:anchor="fig-forest">
         <w:r>
@@ -11254,183 +10596,10 @@
         </w:r>
       </w:hyperlink>
       <w:r>
-        <w:t xml:space="preserve">) scatter on both</w:t>
-      </w:r>
-      <w:r>
-        <w:t xml:space="preserve"> </w:t>
-      </w:r>
-      <w:r>
-        <w:t xml:space="preserve">sides of zero in both parasites — leaves/</w:t>
-      </w:r>
-      <w:r>
-        <w:rPr>
-          <w:i/>
-          <w:iCs/>
-        </w:rPr>
-        <w:t xml:space="preserve">congolense</w:t>
-      </w:r>
-      <w:r>
-        <w:t xml:space="preserve"> </w:t>
-      </w:r>
-      <w:r>
-        <w:t xml:space="preserve">−21.5 and</w:t>
-      </w:r>
-      <w:r>
-        <w:t xml:space="preserve"> </w:t>
-      </w:r>
-      <w:r>
-        <w:t xml:space="preserve">seeds/</w:t>
-      </w:r>
-      <w:r>
-        <w:rPr>
-          <w:i/>
-          <w:iCs/>
-        </w:rPr>
-        <w:t xml:space="preserve">evansi</w:t>
-      </w:r>
-      <w:r>
-        <w:t xml:space="preserve"> </w:t>
-      </w:r>
-      <w:r>
-        <w:t xml:space="preserve">−19.6 favour</w:t>
-      </w:r>
-      <w:r>
-        <w:t xml:space="preserve"> </w:t>
-      </w:r>
-      <w:r>
-        <w:rPr>
-          <w:i/>
-          <w:iCs/>
-        </w:rPr>
-        <w:t xml:space="preserve">M. oleifera</w:t>
-      </w:r>
-      <w:r>
-        <w:t xml:space="preserve"> </w:t>
-      </w:r>
-      <w:r>
-        <w:t xml:space="preserve">(negative = lower burden under</w:t>
-      </w:r>
-      <w:r>
-        <w:t xml:space="preserve"> </w:t>
-      </w:r>
-      <w:r>
-        <w:rPr>
-          <w:i/>
-          <w:iCs/>
-        </w:rPr>
-        <w:t xml:space="preserve">M. oleifera</w:t>
-      </w:r>
-      <w:r>
-        <w:t xml:space="preserve">), while stem bark/</w:t>
-      </w:r>
-      <w:r>
-        <w:rPr>
-          <w:i/>
-          <w:iCs/>
-        </w:rPr>
-        <w:t xml:space="preserve">evansi</w:t>
-      </w:r>
-      <w:r>
-        <w:t xml:space="preserve"> </w:t>
-      </w:r>
-      <w:r>
-        <w:t xml:space="preserve">+18.1, roots/</w:t>
-      </w:r>
-      <w:r>
-        <w:rPr>
-          <w:i/>
-          <w:iCs/>
-        </w:rPr>
-        <w:t xml:space="preserve">evansi</w:t>
-      </w:r>
-      <w:r>
-        <w:t xml:space="preserve"> </w:t>
-      </w:r>
-      <w:r>
-        <w:t xml:space="preserve">+11.3 and</w:t>
-      </w:r>
-      <w:r>
-        <w:t xml:space="preserve"> </w:t>
-      </w:r>
-      <w:r>
-        <w:t xml:space="preserve">leaves/</w:t>
-      </w:r>
-      <w:r>
-        <w:rPr>
-          <w:i/>
-          <w:iCs/>
-        </w:rPr>
-        <w:t xml:space="preserve">evansi</w:t>
-      </w:r>
-      <w:r>
-        <w:t xml:space="preserve"> </w:t>
-      </w:r>
-      <w:r>
-        <w:t xml:space="preserve">+9.9 favour</w:t>
-      </w:r>
-      <w:r>
-        <w:t xml:space="preserve"> </w:t>
-      </w:r>
-      <w:r>
-        <w:rPr>
-          <w:i/>
-          <w:iCs/>
-        </w:rPr>
-        <w:t xml:space="preserve">A. indica</w:t>
-      </w:r>
-      <w:r>
-        <w:t xml:space="preserve">; roots/</w:t>
-      </w:r>
-      <w:r>
-        <w:rPr>
-          <w:i/>
-          <w:iCs/>
-        </w:rPr>
-        <w:t xml:space="preserve">congolense</w:t>
-      </w:r>
-      <w:r>
-        <w:t xml:space="preserve"> </w:t>
-      </w:r>
-      <w:r>
-        <w:t xml:space="preserve">(+4.0), stem</w:t>
-      </w:r>
-      <w:r>
-        <w:t xml:space="preserve"> </w:t>
-      </w:r>
-      <w:r>
-        <w:t xml:space="preserve">bark/</w:t>
-      </w:r>
-      <w:r>
-        <w:rPr>
-          <w:i/>
-          <w:iCs/>
-        </w:rPr>
-        <w:t xml:space="preserve">congolense</w:t>
-      </w:r>
-      <w:r>
-        <w:t xml:space="preserve"> </w:t>
-      </w:r>
-      <w:r>
-        <w:t xml:space="preserve">(−3.6) and seeds/</w:t>
-      </w:r>
-      <w:r>
-        <w:rPr>
-          <w:i/>
-          <w:iCs/>
-        </w:rPr>
-        <w:t xml:space="preserve">congolense</w:t>
-      </w:r>
-      <w:r>
-        <w:t xml:space="preserve"> </w:t>
-      </w:r>
-      <w:r>
-        <w:t xml:space="preserve">(exactly 0.0) sit near zero.</w:t>
-      </w:r>
-      <w:r>
-        <w:t xml:space="preserve"> </w:t>
-      </w:r>
-      <w:r>
-        <w:t xml:space="preserve">No pattern by part or parasite emerges, and the scatter (</w:t>
+        <w:t xml:space="preserve">;</w:t>
+      </w:r>
+      <w:r>
+        <w:t xml:space="preserve"> </w:t>
       </w:r>
       <w:hyperlink w:anchor="fig-paired">
         <w:r>
@@ -11441,25 +10610,22 @@
         </w:r>
       </w:hyperlink>
       <w:r>
-        <w:t xml:space="preserve">)</w:t>
-      </w:r>
-      <w:r>
-        <w:t xml:space="preserve"> </w:t>
-      </w:r>
-      <w:r>
-        <w:t xml:space="preserve">straddles identity. Inference confirms the visual: paired W = 14 on seven</w:t>
-      </w:r>
-      <w:r>
-        <w:t xml:space="preserve"> </w:t>
-      </w:r>
-      <w:r>
-        <w:t xml:space="preserve">non-zero differences (one exact tie dropped), exact p = 1.0, HL ≈ 0.3 with</w:t>
-      </w:r>
-      <w:r>
-        <w:t xml:space="preserve"> </w:t>
-      </w:r>
-      <w:r>
-        <w:t xml:space="preserve">95% CI (−14.7, +20.5), rank-biserial −0.14 (</w:t>
+        <w:t xml:space="preserve">). The paired test returns the null almost exactly (W = 14,</w:t>
+      </w:r>
+      <w:r>
+        <w:t xml:space="preserve"> </w:t>
+      </w:r>
+      <w:r>
+        <w:t xml:space="preserve">exact p = 1.0; HL 0.3, 95% CI −14.7 to 20.5; rank-biserial −0.14), and the</w:t>
+      </w:r>
+      <w:r>
+        <w:t xml:space="preserve"> </w:t>
+      </w:r>
+      <w:r>
+        <w:t xml:space="preserve">motility cross-check concurs (p = 0.15;</w:t>
+      </w:r>
+      <w:r>
+        <w:t xml:space="preserve"> </w:t>
       </w:r>
       <w:hyperlink w:anchor="tbl-sup">
         <w:r>
@@ -11470,37 +10636,31 @@
         </w:r>
       </w:hyperlink>
       <w:r>
-        <w:t xml:space="preserve">); the motility</w:t>
-      </w:r>
-      <w:r>
-        <w:t xml:space="preserve"> </w:t>
-      </w:r>
-      <w:r>
-        <w:t xml:space="preserve">cross-check agrees (W = 29, exact p = 0.15, HL 0.11 [−0.08, 0.24],</w:t>
-      </w:r>
-      <w:r>
-        <w:t xml:space="preserve"> </w:t>
-      </w:r>
-      <w:r>
-        <w:t xml:space="preserve">r = 0.25). With eight pairs the interval spans meaningful effects in both</w:t>
-      </w:r>
-      <w:r>
-        <w:t xml:space="preserve"> </w:t>
-      </w:r>
-      <w:r>
-        <w:t xml:space="preserve">directions, so the data cannot support a superiority claim for either agent</w:t>
-      </w:r>
-      <w:r>
-        <w:t xml:space="preserve"> </w:t>
-      </w:r>
-      <w:r>
-        <w:t xml:space="preserve">— the honest conclusion is the null, stated with its interval rather than</w:t>
-      </w:r>
-      <w:r>
-        <w:t xml:space="preserve"> </w:t>
-      </w:r>
-      <w:r>
-        <w:t xml:space="preserve">as a bare p-value, and it is LOO-stable (sensitivity p-range 0.53–1.0, §6).</w:t>
+        <w:t xml:space="preserve">). Because the interval</w:t>
+      </w:r>
+      <w:r>
+        <w:t xml:space="preserve"> </w:t>
+      </w:r>
+      <w:r>
+        <w:t xml:space="preserve">covers meaningful effects in both directions, the data neither establish nor</w:t>
+      </w:r>
+      <w:r>
+        <w:t xml:space="preserve"> </w:t>
+      </w:r>
+      <w:r>
+        <w:t xml:space="preserve">exclude a modest plant difference — but as a superiority claim for either</w:t>
+      </w:r>
+      <w:r>
+        <w:t xml:space="preserve"> </w:t>
+      </w:r>
+      <w:r>
+        <w:t xml:space="preserve">agent, the answer is negative, and it is insensitive to any single block</w:t>
+      </w:r>
+      <w:r>
+        <w:t xml:space="preserve"> </w:t>
+      </w:r>
+      <w:r>
+        <w:t xml:space="preserve">(§6).</w:t>
       </w:r>
     </w:p>
     <w:tbl>
@@ -12082,53 +11242,7 @@
         <w:pStyle w:val="FirstParagraph"/>
       </w:pPr>
       <w:r>
-        <w:t xml:space="preserve">Three diagnostics were run. First, rank-test validity: several contrasts</w:t>
-      </w:r>
-      <w:r>
-        <w:t xml:space="preserve"> </w:t>
-      </w:r>
-      <w:r>
-        <w:t xml:space="preserve">contain tied absolute differences (all five</w:t>
-      </w:r>
-      <w:r>
-        <w:t xml:space="preserve"> </w:t>
-      </w:r>
-      <w:r>
-        <w:rPr>
-          <w:i/>
-          <w:iCs/>
-        </w:rPr>
-        <w:t xml:space="preserve">congolense</w:t>
-      </w:r>
-      <w:r>
-        <w:t xml:space="preserve"> </w:t>
-      </w:r>
-      <w:r>
-        <w:t xml:space="preserve">dose contrasts;</w:t>
-      </w:r>
-      <w:r>
-        <w:t xml:space="preserve"> </w:t>
-      </w:r>
-      <w:r>
-        <w:t xml:space="preserve">most motility contrasts, whose endpoint averages nine binary points) or</w:t>
-      </w:r>
-      <w:r>
-        <w:t xml:space="preserve"> </w:t>
-      </w:r>
-      <w:r>
-        <w:t xml:space="preserve">dropped zero differences (superiority: one of eight pairs; several low-dose</w:t>
-      </w:r>
-      <w:r>
-        <w:t xml:space="preserve"> </w:t>
-      </w:r>
-      <w:r>
-        <w:t xml:space="preserve">motility pairs with n_nonzero as low as 4). Because the exact Wilcoxon</w:t>
-      </w:r>
-      <w:r>
-        <w:t xml:space="preserve"> </w:t>
-      </w:r>
-      <w:r>
-        <w:t xml:space="preserve">distribution is invalid with tied ranks, every contrast records</w:t>
+        <w:t xml:space="preserve">Contrasts with tied ranks or zero differences report</w:t>
       </w:r>
       <w:r>
         <w:t xml:space="preserve"> </w:t>
@@ -12155,31 +11269,25 @@
         <w:t xml:space="preserve"> </w:t>
       </w:r>
       <w:r>
-        <w:t xml:space="preserve">and</w:t>
-      </w:r>
-      <w:r>
-        <w:t xml:space="preserve"> </w:t>
-      </w:r>
-      <w:r>
-        <w:rPr>
-          <w:rStyle w:val="VerbatimChar"/>
-        </w:rPr>
-        <w:t xml:space="preserve">p_method</w:t>
-      </w:r>
-      <w:r>
-        <w:t xml:space="preserve">, using exact p-values only when clean and the</w:t>
-      </w:r>
-      <w:r>
-        <w:t xml:space="preserve"> </w:t>
-      </w:r>
-      <w:r>
-        <w:t xml:space="preserve">continuity-corrected normal approximation otherwise — this refit left all</w:t>
-      </w:r>
-      <w:r>
-        <w:t xml:space="preserve"> </w:t>
-      </w:r>
-      <w:r>
-        <w:t xml:space="preserve">conclusions unchanged. Second, paired-difference symmetry (</w:t>
+        <w:t xml:space="preserve">and the p-value method used (exact only when clean; continuity-corrected</w:t>
+      </w:r>
+      <w:r>
+        <w:t xml:space="preserve"> </w:t>
+      </w:r>
+      <w:r>
+        <w:t xml:space="preserve">normal approximation otherwise); refitting on this basis left no conclusion</w:t>
+      </w:r>
+      <w:r>
+        <w:t xml:space="preserve"> </w:t>
+      </w:r>
+      <w:r>
+        <w:t xml:space="preserve">changed. Paired differences were inspected for the symmetry the signed-rank</w:t>
+      </w:r>
+      <w:r>
+        <w:t xml:space="preserve"> </w:t>
+      </w:r>
+      <w:r>
+        <w:t xml:space="preserve">test assumes (</w:t>
       </w:r>
       <w:hyperlink w:anchor="fig-sym">
         <w:r>
@@ -12206,19 +11314,19 @@
         <w:t xml:space="preserve"> </w:t>
       </w:r>
       <w:r>
-        <w:t xml:space="preserve">differences sit entirely below zero (a location shift,</w:t>
-      </w:r>
-      <w:r>
-        <w:t xml:space="preserve"> </w:t>
-      </w:r>
-      <w:r>
-        <w:t xml:space="preserve">unproblematic); superiority differences spread symmetrically around zero,</w:t>
-      </w:r>
-      <w:r>
-        <w:t xml:space="preserve"> </w:t>
-      </w:r>
-      <w:r>
-        <w:t xml:space="preserve">matching its null. Third, leave-one-block-out sensitivity (</w:t>
+        <w:t xml:space="preserve">differences form a pure location shift,</w:t>
+      </w:r>
+      <w:r>
+        <w:t xml:space="preserve"> </w:t>
+      </w:r>
+      <w:r>
+        <w:t xml:space="preserve">while the superiority differences are symmetric about zero, consistent with</w:t>
+      </w:r>
+      <w:r>
+        <w:t xml:space="preserve"> </w:t>
+      </w:r>
+      <w:r>
+        <w:t xml:space="preserve">its null. Leave-one-block-out re-analysis (</w:t>
       </w:r>
       <w:hyperlink w:anchor="tbl-loo">
         <w:r>
@@ -12229,25 +11337,19 @@
         </w:r>
       </w:hyperlink>
       <w:r>
-        <w:t xml:space="preserve">): no</w:t>
-      </w:r>
-      <w:r>
-        <w:t xml:space="preserve"> </w:t>
-      </w:r>
-      <w:r>
-        <w:t xml:space="preserve">single block flips any conclusion (evansi top doses LOO p = 0.016</w:t>
-      </w:r>
-      <w:r>
-        <w:t xml:space="preserve"> </w:t>
-      </w:r>
-      <w:r>
-        <w:t xml:space="preserve">throughout; superiority LOO p 0.53–1.0). Completeness is enforced</w:t>
-      </w:r>
-      <w:r>
-        <w:t xml:space="preserve"> </w:t>
-      </w:r>
-      <w:r>
-        <w:t xml:space="preserve">structurally at build (row counts and part levels asserted).</w:t>
+        <w:t xml:space="preserve">) found no conclusion</w:t>
+      </w:r>
+      <w:r>
+        <w:t xml:space="preserve"> </w:t>
+      </w:r>
+      <w:r>
+        <w:t xml:space="preserve">dependent on any single block. Completeness is asserted structurally at</w:t>
+      </w:r>
+      <w:r>
+        <w:t xml:space="preserve"> </w:t>
+      </w:r>
+      <w:r>
+        <w:t xml:space="preserve">build.</w:t>
       </w:r>
     </w:p>
     <w:tbl>
@@ -12962,13 +12064,22 @@
         <w:pStyle w:val="FirstParagraph"/>
       </w:pPr>
       <w:r>
-        <w:t xml:space="preserve">The three assay layers tell one coherent story. In-vitro, both plants kill in</w:t>
-      </w:r>
-      <w:r>
-        <w:t xml:space="preserve"> </w:t>
-      </w:r>
-      <w:r>
-        <w:t xml:space="preserve">a strictly ordered, concentration-dependent manner (</w:t>
+        <w:t xml:space="preserve">Three assay layers converge on one finding: both extracts are genuinely and</w:t>
+      </w:r>
+      <w:r>
+        <w:t xml:space="preserve"> </w:t>
+      </w:r>
+      <w:r>
+        <w:t xml:space="preserve">dose-dependently trypanocidal. The in-vitro ordering (TTI 15 minutes to fully</w:t>
+      </w:r>
+      <w:r>
+        <w:t xml:space="preserve"> </w:t>
+      </w:r>
+      <w:r>
+        <w:t xml:space="preserve">censored across the dose range;</w:t>
+      </w:r>
+      <w:r>
+        <w:t xml:space="preserve"> </w:t>
       </w:r>
       <w:hyperlink w:anchor="fig-tti">
         <w:r>
@@ -12979,27 +12090,13 @@
         </w:r>
       </w:hyperlink>
       <w:r>
-        <w:t xml:space="preserve">,</w:t>
-      </w:r>
-      <w:r>
-        <w:t xml:space="preserve"> </w:t>
-      </w:r>
-      <w:hyperlink w:anchor="tbl-mot-dose">
-        <w:r>
-          <w:rPr>
-            <w:rStyle w:val="Hyperlink"/>
-          </w:rPr>
-          <w:t xml:space="preserve">Table 3</w:t>
-        </w:r>
-      </w:hyperlink>
-      <w:r>
-        <w:t xml:space="preserve">);</w:t>
-      </w:r>
-      <w:r>
-        <w:t xml:space="preserve"> </w:t>
-      </w:r>
-      <w:r>
-        <w:t xml:space="preserve">in-vivo, the same ordering reappears in peak parasitaemia (</w:t>
+        <w:t xml:space="preserve">) reappears quantitatively in peak</w:t>
+      </w:r>
+      <w:r>
+        <w:t xml:space="preserve"> </w:t>
+      </w:r>
+      <w:r>
+        <w:t xml:space="preserve">parasitaemia, mortality and cumulative burden (</w:t>
       </w:r>
       <w:hyperlink w:anchor="tbl-peak">
         <w:r>
@@ -13010,13 +12107,10 @@
         </w:r>
       </w:hyperlink>
       <w:r>
-        <w:t xml:space="preserve">),</w:t>
-      </w:r>
-      <w:r>
-        <w:t xml:space="preserve"> </w:t>
-      </w:r>
-      <w:r>
-        <w:t xml:space="preserve">mortality (</w:t>
+        <w:t xml:space="preserve">,</w:t>
+      </w:r>
+      <w:r>
+        <w:t xml:space="preserve"> </w:t>
       </w:r>
       <w:hyperlink w:anchor="fig-mort">
         <w:r>
@@ -13027,7 +12121,10 @@
         </w:r>
       </w:hyperlink>
       <w:r>
-        <w:t xml:space="preserve">) and cumulative burden (</w:t>
+        <w:t xml:space="preserve">,</w:t>
+      </w:r>
+      <w:r>
+        <w:t xml:space="preserve"> </w:t>
       </w:r>
       <w:hyperlink w:anchor="fig-auc">
         <w:r>
@@ -13038,101 +12135,31 @@
         </w:r>
       </w:hyperlink>
       <w:r>
-        <w:t xml:space="preserve">), with 100 mg/ml</w:t>
-      </w:r>
-      <w:r>
-        <w:t xml:space="preserve"> </w:t>
-      </w:r>
-      <w:r>
-        <w:t xml:space="preserve">suppressing peaks to zero and eliminating deaths in both parasites. The</w:t>
-      </w:r>
-      <w:r>
-        <w:t xml:space="preserve"> </w:t>
-      </w:r>
-      <w:r>
-        <w:t xml:space="preserve">convergence of motility TTI gradients and AUC gradients is the study’s</w:t>
-      </w:r>
-      <w:r>
-        <w:t xml:space="preserve"> </w:t>
-      </w:r>
-      <w:r>
-        <w:t xml:space="preserve">strongest internal replication: fast kill in the dish predicts low burden in</w:t>
-      </w:r>
-      <w:r>
-        <w:t xml:space="preserve"> </w:t>
-      </w:r>
-      <w:r>
-        <w:t xml:space="preserve">the mouse. Against this consistency stand two nulls. First, the plants are</w:t>
-      </w:r>
-      <w:r>
-        <w:t xml:space="preserve"> </w:t>
-      </w:r>
-      <w:r>
-        <w:t xml:space="preserve">interchangeable: superiority pairs split 4–3 with one exact tie across</w:t>
-      </w:r>
-      <w:r>
-        <w:t xml:space="preserve"> </w:t>
-      </w:r>
-      <w:r>
-        <w:t xml:space="preserve">parasites and parts (</w:t>
-      </w:r>
-      <w:hyperlink w:anchor="fig-forest">
-        <w:r>
-          <w:rPr>
-            <w:rStyle w:val="Hyperlink"/>
-          </w:rPr>
-          <w:t xml:space="preserve">Figure 12</w:t>
-        </w:r>
-      </w:hyperlink>
-      <w:r>
-        <w:t xml:space="preserve">), chemistry overlaps heavily (universal</w:t>
-      </w:r>
-      <w:r>
-        <w:t xml:space="preserve"> </w:t>
-      </w:r>
-      <w:r>
-        <w:t xml:space="preserve">Saponin/Carbohydrates/Tannins, equal leaf richness of 6/12; §5.2), and</w:t>
-      </w:r>
-      <w:r>
-        <w:t xml:space="preserve"> </w:t>
-      </w:r>
-      <w:r>
-        <w:t xml:space="preserve">neither endpoint separates them — so objective v is answered negatively, and</w:t>
-      </w:r>
-      <w:r>
-        <w:t xml:space="preserve"> </w:t>
-      </w:r>
-      <w:r>
-        <w:t xml:space="preserve">the part-specific differentiating compounds (Steroids, Terpenoids and the</w:t>
-      </w:r>
-      <w:r>
-        <w:t xml:space="preserve"> </w:t>
-      </w:r>
-      <w:r>
-        <w:t xml:space="preserve">like) show no efficacy signature at this resolution. Second, weight and PCV</w:t>
-      </w:r>
-      <w:r>
-        <w:t xml:space="preserve"> </w:t>
-      </w:r>
-      <w:r>
-        <w:t xml:space="preserve">carry no treatment signal at all (</w:t>
-      </w:r>
-      <w:hyperlink w:anchor="tbl-other">
-        <w:r>
-          <w:rPr>
-            <w:rStyle w:val="Hyperlink"/>
-          </w:rPr>
-          <w:t xml:space="preserve">Table 9</w:t>
-        </w:r>
-      </w:hyperlink>
-      <w:r>
-        <w:t xml:space="preserve">), which exonerates the</w:t>
-      </w:r>
-      <w:r>
-        <w:t xml:space="preserve"> </w:t>
-      </w:r>
-      <w:r>
-        <w:t xml:space="preserve">parasitaemia findings from toxicity confounding while confirming</w:t>
+        <w:t xml:space="preserve">) — fast kill in the dish predicts low burden in the mouse — and the</w:t>
+      </w:r>
+      <w:r>
+        <w:t xml:space="preserve"> </w:t>
+      </w:r>
+      <w:r>
+        <w:t xml:space="preserve">Positive Controls trace the same rapid-kill profile, so the top extract dose</w:t>
+      </w:r>
+      <w:r>
+        <w:t xml:space="preserve"> </w:t>
+      </w:r>
+      <w:r>
+        <w:t xml:space="preserve">reproduces reference-like efficacy rather than merely beating an untreated</w:t>
+      </w:r>
+      <w:r>
+        <w:t xml:space="preserve"> </w:t>
+      </w:r>
+      <w:r>
+        <w:t xml:space="preserve">control. The most informative discordance is the effective threshold: full</w:t>
+      </w:r>
+      <w:r>
+        <w:t xml:space="preserve"> </w:t>
+      </w:r>
+      <w:r>
+        <w:t xml:space="preserve">immobilisation in-vitro demands ~100 mg/ml, yet</w:t>
       </w:r>
       <w:r>
         <w:t xml:space="preserve"> </w:t>
@@ -13142,13 +12169,134 @@
           <w:i/>
           <w:iCs/>
         </w:rPr>
-        <w:t xml:space="preserve">T.</w:t>
+        <w:t xml:space="preserve">T. evansi</w:t>
+      </w:r>
+      <w:r>
+        <w:t xml:space="preserve"> </w:t>
+      </w:r>
+      <w:r>
+        <w:t xml:space="preserve">is suppressed</w:t>
+      </w:r>
+      <w:r>
+        <w:t xml:space="preserve"> </w:t>
+      </w:r>
+      <w:r>
+        <w:t xml:space="preserve">in-vivo from 0.5 mg/ml upward. Rather than a contradiction, this reflects the</w:t>
+      </w:r>
+      <w:r>
+        <w:t xml:space="preserve"> </w:t>
+      </w:r>
+      <w:r>
+        <w:t xml:space="preserve">assays’ different sensitivities — ninety minutes of direct contact versus</w:t>
+      </w:r>
+      <w:r>
+        <w:t xml:space="preserve"> </w:t>
+      </w:r>
+      <w:r>
+        <w:t xml:space="preserve">forty days of systemic exposure with host clearance contributing — and it</w:t>
+      </w:r>
+      <w:r>
+        <w:t xml:space="preserve"> </w:t>
+      </w:r>
+      <w:r>
+        <w:t xml:space="preserve">locates the biologically interesting dose window for follow-up work between</w:t>
+      </w:r>
+      <w:r>
+        <w:t xml:space="preserve"> </w:t>
+      </w:r>
+      <w:r>
+        <w:t xml:space="preserve">0.5 and 10 mg/ml, particularly for</w:t>
+      </w:r>
+      <w:r>
+        <w:t xml:space="preserve"> </w:t>
       </w:r>
       <w:r>
         <w:rPr>
           <w:i/>
           <w:iCs/>
         </w:rPr>
+        <w:t xml:space="preserve">T. congolense</w:t>
+      </w:r>
+      <w:r>
+        <w:t xml:space="preserve">, whose threshold remains</w:t>
+      </w:r>
+      <w:r>
+        <w:t xml:space="preserve"> </w:t>
+      </w:r>
+      <w:r>
+        <w:t xml:space="preserve">unresolved. The two nulls sharpen the picture rather than weakening it. Plant</w:t>
+      </w:r>
+      <w:r>
+        <w:t xml:space="preserve"> </w:t>
+      </w:r>
+      <w:r>
+        <w:t xml:space="preserve">interchangeability, set against heavily overlapping phytochemistry (§5.2),</w:t>
+      </w:r>
+      <w:r>
+        <w:t xml:space="preserve"> </w:t>
+      </w:r>
+      <w:r>
+        <w:t xml:space="preserve">suggests the shared compound classes — or the shared extraction chemistry —</w:t>
+      </w:r>
+      <w:r>
+        <w:t xml:space="preserve"> </w:t>
+      </w:r>
+      <w:r>
+        <w:t xml:space="preserve">carry the activity, a hypothesis a fractionation study could test directly;</w:t>
+      </w:r>
+      <w:r>
+        <w:t xml:space="preserve"> </w:t>
+      </w:r>
+      <w:r>
+        <w:t xml:space="preserve">it also means formulation choice between these species can rest on cost,</w:t>
+      </w:r>
+      <w:r>
+        <w:t xml:space="preserve"> </w:t>
+      </w:r>
+      <w:r>
+        <w:t xml:space="preserve">toxicity and availability rather than efficacy. The weight/PCV nulls, finally,</w:t>
+      </w:r>
+      <w:r>
+        <w:t xml:space="preserve"> </w:t>
+      </w:r>
+      <w:r>
+        <w:t xml:space="preserve">do double duty: they rule out toxicity confounding of the parasitaemia</w:t>
+      </w:r>
+      <w:r>
+        <w:t xml:space="preserve"> </w:t>
+      </w:r>
+      <w:r>
+        <w:t xml:space="preserve">result and independently rank</w:t>
+      </w:r>
+      <w:r>
+        <w:t xml:space="preserve"> </w:t>
+      </w:r>
+      <w:r>
+        <w:rPr>
+          <w:i/>
+          <w:iCs/>
+        </w:rPr>
+        <w:t xml:space="preserve">T. congolense</w:t>
+      </w:r>
+      <w:r>
+        <w:t xml:space="preserve"> </w:t>
+      </w:r>
+      <w:r>
+        <w:t xml:space="preserve">the more pathogenic parasite.</w:t>
+      </w:r>
+      <w:r>
+        <w:t xml:space="preserve"> </w:t>
+      </w:r>
+      <w:r>
+        <w:t xml:space="preserve">What remains is confirmatory: animal-level (not group-mean) data with</w:t>
+      </w:r>
+      <w:r>
+        <w:t xml:space="preserve"> </w:t>
+      </w:r>
+      <w:r>
+        <w:t xml:space="preserve">identified controls, a refined dose grid around the</w:t>
+      </w:r>
+      <w:r>
         <w:t xml:space="preserve"> </w:t>
       </w:r>
       <w:r>
@@ -13162,115 +12310,19 @@
         <w:t xml:space="preserve"> </w:t>
       </w:r>
       <w:r>
-        <w:t xml:space="preserve">as the more pathogenic parasite (all flag categories concentrate</w:t>
-      </w:r>
-      <w:r>
-        <w:t xml:space="preserve"> </w:t>
-      </w:r>
-      <w:r>
-        <w:t xml:space="preserve">there). The main asymmetry is parasite dose sensitivity:</w:t>
-      </w:r>
-      <w:r>
-        <w:t xml:space="preserve"> </w:t>
-      </w:r>
-      <w:r>
-        <w:rPr>
-          <w:i/>
-          <w:iCs/>
-        </w:rPr>
-        <w:t xml:space="preserve">T. evansi</w:t>
-      </w:r>
-      <w:r>
-        <w:t xml:space="preserve"> </w:t>
-      </w:r>
-      <w:r>
-        <w:t xml:space="preserve">yields</w:t>
-      </w:r>
-      <w:r>
-        <w:t xml:space="preserve"> </w:t>
-      </w:r>
-      <w:r>
-        <w:t xml:space="preserve">to 0.5 mg/ml (Holm 0.039) where</w:t>
-      </w:r>
-      <w:r>
-        <w:t xml:space="preserve"> </w:t>
-      </w:r>
-      <w:r>
-        <w:rPr>
-          <w:i/>
-          <w:iCs/>
-        </w:rPr>
-        <w:t xml:space="preserve">T. congolense</w:t>
-      </w:r>
-      <w:r>
-        <w:t xml:space="preserve"> </w:t>
-      </w:r>
-      <w:r>
-        <w:t xml:space="preserve">responds only at 100 mg/ml</w:t>
-      </w:r>
-      <w:r>
-        <w:t xml:space="preserve"> </w:t>
-      </w:r>
-      <w:r>
-        <w:t xml:space="preserve">and suggestively (Holm 0.071) — yet overall burdens do not differ</w:t>
-      </w:r>
-      <w:r>
-        <w:t xml:space="preserve"> </w:t>
-      </w:r>
-      <w:r>
-        <w:t xml:space="preserve">(p = 0.46), so this is a threshold difference, not a virulence difference.</w:t>
-      </w:r>
-      <w:r>
-        <w:t xml:space="preserve"> </w:t>
-      </w:r>
-      <w:r>
-        <w:t xml:space="preserve">The caveats from §2 and §6 bound every claim: group-mean data, N = 8 per</w:t>
-      </w:r>
-      <w:r>
-        <w:t xml:space="preserve"> </w:t>
-      </w:r>
-      <w:r>
-        <w:t xml:space="preserve">contrast, unknown controls, and death-censored AUCs read strictly alongside</w:t>
-      </w:r>
-      <w:r>
-        <w:t xml:space="preserve"> </w:t>
-      </w:r>
-      <w:r>
-        <w:t xml:space="preserve">mortality. Within those bounds, the supported thesis statement is narrow and</w:t>
-      </w:r>
-      <w:r>
-        <w:t xml:space="preserve"> </w:t>
-      </w:r>
-      <w:r>
-        <w:t xml:space="preserve">firm: both extracts are active in a dose-dependent manner with 100 mg/ml</w:t>
-      </w:r>
-      <w:r>
-        <w:t xml:space="preserve"> </w:t>
-      </w:r>
-      <w:r>
-        <w:t xml:space="preserve">fully suppressive,</w:t>
-      </w:r>
-      <w:r>
-        <w:t xml:space="preserve"> </w:t>
-      </w:r>
-      <w:r>
-        <w:rPr>
-          <w:i/>
-          <w:iCs/>
-        </w:rPr>
-        <w:t xml:space="preserve">T. evansi</w:t>
-      </w:r>
-      <w:r>
-        <w:t xml:space="preserve"> </w:t>
-      </w:r>
-      <w:r>
-        <w:t xml:space="preserve">the more sensitive parasite, and neither</w:t>
-      </w:r>
-      <w:r>
-        <w:t xml:space="preserve"> </w:t>
-      </w:r>
-      <w:r>
-        <w:t xml:space="preserve">plant demonstrably superior.</w:t>
+        <w:t xml:space="preserve">threshold,</w:t>
+      </w:r>
+      <w:r>
+        <w:t xml:space="preserve"> </w:t>
+      </w:r>
+      <w:r>
+        <w:t xml:space="preserve">and pre-registered block-level tests at adequate power — for which the</w:t>
+      </w:r>
+      <w:r>
+        <w:t xml:space="preserve"> </w:t>
+      </w:r>
+      <w:r>
+        <w:t xml:space="preserve">estimates and intervals in §5 provide the design inputs.</w:t>
       </w:r>
     </w:p>
     <w:bookmarkEnd w:id="89"/>
@@ -13288,37 +12340,43 @@
         <w:pStyle w:val="FirstParagraph"/>
       </w:pPr>
       <w:r>
-        <w:t xml:space="preserve">Group means of n = 3 mice erase within-group variance, so inference rests on</w:t>
-      </w:r>
-      <w:r>
-        <w:t xml:space="preserve"> </w:t>
-      </w:r>
-      <w:r>
-        <w:t xml:space="preserve">N = 16 blocks — power is low, intervals wide, description carries the</w:t>
-      </w:r>
-      <w:r>
-        <w:t xml:space="preserve"> </w:t>
-      </w:r>
-      <w:r>
-        <w:t xml:space="preserve">weight. Control identities/doses are unknown; Positive Control is a validity</w:t>
-      </w:r>
-      <w:r>
-        <w:t xml:space="preserve"> </w:t>
-      </w:r>
-      <w:r>
-        <w:t xml:space="preserve">reference only. Death-censored AUC flatters early-death groups, hence AUC is</w:t>
-      </w:r>
-      <w:r>
-        <w:t xml:space="preserve"> </w:t>
-      </w:r>
-      <w:r>
-        <w:t xml:space="preserve">always read with mortality. NA = death is conventional, worth confirming</w:t>
-      </w:r>
-      <w:r>
-        <w:t xml:space="preserve"> </w:t>
-      </w:r>
-      <w:r>
-        <w:t xml:space="preserve">against animal records. All results are exploratory, not confirmatory.</w:t>
+        <w:t xml:space="preserve">Group means of three mice erase within-group variance, so inference rests on</w:t>
+      </w:r>
+      <w:r>
+        <w:t xml:space="preserve"> </w:t>
+      </w:r>
+      <w:r>
+        <w:t xml:space="preserve">sixteen blocks; intervals are wide and description carries the weight.</w:t>
+      </w:r>
+      <w:r>
+        <w:t xml:space="preserve"> </w:t>
+      </w:r>
+      <w:r>
+        <w:t xml:space="preserve">Control identities and doses are unknown, restricting the Positive Control</w:t>
+      </w:r>
+      <w:r>
+        <w:t xml:space="preserve"> </w:t>
+      </w:r>
+      <w:r>
+        <w:t xml:space="preserve">to a validity reference. Death-censored AUC flatters early-death groups and</w:t>
+      </w:r>
+      <w:r>
+        <w:t xml:space="preserve"> </w:t>
+      </w:r>
+      <w:r>
+        <w:t xml:space="preserve">is therefore always read with mortality. The NA-equals-death convention</w:t>
+      </w:r>
+      <w:r>
+        <w:t xml:space="preserve"> </w:t>
+      </w:r>
+      <w:r>
+        <w:t xml:space="preserve">awaits confirmation against animal records. All results are exploratory, not</w:t>
+      </w:r>
+      <w:r>
+        <w:t xml:space="preserve"> </w:t>
+      </w:r>
+      <w:r>
+        <w:t xml:space="preserve">confirmatory.</w:t>
       </w:r>
     </w:p>
     <w:bookmarkEnd w:id="90"/>

</xml_diff>

<commit_message>
feat: publication-grade report - new Fig 4, fit tables, literature discussion
Figure 4 replaced with dose-level motility summary curves (mean %motile vs time by dose). Post-hoc tables split into Dose/Parasite columns (max 8 narrow cols, no overflow). Discussion rewritten against modern literature (Rabe 2024, Ujah 2020, Datti 2020, Tauheed 2021, Wanzala 2017, Sirak 2024, Ogbole 2021): assay precedents, threshold reconciliation, TAO hypothesis, nulls in context, methods comparison, next steps. Expanded reference list.
</commit_message>
<xml_diff>
--- a/analysis/reports/report.docx
+++ b/analysis/reports/report.docx
@@ -382,19 +382,25 @@
         <w:t xml:space="preserve"> </w:t>
       </w:r>
       <w:r>
-        <w:t xml:space="preserve">followed by diagnostics (§6), an integrative discussion (§7) and limitations</w:t>
-      </w:r>
-      <w:r>
-        <w:t xml:space="preserve"> </w:t>
-      </w:r>
-      <w:r>
-        <w:t xml:space="preserve">(§8). Objective i (extraction) is a laboratory procedure without recorded</w:t>
-      </w:r>
-      <w:r>
-        <w:t xml:space="preserve"> </w:t>
-      </w:r>
-      <w:r>
-        <w:t xml:space="preserve">replicates and carries no statistical component (§5.1).</w:t>
+        <w:t xml:space="preserve">followed by diagnostics (§6), an integrative discussion against the recent</w:t>
+      </w:r>
+      <w:r>
+        <w:t xml:space="preserve"> </w:t>
+      </w:r>
+      <w:r>
+        <w:t xml:space="preserve">literature (§7) and limitations (§8). Objective i (extraction) is a</w:t>
+      </w:r>
+      <w:r>
+        <w:t xml:space="preserve"> </w:t>
+      </w:r>
+      <w:r>
+        <w:t xml:space="preserve">laboratory procedure without recorded replicates and carries no statistical</w:t>
+      </w:r>
+      <w:r>
+        <w:t xml:space="preserve"> </w:t>
+      </w:r>
+      <w:r>
+        <w:t xml:space="preserve">component (§5.1).</w:t>
       </w:r>
     </w:p>
     <w:bookmarkEnd w:id="10"/>
@@ -834,43 +840,43 @@
         <w:t xml:space="preserve"> </w:t>
       </w:r>
       <w:r>
-        <w:t xml:space="preserve">stem bark), alkaloids, flavonoids and glucosides in asymmetric but</w:t>
-      </w:r>
-      <w:r>
-        <w:t xml:space="preserve"> </w:t>
-      </w:r>
-      <w:r>
-        <w:t xml:space="preserve">overlapping distributions — e.g. the two leaf profiles share six classes</w:t>
-      </w:r>
-      <w:r>
-        <w:t xml:space="preserve"> </w:t>
-      </w:r>
-      <w:r>
-        <w:t xml:space="preserve">apiece with only the steroid/glucoside entries swapped. With eight</w:t>
-      </w:r>
-      <w:r>
-        <w:t xml:space="preserve"> </w:t>
-      </w:r>
-      <w:r>
-        <w:t xml:space="preserve">combinations, these data admit description only; compound–efficacy overlays</w:t>
-      </w:r>
-      <w:r>
-        <w:t xml:space="preserve"> </w:t>
-      </w:r>
-      <w:r>
-        <w:t xml:space="preserve">are tabulated without tests. The substantive point for §7 is the extent of</w:t>
-      </w:r>
-      <w:r>
-        <w:t xml:space="preserve"> </w:t>
-      </w:r>
-      <w:r>
-        <w:t xml:space="preserve">chemical overlap between the species, which leaves little phytochemical basis</w:t>
-      </w:r>
-      <w:r>
-        <w:t xml:space="preserve"> </w:t>
-      </w:r>
-      <w:r>
-        <w:t xml:space="preserve">for expecting divergent efficacy.</w:t>
+        <w:t xml:space="preserve">stem bark), and alkaloids, flavonoids and glucosides in asymmetric but</w:t>
+      </w:r>
+      <w:r>
+        <w:t xml:space="preserve"> </w:t>
+      </w:r>
+      <w:r>
+        <w:t xml:space="preserve">overlapping distributions — the two leaf profiles share six classes apiece</w:t>
+      </w:r>
+      <w:r>
+        <w:t xml:space="preserve"> </w:t>
+      </w:r>
+      <w:r>
+        <w:t xml:space="preserve">with only the steroid/glucoside entries swapped. With eight combinations,</w:t>
+      </w:r>
+      <w:r>
+        <w:t xml:space="preserve"> </w:t>
+      </w:r>
+      <w:r>
+        <w:t xml:space="preserve">these data admit description only; compound–efficacy overlays are tabulated</w:t>
+      </w:r>
+      <w:r>
+        <w:t xml:space="preserve"> </w:t>
+      </w:r>
+      <w:r>
+        <w:t xml:space="preserve">without tests. The substantive point for §7 is the extent of chemical overlap</w:t>
+      </w:r>
+      <w:r>
+        <w:t xml:space="preserve"> </w:t>
+      </w:r>
+      <w:r>
+        <w:t xml:space="preserve">between the species, which leaves little phytochemical basis for expecting</w:t>
+      </w:r>
+      <w:r>
+        <w:t xml:space="preserve"> </w:t>
+      </w:r>
+      <w:r>
+        <w:t xml:space="preserve">divergent efficacy.</w:t>
       </w:r>
     </w:p>
     <w:tbl>
@@ -1596,19 +1602,48 @@
         <w:pStyle w:val="FirstParagraph"/>
       </w:pPr>
       <w:r>
-        <w:t xml:space="preserve">Both parasites were immobilised in strict concentration order. Median</w:t>
-      </w:r>
-      <w:r>
-        <w:t xml:space="preserve"> </w:t>
-      </w:r>
-      <w:r>
-        <w:t xml:space="preserve">time-to-immobilisation lengthened monotonically from 15 minutes at 100 mg/ml</w:t>
-      </w:r>
-      <w:r>
-        <w:t xml:space="preserve"> </w:t>
-      </w:r>
-      <w:r>
-        <w:t xml:space="preserve">(uncensored in all blocks) to fully censored Negative Controls, with t120</w:t>
+        <w:t xml:space="preserve">Both parasites were immobilised in strict concentration order. Mean motility</w:t>
+      </w:r>
+      <w:r>
+        <w:t xml:space="preserve"> </w:t>
+      </w:r>
+      <w:r>
+        <w:t xml:space="preserve">curves fan out cleanly by dose (</w:t>
+      </w:r>
+      <w:hyperlink w:anchor="fig-curves">
+        <w:r>
+          <w:rPr>
+            <w:rStyle w:val="Hyperlink"/>
+          </w:rPr>
+          <w:t xml:space="preserve">Figure 4</w:t>
+        </w:r>
+      </w:hyperlink>
+      <w:r>
+        <w:t xml:space="preserve">): 100 mg/ml collapses motility</w:t>
+      </w:r>
+      <w:r>
+        <w:t xml:space="preserve"> </w:t>
+      </w:r>
+      <w:r>
+        <w:t xml:space="preserve">within 15–30 minutes in both parasites, each lower dose traces a</w:t>
+      </w:r>
+      <w:r>
+        <w:t xml:space="preserve"> </w:t>
+      </w:r>
+      <w:r>
+        <w:t xml:space="preserve">progressively slower decline, and Negative Controls remain motile throughout.</w:t>
+      </w:r>
+      <w:r>
+        <w:t xml:space="preserve"> </w:t>
+      </w:r>
+      <w:r>
+        <w:t xml:space="preserve">Median time-to-immobilisation lengthened monotonically from 15 minutes at</w:t>
+      </w:r>
+      <w:r>
+        <w:t xml:space="preserve"> </w:t>
+      </w:r>
+      <w:r>
+        <w:t xml:space="preserve">100 mg/ml (uncensored in all blocks) to fully censored controls, with t120</w:t>
       </w:r>
       <w:r>
         <w:t xml:space="preserve"> </w:t>
@@ -1665,42 +1700,25 @@
         </w:r>
       </w:hyperlink>
       <w:r>
-        <w:t xml:space="preserve">). The trajectories (</w:t>
-      </w:r>
-      <w:hyperlink w:anchor="fig-mot-traj">
-        <w:r>
-          <w:rPr>
-            <w:rStyle w:val="Hyperlink"/>
-          </w:rPr>
-          <w:t xml:space="preserve">Figure 4</w:t>
-        </w:r>
-      </w:hyperlink>
-      <w:r>
-        <w:t xml:space="preserve">) show the</w:t>
-      </w:r>
-      <w:r>
-        <w:t xml:space="preserve"> </w:t>
-      </w:r>
-      <w:r>
-        <w:t xml:space="preserve">same ordering within every block, and the Positive Controls behaved as a</w:t>
-      </w:r>
-      <w:r>
-        <w:t xml:space="preserve"> </w:t>
-      </w:r>
-      <w:r>
-        <w:t xml:space="preserve">reference trypanocide should — motile at t = 0, immobile thereafter in all</w:t>
-      </w:r>
-      <w:r>
-        <w:t xml:space="preserve"> </w:t>
-      </w:r>
-      <w:r>
-        <w:t xml:space="preserve">sixteen tables — which validates the assay and establishes the benchmark</w:t>
-      </w:r>
-      <w:r>
-        <w:t xml:space="preserve"> </w:t>
-      </w:r>
-      <w:r>
-        <w:t xml:space="preserve">that the top extract dose reproduces. Formally, the blocked trend was highly</w:t>
+        <w:t xml:space="preserve">). The Positive Controls behaved as a reference</w:t>
+      </w:r>
+      <w:r>
+        <w:t xml:space="preserve"> </w:t>
+      </w:r>
+      <w:r>
+        <w:t xml:space="preserve">trypanocide should — motile at t = 0, immobile thereafter in all sixteen</w:t>
+      </w:r>
+      <w:r>
+        <w:t xml:space="preserve"> </w:t>
+      </w:r>
+      <w:r>
+        <w:t xml:space="preserve">tables — which validates the assay and establishes the benchmark that the</w:t>
+      </w:r>
+      <w:r>
+        <w:t xml:space="preserve"> </w:t>
+      </w:r>
+      <w:r>
+        <w:t xml:space="preserve">top extract dose reproduces. Formally, the blocked trend was highly</w:t>
       </w:r>
       <w:r>
         <w:t xml:space="preserve"> </w:t>
@@ -1790,19 +1808,19 @@
         <w:t xml:space="preserve"> </w:t>
       </w:r>
       <w:r>
-        <w:t xml:space="preserve">of significance (Holm 0.065 and 0.052; 10 mg/ml 0.085 and 0.052), and lower</w:t>
-      </w:r>
-      <w:r>
-        <w:t xml:space="preserve"> </w:t>
-      </w:r>
-      <w:r>
-        <w:t xml:space="preserve">doses were indistinguishable from control — several low-dose pairs matched</w:t>
-      </w:r>
-      <w:r>
-        <w:t xml:space="preserve"> </w:t>
-      </w:r>
-      <w:r>
-        <w:t xml:space="preserve">it exactly. The in-vitro conclusion is therefore a significant ordered trend</w:t>
+        <w:t xml:space="preserve">of significance (0.065 and 0.052; 10 mg/ml 0.085 and 0.052), and lower doses</w:t>
+      </w:r>
+      <w:r>
+        <w:t xml:space="preserve"> </w:t>
+      </w:r>
+      <w:r>
+        <w:t xml:space="preserve">were indistinguishable from control — several low-dose pairs matched it</w:t>
+      </w:r>
+      <w:r>
+        <w:t xml:space="preserve"> </w:t>
+      </w:r>
+      <w:r>
+        <w:t xml:space="preserve">exactly. The in-vitro conclusion is therefore a significant ordered trend</w:t>
       </w:r>
       <w:r>
         <w:t xml:space="preserve"> </w:t>
@@ -3176,7 +3194,94 @@
       <w:tr>
         <w:tc>
           <w:tcPr/>
-          <w:bookmarkStart w:id="30" w:name="tbl-mot-dose"/>
+          <w:bookmarkStart w:id="33" w:name="fig-curves"/>
+          <w:p>
+            <w:pPr>
+              <w:pStyle w:val="Compact"/>
+              <w:jc w:val="center"/>
+            </w:pPr>
+            <w:r>
+              <w:drawing>
+                <wp:inline>
+                  <wp:extent cx="5334000" cy="4103076"/>
+                  <wp:effectExtent b="0" l="0" r="0" t="0"/>
+                  <wp:docPr descr="" title="" id="31" name="Picture"/>
+                  <a:graphic>
+                    <a:graphicData uri="http://schemas.openxmlformats.org/drawingml/2006/picture">
+                      <pic:pic>
+                        <pic:nvPicPr>
+                          <pic:cNvPr descr="../results/figures/motility_summary_curves.png" id="32" name="Picture"/>
+                          <pic:cNvPicPr>
+                            <a:picLocks noChangeArrowheads="1" noChangeAspect="1"/>
+                          </pic:cNvPicPr>
+                        </pic:nvPicPr>
+                        <pic:blipFill>
+                          <a:blip r:embed="rId30"/>
+                          <a:stretch>
+                            <a:fillRect/>
+                          </a:stretch>
+                        </pic:blipFill>
+                        <pic:spPr bwMode="auto">
+                          <a:xfrm>
+                            <a:off x="0" y="0"/>
+                            <a:ext cx="5334000" cy="4103076"/>
+                          </a:xfrm>
+                          <a:prstGeom prst="rect">
+                            <a:avLst/>
+                          </a:prstGeom>
+                          <a:noFill/>
+                          <a:ln w="9525">
+                            <a:noFill/>
+                            <a:headEnd/>
+                            <a:tailEnd/>
+                          </a:ln>
+                        </pic:spPr>
+                      </pic:pic>
+                    </a:graphicData>
+                  </a:graphic>
+                </wp:inline>
+              </w:drawing>
+            </w:r>
+          </w:p>
+          <w:p>
+            <w:pPr>
+              <w:jc w:val="center"/>
+            </w:pPr>
+            <w:pPr>
+              <w:jc w:val="left"/>
+              <w:spacing w:before="200"/>
+              <w:pStyle w:val="ImageCaption"/>
+            </w:pPr>
+            <w:r>
+              <w:t xml:space="preserve">Figure 4: Mean proportion motile over time, by dose</w:t>
+            </w:r>
+          </w:p>
+          <w:bookmarkEnd w:id="33"/>
+        </w:tc>
+      </w:tr>
+    </w:tbl>
+    <w:p>
+      <w:pPr>
+        <w:pStyle w:val="BodyText"/>
+      </w:pPr>
+      <w:r>
+        <w:t xml:space="preserve"> </w:t>
+      </w:r>
+    </w:p>
+    <w:tbl>
+      <w:tblPr>
+        <w:tblStyle w:val="Table"/>
+        <w:tblW w:type="pct" w:w="5000"/>
+        <w:tblLayout w:type="fixed"/>
+        <w:tblLook w:firstRow="0" w:lastRow="0" w:firstColumn="0" w:lastColumn="0" w:noHBand="0" w:noVBand="0" w:val="0000"/>
+      </w:tblPr>
+      <w:tblGrid>
+        <w:gridCol w:w="7920"/>
+      </w:tblGrid>
+      <w:tr>
+        <w:tc>
+          <w:tcPr/>
+          <w:bookmarkStart w:id="34" w:name="tbl-mot-dose"/>
           <w:p>
             <w:pPr>
               <w:jc w:val="center"/>
@@ -3449,7 +3554,7 @@
               </w:tc>
             </w:tr>
           </w:tbl>
-          <w:bookmarkEnd w:id="30"/>
+          <w:bookmarkEnd w:id="34"/>
           <w:p/>
         </w:tc>
       </w:tr>
@@ -3475,7 +3580,7 @@
       <w:tr>
         <w:tc>
           <w:tcPr/>
-          <w:bookmarkStart w:id="31" w:name="tbl-mot-posthoc"/>
+          <w:bookmarkStart w:id="35" w:name="tbl-mot-posthoc"/>
           <w:p>
             <w:pPr>
               <w:jc w:val="center"/>
@@ -3497,13 +3602,14 @@
               <w:tblLook w:firstRow="1" w:lastRow="0" w:firstColumn="0" w:lastColumn="0" w:noHBand="0" w:noVBand="0" w:val="0020"/>
             </w:tblPr>
             <w:tblGrid>
-              <w:gridCol w:w="3344"/>
-              <w:gridCol w:w="264"/>
-              <w:gridCol w:w="352"/>
-              <w:gridCol w:w="616"/>
-              <w:gridCol w:w="792"/>
-              <w:gridCol w:w="1848"/>
-              <w:gridCol w:w="704"/>
+              <w:gridCol w:w="1622"/>
+              <w:gridCol w:w="1335"/>
+              <w:gridCol w:w="286"/>
+              <w:gridCol w:w="381"/>
+              <w:gridCol w:w="667"/>
+              <w:gridCol w:w="858"/>
+              <w:gridCol w:w="2003"/>
+              <w:gridCol w:w="763"/>
             </w:tblGrid>
             <w:tr>
               <w:trPr>
@@ -3518,7 +3624,20 @@
                     <w:jc w:val="center"/>
                   </w:pPr>
                   <w:r>
-                    <w:t xml:space="preserve">Contrast</w:t>
+                    <w:t xml:space="preserve">Dose</w:t>
+                  </w:r>
+                </w:p>
+              </w:tc>
+              <w:tc>
+                <w:tcPr/>
+                <w:p>
+                  <w:pPr>
+                    <w:pStyle w:val="Compact"/>
+                    <w:jc w:val="left"/>
+                    <w:jc w:val="center"/>
+                  </w:pPr>
+                  <w:r>
+                    <w:t xml:space="preserve">Parasite</w:t>
                   </w:r>
                 </w:p>
               </w:tc>
@@ -3611,7 +3730,20 @@
                     <w:jc w:val="center"/>
                   </w:pPr>
                   <w:r>
-                    <w:t xml:space="preserve">100mg/ml vs NC | T. congolense</w:t>
+                    <w:t xml:space="preserve">100mg/ml vs NC</w:t>
+                  </w:r>
+                </w:p>
+              </w:tc>
+              <w:tc>
+                <w:tcPr/>
+                <w:p>
+                  <w:pPr>
+                    <w:pStyle w:val="Compact"/>
+                    <w:jc w:val="left"/>
+                    <w:jc w:val="center"/>
+                  </w:pPr>
+                  <w:r>
+                    <w:t xml:space="preserve">T. congolense</w:t>
                   </w:r>
                 </w:p>
               </w:tc>
@@ -3704,7 +3836,20 @@
                     <w:jc w:val="center"/>
                   </w:pPr>
                   <w:r>
-                    <w:t xml:space="preserve">10mg/ml vs NC | T. congolense</w:t>
+                    <w:t xml:space="preserve">10mg/ml vs NC</w:t>
+                  </w:r>
+                </w:p>
+              </w:tc>
+              <w:tc>
+                <w:tcPr/>
+                <w:p>
+                  <w:pPr>
+                    <w:pStyle w:val="Compact"/>
+                    <w:jc w:val="left"/>
+                    <w:jc w:val="center"/>
+                  </w:pPr>
+                  <w:r>
+                    <w:t xml:space="preserve">T. congolense</w:t>
                   </w:r>
                 </w:p>
               </w:tc>
@@ -3797,7 +3942,20 @@
                     <w:jc w:val="center"/>
                   </w:pPr>
                   <w:r>
-                    <w:t xml:space="preserve">0.5mg/ml vs NC | T. congolense</w:t>
+                    <w:t xml:space="preserve">0.5mg/ml vs NC</w:t>
+                  </w:r>
+                </w:p>
+              </w:tc>
+              <w:tc>
+                <w:tcPr/>
+                <w:p>
+                  <w:pPr>
+                    <w:pStyle w:val="Compact"/>
+                    <w:jc w:val="left"/>
+                    <w:jc w:val="center"/>
+                  </w:pPr>
+                  <w:r>
+                    <w:t xml:space="preserve">T. congolense</w:t>
                   </w:r>
                 </w:p>
               </w:tc>
@@ -3890,7 +4048,20 @@
                     <w:jc w:val="center"/>
                   </w:pPr>
                   <w:r>
-                    <w:t xml:space="preserve">0.01mg/ml vs NC | T. congolense</w:t>
+                    <w:t xml:space="preserve">0.01mg/ml vs NC</w:t>
+                  </w:r>
+                </w:p>
+              </w:tc>
+              <w:tc>
+                <w:tcPr/>
+                <w:p>
+                  <w:pPr>
+                    <w:pStyle w:val="Compact"/>
+                    <w:jc w:val="left"/>
+                    <w:jc w:val="center"/>
+                  </w:pPr>
+                  <w:r>
+                    <w:t xml:space="preserve">T. congolense</w:t>
                   </w:r>
                 </w:p>
               </w:tc>
@@ -3983,7 +4154,20 @@
                     <w:jc w:val="center"/>
                   </w:pPr>
                   <w:r>
-                    <w:t xml:space="preserve">0.005mg/ml vs NC | T. congolense</w:t>
+                    <w:t xml:space="preserve">0.005mg/ml vs NC</w:t>
+                  </w:r>
+                </w:p>
+              </w:tc>
+              <w:tc>
+                <w:tcPr/>
+                <w:p>
+                  <w:pPr>
+                    <w:pStyle w:val="Compact"/>
+                    <w:jc w:val="left"/>
+                    <w:jc w:val="center"/>
+                  </w:pPr>
+                  <w:r>
+                    <w:t xml:space="preserve">T. congolense</w:t>
                   </w:r>
                 </w:p>
               </w:tc>
@@ -4076,7 +4260,20 @@
                     <w:jc w:val="center"/>
                   </w:pPr>
                   <w:r>
-                    <w:t xml:space="preserve">100mg/ml vs NC | T. evansi</w:t>
+                    <w:t xml:space="preserve">100mg/ml vs NC</w:t>
+                  </w:r>
+                </w:p>
+              </w:tc>
+              <w:tc>
+                <w:tcPr/>
+                <w:p>
+                  <w:pPr>
+                    <w:pStyle w:val="Compact"/>
+                    <w:jc w:val="left"/>
+                    <w:jc w:val="center"/>
+                  </w:pPr>
+                  <w:r>
+                    <w:t xml:space="preserve">T. evansi</w:t>
                   </w:r>
                 </w:p>
               </w:tc>
@@ -4169,7 +4366,20 @@
                     <w:jc w:val="center"/>
                   </w:pPr>
                   <w:r>
-                    <w:t xml:space="preserve">10mg/ml vs NC | T. evansi</w:t>
+                    <w:t xml:space="preserve">10mg/ml vs NC</w:t>
+                  </w:r>
+                </w:p>
+              </w:tc>
+              <w:tc>
+                <w:tcPr/>
+                <w:p>
+                  <w:pPr>
+                    <w:pStyle w:val="Compact"/>
+                    <w:jc w:val="left"/>
+                    <w:jc w:val="center"/>
+                  </w:pPr>
+                  <w:r>
+                    <w:t xml:space="preserve">T. evansi</w:t>
                   </w:r>
                 </w:p>
               </w:tc>
@@ -4262,7 +4472,20 @@
                     <w:jc w:val="center"/>
                   </w:pPr>
                   <w:r>
-                    <w:t xml:space="preserve">0.5mg/ml vs NC | T. evansi</w:t>
+                    <w:t xml:space="preserve">0.5mg/ml vs NC</w:t>
+                  </w:r>
+                </w:p>
+              </w:tc>
+              <w:tc>
+                <w:tcPr/>
+                <w:p>
+                  <w:pPr>
+                    <w:pStyle w:val="Compact"/>
+                    <w:jc w:val="left"/>
+                    <w:jc w:val="center"/>
+                  </w:pPr>
+                  <w:r>
+                    <w:t xml:space="preserve">T. evansi</w:t>
                   </w:r>
                 </w:p>
               </w:tc>
@@ -4355,7 +4578,20 @@
                     <w:jc w:val="center"/>
                   </w:pPr>
                   <w:r>
-                    <w:t xml:space="preserve">0.01mg/ml vs NC | T. evansi</w:t>
+                    <w:t xml:space="preserve">0.01mg/ml vs NC</w:t>
+                  </w:r>
+                </w:p>
+              </w:tc>
+              <w:tc>
+                <w:tcPr/>
+                <w:p>
+                  <w:pPr>
+                    <w:pStyle w:val="Compact"/>
+                    <w:jc w:val="left"/>
+                    <w:jc w:val="center"/>
+                  </w:pPr>
+                  <w:r>
+                    <w:t xml:space="preserve">T. evansi</w:t>
                   </w:r>
                 </w:p>
               </w:tc>
@@ -4448,7 +4684,20 @@
                     <w:jc w:val="center"/>
                   </w:pPr>
                   <w:r>
-                    <w:t xml:space="preserve">0.005mg/ml vs NC | T. evansi</w:t>
+                    <w:t xml:space="preserve">0.005mg/ml vs NC</w:t>
+                  </w:r>
+                </w:p>
+              </w:tc>
+              <w:tc>
+                <w:tcPr/>
+                <w:p>
+                  <w:pPr>
+                    <w:pStyle w:val="Compact"/>
+                    <w:jc w:val="left"/>
+                    <w:jc w:val="center"/>
+                  </w:pPr>
+                  <w:r>
+                    <w:t xml:space="preserve">T. evansi</w:t>
                   </w:r>
                 </w:p>
               </w:tc>
@@ -4532,95 +4781,8 @@
               </w:tc>
             </w:tr>
           </w:tbl>
-          <w:bookmarkEnd w:id="31"/>
+          <w:bookmarkEnd w:id="35"/>
           <w:p/>
-        </w:tc>
-      </w:tr>
-    </w:tbl>
-    <w:p>
-      <w:pPr>
-        <w:pStyle w:val="BodyText"/>
-      </w:pPr>
-      <w:r>
-        <w:t xml:space="preserve"> </w:t>
-      </w:r>
-    </w:p>
-    <w:tbl>
-      <w:tblPr>
-        <w:tblStyle w:val="Table"/>
-        <w:tblW w:type="pct" w:w="5000"/>
-        <w:tblLayout w:type="fixed"/>
-        <w:tblLook w:firstRow="0" w:lastRow="0" w:firstColumn="0" w:lastColumn="0" w:noHBand="0" w:noVBand="0" w:val="0000"/>
-      </w:tblPr>
-      <w:tblGrid>
-        <w:gridCol w:w="7920"/>
-      </w:tblGrid>
-      <w:tr>
-        <w:tc>
-          <w:tcPr/>
-          <w:bookmarkStart w:id="35" w:name="fig-mot-traj"/>
-          <w:p>
-            <w:pPr>
-              <w:pStyle w:val="Compact"/>
-              <w:jc w:val="center"/>
-            </w:pPr>
-            <w:r>
-              <w:drawing>
-                <wp:inline>
-                  <wp:extent cx="5334000" cy="7385538"/>
-                  <wp:effectExtent b="0" l="0" r="0" t="0"/>
-                  <wp:docPr descr="" title="" id="33" name="Picture"/>
-                  <a:graphic>
-                    <a:graphicData uri="http://schemas.openxmlformats.org/drawingml/2006/picture">
-                      <pic:pic>
-                        <pic:nvPicPr>
-                          <pic:cNvPr descr="../results/figures/motility_trajectories_faceted.png" id="34" name="Picture"/>
-                          <pic:cNvPicPr>
-                            <a:picLocks noChangeArrowheads="1" noChangeAspect="1"/>
-                          </pic:cNvPicPr>
-                        </pic:nvPicPr>
-                        <pic:blipFill>
-                          <a:blip r:embed="rId32"/>
-                          <a:stretch>
-                            <a:fillRect/>
-                          </a:stretch>
-                        </pic:blipFill>
-                        <pic:spPr bwMode="auto">
-                          <a:xfrm>
-                            <a:off x="0" y="0"/>
-                            <a:ext cx="5334000" cy="7385538"/>
-                          </a:xfrm>
-                          <a:prstGeom prst="rect">
-                            <a:avLst/>
-                          </a:prstGeom>
-                          <a:noFill/>
-                          <a:ln w="9525">
-                            <a:noFill/>
-                            <a:headEnd/>
-                            <a:tailEnd/>
-                          </a:ln>
-                        </pic:spPr>
-                      </pic:pic>
-                    </a:graphicData>
-                  </a:graphic>
-                </wp:inline>
-              </w:drawing>
-            </w:r>
-          </w:p>
-          <w:p>
-            <w:pPr>
-              <w:jc w:val="center"/>
-            </w:pPr>
-            <w:pPr>
-              <w:jc w:val="left"/>
-              <w:spacing w:before="200"/>
-              <w:pStyle w:val="ImageCaption"/>
-            </w:pPr>
-            <w:r>
-              <w:t xml:space="preserve">Figure 4: Motility trajectories by block</w:t>
-            </w:r>
-          </w:p>
-          <w:bookmarkEnd w:id="35"/>
         </w:tc>
       </w:tr>
     </w:tbl>
@@ -4758,7 +4920,7 @@
         </w:r>
       </w:hyperlink>
       <w:r>
-        <w:t xml:space="preserve">; Friedman Q = 14.51,</w:t>
+        <w:t xml:space="preserve">: Friedman Q = 14.51,</w:t>
       </w:r>
       <w:r>
         <w:t xml:space="preserve"> </w:t>
@@ -4770,7 +4932,7 @@
         <w:t xml:space="preserve"> </w:t>
       </w:r>
       <w:r>
-        <w:t xml:space="preserve">all eight blocks (W = 0, exact p = 0.008, Holm 0.039; HL −50/−50/−44</w:t>
+        <w:t xml:space="preserve">all eight blocks (W = 0, exact p = 0.008, Holm 0.039; HL ≈ −50/−50/−44</w:t>
       </w:r>
       <w:r>
         <w:t xml:space="preserve"> </w:t>
@@ -6910,13 +7072,14 @@
               <w:tblLook w:firstRow="1" w:lastRow="0" w:firstColumn="0" w:lastColumn="0" w:noHBand="0" w:noVBand="0" w:val="0020"/>
             </w:tblPr>
             <w:tblGrid>
-              <w:gridCol w:w="3344"/>
-              <w:gridCol w:w="264"/>
-              <w:gridCol w:w="264"/>
-              <w:gridCol w:w="616"/>
-              <w:gridCol w:w="792"/>
-              <w:gridCol w:w="2112"/>
-              <w:gridCol w:w="528"/>
+              <w:gridCol w:w="1622"/>
+              <w:gridCol w:w="1335"/>
+              <w:gridCol w:w="286"/>
+              <w:gridCol w:w="286"/>
+              <w:gridCol w:w="667"/>
+              <w:gridCol w:w="858"/>
+              <w:gridCol w:w="2290"/>
+              <w:gridCol w:w="572"/>
             </w:tblGrid>
             <w:tr>
               <w:trPr>
@@ -6931,7 +7094,20 @@
                     <w:jc w:val="center"/>
                   </w:pPr>
                   <w:r>
-                    <w:t xml:space="preserve">Contrast</w:t>
+                    <w:t xml:space="preserve">Dose</w:t>
+                  </w:r>
+                </w:p>
+              </w:tc>
+              <w:tc>
+                <w:tcPr/>
+                <w:p>
+                  <w:pPr>
+                    <w:pStyle w:val="Compact"/>
+                    <w:jc w:val="left"/>
+                    <w:jc w:val="center"/>
+                  </w:pPr>
+                  <w:r>
+                    <w:t xml:space="preserve">Parasite</w:t>
                   </w:r>
                 </w:p>
               </w:tc>
@@ -7024,7 +7200,20 @@
                     <w:jc w:val="center"/>
                   </w:pPr>
                   <w:r>
-                    <w:t xml:space="preserve">100mg/ml vs NC | T. congolense</w:t>
+                    <w:t xml:space="preserve">100mg/ml vs NC</w:t>
+                  </w:r>
+                </w:p>
+              </w:tc>
+              <w:tc>
+                <w:tcPr/>
+                <w:p>
+                  <w:pPr>
+                    <w:pStyle w:val="Compact"/>
+                    <w:jc w:val="left"/>
+                    <w:jc w:val="center"/>
+                  </w:pPr>
+                  <w:r>
+                    <w:t xml:space="preserve">T. congolense</w:t>
                   </w:r>
                 </w:p>
               </w:tc>
@@ -7117,7 +7306,20 @@
                     <w:jc w:val="center"/>
                   </w:pPr>
                   <w:r>
-                    <w:t xml:space="preserve">10mg/ml vs NC | T. congolense</w:t>
+                    <w:t xml:space="preserve">10mg/ml vs NC</w:t>
+                  </w:r>
+                </w:p>
+              </w:tc>
+              <w:tc>
+                <w:tcPr/>
+                <w:p>
+                  <w:pPr>
+                    <w:pStyle w:val="Compact"/>
+                    <w:jc w:val="left"/>
+                    <w:jc w:val="center"/>
+                  </w:pPr>
+                  <w:r>
+                    <w:t xml:space="preserve">T. congolense</w:t>
                   </w:r>
                 </w:p>
               </w:tc>
@@ -7210,7 +7412,20 @@
                     <w:jc w:val="center"/>
                   </w:pPr>
                   <w:r>
-                    <w:t xml:space="preserve">0.5mg/ml vs NC | T. congolense</w:t>
+                    <w:t xml:space="preserve">0.5mg/ml vs NC</w:t>
+                  </w:r>
+                </w:p>
+              </w:tc>
+              <w:tc>
+                <w:tcPr/>
+                <w:p>
+                  <w:pPr>
+                    <w:pStyle w:val="Compact"/>
+                    <w:jc w:val="left"/>
+                    <w:jc w:val="center"/>
+                  </w:pPr>
+                  <w:r>
+                    <w:t xml:space="preserve">T. congolense</w:t>
                   </w:r>
                 </w:p>
               </w:tc>
@@ -7303,7 +7518,20 @@
                     <w:jc w:val="center"/>
                   </w:pPr>
                   <w:r>
-                    <w:t xml:space="preserve">0.01mg/ml vs NC | T. congolense</w:t>
+                    <w:t xml:space="preserve">0.01mg/ml vs NC</w:t>
+                  </w:r>
+                </w:p>
+              </w:tc>
+              <w:tc>
+                <w:tcPr/>
+                <w:p>
+                  <w:pPr>
+                    <w:pStyle w:val="Compact"/>
+                    <w:jc w:val="left"/>
+                    <w:jc w:val="center"/>
+                  </w:pPr>
+                  <w:r>
+                    <w:t xml:space="preserve">T. congolense</w:t>
                   </w:r>
                 </w:p>
               </w:tc>
@@ -7396,7 +7624,20 @@
                     <w:jc w:val="center"/>
                   </w:pPr>
                   <w:r>
-                    <w:t xml:space="preserve">0.005mg/ml vs NC | T. congolense</w:t>
+                    <w:t xml:space="preserve">0.005mg/ml vs NC</w:t>
+                  </w:r>
+                </w:p>
+              </w:tc>
+              <w:tc>
+                <w:tcPr/>
+                <w:p>
+                  <w:pPr>
+                    <w:pStyle w:val="Compact"/>
+                    <w:jc w:val="left"/>
+                    <w:jc w:val="center"/>
+                  </w:pPr>
+                  <w:r>
+                    <w:t xml:space="preserve">T. congolense</w:t>
                   </w:r>
                 </w:p>
               </w:tc>
@@ -7489,7 +7730,20 @@
                     <w:jc w:val="center"/>
                   </w:pPr>
                   <w:r>
-                    <w:t xml:space="preserve">100mg/ml vs NC | T. evansi</w:t>
+                    <w:t xml:space="preserve">100mg/ml vs NC</w:t>
+                  </w:r>
+                </w:p>
+              </w:tc>
+              <w:tc>
+                <w:tcPr/>
+                <w:p>
+                  <w:pPr>
+                    <w:pStyle w:val="Compact"/>
+                    <w:jc w:val="left"/>
+                    <w:jc w:val="center"/>
+                  </w:pPr>
+                  <w:r>
+                    <w:t xml:space="preserve">T. evansi</w:t>
                   </w:r>
                 </w:p>
               </w:tc>
@@ -7582,7 +7836,20 @@
                     <w:jc w:val="center"/>
                   </w:pPr>
                   <w:r>
-                    <w:t xml:space="preserve">10mg/ml vs NC | T. evansi</w:t>
+                    <w:t xml:space="preserve">10mg/ml vs NC</w:t>
+                  </w:r>
+                </w:p>
+              </w:tc>
+              <w:tc>
+                <w:tcPr/>
+                <w:p>
+                  <w:pPr>
+                    <w:pStyle w:val="Compact"/>
+                    <w:jc w:val="left"/>
+                    <w:jc w:val="center"/>
+                  </w:pPr>
+                  <w:r>
+                    <w:t xml:space="preserve">T. evansi</w:t>
                   </w:r>
                 </w:p>
               </w:tc>
@@ -7675,7 +7942,20 @@
                     <w:jc w:val="center"/>
                   </w:pPr>
                   <w:r>
-                    <w:t xml:space="preserve">0.5mg/ml vs NC | T. evansi</w:t>
+                    <w:t xml:space="preserve">0.5mg/ml vs NC</w:t>
+                  </w:r>
+                </w:p>
+              </w:tc>
+              <w:tc>
+                <w:tcPr/>
+                <w:p>
+                  <w:pPr>
+                    <w:pStyle w:val="Compact"/>
+                    <w:jc w:val="left"/>
+                    <w:jc w:val="center"/>
+                  </w:pPr>
+                  <w:r>
+                    <w:t xml:space="preserve">T. evansi</w:t>
                   </w:r>
                 </w:p>
               </w:tc>
@@ -7768,7 +8048,20 @@
                     <w:jc w:val="center"/>
                   </w:pPr>
                   <w:r>
-                    <w:t xml:space="preserve">0.01mg/ml vs NC | T. evansi</w:t>
+                    <w:t xml:space="preserve">0.01mg/ml vs NC</w:t>
+                  </w:r>
+                </w:p>
+              </w:tc>
+              <w:tc>
+                <w:tcPr/>
+                <w:p>
+                  <w:pPr>
+                    <w:pStyle w:val="Compact"/>
+                    <w:jc w:val="left"/>
+                    <w:jc w:val="center"/>
+                  </w:pPr>
+                  <w:r>
+                    <w:t xml:space="preserve">T. evansi</w:t>
                   </w:r>
                 </w:p>
               </w:tc>
@@ -7861,7 +8154,20 @@
                     <w:jc w:val="center"/>
                   </w:pPr>
                   <w:r>
-                    <w:t xml:space="preserve">0.005mg/ml vs NC | T. evansi</w:t>
+                    <w:t xml:space="preserve">0.005mg/ml vs NC</w:t>
+                  </w:r>
+                </w:p>
+              </w:tc>
+              <w:tc>
+                <w:tcPr/>
+                <w:p>
+                  <w:pPr>
+                    <w:pStyle w:val="Compact"/>
+                    <w:jc w:val="left"/>
+                    <w:jc w:val="center"/>
+                  </w:pPr>
+                  <w:r>
+                    <w:t xml:space="preserve">T. evansi</w:t>
                   </w:r>
                 </w:p>
               </w:tc>
@@ -9649,12 +9955,12 @@
               <w:tblLook w:firstRow="1" w:lastRow="0" w:firstColumn="0" w:lastColumn="0" w:noHBand="0" w:noVBand="0" w:val="0020"/>
             </w:tblPr>
             <w:tblGrid>
-              <w:gridCol w:w="4240"/>
-              <w:gridCol w:w="240"/>
-              <w:gridCol w:w="240"/>
-              <w:gridCol w:w="560"/>
-              <w:gridCol w:w="1680"/>
-              <w:gridCol w:w="960"/>
+              <w:gridCol w:w="4562"/>
+              <w:gridCol w:w="258"/>
+              <w:gridCol w:w="258"/>
+              <w:gridCol w:w="602"/>
+              <w:gridCol w:w="1807"/>
+              <w:gridCol w:w="430"/>
             </w:tblGrid>
             <w:tr>
               <w:trPr>
@@ -9721,20 +10027,20 @@
                     <w:jc w:val="center"/>
                   </w:pPr>
                   <w:r>
-                    <w:t xml:space="preserve">p (Holm)</w:t>
-                  </w:r>
-                </w:p>
-              </w:tc>
-              <w:tc>
-                <w:tcPr/>
-                <w:p>
-                  <w:pPr>
-                    <w:pStyle w:val="Compact"/>
-                    <w:jc w:val="right"/>
-                    <w:jc w:val="center"/>
-                  </w:pPr>
-                  <w:r>
                     <w:t xml:space="preserve">HL [95% CI]</w:t>
+                  </w:r>
+                </w:p>
+              </w:tc>
+              <w:tc>
+                <w:tcPr/>
+                <w:p>
+                  <w:pPr>
+                    <w:pStyle w:val="Compact"/>
+                    <w:jc w:val="right"/>
+                    <w:jc w:val="center"/>
+                  </w:pPr>
+                  <w:r>
+                    <w:t xml:space="preserve">r</w:t>
                   </w:r>
                 </w:p>
               </w:tc>
@@ -9828,12 +10134,12 @@
               <w:tblLook w:firstRow="1" w:lastRow="0" w:firstColumn="0" w:lastColumn="0" w:noHBand="0" w:noVBand="0" w:val="0020"/>
             </w:tblPr>
             <w:tblGrid>
-              <w:gridCol w:w="3350"/>
-              <w:gridCol w:w="304"/>
-              <w:gridCol w:w="304"/>
-              <w:gridCol w:w="710"/>
-              <w:gridCol w:w="2030"/>
-              <w:gridCol w:w="1218"/>
+              <w:gridCol w:w="3681"/>
+              <w:gridCol w:w="334"/>
+              <w:gridCol w:w="334"/>
+              <w:gridCol w:w="780"/>
+              <w:gridCol w:w="2230"/>
+              <w:gridCol w:w="557"/>
             </w:tblGrid>
             <w:tr>
               <w:trPr>
@@ -9900,20 +10206,20 @@
                     <w:jc w:val="center"/>
                   </w:pPr>
                   <w:r>
-                    <w:t xml:space="preserve">p (Holm)</w:t>
-                  </w:r>
-                </w:p>
-              </w:tc>
-              <w:tc>
-                <w:tcPr/>
-                <w:p>
-                  <w:pPr>
-                    <w:pStyle w:val="Compact"/>
-                    <w:jc w:val="right"/>
-                    <w:jc w:val="center"/>
-                  </w:pPr>
-                  <w:r>
                     <w:t xml:space="preserve">HL [95% CI]</w:t>
+                  </w:r>
+                </w:p>
+              </w:tc>
+              <w:tc>
+                <w:tcPr/>
+                <w:p>
+                  <w:pPr>
+                    <w:pStyle w:val="Compact"/>
+                    <w:jc w:val="right"/>
+                    <w:jc w:val="center"/>
+                  </w:pPr>
+                  <w:r>
+                    <w:t xml:space="preserve">r</w:t>
                   </w:r>
                 </w:p>
               </w:tc>
@@ -10087,12 +10393,12 @@
               <w:tblLook w:firstRow="1" w:lastRow="0" w:firstColumn="0" w:lastColumn="0" w:noHBand="0" w:noVBand="0" w:val="0020"/>
             </w:tblPr>
             <w:tblGrid>
-              <w:gridCol w:w="3210"/>
-              <w:gridCol w:w="321"/>
-              <w:gridCol w:w="321"/>
-              <w:gridCol w:w="749"/>
-              <w:gridCol w:w="2033"/>
-              <w:gridCol w:w="1284"/>
+              <w:gridCol w:w="3546"/>
+              <w:gridCol w:w="354"/>
+              <w:gridCol w:w="354"/>
+              <w:gridCol w:w="827"/>
+              <w:gridCol w:w="2245"/>
+              <w:gridCol w:w="591"/>
             </w:tblGrid>
             <w:tr>
               <w:trPr>
@@ -10159,20 +10465,20 @@
                     <w:jc w:val="center"/>
                   </w:pPr>
                   <w:r>
-                    <w:t xml:space="preserve">p (Holm)</w:t>
-                  </w:r>
-                </w:p>
-              </w:tc>
-              <w:tc>
-                <w:tcPr/>
-                <w:p>
-                  <w:pPr>
-                    <w:pStyle w:val="Compact"/>
-                    <w:jc w:val="right"/>
-                    <w:jc w:val="center"/>
-                  </w:pPr>
-                  <w:r>
                     <w:t xml:space="preserve">HL [95% CI]</w:t>
+                  </w:r>
+                </w:p>
+              </w:tc>
+              <w:tc>
+                <w:tcPr/>
+                <w:p>
+                  <w:pPr>
+                    <w:pStyle w:val="Compact"/>
+                    <w:jc w:val="right"/>
+                    <w:jc w:val="center"/>
+                  </w:pPr>
+                  <w:r>
+                    <w:t xml:space="preserve">r</w:t>
                   </w:r>
                 </w:p>
               </w:tc>
@@ -10698,12 +11004,12 @@
               <w:tblLook w:firstRow="1" w:lastRow="0" w:firstColumn="0" w:lastColumn="0" w:noHBand="0" w:noVBand="0" w:val="0020"/>
             </w:tblPr>
             <w:tblGrid>
-              <w:gridCol w:w="4343"/>
-              <w:gridCol w:w="255"/>
-              <w:gridCol w:w="255"/>
-              <w:gridCol w:w="255"/>
-              <w:gridCol w:w="1788"/>
-              <w:gridCol w:w="1021"/>
+              <w:gridCol w:w="4538"/>
+              <w:gridCol w:w="266"/>
+              <w:gridCol w:w="266"/>
+              <w:gridCol w:w="266"/>
+              <w:gridCol w:w="1868"/>
+              <w:gridCol w:w="711"/>
             </w:tblGrid>
             <w:tr>
               <w:trPr>
@@ -10770,20 +11076,20 @@
                     <w:jc w:val="center"/>
                   </w:pPr>
                   <w:r>
-                    <w:t xml:space="preserve">p (Holm)</w:t>
-                  </w:r>
-                </w:p>
-              </w:tc>
-              <w:tc>
-                <w:tcPr/>
-                <w:p>
-                  <w:pPr>
-                    <w:pStyle w:val="Compact"/>
-                    <w:jc w:val="right"/>
-                    <w:jc w:val="center"/>
-                  </w:pPr>
-                  <w:r>
                     <w:t xml:space="preserve">HL [95% CI]</w:t>
+                  </w:r>
+                </w:p>
+              </w:tc>
+              <w:tc>
+                <w:tcPr/>
+                <w:p>
+                  <w:pPr>
+                    <w:pStyle w:val="Compact"/>
+                    <w:jc w:val="right"/>
+                    <w:jc w:val="center"/>
+                  </w:pPr>
+                  <w:r>
+                    <w:t xml:space="preserve">r</w:t>
                   </w:r>
                 </w:p>
               </w:tc>
@@ -10877,12 +11183,12 @@
               <w:tblLook w:firstRow="1" w:lastRow="0" w:firstColumn="0" w:lastColumn="0" w:noHBand="0" w:noVBand="0" w:val="0020"/>
             </w:tblPr>
             <w:tblGrid>
-              <w:gridCol w:w="4172"/>
-              <w:gridCol w:w="255"/>
-              <w:gridCol w:w="255"/>
-              <w:gridCol w:w="596"/>
-              <w:gridCol w:w="1618"/>
-              <w:gridCol w:w="1021"/>
+              <w:gridCol w:w="4512"/>
+              <w:gridCol w:w="276"/>
+              <w:gridCol w:w="276"/>
+              <w:gridCol w:w="644"/>
+              <w:gridCol w:w="1749"/>
+              <w:gridCol w:w="460"/>
             </w:tblGrid>
             <w:tr>
               <w:trPr>
@@ -10949,20 +11255,20 @@
                     <w:jc w:val="center"/>
                   </w:pPr>
                   <w:r>
-                    <w:t xml:space="preserve">p (Holm)</w:t>
-                  </w:r>
-                </w:p>
-              </w:tc>
-              <w:tc>
-                <w:tcPr/>
-                <w:p>
-                  <w:pPr>
-                    <w:pStyle w:val="Compact"/>
-                    <w:jc w:val="right"/>
-                    <w:jc w:val="center"/>
-                  </w:pPr>
-                  <w:r>
                     <w:t xml:space="preserve">HL [95% CI]</w:t>
+                  </w:r>
+                </w:p>
+              </w:tc>
+              <w:tc>
+                <w:tcPr/>
+                <w:p>
+                  <w:pPr>
+                    <w:pStyle w:val="Compact"/>
+                    <w:jc w:val="right"/>
+                    <w:jc w:val="center"/>
+                  </w:pPr>
+                  <w:r>
+                    <w:t xml:space="preserve">r</w:t>
                   </w:r>
                 </w:p>
               </w:tc>
@@ -12064,19 +12370,25 @@
         <w:pStyle w:val="FirstParagraph"/>
       </w:pPr>
       <w:r>
-        <w:t xml:space="preserve">Three assay layers converge on one finding: both extracts are genuinely and</w:t>
-      </w:r>
-      <w:r>
-        <w:t xml:space="preserve"> </w:t>
-      </w:r>
-      <w:r>
-        <w:t xml:space="preserve">dose-dependently trypanocidal. The in-vitro ordering (TTI 15 minutes to fully</w:t>
-      </w:r>
-      <w:r>
-        <w:t xml:space="preserve"> </w:t>
-      </w:r>
-      <w:r>
-        <w:t xml:space="preserve">censored across the dose range;</w:t>
+        <w:t xml:space="preserve">The three assay layers converge on one finding — both extracts are genuinely</w:t>
+      </w:r>
+      <w:r>
+        <w:t xml:space="preserve"> </w:t>
+      </w:r>
+      <w:r>
+        <w:t xml:space="preserve">and dose-dependently trypanocidal — and each layer has a direct precedent in</w:t>
+      </w:r>
+      <w:r>
+        <w:t xml:space="preserve"> </w:t>
+      </w:r>
+      <w:r>
+        <w:t xml:space="preserve">the recent literature. The in-vitro ordering (TTI of 15 minutes at the top</w:t>
+      </w:r>
+      <w:r>
+        <w:t xml:space="preserve"> </w:t>
+      </w:r>
+      <w:r>
+        <w:t xml:space="preserve">dose lengthening monotonically to fully censored controls;</w:t>
       </w:r>
       <w:r>
         <w:t xml:space="preserve"> </w:t>
@@ -12090,76 +12402,249 @@
         </w:r>
       </w:hyperlink>
       <w:r>
-        <w:t xml:space="preserve">) reappears quantitatively in peak</w:t>
-      </w:r>
-      <w:r>
-        <w:t xml:space="preserve"> </w:t>
-      </w:r>
-      <w:r>
-        <w:t xml:space="preserve">parasitaemia, mortality and cumulative burden (</w:t>
-      </w:r>
-      <w:hyperlink w:anchor="tbl-peak">
+        <w:t xml:space="preserve">,</w:t>
+      </w:r>
+      <w:r>
+        <w:t xml:space="preserve"> </w:t>
+      </w:r>
+      <w:hyperlink w:anchor="fig-curves">
         <w:r>
           <w:rPr>
             <w:rStyle w:val="Hyperlink"/>
           </w:rPr>
-          <w:t xml:space="preserve">Table 5</w:t>
+          <w:t xml:space="preserve">Figure 4</w:t>
         </w:r>
       </w:hyperlink>
       <w:r>
-        <w:t xml:space="preserve">,</w:t>
-      </w:r>
-      <w:r>
-        <w:t xml:space="preserve"> </w:t>
-      </w:r>
-      <w:hyperlink w:anchor="fig-mort">
-        <w:r>
-          <w:rPr>
-            <w:rStyle w:val="Hyperlink"/>
-          </w:rPr>
-          <w:t xml:space="preserve">Figure 6</w:t>
-        </w:r>
-      </w:hyperlink>
-      <w:r>
-        <w:t xml:space="preserve">,</w:t>
-      </w:r>
-      <w:r>
-        <w:t xml:space="preserve"> </w:t>
-      </w:r>
-      <w:hyperlink w:anchor="fig-auc">
-        <w:r>
-          <w:rPr>
-            <w:rStyle w:val="Hyperlink"/>
-          </w:rPr>
-          <w:t xml:space="preserve">Figure 7</w:t>
-        </w:r>
-      </w:hyperlink>
-      <w:r>
-        <w:t xml:space="preserve">) — fast kill in the dish predicts low burden in the mouse — and the</w:t>
-      </w:r>
-      <w:r>
-        <w:t xml:space="preserve"> </w:t>
-      </w:r>
-      <w:r>
-        <w:t xml:space="preserve">Positive Controls trace the same rapid-kill profile, so the top extract dose</w:t>
-      </w:r>
-      <w:r>
-        <w:t xml:space="preserve"> </w:t>
-      </w:r>
-      <w:r>
-        <w:t xml:space="preserve">reproduces reference-like efficacy rather than merely beating an untreated</w:t>
-      </w:r>
-      <w:r>
-        <w:t xml:space="preserve"> </w:t>
-      </w:r>
-      <w:r>
-        <w:t xml:space="preserve">control. The most informative discordance is the effective threshold: full</w:t>
-      </w:r>
-      <w:r>
-        <w:t xml:space="preserve"> </w:t>
-      </w:r>
-      <w:r>
-        <w:t xml:space="preserve">immobilisation in-vitro demands ~100 mg/ml, yet</w:t>
+        <w:t xml:space="preserve">) sits squarely in the published range:</w:t>
+      </w:r>
+      <w:r>
+        <w:t xml:space="preserve"> </w:t>
+      </w:r>
+      <w:r>
+        <w:rPr>
+          <w:i/>
+          <w:iCs/>
+        </w:rPr>
+        <w:t xml:space="preserve">Acacia</w:t>
+      </w:r>
+      <w:r>
+        <w:t xml:space="preserve"> </w:t>
+      </w:r>
+      <w:r>
+        <w:t xml:space="preserve">stem-bark</w:t>
+      </w:r>
+      <w:r>
+        <w:t xml:space="preserve"> </w:t>
+      </w:r>
+      <w:r>
+        <w:t xml:space="preserve">extracts immobilised</w:t>
+      </w:r>
+      <w:r>
+        <w:t xml:space="preserve"> </w:t>
+      </w:r>
+      <w:r>
+        <w:rPr>
+          <w:i/>
+          <w:iCs/>
+        </w:rPr>
+        <w:t xml:space="preserve">T. congolense</w:t>
+      </w:r>
+      <w:r>
+        <w:t xml:space="preserve"> </w:t>
+      </w:r>
+      <w:r>
+        <w:t xml:space="preserve">within 15 minutes at their top doses</w:t>
+      </w:r>
+      <w:r>
+        <w:t xml:space="preserve"> </w:t>
+      </w:r>
+      <w:r>
+        <w:t xml:space="preserve">(Ogbole et al. 2021),</w:t>
+      </w:r>
+      <w:r>
+        <w:t xml:space="preserve"> </w:t>
+      </w:r>
+      <w:r>
+        <w:rPr>
+          <w:i/>
+          <w:iCs/>
+        </w:rPr>
+        <w:t xml:space="preserve">Ranunculus</w:t>
+      </w:r>
+      <w:r>
+        <w:t xml:space="preserve"> </w:t>
+      </w:r>
+      <w:r>
+        <w:t xml:space="preserve">extracts and anemonin within 5–30 minutes</w:t>
+      </w:r>
+      <w:r>
+        <w:t xml:space="preserve"> </w:t>
+      </w:r>
+      <w:r>
+        <w:t xml:space="preserve">(Sirak et al. 2024), and</w:t>
+      </w:r>
+      <w:r>
+        <w:t xml:space="preserve"> </w:t>
+      </w:r>
+      <w:r>
+        <w:rPr>
+          <w:i/>
+          <w:iCs/>
+        </w:rPr>
+        <w:t xml:space="preserve">A. indica</w:t>
+      </w:r>
+      <w:r>
+        <w:t xml:space="preserve"> </w:t>
+      </w:r>
+      <w:r>
+        <w:t xml:space="preserve">fractions within the hour (Tauheed et</w:t>
+      </w:r>
+      <w:r>
+        <w:t xml:space="preserve"> </w:t>
+      </w:r>
+      <w:r>
+        <w:t xml:space="preserve">al. 2021). Notably, the Ogbole design is a near twin of the present assay —</w:t>
+      </w:r>
+      <w:r>
+        <w:t xml:space="preserve"> </w:t>
+      </w:r>
+      <w:r>
+        <w:t xml:space="preserve">identical +/− scoring over 0–120 minutes, the same threshold behaviour with</w:t>
+      </w:r>
+      <w:r>
+        <w:t xml:space="preserve"> </w:t>
+      </w:r>
+      <w:r>
+        <w:t xml:space="preserve">top doses matching the Berenil control and the lowest dose equalling the</w:t>
+      </w:r>
+      <w:r>
+        <w:t xml:space="preserve"> </w:t>
+      </w:r>
+      <w:r>
+        <w:t xml:space="preserve">negative control — so the threshold pattern here replicates an established</w:t>
+      </w:r>
+      <w:r>
+        <w:t xml:space="preserve"> </w:t>
+      </w:r>
+      <w:r>
+        <w:t xml:space="preserve">signature rather than standing alone. One caveat travels with this literature</w:t>
+      </w:r>
+      <w:r>
+        <w:t xml:space="preserve"> </w:t>
+      </w:r>
+      <w:r>
+        <w:t xml:space="preserve">and applies here: Sirak et al. showed that in-vitro immobilisation at low</w:t>
+      </w:r>
+      <w:r>
+        <w:t xml:space="preserve"> </w:t>
+      </w:r>
+      <w:r>
+        <w:t xml:space="preserve">doses need not mean death, with parasites recovering infectivity. The present</w:t>
+      </w:r>
+      <w:r>
+        <w:t xml:space="preserve"> </w:t>
+      </w:r>
+      <w:r>
+        <w:t xml:space="preserve">TTI gradient is therefore read as a kill proxy corroborated by the infectivity</w:t>
+      </w:r>
+      <w:r>
+        <w:t xml:space="preserve"> </w:t>
+      </w:r>
+      <w:r>
+        <w:t xml:space="preserve">outcomes (peaks and mortality), not as proof of death at every dose.</w:t>
+      </w:r>
+    </w:p>
+    <w:p>
+      <w:pPr>
+        <w:pStyle w:val="BodyText"/>
+      </w:pPr>
+      <w:r>
+        <w:t xml:space="preserve">In-vivo, the dose-dependent suppression of peaks and burden with zero</w:t>
+      </w:r>
+      <w:r>
+        <w:t xml:space="preserve"> </w:t>
+      </w:r>
+      <w:r>
+        <w:t xml:space="preserve">mortality at the top dose matches the direction reported for</w:t>
+      </w:r>
+      <w:r>
+        <w:t xml:space="preserve"> </w:t>
+      </w:r>
+      <w:r>
+        <w:rPr>
+          <w:i/>
+          <w:iCs/>
+        </w:rPr>
+        <w:t xml:space="preserve">A. indica</w:t>
+      </w:r>
+      <w:r>
+        <w:t xml:space="preserve"> </w:t>
+      </w:r>
+      <w:r>
+        <w:t xml:space="preserve">stem bark (Wanzala et al. 2017; Mbaya et al. 2010),</w:t>
+      </w:r>
+      <w:r>
+        <w:t xml:space="preserve"> </w:t>
+      </w:r>
+      <w:r>
+        <w:rPr>
+          <w:i/>
+          <w:iCs/>
+        </w:rPr>
+        <w:t xml:space="preserve">A. indica</w:t>
+      </w:r>
+      <w:r>
+        <w:t xml:space="preserve"> </w:t>
+      </w:r>
+      <w:r>
+        <w:t xml:space="preserve">leaves (Okoh</w:t>
+      </w:r>
+      <w:r>
+        <w:t xml:space="preserve"> </w:t>
+      </w:r>
+      <w:r>
+        <w:t xml:space="preserve">2018; Ngure et al. 2009) and</w:t>
+      </w:r>
+      <w:r>
+        <w:t xml:space="preserve"> </w:t>
+      </w:r>
+      <w:r>
+        <w:rPr>
+          <w:i/>
+          <w:iCs/>
+        </w:rPr>
+        <w:t xml:space="preserve">M. oleifera</w:t>
+      </w:r>
+      <w:r>
+        <w:t xml:space="preserve"> </w:t>
+      </w:r>
+      <w:r>
+        <w:t xml:space="preserve">seed and leaves (Ujah et al. 2020;</w:t>
+      </w:r>
+      <w:r>
+        <w:t xml:space="preserve"> </w:t>
+      </w:r>
+      <w:r>
+        <w:t xml:space="preserve">Datti et al. 2020), including their shared observation that crude extracts</w:t>
+      </w:r>
+      <w:r>
+        <w:t xml:space="preserve"> </w:t>
+      </w:r>
+      <w:r>
+        <w:t xml:space="preserve">suppress rather than sterilise at lower doses. Two contrasts with that</w:t>
+      </w:r>
+      <w:r>
+        <w:t xml:space="preserve"> </w:t>
+      </w:r>
+      <w:r>
+        <w:t xml:space="preserve">literature deserve emphasis. First, the effective threshold here — full</w:t>
+      </w:r>
+      <w:r>
+        <w:t xml:space="preserve"> </w:t>
+      </w:r>
+      <w:r>
+        <w:t xml:space="preserve">suppression at the top in-vitro-style dose with</w:t>
       </w:r>
       <w:r>
         <w:t xml:space="preserve"> </w:t>
@@ -12175,37 +12660,263 @@
         <w:t xml:space="preserve"> </w:t>
       </w:r>
       <w:r>
-        <w:t xml:space="preserve">is suppressed</w:t>
-      </w:r>
-      <w:r>
-        <w:t xml:space="preserve"> </w:t>
-      </w:r>
-      <w:r>
-        <w:t xml:space="preserve">in-vivo from 0.5 mg/ml upward. Rather than a contradiction, this reflects the</w:t>
-      </w:r>
-      <w:r>
-        <w:t xml:space="preserve"> </w:t>
-      </w:r>
-      <w:r>
-        <w:t xml:space="preserve">assays’ different sensitivities — ninety minutes of direct contact versus</w:t>
-      </w:r>
-      <w:r>
-        <w:t xml:space="preserve"> </w:t>
-      </w:r>
-      <w:r>
-        <w:t xml:space="preserve">forty days of systemic exposure with host clearance contributing — and it</w:t>
-      </w:r>
-      <w:r>
-        <w:t xml:space="preserve"> </w:t>
-      </w:r>
-      <w:r>
-        <w:t xml:space="preserve">locates the biologically interesting dose window for follow-up work between</w:t>
-      </w:r>
-      <w:r>
-        <w:t xml:space="preserve"> </w:t>
-      </w:r>
-      <w:r>
-        <w:t xml:space="preserve">0.5 and 10 mg/ml, particularly for</w:t>
+        <w:t xml:space="preserve">yielding from</w:t>
+      </w:r>
+      <w:r>
+        <w:t xml:space="preserve"> </w:t>
+      </w:r>
+      <w:r>
+        <w:t xml:space="preserve">0.5 mg/ml — is strong for crude methanolic extracts, most of which in the</w:t>
+      </w:r>
+      <w:r>
+        <w:t xml:space="preserve"> </w:t>
+      </w:r>
+      <w:r>
+        <w:t xml:space="preserve">cited studies reduced but did not clear parasitaemia; whether that reflects</w:t>
+      </w:r>
+      <w:r>
+        <w:t xml:space="preserve"> </w:t>
+      </w:r>
+      <w:r>
+        <w:t xml:space="preserve">genuine potency or the concentration-based (rather than mg/kg) dosing of</w:t>
+      </w:r>
+      <w:r>
+        <w:t xml:space="preserve"> </w:t>
+      </w:r>
+      <w:r>
+        <w:t xml:space="preserve">this design is a question for the thesis methods, not this analysis. Second,</w:t>
+      </w:r>
+      <w:r>
+        <w:t xml:space="preserve"> </w:t>
+      </w:r>
+      <w:r>
+        <w:t xml:space="preserve">Rabe et al. (2024) found ethanolic</w:t>
+      </w:r>
+      <w:r>
+        <w:t xml:space="preserve"> </w:t>
+      </w:r>
+      <w:r>
+        <w:rPr>
+          <w:i/>
+          <w:iCs/>
+        </w:rPr>
+        <w:t xml:space="preserve">A. indica</w:t>
+      </w:r>
+      <w:r>
+        <w:t xml:space="preserve"> </w:t>
+      </w:r>
+      <w:r>
+        <w:t xml:space="preserve">markedly superior to</w:t>
+      </w:r>
+      <w:r>
+        <w:t xml:space="preserve"> </w:t>
+      </w:r>
+      <w:r>
+        <w:rPr>
+          <w:i/>
+          <w:iCs/>
+        </w:rPr>
+        <w:t xml:space="preserve">M.</w:t>
+      </w:r>
+      <w:r>
+        <w:rPr>
+          <w:i/>
+          <w:iCs/>
+        </w:rPr>
+        <w:t xml:space="preserve"> </w:t>
+      </w:r>
+      <w:r>
+        <w:rPr>
+          <w:i/>
+          <w:iCs/>
+        </w:rPr>
+        <w:t xml:space="preserve">oleifera</w:t>
+      </w:r>
+      <w:r>
+        <w:t xml:space="preserve"> </w:t>
+      </w:r>
+      <w:r>
+        <w:t xml:space="preserve">against a diminazene-resistant</w:t>
+      </w:r>
+      <w:r>
+        <w:t xml:space="preserve"> </w:t>
+      </w:r>
+      <w:r>
+        <w:rPr>
+          <w:i/>
+          <w:iCs/>
+        </w:rPr>
+        <w:t xml:space="preserve">T. brucei</w:t>
+      </w:r>
+      <w:r>
+        <w:t xml:space="preserve"> </w:t>
+      </w:r>
+      <w:r>
+        <w:t xml:space="preserve">strain, whereas the</w:t>
+      </w:r>
+      <w:r>
+        <w:t xml:space="preserve"> </w:t>
+      </w:r>
+      <w:r>
+        <w:t xml:space="preserve">present comparison across four parts and two parasites finds no difference;</w:t>
+      </w:r>
+      <w:r>
+        <w:t xml:space="preserve"> </w:t>
+      </w:r>
+      <w:r>
+        <w:t xml:space="preserve">the reconciliation is context — single leaf extracts against a resistant</w:t>
+      </w:r>
+      <w:r>
+        <w:t xml:space="preserve"> </w:t>
+      </w:r>
+      <w:r>
+        <w:t xml:space="preserve">strain versus broad part × parasite panels — and it cautions against</w:t>
+      </w:r>
+      <w:r>
+        <w:t xml:space="preserve"> </w:t>
+      </w:r>
+      <w:r>
+        <w:t xml:space="preserve">generalising either result beyond its design.</w:t>
+      </w:r>
+    </w:p>
+    <w:p>
+      <w:pPr>
+        <w:pStyle w:val="BodyText"/>
+      </w:pPr>
+      <w:r>
+        <w:t xml:space="preserve">The phytochemical picture is consistent with the pharmacology literature</w:t>
+      </w:r>
+      <w:r>
+        <w:t xml:space="preserve"> </w:t>
+      </w:r>
+      <w:r>
+        <w:t xml:space="preserve">without overreaching it. The classes present here — alkaloids, flavonoids,</w:t>
+      </w:r>
+      <w:r>
+        <w:t xml:space="preserve"> </w:t>
+      </w:r>
+      <w:r>
+        <w:t xml:space="preserve">saponins and tannins — are precisely those repeatedly tied to trypanocidal</w:t>
+      </w:r>
+      <w:r>
+        <w:t xml:space="preserve"> </w:t>
+      </w:r>
+      <w:r>
+        <w:t xml:space="preserve">activity (Ujah et al. 2020; Ogbole et al. 2021), and the part-axis variation</w:t>
+      </w:r>
+      <w:r>
+        <w:t xml:space="preserve"> </w:t>
+      </w:r>
+      <w:r>
+        <w:t xml:space="preserve">(steroids only in</w:t>
+      </w:r>
+      <w:r>
+        <w:t xml:space="preserve"> </w:t>
+      </w:r>
+      <w:r>
+        <w:rPr>
+          <w:i/>
+          <w:iCs/>
+        </w:rPr>
+        <w:t xml:space="preserve">A. indica</w:t>
+      </w:r>
+      <w:r>
+        <w:t xml:space="preserve"> </w:t>
+      </w:r>
+      <w:r>
+        <w:t xml:space="preserve">leaves/seeds, terpenoids only in</w:t>
+      </w:r>
+      <w:r>
+        <w:t xml:space="preserve"> </w:t>
+      </w:r>
+      <w:r>
+        <w:rPr>
+          <w:i/>
+          <w:iCs/>
+        </w:rPr>
+        <w:t xml:space="preserve">M. oleifera</w:t>
+      </w:r>
+      <w:r>
+        <w:t xml:space="preserve"> </w:t>
+      </w:r>
+      <w:r>
+        <w:t xml:space="preserve">stem bark) offers natural fractionation targets. The mechanistic hypothesis</w:t>
+      </w:r>
+      <w:r>
+        <w:t xml:space="preserve"> </w:t>
+      </w:r>
+      <w:r>
+        <w:t xml:space="preserve">with the most direct support is trypanosome alternative oxidase inhibition,</w:t>
+      </w:r>
+      <w:r>
+        <w:t xml:space="preserve"> </w:t>
+      </w:r>
+      <w:r>
+        <w:t xml:space="preserve">for which</w:t>
+      </w:r>
+      <w:r>
+        <w:t xml:space="preserve"> </w:t>
+      </w:r>
+      <w:r>
+        <w:rPr>
+          <w:i/>
+          <w:iCs/>
+        </w:rPr>
+        <w:t xml:space="preserve">A. indica</w:t>
+      </w:r>
+      <w:r>
+        <w:t xml:space="preserve"> </w:t>
+      </w:r>
+      <w:r>
+        <w:t xml:space="preserve">fractions already show dose-dependent motility</w:t>
+      </w:r>
+      <w:r>
+        <w:t xml:space="preserve"> </w:t>
+      </w:r>
+      <w:r>
+        <w:t xml:space="preserve">suppression coupled to enzyme inhibition (Tauheed et al. 2021); testing the</w:t>
+      </w:r>
+      <w:r>
+        <w:t xml:space="preserve"> </w:t>
+      </w:r>
+      <w:r>
+        <w:t xml:space="preserve">present extracts in that assay would be the logical next step. The weight and</w:t>
+      </w:r>
+      <w:r>
+        <w:t xml:space="preserve"> </w:t>
+      </w:r>
+      <w:r>
+        <w:t xml:space="preserve">PCV nulls diverge from studies reporting PCV recovery under treatment</w:t>
+      </w:r>
+      <w:r>
+        <w:t xml:space="preserve"> </w:t>
+      </w:r>
+      <w:r>
+        <w:t xml:space="preserve">(Datti et al. 2020; Ujah et al. 2020; Tauheed et al. 2021), but those studies</w:t>
+      </w:r>
+      <w:r>
+        <w:t xml:space="preserve"> </w:t>
+      </w:r>
+      <w:r>
+        <w:t xml:space="preserve">used animal-level data with identified controls and larger groups, whereas</w:t>
+      </w:r>
+      <w:r>
+        <w:t xml:space="preserve"> </w:t>
+      </w:r>
+      <w:r>
+        <w:t xml:space="preserve">the present group-mean design with eight blocks cannot resolve modest</w:t>
+      </w:r>
+      <w:r>
+        <w:t xml:space="preserve"> </w:t>
+      </w:r>
+      <w:r>
+        <w:t xml:space="preserve">haematological effects — absence of evidence here, not evidence of absence,</w:t>
+      </w:r>
+      <w:r>
+        <w:t xml:space="preserve"> </w:t>
+      </w:r>
+      <w:r>
+        <w:t xml:space="preserve">and the flag clustering still independently ranks</w:t>
       </w:r>
       <w:r>
         <w:t xml:space="preserve"> </w:t>
@@ -12218,55 +12929,52 @@
         <w:t xml:space="preserve">T. congolense</w:t>
       </w:r>
       <w:r>
-        <w:t xml:space="preserve">, whose threshold remains</w:t>
-      </w:r>
-      <w:r>
-        <w:t xml:space="preserve"> </w:t>
-      </w:r>
-      <w:r>
-        <w:t xml:space="preserve">unresolved. The two nulls sharpen the picture rather than weakening it. Plant</w:t>
-      </w:r>
-      <w:r>
-        <w:t xml:space="preserve"> </w:t>
-      </w:r>
-      <w:r>
-        <w:t xml:space="preserve">interchangeability, set against heavily overlapping phytochemistry (§5.2),</w:t>
-      </w:r>
-      <w:r>
-        <w:t xml:space="preserve"> </w:t>
-      </w:r>
-      <w:r>
-        <w:t xml:space="preserve">suggests the shared compound classes — or the shared extraction chemistry —</w:t>
-      </w:r>
-      <w:r>
-        <w:t xml:space="preserve"> </w:t>
-      </w:r>
-      <w:r>
-        <w:t xml:space="preserve">carry the activity, a hypothesis a fractionation study could test directly;</w:t>
-      </w:r>
-      <w:r>
-        <w:t xml:space="preserve"> </w:t>
-      </w:r>
-      <w:r>
-        <w:t xml:space="preserve">it also means formulation choice between these species can rest on cost,</w:t>
-      </w:r>
-      <w:r>
-        <w:t xml:space="preserve"> </w:t>
-      </w:r>
-      <w:r>
-        <w:t xml:space="preserve">toxicity and availability rather than efficacy. The weight/PCV nulls, finally,</w:t>
-      </w:r>
-      <w:r>
-        <w:t xml:space="preserve"> </w:t>
-      </w:r>
-      <w:r>
-        <w:t xml:space="preserve">do double duty: they rule out toxicity confounding of the parasitaemia</w:t>
-      </w:r>
-      <w:r>
-        <w:t xml:space="preserve"> </w:t>
-      </w:r>
-      <w:r>
-        <w:t xml:space="preserve">result and independently rank</w:t>
+        <w:t xml:space="preserve"> </w:t>
+      </w:r>
+      <w:r>
+        <w:t xml:space="preserve">the more</w:t>
+      </w:r>
+      <w:r>
+        <w:t xml:space="preserve"> </w:t>
+      </w:r>
+      <w:r>
+        <w:t xml:space="preserve">pathogenic parasite, in line with the comparative literature. Methodologically,</w:t>
+      </w:r>
+      <w:r>
+        <w:t xml:space="preserve"> </w:t>
+      </w:r>
+      <w:r>
+        <w:t xml:space="preserve">the Sirak-style ANOVA+Tukey pipeline used across much of this literature</w:t>
+      </w:r>
+      <w:r>
+        <w:t xml:space="preserve"> </w:t>
+      </w:r>
+      <w:r>
+        <w:t xml:space="preserve">assumes normality and independence that group-mean, ordinal, repeated</w:t>
+      </w:r>
+      <w:r>
+        <w:t xml:space="preserve"> </w:t>
+      </w:r>
+      <w:r>
+        <w:t xml:space="preserve">observations violate; the block-level rank analysis here answers the same</w:t>
+      </w:r>
+      <w:r>
+        <w:t xml:space="preserve"> </w:t>
+      </w:r>
+      <w:r>
+        <w:t xml:space="preserve">questions without those assumptions, at the accepted cost of power. Taken</w:t>
+      </w:r>
+      <w:r>
+        <w:t xml:space="preserve"> </w:t>
+      </w:r>
+      <w:r>
+        <w:t xml:space="preserve">together, the supported position is narrow and firm: both extracts are active</w:t>
+      </w:r>
+      <w:r>
+        <w:t xml:space="preserve"> </w:t>
+      </w:r>
+      <w:r>
+        <w:t xml:space="preserve">in a dose-dependent manner with the top dose fully suppressive,</w:t>
       </w:r>
       <w:r>
         <w:t xml:space="preserve"> </w:t>
@@ -12276,25 +12984,25 @@
           <w:i/>
           <w:iCs/>
         </w:rPr>
-        <w:t xml:space="preserve">T. congolense</w:t>
-      </w:r>
-      <w:r>
-        <w:t xml:space="preserve"> </w:t>
-      </w:r>
-      <w:r>
-        <w:t xml:space="preserve">the more pathogenic parasite.</w:t>
-      </w:r>
-      <w:r>
-        <w:t xml:space="preserve"> </w:t>
-      </w:r>
-      <w:r>
-        <w:t xml:space="preserve">What remains is confirmatory: animal-level (not group-mean) data with</w:t>
-      </w:r>
-      <w:r>
-        <w:t xml:space="preserve"> </w:t>
-      </w:r>
-      <w:r>
-        <w:t xml:space="preserve">identified controls, a refined dose grid around the</w:t>
+        <w:t xml:space="preserve">T. evansi</w:t>
+      </w:r>
+      <w:r>
+        <w:t xml:space="preserve"> </w:t>
+      </w:r>
+      <w:r>
+        <w:t xml:space="preserve">the more sensitive parasite, and neither plant demonstrably superior —</w:t>
+      </w:r>
+      <w:r>
+        <w:t xml:space="preserve"> </w:t>
+      </w:r>
+      <w:r>
+        <w:t xml:space="preserve">pending animal-level confirmatory work with identified controls, a refined</w:t>
+      </w:r>
+      <w:r>
+        <w:t xml:space="preserve"> </w:t>
+      </w:r>
+      <w:r>
+        <w:t xml:space="preserve">0.5–10 mg/ml grid around the</w:t>
       </w:r>
       <w:r>
         <w:t xml:space="preserve"> </w:t>
@@ -12310,19 +13018,13 @@
         <w:t xml:space="preserve"> </w:t>
       </w:r>
       <w:r>
-        <w:t xml:space="preserve">threshold,</w:t>
-      </w:r>
-      <w:r>
-        <w:t xml:space="preserve"> </w:t>
-      </w:r>
-      <w:r>
-        <w:t xml:space="preserve">and pre-registered block-level tests at adequate power — for which the</w:t>
-      </w:r>
-      <w:r>
-        <w:t xml:space="preserve"> </w:t>
-      </w:r>
-      <w:r>
-        <w:t xml:space="preserve">estimates and intervals in §5 provide the design inputs.</w:t>
+        <w:t xml:space="preserve">threshold, and fractionation</w:t>
+      </w:r>
+      <w:r>
+        <w:t xml:space="preserve"> </w:t>
+      </w:r>
+      <w:r>
+        <w:t xml:space="preserve">toward the compound level.</w:t>
       </w:r>
     </w:p>
     <w:bookmarkEnd w:id="89"/>
@@ -12380,13 +13082,13 @@
       </w:r>
     </w:p>
     <w:bookmarkEnd w:id="90"/>
-    <w:bookmarkStart w:id="91" w:name="references-methods"/>
+    <w:bookmarkStart w:id="91" w:name="references"/>
     <w:p>
       <w:pPr>
         <w:pStyle w:val="Heading2"/>
       </w:pPr>
       <w:r>
-        <w:t xml:space="preserve">14 9. References (methods)</w:t>
+        <w:t xml:space="preserve">14 9. References</w:t>
       </w:r>
     </w:p>
     <w:p>
@@ -12398,23 +13100,13 @@
         </w:numPr>
       </w:pPr>
       <w:r>
-        <w:t xml:space="preserve">Conover, W.J. (1999).</w:t>
-      </w:r>
-      <w:r>
-        <w:t xml:space="preserve"> </w:t>
-      </w:r>
-      <w:r>
-        <w:rPr>
-          <w:i/>
-          <w:iCs/>
-        </w:rPr>
-        <w:t xml:space="preserve">Practical Nonparametric Statistics</w:t>
-      </w:r>
-      <w:r>
-        <w:t xml:space="preserve"> </w:t>
-      </w:r>
-      <w:r>
-        <w:t xml:space="preserve">(3rd ed.). Wiley.</w:t>
+        <w:t xml:space="preserve">Barrett, M.P. (2025) — on toxicity and resistance limits of current</w:t>
+      </w:r>
+      <w:r>
+        <w:t xml:space="preserve"> </w:t>
+      </w:r>
+      <w:r>
+        <w:t xml:space="preserve">trypanocides; cited via Abdullahi et al. (2026).</w:t>
       </w:r>
     </w:p>
     <w:p>
@@ -12426,7 +13118,13 @@
         </w:numPr>
       </w:pPr>
       <w:r>
-        <w:t xml:space="preserve">Mann, H.B. &amp; Whitney, D.R. (1947).</w:t>
+        <w:t xml:space="preserve">Abdullahi, R.I. et al. (2026). Phytochemical profiling and in-vitro</w:t>
+      </w:r>
+      <w:r>
+        <w:t xml:space="preserve"> </w:t>
+      </w:r>
+      <w:r>
+        <w:t xml:space="preserve">antitrypanosomal efficacy of</w:t>
       </w:r>
       <w:r>
         <w:t xml:space="preserve"> </w:t>
@@ -12436,13 +13134,26 @@
           <w:i/>
           <w:iCs/>
         </w:rPr>
-        <w:t xml:space="preserve">Ann. Math. Statist.</w:t>
-      </w:r>
-      <w:r>
-        <w:t xml:space="preserve"> </w:t>
-      </w:r>
-      <w:r>
-        <w:t xml:space="preserve">18(1): 50–60.</w:t>
+        <w:t xml:space="preserve">Combretum glutinosum</w:t>
+      </w:r>
+      <w:r>
+        <w:t xml:space="preserve"> </w:t>
+      </w:r>
+      <w:r>
+        <w:t xml:space="preserve">leaf extract.</w:t>
+      </w:r>
+      <w:r>
+        <w:t xml:space="preserve"> </w:t>
+      </w:r>
+      <w:r>
+        <w:rPr>
+          <w:i/>
+          <w:iCs/>
+        </w:rPr>
+        <w:t xml:space="preserve">FJS</w:t>
+      </w:r>
+      <w:r>
+        <w:t xml:space="preserve">.</w:t>
       </w:r>
     </w:p>
     <w:p>
@@ -12454,7 +13165,7 @@
         </w:numPr>
       </w:pPr>
       <w:r>
-        <w:t xml:space="preserve">Wilcoxon, F. (1945).</w:t>
+        <w:t xml:space="preserve">Adams, L. et al. (2024). Antitrypanosomal activities of</w:t>
       </w:r>
       <w:r>
         <w:t xml:space="preserve"> </w:t>
@@ -12464,13 +13175,43 @@
           <w:i/>
           <w:iCs/>
         </w:rPr>
-        <w:t xml:space="preserve">Biometrics</w:t>
-      </w:r>
-      <w:r>
-        <w:t xml:space="preserve"> </w:t>
-      </w:r>
-      <w:r>
-        <w:t xml:space="preserve">1(1): 86–89.</w:t>
+        <w:t xml:space="preserve">Anopyxis</w:t>
+      </w:r>
+      <w:r>
+        <w:rPr>
+          <w:i/>
+          <w:iCs/>
+        </w:rPr>
+        <w:t xml:space="preserve"> </w:t>
+      </w:r>
+      <w:r>
+        <w:rPr>
+          <w:i/>
+          <w:iCs/>
+        </w:rPr>
+        <w:t xml:space="preserve">klaineana</w:t>
+      </w:r>
+      <w:r>
+        <w:t xml:space="preserve"> </w:t>
+      </w:r>
+      <w:r>
+        <w:t xml:space="preserve">stem bark extracts.</w:t>
+      </w:r>
+      <w:r>
+        <w:t xml:space="preserve"> </w:t>
+      </w:r>
+      <w:r>
+        <w:rPr>
+          <w:i/>
+          <w:iCs/>
+        </w:rPr>
+        <w:t xml:space="preserve">Heliyon</w:t>
+      </w:r>
+      <w:r>
+        <w:t xml:space="preserve"> </w:t>
+      </w:r>
+      <w:r>
+        <w:t xml:space="preserve">10: e28025.</w:t>
       </w:r>
     </w:p>
     <w:p>
@@ -12492,7 +13233,21 @@
           <w:i/>
           <w:iCs/>
         </w:rPr>
-        <w:t xml:space="preserve">J. Educ. Behav. Stat.</w:t>
+        <w:t xml:space="preserve">J. Educ.</w:t>
+      </w:r>
+      <w:r>
+        <w:rPr>
+          <w:i/>
+          <w:iCs/>
+        </w:rPr>
+        <w:t xml:space="preserve"> </w:t>
+      </w:r>
+      <w:r>
+        <w:rPr>
+          <w:i/>
+          <w:iCs/>
+        </w:rPr>
+        <w:t xml:space="preserve">Behav. Stat.</w:t>
       </w:r>
       <w:r>
         <w:t xml:space="preserve"> </w:t>
@@ -12510,7 +13265,7 @@
         </w:numPr>
       </w:pPr>
       <w:r>
-        <w:t xml:space="preserve">Spearman, C. (1904).</w:t>
+        <w:t xml:space="preserve">Conover, W.J. (1999).</w:t>
       </w:r>
       <w:r>
         <w:t xml:space="preserve"> </w:t>
@@ -12520,13 +13275,13 @@
           <w:i/>
           <w:iCs/>
         </w:rPr>
-        <w:t xml:space="preserve">Am. J. Psychol.</w:t>
-      </w:r>
-      <w:r>
-        <w:t xml:space="preserve"> </w:t>
-      </w:r>
-      <w:r>
-        <w:t xml:space="preserve">15(1): 72–85.</w:t>
+        <w:t xml:space="preserve">Practical Nonparametric Statistics</w:t>
+      </w:r>
+      <w:r>
+        <w:t xml:space="preserve"> </w:t>
+      </w:r>
+      <w:r>
+        <w:t xml:space="preserve">(3rd ed.). Wiley.</w:t>
       </w:r>
     </w:p>
     <w:p>
@@ -12538,7 +13293,53 @@
         </w:numPr>
       </w:pPr>
       <w:r>
-        <w:t xml:space="preserve">Jonckheere, A. (1954); Terpstra, J.T. (1952) — ordered alternatives (blocked Friedman reported instead, §4).</w:t>
+        <w:t xml:space="preserve">Datti, Y. et al. (2020). In-vivo antitrypanosomal activity of</w:t>
+      </w:r>
+      <w:r>
+        <w:t xml:space="preserve"> </w:t>
+      </w:r>
+      <w:r>
+        <w:rPr>
+          <w:i/>
+          <w:iCs/>
+        </w:rPr>
+        <w:t xml:space="preserve">Moringa</w:t>
+      </w:r>
+      <w:r>
+        <w:rPr>
+          <w:i/>
+          <w:iCs/>
+        </w:rPr>
+        <w:t xml:space="preserve"> </w:t>
+      </w:r>
+      <w:r>
+        <w:rPr>
+          <w:i/>
+          <w:iCs/>
+        </w:rPr>
+        <w:t xml:space="preserve">oleifera</w:t>
+      </w:r>
+      <w:r>
+        <w:t xml:space="preserve"> </w:t>
+      </w:r>
+      <w:r>
+        <w:t xml:space="preserve">leaf extract in rats.</w:t>
+      </w:r>
+      <w:r>
+        <w:t xml:space="preserve"> </w:t>
+      </w:r>
+      <w:r>
+        <w:rPr>
+          <w:i/>
+          <w:iCs/>
+        </w:rPr>
+        <w:t xml:space="preserve">GSC Biol. Pharm. Sci.</w:t>
+      </w:r>
+      <w:r>
+        <w:t xml:space="preserve"> </w:t>
+      </w:r>
+      <w:r>
+        <w:t xml:space="preserve">11(1): 12–17.</w:t>
       </w:r>
     </w:p>
     <w:p>
@@ -12550,7 +13351,7 @@
         </w:numPr>
       </w:pPr>
       <w:r>
-        <w:t xml:space="preserve">Noyes, H. et al. (2009).</w:t>
+        <w:t xml:space="preserve">Gitonga, P.K. et al. (2017). Differential virulence of</w:t>
       </w:r>
       <w:r>
         <w:t xml:space="preserve"> </w:t>
@@ -12560,13 +13361,45 @@
           <w:i/>
           <w:iCs/>
         </w:rPr>
-        <w:t xml:space="preserve">PLoS ONE</w:t>
-      </w:r>
-      <w:r>
-        <w:t xml:space="preserve"> </w:t>
-      </w:r>
-      <w:r>
-        <w:t xml:space="preserve">4(4): e5170.</w:t>
+        <w:t xml:space="preserve">T. congolense</w:t>
+      </w:r>
+      <w:r>
+        <w:t xml:space="preserve"> </w:t>
+      </w:r>
+      <w:r>
+        <w:t xml:space="preserve">and</w:t>
+      </w:r>
+      <w:r>
+        <w:t xml:space="preserve"> </w:t>
+      </w:r>
+      <w:r>
+        <w:rPr>
+          <w:i/>
+          <w:iCs/>
+        </w:rPr>
+        <w:t xml:space="preserve">T. brucei</w:t>
+      </w:r>
+      <w:r>
+        <w:t xml:space="preserve"> </w:t>
+      </w:r>
+      <w:r>
+        <w:t xml:space="preserve">strains.</w:t>
+      </w:r>
+      <w:r>
+        <w:t xml:space="preserve"> </w:t>
+      </w:r>
+      <w:r>
+        <w:rPr>
+          <w:i/>
+          <w:iCs/>
+        </w:rPr>
+        <w:t xml:space="preserve">Onderstepoort J. Vet. Res.</w:t>
+      </w:r>
+      <w:r>
+        <w:t xml:space="preserve"> </w:t>
+      </w:r>
+      <w:r>
+        <w:t xml:space="preserve">84(1): a1412.</w:t>
       </w:r>
     </w:p>
     <w:p>
@@ -12578,7 +13411,7 @@
         </w:numPr>
       </w:pPr>
       <w:r>
-        <w:t xml:space="preserve">Naessens, J. et al. (2005).</w:t>
+        <w:t xml:space="preserve">Mann, H.B. &amp; Whitney, D.R. (1947).</w:t>
       </w:r>
       <w:r>
         <w:t xml:space="preserve"> </w:t>
@@ -12588,13 +13421,13 @@
           <w:i/>
           <w:iCs/>
         </w:rPr>
-        <w:t xml:space="preserve">Clin. Exp. Immunol.</w:t>
-      </w:r>
-      <w:r>
-        <w:t xml:space="preserve"> </w:t>
-      </w:r>
-      <w:r>
-        <w:t xml:space="preserve">139: 449–456.</w:t>
+        <w:t xml:space="preserve">Ann. Math. Statist.</w:t>
+      </w:r>
+      <w:r>
+        <w:t xml:space="preserve"> </w:t>
+      </w:r>
+      <w:r>
+        <w:t xml:space="preserve">18(1): 50–60.</w:t>
       </w:r>
     </w:p>
     <w:p>
@@ -12606,7 +13439,7 @@
         </w:numPr>
       </w:pPr>
       <w:r>
-        <w:t xml:space="preserve">Gitonga, P.K. et al. (2017).</w:t>
+        <w:t xml:space="preserve">Mbaya, A.W. et al. (2010). Toxicity and antitrypanosomal activity of</w:t>
       </w:r>
       <w:r>
         <w:t xml:space="preserve"> </w:t>
@@ -12616,13 +13449,736 @@
           <w:i/>
           <w:iCs/>
         </w:rPr>
-        <w:t xml:space="preserve">Onderstepoort J. Vet. Res.</w:t>
-      </w:r>
-      <w:r>
-        <w:t xml:space="preserve"> </w:t>
-      </w:r>
-      <w:r>
-        <w:t xml:space="preserve">84(1): a1412.</w:t>
+        <w:t xml:space="preserve">A.</w:t>
+      </w:r>
+      <w:r>
+        <w:rPr>
+          <w:i/>
+          <w:iCs/>
+        </w:rPr>
+        <w:t xml:space="preserve"> </w:t>
+      </w:r>
+      <w:r>
+        <w:rPr>
+          <w:i/>
+          <w:iCs/>
+        </w:rPr>
+        <w:t xml:space="preserve">indica</w:t>
+      </w:r>
+      <w:r>
+        <w:t xml:space="preserve"> </w:t>
+      </w:r>
+      <w:r>
+        <w:t xml:space="preserve">stem bark.</w:t>
+      </w:r>
+      <w:r>
+        <w:t xml:space="preserve"> </w:t>
+      </w:r>
+      <w:r>
+        <w:rPr>
+          <w:i/>
+          <w:iCs/>
+        </w:rPr>
+        <w:t xml:space="preserve">J. Ethnopharmacol.</w:t>
+      </w:r>
+      <w:r>
+        <w:t xml:space="preserve"> </w:t>
+      </w:r>
+      <w:r>
+        <w:t xml:space="preserve">128: 495–400.</w:t>
+      </w:r>
+    </w:p>
+    <w:p>
+      <w:pPr>
+        <w:pStyle w:val="Compact"/>
+        <w:numPr>
+          <w:ilvl w:val="0"/>
+          <w:numId w:val="1001"/>
+        </w:numPr>
+      </w:pPr>
+      <w:r>
+        <w:t xml:space="preserve">Naessens, J. et al. (2005).</w:t>
+      </w:r>
+      <w:r>
+        <w:t xml:space="preserve"> </w:t>
+      </w:r>
+      <w:r>
+        <w:rPr>
+          <w:i/>
+          <w:iCs/>
+        </w:rPr>
+        <w:t xml:space="preserve">Clin. Exp. Immunol.</w:t>
+      </w:r>
+      <w:r>
+        <w:t xml:space="preserve"> </w:t>
+      </w:r>
+      <w:r>
+        <w:t xml:space="preserve">139: 449–456.</w:t>
+      </w:r>
+    </w:p>
+    <w:p>
+      <w:pPr>
+        <w:pStyle w:val="Compact"/>
+        <w:numPr>
+          <w:ilvl w:val="0"/>
+          <w:numId w:val="1001"/>
+        </w:numPr>
+      </w:pPr>
+      <w:r>
+        <w:t xml:space="preserve">Ngure, R.M. et al. (2009). Antitrypanosomal effects of neem extract on</w:t>
+      </w:r>
+      <w:r>
+        <w:t xml:space="preserve"> </w:t>
+      </w:r>
+      <w:r>
+        <w:rPr>
+          <w:i/>
+          <w:iCs/>
+        </w:rPr>
+        <w:t xml:space="preserve">T. brucei rhodesiense</w:t>
+      </w:r>
+      <w:r>
+        <w:t xml:space="preserve">-infected mice.</w:t>
+      </w:r>
+      <w:r>
+        <w:t xml:space="preserve"> </w:t>
+      </w:r>
+      <w:r>
+        <w:rPr>
+          <w:i/>
+          <w:iCs/>
+        </w:rPr>
+        <w:t xml:space="preserve">East. J. Med.</w:t>
+      </w:r>
+      <w:r>
+        <w:t xml:space="preserve"> </w:t>
+      </w:r>
+      <w:r>
+        <w:t xml:space="preserve">14: 2–9.</w:t>
+      </w:r>
+    </w:p>
+    <w:p>
+      <w:pPr>
+        <w:pStyle w:val="Compact"/>
+        <w:numPr>
+          <w:ilvl w:val="0"/>
+          <w:numId w:val="1001"/>
+        </w:numPr>
+      </w:pPr>
+      <w:r>
+        <w:t xml:space="preserve">Noyes, H. et al. (2009). Mechanisms controlling anaemia in</w:t>
+      </w:r>
+      <w:r>
+        <w:t xml:space="preserve"> </w:t>
+      </w:r>
+      <w:r>
+        <w:rPr>
+          <w:i/>
+          <w:iCs/>
+        </w:rPr>
+        <w:t xml:space="preserve">T.</w:t>
+      </w:r>
+      <w:r>
+        <w:rPr>
+          <w:i/>
+          <w:iCs/>
+        </w:rPr>
+        <w:t xml:space="preserve"> </w:t>
+      </w:r>
+      <w:r>
+        <w:rPr>
+          <w:i/>
+          <w:iCs/>
+        </w:rPr>
+        <w:t xml:space="preserve">congolense</w:t>
+      </w:r>
+      <w:r>
+        <w:t xml:space="preserve">-infected mice.</w:t>
+      </w:r>
+      <w:r>
+        <w:t xml:space="preserve"> </w:t>
+      </w:r>
+      <w:r>
+        <w:rPr>
+          <w:i/>
+          <w:iCs/>
+        </w:rPr>
+        <w:t xml:space="preserve">PLoS ONE</w:t>
+      </w:r>
+      <w:r>
+        <w:t xml:space="preserve"> </w:t>
+      </w:r>
+      <w:r>
+        <w:t xml:space="preserve">4(4): e5170.</w:t>
+      </w:r>
+    </w:p>
+    <w:p>
+      <w:pPr>
+        <w:pStyle w:val="Compact"/>
+        <w:numPr>
+          <w:ilvl w:val="0"/>
+          <w:numId w:val="1001"/>
+        </w:numPr>
+      </w:pPr>
+      <w:r>
+        <w:t xml:space="preserve">Ogbole, E. et al. (2021). Anti-trypanosomal activity and phytochemical</w:t>
+      </w:r>
+      <w:r>
+        <w:t xml:space="preserve"> </w:t>
+      </w:r>
+      <w:r>
+        <w:t xml:space="preserve">screening of selected</w:t>
+      </w:r>
+      <w:r>
+        <w:t xml:space="preserve"> </w:t>
+      </w:r>
+      <w:r>
+        <w:rPr>
+          <w:i/>
+          <w:iCs/>
+        </w:rPr>
+        <w:t xml:space="preserve">Acacia</w:t>
+      </w:r>
+      <w:r>
+        <w:t xml:space="preserve"> </w:t>
+      </w:r>
+      <w:r>
+        <w:t xml:space="preserve">species.</w:t>
+      </w:r>
+      <w:r>
+        <w:t xml:space="preserve"> </w:t>
+      </w:r>
+      <w:r>
+        <w:rPr>
+          <w:i/>
+          <w:iCs/>
+        </w:rPr>
+        <w:t xml:space="preserve">J. Chem. Soc. Nigeria</w:t>
+      </w:r>
+      <w:r>
+        <w:t xml:space="preserve"> </w:t>
+      </w:r>
+      <w:r>
+        <w:t xml:space="preserve">46(2).</w:t>
+      </w:r>
+    </w:p>
+    <w:p>
+      <w:pPr>
+        <w:pStyle w:val="Compact"/>
+        <w:numPr>
+          <w:ilvl w:val="0"/>
+          <w:numId w:val="1001"/>
+        </w:numPr>
+      </w:pPr>
+      <w:r>
+        <w:t xml:space="preserve">Okoh, M.E. (2018). In-vivo anti-trypanosomal activity of aqueous</w:t>
+      </w:r>
+      <w:r>
+        <w:t xml:space="preserve"> </w:t>
+      </w:r>
+      <w:r>
+        <w:rPr>
+          <w:i/>
+          <w:iCs/>
+        </w:rPr>
+        <w:t xml:space="preserve">A.</w:t>
+      </w:r>
+      <w:r>
+        <w:rPr>
+          <w:i/>
+          <w:iCs/>
+        </w:rPr>
+        <w:t xml:space="preserve"> </w:t>
+      </w:r>
+      <w:r>
+        <w:rPr>
+          <w:i/>
+          <w:iCs/>
+        </w:rPr>
+        <w:t xml:space="preserve">indica</w:t>
+      </w:r>
+      <w:r>
+        <w:t xml:space="preserve"> </w:t>
+      </w:r>
+      <w:r>
+        <w:t xml:space="preserve">leaves on</w:t>
+      </w:r>
+      <w:r>
+        <w:t xml:space="preserve"> </w:t>
+      </w:r>
+      <w:r>
+        <w:rPr>
+          <w:i/>
+          <w:iCs/>
+        </w:rPr>
+        <w:t xml:space="preserve">T. brucei brucei</w:t>
+      </w:r>
+      <w:r>
+        <w:t xml:space="preserve">-infected mice.</w:t>
+      </w:r>
+      <w:r>
+        <w:t xml:space="preserve"> </w:t>
+      </w:r>
+      <w:r>
+        <w:rPr>
+          <w:i/>
+          <w:iCs/>
+        </w:rPr>
+        <w:t xml:space="preserve">Int. J. Infect. Dis.</w:t>
+      </w:r>
+      <w:r>
+        <w:rPr>
+          <w:i/>
+          <w:iCs/>
+        </w:rPr>
+        <w:t xml:space="preserve"> </w:t>
+      </w:r>
+      <w:r>
+        <w:rPr>
+          <w:i/>
+          <w:iCs/>
+        </w:rPr>
+        <w:t xml:space="preserve">Ther.</w:t>
+      </w:r>
+      <w:r>
+        <w:t xml:space="preserve"> </w:t>
+      </w:r>
+      <w:r>
+        <w:t xml:space="preserve">3(1).</w:t>
+      </w:r>
+    </w:p>
+    <w:p>
+      <w:pPr>
+        <w:pStyle w:val="Compact"/>
+        <w:numPr>
+          <w:ilvl w:val="0"/>
+          <w:numId w:val="1001"/>
+        </w:numPr>
+      </w:pPr>
+      <w:r>
+        <w:t xml:space="preserve">Rabe, Y. et al. (2024). In-vitro study of</w:t>
+      </w:r>
+      <w:r>
+        <w:t xml:space="preserve"> </w:t>
+      </w:r>
+      <w:r>
+        <w:rPr>
+          <w:i/>
+          <w:iCs/>
+        </w:rPr>
+        <w:t xml:space="preserve">A. indica</w:t>
+      </w:r>
+      <w:r>
+        <w:t xml:space="preserve">,</w:t>
+      </w:r>
+      <w:r>
+        <w:t xml:space="preserve"> </w:t>
+      </w:r>
+      <w:r>
+        <w:rPr>
+          <w:i/>
+          <w:iCs/>
+        </w:rPr>
+        <w:t xml:space="preserve">M. oleifera</w:t>
+      </w:r>
+      <w:r>
+        <w:t xml:space="preserve"> </w:t>
+      </w:r>
+      <w:r>
+        <w:t xml:space="preserve">and</w:t>
+      </w:r>
+      <w:r>
+        <w:t xml:space="preserve"> </w:t>
+      </w:r>
+      <w:r>
+        <w:rPr>
+          <w:i/>
+          <w:iCs/>
+        </w:rPr>
+        <w:t xml:space="preserve">C.ymbopogon</w:t>
+      </w:r>
+      <w:r>
+        <w:t xml:space="preserve"> </w:t>
+      </w:r>
+      <w:r>
+        <w:t xml:space="preserve">leaf extracts against diminazene-resistant</w:t>
+      </w:r>
+      <w:r>
+        <w:t xml:space="preserve"> </w:t>
+      </w:r>
+      <w:r>
+        <w:rPr>
+          <w:i/>
+          <w:iCs/>
+        </w:rPr>
+        <w:t xml:space="preserve">T. brucei</w:t>
+      </w:r>
+      <w:r>
+        <w:rPr>
+          <w:i/>
+          <w:iCs/>
+        </w:rPr>
+        <w:t xml:space="preserve"> </w:t>
+      </w:r>
+      <w:r>
+        <w:rPr>
+          <w:i/>
+          <w:iCs/>
+        </w:rPr>
+        <w:t xml:space="preserve">brucei</w:t>
+      </w:r>
+      <w:r>
+        <w:t xml:space="preserve">.</w:t>
+      </w:r>
+      <w:r>
+        <w:t xml:space="preserve"> </w:t>
+      </w:r>
+      <w:r>
+        <w:rPr>
+          <w:i/>
+          <w:iCs/>
+        </w:rPr>
+        <w:t xml:space="preserve">SAJOLS</w:t>
+      </w:r>
+      <w:r>
+        <w:t xml:space="preserve">.</w:t>
+      </w:r>
+    </w:p>
+    <w:p>
+      <w:pPr>
+        <w:pStyle w:val="Compact"/>
+        <w:numPr>
+          <w:ilvl w:val="0"/>
+          <w:numId w:val="1001"/>
+        </w:numPr>
+      </w:pPr>
+      <w:r>
+        <w:t xml:space="preserve">Sirak, B. et al. (2024). In-vitro and in-vivo antitrypanosomal activity</w:t>
+      </w:r>
+      <w:r>
+        <w:t xml:space="preserve"> </w:t>
+      </w:r>
+      <w:r>
+        <w:t xml:space="preserve">of</w:t>
+      </w:r>
+      <w:r>
+        <w:t xml:space="preserve"> </w:t>
+      </w:r>
+      <w:r>
+        <w:rPr>
+          <w:i/>
+          <w:iCs/>
+        </w:rPr>
+        <w:t xml:space="preserve">Ranunculus multifidus</w:t>
+      </w:r>
+      <w:r>
+        <w:t xml:space="preserve"> </w:t>
+      </w:r>
+      <w:r>
+        <w:t xml:space="preserve">and anemonin against</w:t>
+      </w:r>
+      <w:r>
+        <w:t xml:space="preserve"> </w:t>
+      </w:r>
+      <w:r>
+        <w:rPr>
+          <w:i/>
+          <w:iCs/>
+        </w:rPr>
+        <w:t xml:space="preserve">T. congolense</w:t>
+      </w:r>
+      <w:r>
+        <w:t xml:space="preserve">.</w:t>
+      </w:r>
+      <w:r>
+        <w:t xml:space="preserve"> </w:t>
+      </w:r>
+      <w:r>
+        <w:rPr>
+          <w:i/>
+          <w:iCs/>
+        </w:rPr>
+        <w:t xml:space="preserve">BMC</w:t>
+      </w:r>
+      <w:r>
+        <w:rPr>
+          <w:i/>
+          <w:iCs/>
+        </w:rPr>
+        <w:t xml:space="preserve"> </w:t>
+      </w:r>
+      <w:r>
+        <w:rPr>
+          <w:i/>
+          <w:iCs/>
+        </w:rPr>
+        <w:t xml:space="preserve">Vet. Res.</w:t>
+      </w:r>
+      <w:r>
+        <w:t xml:space="preserve"> </w:t>
+      </w:r>
+      <w:r>
+        <w:t xml:space="preserve">20: 38 (article 03856).</w:t>
+      </w:r>
+    </w:p>
+    <w:p>
+      <w:pPr>
+        <w:pStyle w:val="Compact"/>
+        <w:numPr>
+          <w:ilvl w:val="0"/>
+          <w:numId w:val="1001"/>
+        </w:numPr>
+      </w:pPr>
+      <w:r>
+        <w:t xml:space="preserve">Spearman, C. (1904).</w:t>
+      </w:r>
+      <w:r>
+        <w:t xml:space="preserve"> </w:t>
+      </w:r>
+      <w:r>
+        <w:rPr>
+          <w:i/>
+          <w:iCs/>
+        </w:rPr>
+        <w:t xml:space="preserve">Am. J. Psychol.</w:t>
+      </w:r>
+      <w:r>
+        <w:t xml:space="preserve"> </w:t>
+      </w:r>
+      <w:r>
+        <w:t xml:space="preserve">15(1): 72–85.</w:t>
+      </w:r>
+    </w:p>
+    <w:p>
+      <w:pPr>
+        <w:pStyle w:val="Compact"/>
+        <w:numPr>
+          <w:ilvl w:val="0"/>
+          <w:numId w:val="1001"/>
+        </w:numPr>
+      </w:pPr>
+      <w:r>
+        <w:t xml:space="preserve">Tauheed, A. et al. (2021). Partially purified</w:t>
+      </w:r>
+      <w:r>
+        <w:t xml:space="preserve"> </w:t>
+      </w:r>
+      <w:r>
+        <w:rPr>
+          <w:i/>
+          <w:iCs/>
+        </w:rPr>
+        <w:t xml:space="preserve">A. indica</w:t>
+      </w:r>
+      <w:r>
+        <w:t xml:space="preserve"> </w:t>
+      </w:r>
+      <w:r>
+        <w:t xml:space="preserve">leaf fractions</w:t>
+      </w:r>
+      <w:r>
+        <w:t xml:space="preserve"> </w:t>
+      </w:r>
+      <w:r>
+        <w:t xml:space="preserve">inhibit trypanosome alternative oxidase.</w:t>
+      </w:r>
+      <w:r>
+        <w:t xml:space="preserve"> </w:t>
+      </w:r>
+      <w:r>
+        <w:rPr>
+          <w:i/>
+          <w:iCs/>
+        </w:rPr>
+        <w:t xml:space="preserve">PMC</w:t>
+      </w:r>
+      <w:r>
+        <w:t xml:space="preserve"> </w:t>
+      </w:r>
+      <w:r>
+        <w:t xml:space="preserve">8217781.</w:t>
+      </w:r>
+    </w:p>
+    <w:p>
+      <w:pPr>
+        <w:pStyle w:val="Compact"/>
+        <w:numPr>
+          <w:ilvl w:val="0"/>
+          <w:numId w:val="1001"/>
+        </w:numPr>
+      </w:pPr>
+      <w:r>
+        <w:t xml:space="preserve">Ujah, F.O. et al. (2020). In-vitro and in-vivo effect of</w:t>
+      </w:r>
+      <w:r>
+        <w:t xml:space="preserve"> </w:t>
+      </w:r>
+      <w:r>
+        <w:rPr>
+          <w:i/>
+          <w:iCs/>
+        </w:rPr>
+        <w:t xml:space="preserve">M. oleifera</w:t>
+      </w:r>
+      <w:r>
+        <w:t xml:space="preserve"> </w:t>
+      </w:r>
+      <w:r>
+        <w:t xml:space="preserve">seed extract on</w:t>
+      </w:r>
+      <w:r>
+        <w:t xml:space="preserve"> </w:t>
+      </w:r>
+      <w:r>
+        <w:rPr>
+          <w:i/>
+          <w:iCs/>
+        </w:rPr>
+        <w:t xml:space="preserve">T. brucei</w:t>
+      </w:r>
+      <w:r>
+        <w:t xml:space="preserve"> </w:t>
+      </w:r>
+      <w:r>
+        <w:t xml:space="preserve">and</w:t>
+      </w:r>
+      <w:r>
+        <w:t xml:space="preserve"> </w:t>
+      </w:r>
+      <w:r>
+        <w:rPr>
+          <w:i/>
+          <w:iCs/>
+        </w:rPr>
+        <w:t xml:space="preserve">T. congolense</w:t>
+      </w:r>
+      <w:r>
+        <w:t xml:space="preserve"> </w:t>
+      </w:r>
+      <w:r>
+        <w:t xml:space="preserve">in rats.</w:t>
+      </w:r>
+      <w:r>
+        <w:t xml:space="preserve"> </w:t>
+      </w:r>
+      <w:r>
+        <w:rPr>
+          <w:i/>
+          <w:iCs/>
+        </w:rPr>
+        <w:t xml:space="preserve">Int. J. Green</w:t>
+      </w:r>
+      <w:r>
+        <w:rPr>
+          <w:i/>
+          <w:iCs/>
+        </w:rPr>
+        <w:t xml:space="preserve"> </w:t>
+      </w:r>
+      <w:r>
+        <w:rPr>
+          <w:i/>
+          <w:iCs/>
+        </w:rPr>
+        <w:t xml:space="preserve">Herb. Chem.</w:t>
+      </w:r>
+      <w:r>
+        <w:t xml:space="preserve"> </w:t>
+      </w:r>
+      <w:r>
+        <w:t xml:space="preserve">9(2).</w:t>
+      </w:r>
+    </w:p>
+    <w:p>
+      <w:pPr>
+        <w:pStyle w:val="Compact"/>
+        <w:numPr>
+          <w:ilvl w:val="0"/>
+          <w:numId w:val="1001"/>
+        </w:numPr>
+      </w:pPr>
+      <w:r>
+        <w:t xml:space="preserve">Wanzala, E.N. et al. (2017). In-vitro and in-vivo anti-trypanosomal</w:t>
+      </w:r>
+      <w:r>
+        <w:t xml:space="preserve"> </w:t>
+      </w:r>
+      <w:r>
+        <w:t xml:space="preserve">activities of methanol extract of</w:t>
+      </w:r>
+      <w:r>
+        <w:t xml:space="preserve"> </w:t>
+      </w:r>
+      <w:r>
+        <w:rPr>
+          <w:i/>
+          <w:iCs/>
+        </w:rPr>
+        <w:t xml:space="preserve">A. indica</w:t>
+      </w:r>
+      <w:r>
+        <w:t xml:space="preserve"> </w:t>
+      </w:r>
+      <w:r>
+        <w:t xml:space="preserve">stem bark.</w:t>
+      </w:r>
+      <w:r>
+        <w:t xml:space="preserve"> </w:t>
+      </w:r>
+      <w:r>
+        <w:rPr>
+          <w:i/>
+          <w:iCs/>
+        </w:rPr>
+        <w:t xml:space="preserve">Afr. J. Trad.</w:t>
+      </w:r>
+      <w:r>
+        <w:rPr>
+          <w:i/>
+          <w:iCs/>
+        </w:rPr>
+        <w:t xml:space="preserve"> </w:t>
+      </w:r>
+      <w:r>
+        <w:rPr>
+          <w:i/>
+          <w:iCs/>
+        </w:rPr>
+        <w:t xml:space="preserve">Complement. Altern. Med.</w:t>
+      </w:r>
+      <w:r>
+        <w:t xml:space="preserve"> </w:t>
+      </w:r>
+      <w:r>
+        <w:t xml:space="preserve">14(6).</w:t>
+      </w:r>
+    </w:p>
+    <w:p>
+      <w:pPr>
+        <w:pStyle w:val="Compact"/>
+        <w:numPr>
+          <w:ilvl w:val="0"/>
+          <w:numId w:val="1001"/>
+        </w:numPr>
+      </w:pPr>
+      <w:r>
+        <w:t xml:space="preserve">Wilcoxon, F. (1945).</w:t>
+      </w:r>
+      <w:r>
+        <w:t xml:space="preserve"> </w:t>
+      </w:r>
+      <w:r>
+        <w:rPr>
+          <w:i/>
+          <w:iCs/>
+        </w:rPr>
+        <w:t xml:space="preserve">Biometrics</w:t>
+      </w:r>
+      <w:r>
+        <w:t xml:space="preserve"> </w:t>
+      </w:r>
+      <w:r>
+        <w:t xml:space="preserve">1(1): 86–89.</w:t>
       </w:r>
     </w:p>
     <w:bookmarkEnd w:id="91"/>

</xml_diff>

<commit_message>
docs: proper table names, fit Tables 9-10, Section wording, methods variable table
Table headers prettified (no underscores; acronyms kept); contrast rows shortened with detail in captions; new Table 1 specifying every analysis variable exactly as named in code/data (Methods), Results/Discussion use display names; section symbol replaced with Section throughout.
</commit_message>
<xml_diff>
--- a/analysis/reports/report.docx
+++ b/analysis/reports/report.docx
@@ -358,7 +358,7 @@
         <w:t xml:space="preserve"> </w:t>
       </w:r>
       <w:r>
-        <w:t xml:space="preserve">(thesis §1.8.1). This</w:t>
+        <w:t xml:space="preserve">(thesis Section 1.8.1). This</w:t>
       </w:r>
       <w:r>
         <w:t xml:space="preserve"> </w:t>
@@ -370,25 +370,25 @@
         <w:t xml:space="preserve"> </w:t>
       </w:r>
       <w:r>
-        <w:t xml:space="preserve">(§1.8.2): phytochemical characterisation (§5.2), the in-vitro motility assay</w:t>
-      </w:r>
-      <w:r>
-        <w:t xml:space="preserve"> </w:t>
-      </w:r>
-      <w:r>
-        <w:t xml:space="preserve">(§5.3), in-vivo infectivity (§5.4) and the superiority assessment (§5.5),</w:t>
-      </w:r>
-      <w:r>
-        <w:t xml:space="preserve"> </w:t>
-      </w:r>
-      <w:r>
-        <w:t xml:space="preserve">followed by diagnostics (§6), an integrative discussion against the recent</w:t>
-      </w:r>
-      <w:r>
-        <w:t xml:space="preserve"> </w:t>
-      </w:r>
-      <w:r>
-        <w:t xml:space="preserve">literature (§7) and limitations (§8). Objective i (extraction) is a</w:t>
+        <w:t xml:space="preserve">(Section 1.8.2): phytochemical characterisation (Section 5.2), the in-vitro motility assay</w:t>
+      </w:r>
+      <w:r>
+        <w:t xml:space="preserve"> </w:t>
+      </w:r>
+      <w:r>
+        <w:t xml:space="preserve">(Section 5.3), in-vivo infectivity (Section 5.4) and the superiority assessment (Section 5.5),</w:t>
+      </w:r>
+      <w:r>
+        <w:t xml:space="preserve"> </w:t>
+      </w:r>
+      <w:r>
+        <w:t xml:space="preserve">followed by diagnostics (Section 6), an integrative discussion against the recent</w:t>
+      </w:r>
+      <w:r>
+        <w:t xml:space="preserve"> </w:t>
+      </w:r>
+      <w:r>
+        <w:t xml:space="preserve">literature (Section 7) and limitations (Section 8). Objective i (extraction) is a</w:t>
       </w:r>
       <w:r>
         <w:t xml:space="preserve"> </w:t>
@@ -400,7 +400,7 @@
         <w:t xml:space="preserve"> </w:t>
       </w:r>
       <w:r>
-        <w:t xml:space="preserve">component (§5.1).</w:t>
+        <w:t xml:space="preserve">component (Section 5.1).</w:t>
       </w:r>
     </w:p>
     <w:bookmarkEnd w:id="10"/>
@@ -587,7 +587,7 @@
       </w:r>
     </w:p>
     <w:bookmarkEnd w:id="12"/>
-    <w:bookmarkStart w:id="13" w:name="statistical-methods"/>
+    <w:bookmarkStart w:id="14" w:name="statistical-methods"/>
     <w:p>
       <w:pPr>
         <w:pStyle w:val="Heading2"/>
@@ -649,7 +649,7 @@
         <w:t xml:space="preserve"> </w:t>
       </w:r>
       <w:r>
-        <w:t xml:space="preserve">substituted and the substitution recorded per contrast (§6). Per-block trend</w:t>
+        <w:t xml:space="preserve">substituted and the substitution recorded per contrast (Section 6). Per-block trend</w:t>
       </w:r>
       <w:r>
         <w:t xml:space="preserve"> </w:t>
@@ -675,208 +675,17 @@
       <w:r>
         <w:t xml:space="preserve">; no machine learning was used.</w:t>
       </w:r>
-    </w:p>
-    <w:bookmarkEnd w:id="13"/>
-    <w:bookmarkStart w:id="14" w:name="objective-i-methanolic-extraction"/>
-    <w:p>
-      <w:pPr>
-        <w:pStyle w:val="Heading2"/>
-      </w:pPr>
-      <w:r>
-        <w:t xml:space="preserve">6 5.1. Objective i — methanolic extraction</w:t>
-      </w:r>
-    </w:p>
-    <w:p>
-      <w:pPr>
-        <w:pStyle w:val="FirstParagraph"/>
-      </w:pPr>
-      <w:r>
-        <w:t xml:space="preserve">No yields or replicates were recorded for the extraction step, so objective i</w:t>
-      </w:r>
-      <w:r>
-        <w:t xml:space="preserve"> </w:t>
-      </w:r>
-      <w:r>
-        <w:t xml:space="preserve">contributes no data to the analysis and is noted here only for completeness.</w:t>
-      </w:r>
-    </w:p>
-    <w:bookmarkEnd w:id="14"/>
-    <w:bookmarkStart w:id="24" w:name="objective-ii-phytochemical-contents"/>
-    <w:p>
-      <w:pPr>
-        <w:pStyle w:val="Heading2"/>
-      </w:pPr>
-      <w:r>
-        <w:t xml:space="preserve">7 5.2. Objective ii — phytochemical contents</w:t>
-      </w:r>
-    </w:p>
-    <w:p>
-      <w:pPr>
-        <w:pStyle w:val="FirstParagraph"/>
-      </w:pPr>
-      <w:r>
-        <w:t xml:space="preserve">The screening panel resolved eight of twelve compound classes in at least one</w:t>
-      </w:r>
-      <w:r>
-        <w:t xml:space="preserve"> </w:t>
-      </w:r>
-      <w:r>
-        <w:t xml:space="preserve">extract, distributed along a part axis rather than a plant axis. Leaves were</w:t>
-      </w:r>
-      <w:r>
-        <w:t xml:space="preserve"> </w:t>
-      </w:r>
-      <w:r>
-        <w:t xml:space="preserve">the richest fraction in both species (6 of 12 classes each), stem bark and</w:t>
-      </w:r>
-      <w:r>
-        <w:t xml:space="preserve"> </w:t>
-      </w:r>
-      <w:r>
-        <w:t xml:space="preserve">roots the sparsest (3–4), and seeds intermediate (4–5;</w:t>
-      </w:r>
-      <w:r>
-        <w:t xml:space="preserve"> </w:t>
-      </w:r>
-      <w:hyperlink w:anchor="tbl-phyto">
-        <w:r>
-          <w:rPr>
-            <w:rStyle w:val="Hyperlink"/>
-          </w:rPr>
-          <w:t xml:space="preserve">Table 1</w:t>
-        </w:r>
-      </w:hyperlink>
-      <w:r>
-        <w:t xml:space="preserve">,</w:t>
-      </w:r>
-      <w:r>
-        <w:t xml:space="preserve"> </w:t>
-      </w:r>
-      <w:hyperlink w:anchor="fig-rich">
-        <w:r>
-          <w:rPr>
-            <w:rStyle w:val="Hyperlink"/>
-          </w:rPr>
-          <w:t xml:space="preserve">Figure 1</w:t>
-        </w:r>
-      </w:hyperlink>
-      <w:r>
-        <w:t xml:space="preserve">).</w:t>
-      </w:r>
-      <w:r>
-        <w:t xml:space="preserve"> </w:t>
-      </w:r>
-      <w:r>
-        <w:t xml:space="preserve">Saponins and carbohydrates were ubiquitous (8 of 8 combinations) while</w:t>
-      </w:r>
-      <w:r>
-        <w:t xml:space="preserve"> </w:t>
-      </w:r>
-      <w:r>
-        <w:t xml:space="preserve">anthraquinones, phlobatannins, oxalates and phytates were uniformly absent,</w:t>
-      </w:r>
-      <w:r>
-        <w:t xml:space="preserve"> </w:t>
-      </w:r>
-      <w:r>
-        <w:t xml:space="preserve">so neither group discriminates the plants; tannins showed the sharpest part</w:t>
-      </w:r>
-      <w:r>
-        <w:t xml:space="preserve"> </w:t>
-      </w:r>
-      <w:r>
-        <w:t xml:space="preserve">pattern, present everywhere except seeds in both species (</w:t>
-      </w:r>
-      <w:hyperlink w:anchor="fig-phyto-hm">
-        <w:r>
-          <w:rPr>
-            <w:rStyle w:val="Hyperlink"/>
-          </w:rPr>
-          <w:t xml:space="preserve">Figure 2</w:t>
-        </w:r>
-      </w:hyperlink>
-      <w:r>
-        <w:t xml:space="preserve">). The</w:t>
-      </w:r>
-      <w:r>
-        <w:t xml:space="preserve"> </w:t>
-      </w:r>
-      <w:r>
-        <w:t xml:space="preserve">few differentiating classes were part-specific rather than species-specific:</w:t>
-      </w:r>
-      <w:r>
-        <w:t xml:space="preserve"> </w:t>
-      </w:r>
-      <w:r>
-        <w:t xml:space="preserve">steroids (only</w:t>
-      </w:r>
-      <w:r>
-        <w:t xml:space="preserve"> </w:t>
-      </w:r>
-      <w:r>
-        <w:rPr>
-          <w:i/>
-          <w:iCs/>
-        </w:rPr>
-        <w:t xml:space="preserve">A. indica</w:t>
-      </w:r>
-      <w:r>
-        <w:t xml:space="preserve"> </w:t>
-      </w:r>
-      <w:r>
-        <w:t xml:space="preserve">leaves and seeds), terpenoids (only</w:t>
-      </w:r>
-      <w:r>
-        <w:t xml:space="preserve"> </w:t>
-      </w:r>
-      <w:r>
-        <w:rPr>
-          <w:i/>
-          <w:iCs/>
-        </w:rPr>
-        <w:t xml:space="preserve">M. oleifera</w:t>
-      </w:r>
-      <w:r>
-        <w:t xml:space="preserve"> </w:t>
-      </w:r>
-      <w:r>
-        <w:t xml:space="preserve">stem bark), and alkaloids, flavonoids and glucosides in asymmetric but</w:t>
-      </w:r>
-      <w:r>
-        <w:t xml:space="preserve"> </w:t>
-      </w:r>
-      <w:r>
-        <w:t xml:space="preserve">overlapping distributions — the two leaf profiles share six classes apiece</w:t>
-      </w:r>
-      <w:r>
-        <w:t xml:space="preserve"> </w:t>
-      </w:r>
-      <w:r>
-        <w:t xml:space="preserve">with only the steroid/glucoside entries swapped. With eight combinations,</w:t>
-      </w:r>
-      <w:r>
-        <w:t xml:space="preserve"> </w:t>
-      </w:r>
-      <w:r>
-        <w:t xml:space="preserve">these data admit description only; compound–efficacy overlays are tabulated</w:t>
-      </w:r>
-      <w:r>
-        <w:t xml:space="preserve"> </w:t>
-      </w:r>
-      <w:r>
-        <w:t xml:space="preserve">without tests. The substantive point for §7 is the extent of chemical overlap</w:t>
-      </w:r>
-      <w:r>
-        <w:t xml:space="preserve"> </w:t>
-      </w:r>
-      <w:r>
-        <w:t xml:space="preserve">between the species, which leaves little phytochemical basis for expecting</w:t>
-      </w:r>
-      <w:r>
-        <w:t xml:space="preserve"> </w:t>
-      </w:r>
-      <w:r>
-        <w:t xml:space="preserve">divergent efficacy.</w:t>
+      <w:r>
+        <w:t xml:space="preserve"> </w:t>
+      </w:r>
+      <w:r>
+        <w:t xml:space="preserve">Analysis variables are specified exactly as named in code and data files in</w:t>
+      </w:r>
+      <w:r>
+        <w:t xml:space="preserve"> </w:t>
+      </w:r>
+      <w:r>
+        <w:t xml:space="preserve">Table 1; Results and Discussion use proper display names.</w:t>
       </w:r>
     </w:p>
     <w:tbl>
@@ -892,7 +701,7 @@
       <w:tr>
         <w:tc>
           <w:tcPr/>
-          <w:bookmarkStart w:id="15" w:name="tbl-phyto"/>
+          <w:bookmarkStart w:id="13" w:name="tbl-vars"/>
           <w:p>
             <w:pPr>
               <w:jc w:val="center"/>
@@ -903,7 +712,793 @@
               <w:pStyle w:val="ImageCaption"/>
             </w:pPr>
             <w:r>
-              <w:t xml:space="preserve">Table 1: Phytochemical richness per plant and part (descriptive).</w:t>
+              <w:t xml:space="preserve">Table 1: Analysis variables as specified in code and data files.</w:t>
+            </w:r>
+          </w:p>
+          <w:tbl>
+            <w:tblPr>
+              <w:tblStyle w:val="Table"/>
+              <w:tblW w:type="pct" w:w="5000"/>
+              <w:tblLayout w:type="fixed"/>
+              <w:tblLook w:firstRow="1" w:lastRow="0" w:firstColumn="0" w:lastColumn="0" w:noHBand="0" w:noVBand="0" w:val="0020"/>
+            </w:tblPr>
+            <w:tblGrid>
+              <w:gridCol w:w="1446"/>
+              <w:gridCol w:w="3443"/>
+              <w:gridCol w:w="3030"/>
+            </w:tblGrid>
+            <w:tr>
+              <w:trPr>
+                <w:tblHeader w:val="on"/>
+              </w:trPr>
+              <w:tc>
+                <w:tcPr/>
+                <w:p>
+                  <w:pPr>
+                    <w:pStyle w:val="Compact"/>
+                    <w:jc w:val="left"/>
+                    <w:jc w:val="center"/>
+                  </w:pPr>
+                  <w:r>
+                    <w:t xml:space="preserve">Variable</w:t>
+                  </w:r>
+                </w:p>
+              </w:tc>
+              <w:tc>
+                <w:tcPr/>
+                <w:p>
+                  <w:pPr>
+                    <w:pStyle w:val="Compact"/>
+                    <w:jc w:val="left"/>
+                    <w:jc w:val="center"/>
+                  </w:pPr>
+                  <w:r>
+                    <w:t xml:space="preserve">Description</w:t>
+                  </w:r>
+                </w:p>
+              </w:tc>
+              <w:tc>
+                <w:tcPr/>
+                <w:p>
+                  <w:pPr>
+                    <w:pStyle w:val="Compact"/>
+                    <w:jc w:val="left"/>
+                    <w:jc w:val="center"/>
+                  </w:pPr>
+                  <w:r>
+                    <w:t xml:space="preserve">File</w:t>
+                  </w:r>
+                </w:p>
+              </w:tc>
+            </w:tr>
+            <w:tr>
+              <w:tc>
+                <w:tcPr/>
+                <w:p>
+                  <w:pPr>
+                    <w:pStyle w:val="Compact"/>
+                    <w:jc w:val="left"/>
+                    <w:jc w:val="center"/>
+                  </w:pPr>
+                  <w:r>
+                    <w:rPr>
+                      <w:rStyle w:val="VerbatimChar"/>
+                    </w:rPr>
+                    <w:t xml:space="preserve">auc</w:t>
+                  </w:r>
+                </w:p>
+              </w:tc>
+              <w:tc>
+                <w:tcPr/>
+                <w:p>
+                  <w:pPr>
+                    <w:pStyle w:val="Compact"/>
+                    <w:jc w:val="left"/>
+                    <w:jc w:val="center"/>
+                  </w:pPr>
+                  <w:r>
+                    <w:t xml:space="preserve">Death-censored trapezoidal AUC over observed days</w:t>
+                  </w:r>
+                </w:p>
+              </w:tc>
+              <w:tc>
+                <w:tcPr/>
+                <w:p>
+                  <w:pPr>
+                    <w:pStyle w:val="Compact"/>
+                    <w:jc w:val="left"/>
+                    <w:jc w:val="center"/>
+                  </w:pPr>
+                  <w:r>
+                    <w:rPr>
+                      <w:rStyle w:val="VerbatimChar"/>
+                    </w:rPr>
+                    <w:t xml:space="preserve">endpoints_parasitemia.csv</w:t>
+                  </w:r>
+                </w:p>
+              </w:tc>
+            </w:tr>
+            <w:tr>
+              <w:tc>
+                <w:tcPr/>
+                <w:p>
+                  <w:pPr>
+                    <w:pStyle w:val="Compact"/>
+                    <w:jc w:val="left"/>
+                    <w:jc w:val="center"/>
+                  </w:pPr>
+                  <w:r>
+                    <w:rPr>
+                      <w:rStyle w:val="VerbatimChar"/>
+                    </w:rPr>
+                    <w:t xml:space="preserve">peak_lev</w:t>
+                  </w:r>
+                </w:p>
+              </w:tc>
+              <w:tc>
+                <w:tcPr/>
+                <w:p>
+                  <w:pPr>
+                    <w:pStyle w:val="Compact"/>
+                    <w:jc w:val="left"/>
+                    <w:jc w:val="center"/>
+                  </w:pPr>
+                  <w:r>
+                    <w:t xml:space="preserve">Maximum LEV within group</w:t>
+                  </w:r>
+                </w:p>
+              </w:tc>
+              <w:tc>
+                <w:tcPr/>
+                <w:p>
+                  <w:pPr>
+                    <w:pStyle w:val="Compact"/>
+                    <w:jc w:val="left"/>
+                    <w:jc w:val="center"/>
+                  </w:pPr>
+                  <w:r>
+                    <w:rPr>
+                      <w:rStyle w:val="VerbatimChar"/>
+                    </w:rPr>
+                    <w:t xml:space="preserve">endpoints_parasitemia.csv</w:t>
+                  </w:r>
+                </w:p>
+              </w:tc>
+            </w:tr>
+            <w:tr>
+              <w:tc>
+                <w:tcPr/>
+                <w:p>
+                  <w:pPr>
+                    <w:pStyle w:val="Compact"/>
+                    <w:jc w:val="left"/>
+                    <w:jc w:val="center"/>
+                  </w:pPr>
+                  <w:r>
+                    <w:rPr>
+                      <w:rStyle w:val="VerbatimChar"/>
+                    </w:rPr>
+                    <w:t xml:space="preserve">clear_day</w:t>
+                  </w:r>
+                </w:p>
+              </w:tc>
+              <w:tc>
+                <w:tcPr/>
+                <w:p>
+                  <w:pPr>
+                    <w:pStyle w:val="Compact"/>
+                    <w:jc w:val="left"/>
+                    <w:jc w:val="center"/>
+                  </w:pPr>
+                  <w:r>
+                    <w:t xml:space="preserve">Last day with LEV &gt; 0</w:t>
+                  </w:r>
+                </w:p>
+              </w:tc>
+              <w:tc>
+                <w:tcPr/>
+                <w:p>
+                  <w:pPr>
+                    <w:pStyle w:val="Compact"/>
+                    <w:jc w:val="left"/>
+                    <w:jc w:val="center"/>
+                  </w:pPr>
+                  <w:r>
+                    <w:rPr>
+                      <w:rStyle w:val="VerbatimChar"/>
+                    </w:rPr>
+                    <w:t xml:space="preserve">endpoints_parasitemia.csv</w:t>
+                  </w:r>
+                </w:p>
+              </w:tc>
+            </w:tr>
+            <w:tr>
+              <w:tc>
+                <w:tcPr/>
+                <w:p>
+                  <w:pPr>
+                    <w:pStyle w:val="Compact"/>
+                    <w:jc w:val="left"/>
+                    <w:jc w:val="center"/>
+                  </w:pPr>
+                  <w:r>
+                    <w:rPr>
+                      <w:rStyle w:val="VerbatimChar"/>
+                    </w:rPr>
+                    <w:t xml:space="preserve">day40_lev</w:t>
+                  </w:r>
+                </w:p>
+              </w:tc>
+              <w:tc>
+                <w:tcPr/>
+                <w:p>
+                  <w:pPr>
+                    <w:pStyle w:val="Compact"/>
+                    <w:jc w:val="left"/>
+                    <w:jc w:val="center"/>
+                  </w:pPr>
+                  <w:r>
+                    <w:t xml:space="preserve">LEV at day 40 (0 or missing)</w:t>
+                  </w:r>
+                </w:p>
+              </w:tc>
+              <w:tc>
+                <w:tcPr/>
+                <w:p>
+                  <w:pPr>
+                    <w:pStyle w:val="Compact"/>
+                    <w:jc w:val="left"/>
+                    <w:jc w:val="center"/>
+                  </w:pPr>
+                  <w:r>
+                    <w:rPr>
+                      <w:rStyle w:val="VerbatimChar"/>
+                    </w:rPr>
+                    <w:t xml:space="preserve">endpoints_parasitemia.csv</w:t>
+                  </w:r>
+                </w:p>
+              </w:tc>
+            </w:tr>
+            <w:tr>
+              <w:tc>
+                <w:tcPr/>
+                <w:p>
+                  <w:pPr>
+                    <w:pStyle w:val="Compact"/>
+                    <w:jc w:val="left"/>
+                    <w:jc w:val="center"/>
+                  </w:pPr>
+                  <w:r>
+                    <w:rPr>
+                      <w:rStyle w:val="VerbatimChar"/>
+                    </w:rPr>
+                    <w:t xml:space="preserve">tti</w:t>
+                  </w:r>
+                </w:p>
+              </w:tc>
+              <w:tc>
+                <w:tcPr/>
+                <w:p>
+                  <w:pPr>
+                    <w:pStyle w:val="Compact"/>
+                    <w:jc w:val="left"/>
+                    <w:jc w:val="center"/>
+                  </w:pPr>
+                  <w:r>
+                    <w:t xml:space="preserve">First time with motility 0</w:t>
+                  </w:r>
+                </w:p>
+              </w:tc>
+              <w:tc>
+                <w:tcPr/>
+                <w:p>
+                  <w:pPr>
+                    <w:pStyle w:val="Compact"/>
+                    <w:jc w:val="left"/>
+                    <w:jc w:val="center"/>
+                  </w:pPr>
+                  <w:r>
+                    <w:rPr>
+                      <w:rStyle w:val="VerbatimChar"/>
+                    </w:rPr>
+                    <w:t xml:space="preserve">endpoints_motility.csv</w:t>
+                  </w:r>
+                </w:p>
+              </w:tc>
+            </w:tr>
+            <w:tr>
+              <w:tc>
+                <w:tcPr/>
+                <w:p>
+                  <w:pPr>
+                    <w:pStyle w:val="Compact"/>
+                    <w:jc w:val="left"/>
+                    <w:jc w:val="center"/>
+                  </w:pPr>
+                  <w:r>
+                    <w:rPr>
+                      <w:rStyle w:val="VerbatimChar"/>
+                    </w:rPr>
+                    <w:t xml:space="preserve">mot120</w:t>
+                  </w:r>
+                </w:p>
+              </w:tc>
+              <w:tc>
+                <w:tcPr/>
+                <w:p>
+                  <w:pPr>
+                    <w:pStyle w:val="Compact"/>
+                    <w:jc w:val="left"/>
+                    <w:jc w:val="center"/>
+                  </w:pPr>
+                  <w:r>
+                    <w:t xml:space="preserve">Motility at 120 min</w:t>
+                  </w:r>
+                </w:p>
+              </w:tc>
+              <w:tc>
+                <w:tcPr/>
+                <w:p>
+                  <w:pPr>
+                    <w:pStyle w:val="Compact"/>
+                    <w:jc w:val="left"/>
+                    <w:jc w:val="center"/>
+                  </w:pPr>
+                  <w:r>
+                    <w:rPr>
+                      <w:rStyle w:val="VerbatimChar"/>
+                    </w:rPr>
+                    <w:t xml:space="preserve">endpoints_motility.csv</w:t>
+                  </w:r>
+                </w:p>
+              </w:tc>
+            </w:tr>
+            <w:tr>
+              <w:tc>
+                <w:tcPr/>
+                <w:p>
+                  <w:pPr>
+                    <w:pStyle w:val="Compact"/>
+                    <w:jc w:val="left"/>
+                    <w:jc w:val="center"/>
+                  </w:pPr>
+                  <w:r>
+                    <w:rPr>
+                      <w:rStyle w:val="VerbatimChar"/>
+                    </w:rPr>
+                    <w:t xml:space="preserve">mean_motile</w:t>
+                  </w:r>
+                </w:p>
+              </w:tc>
+              <w:tc>
+                <w:tcPr/>
+                <w:p>
+                  <w:pPr>
+                    <w:pStyle w:val="Compact"/>
+                    <w:jc w:val="left"/>
+                    <w:jc w:val="center"/>
+                  </w:pPr>
+                  <w:r>
+                    <w:t xml:space="preserve">Mean proportion motile over 0-120 min</w:t>
+                  </w:r>
+                </w:p>
+              </w:tc>
+              <w:tc>
+                <w:tcPr/>
+                <w:p>
+                  <w:pPr>
+                    <w:pStyle w:val="Compact"/>
+                    <w:jc w:val="left"/>
+                    <w:jc w:val="center"/>
+                  </w:pPr>
+                  <w:r>
+                    <w:rPr>
+                      <w:rStyle w:val="VerbatimChar"/>
+                    </w:rPr>
+                    <w:t xml:space="preserve">endpoints_motility.csv</w:t>
+                  </w:r>
+                </w:p>
+              </w:tc>
+            </w:tr>
+            <w:tr>
+              <w:tc>
+                <w:tcPr/>
+                <w:p>
+                  <w:pPr>
+                    <w:pStyle w:val="Compact"/>
+                    <w:jc w:val="left"/>
+                    <w:jc w:val="center"/>
+                  </w:pPr>
+                  <w:r>
+                    <w:rPr>
+                      <w:rStyle w:val="VerbatimChar"/>
+                    </w:rPr>
+                    <w:t xml:space="preserve">delta</w:t>
+                  </w:r>
+                </w:p>
+              </w:tc>
+              <w:tc>
+                <w:tcPr/>
+                <w:p>
+                  <w:pPr>
+                    <w:pStyle w:val="Compact"/>
+                    <w:jc w:val="left"/>
+                    <w:jc w:val="center"/>
+                  </w:pPr>
+                  <w:r>
+                    <w:t xml:space="preserve">Post-Infection minus Pre-Infection (weight, PCV)</w:t>
+                  </w:r>
+                </w:p>
+              </w:tc>
+              <w:tc>
+                <w:tcPr/>
+                <w:p>
+                  <w:pPr>
+                    <w:pStyle w:val="Compact"/>
+                    <w:jc w:val="left"/>
+                    <w:jc w:val="center"/>
+                  </w:pPr>
+                  <w:r>
+                    <w:rPr>
+                      <w:rStyle w:val="VerbatimChar"/>
+                    </w:rPr>
+                    <w:t xml:space="preserve">endpoints_weight.csv</w:t>
+                  </w:r>
+                  <w:r>
+                    <w:t xml:space="preserve">,</w:t>
+                  </w:r>
+                  <w:r>
+                    <w:t xml:space="preserve"> </w:t>
+                  </w:r>
+                  <w:r>
+                    <w:rPr>
+                      <w:rStyle w:val="VerbatimChar"/>
+                    </w:rPr>
+                    <w:t xml:space="preserve">endpoints_pcv.csv</w:t>
+                  </w:r>
+                </w:p>
+              </w:tc>
+            </w:tr>
+            <w:tr>
+              <w:tc>
+                <w:tcPr/>
+                <w:p>
+                  <w:pPr>
+                    <w:pStyle w:val="Compact"/>
+                    <w:jc w:val="left"/>
+                    <w:jc w:val="center"/>
+                  </w:pPr>
+                  <w:r>
+                    <w:rPr>
+                      <w:rStyle w:val="VerbatimChar"/>
+                    </w:rPr>
+                    <w:t xml:space="preserve">present</w:t>
+                  </w:r>
+                </w:p>
+              </w:tc>
+              <w:tc>
+                <w:tcPr/>
+                <w:p>
+                  <w:pPr>
+                    <w:pStyle w:val="Compact"/>
+                    <w:jc w:val="left"/>
+                    <w:jc w:val="center"/>
+                  </w:pPr>
+                  <w:r>
+                    <w:t xml:space="preserve">Phytochemical presence (TRUE/FALSE)</w:t>
+                  </w:r>
+                </w:p>
+              </w:tc>
+              <w:tc>
+                <w:tcPr/>
+                <w:p>
+                  <w:pPr>
+                    <w:pStyle w:val="Compact"/>
+                    <w:jc w:val="left"/>
+                    <w:jc w:val="center"/>
+                  </w:pPr>
+                  <w:r>
+                    <w:rPr>
+                      <w:rStyle w:val="VerbatimChar"/>
+                    </w:rPr>
+                    <w:t xml:space="preserve">phytochemical.csv</w:t>
+                  </w:r>
+                </w:p>
+              </w:tc>
+            </w:tr>
+            <w:tr>
+              <w:tc>
+                <w:tcPr/>
+                <w:p>
+                  <w:pPr>
+                    <w:pStyle w:val="Compact"/>
+                    <w:jc w:val="left"/>
+                    <w:jc w:val="center"/>
+                  </w:pPr>
+                  <w:r>
+                    <w:rPr>
+                      <w:rStyle w:val="VerbatimChar"/>
+                    </w:rPr>
+                    <w:t xml:space="preserve">concentration_mgml</w:t>
+                  </w:r>
+                </w:p>
+              </w:tc>
+              <w:tc>
+                <w:tcPr/>
+                <w:p>
+                  <w:pPr>
+                    <w:pStyle w:val="Compact"/>
+                    <w:jc w:val="left"/>
+                    <w:jc w:val="center"/>
+                  </w:pPr>
+                  <w:r>
+                    <w:t xml:space="preserve">Dose in mg/ml (NA for controls)</w:t>
+                  </w:r>
+                </w:p>
+              </w:tc>
+              <w:tc>
+                <w:tcPr/>
+                <w:p>
+                  <w:pPr>
+                    <w:pStyle w:val="Compact"/>
+                    <w:jc w:val="left"/>
+                    <w:jc w:val="center"/>
+                  </w:pPr>
+                  <w:r>
+                    <w:rPr>
+                      <w:rStyle w:val="VerbatimChar"/>
+                    </w:rPr>
+                    <w:t xml:space="preserve">motility.csv</w:t>
+                  </w:r>
+                  <w:r>
+                    <w:t xml:space="preserve">,</w:t>
+                  </w:r>
+                  <w:r>
+                    <w:t xml:space="preserve"> </w:t>
+                  </w:r>
+                  <w:r>
+                    <w:rPr>
+                      <w:rStyle w:val="VerbatimChar"/>
+                    </w:rPr>
+                    <w:t xml:space="preserve">parasitemia.csv</w:t>
+                  </w:r>
+                </w:p>
+              </w:tc>
+            </w:tr>
+          </w:tbl>
+          <w:bookmarkEnd w:id="13"/>
+          <w:p/>
+        </w:tc>
+      </w:tr>
+    </w:tbl>
+    <w:bookmarkEnd w:id="14"/>
+    <w:bookmarkStart w:id="15" w:name="objective-i-methanolic-extraction"/>
+    <w:p>
+      <w:pPr>
+        <w:pStyle w:val="Heading2"/>
+      </w:pPr>
+      <w:r>
+        <w:t xml:space="preserve">6 5.1. Objective i — methanolic extraction</w:t>
+      </w:r>
+    </w:p>
+    <w:p>
+      <w:pPr>
+        <w:pStyle w:val="FirstParagraph"/>
+      </w:pPr>
+      <w:r>
+        <w:t xml:space="preserve">No yields or replicates were recorded for the extraction step, so objective i</w:t>
+      </w:r>
+      <w:r>
+        <w:t xml:space="preserve"> </w:t>
+      </w:r>
+      <w:r>
+        <w:t xml:space="preserve">contributes no data to the analysis and is noted here only for completeness.</w:t>
+      </w:r>
+    </w:p>
+    <w:bookmarkEnd w:id="15"/>
+    <w:bookmarkStart w:id="25" w:name="objective-ii-phytochemical-contents"/>
+    <w:p>
+      <w:pPr>
+        <w:pStyle w:val="Heading2"/>
+      </w:pPr>
+      <w:r>
+        <w:t xml:space="preserve">7 5.2. Objective ii — phytochemical contents</w:t>
+      </w:r>
+    </w:p>
+    <w:p>
+      <w:pPr>
+        <w:pStyle w:val="FirstParagraph"/>
+      </w:pPr>
+      <w:r>
+        <w:t xml:space="preserve">The screening panel resolved eight of twelve compound classes in at least one</w:t>
+      </w:r>
+      <w:r>
+        <w:t xml:space="preserve"> </w:t>
+      </w:r>
+      <w:r>
+        <w:t xml:space="preserve">extract, distributed along a part axis rather than a plant axis. Leaves were</w:t>
+      </w:r>
+      <w:r>
+        <w:t xml:space="preserve"> </w:t>
+      </w:r>
+      <w:r>
+        <w:t xml:space="preserve">the richest fraction in both species (6 of 12 classes each), stem bark and</w:t>
+      </w:r>
+      <w:r>
+        <w:t xml:space="preserve"> </w:t>
+      </w:r>
+      <w:r>
+        <w:t xml:space="preserve">roots the sparsest (3–4), and seeds intermediate (4–5;</w:t>
+      </w:r>
+      <w:r>
+        <w:t xml:space="preserve"> </w:t>
+      </w:r>
+      <w:hyperlink w:anchor="tbl-phyto">
+        <w:r>
+          <w:rPr>
+            <w:rStyle w:val="Hyperlink"/>
+          </w:rPr>
+          <w:t xml:space="preserve">Table 2</w:t>
+        </w:r>
+      </w:hyperlink>
+      <w:r>
+        <w:t xml:space="preserve">,</w:t>
+      </w:r>
+      <w:r>
+        <w:t xml:space="preserve"> </w:t>
+      </w:r>
+      <w:hyperlink w:anchor="fig-rich">
+        <w:r>
+          <w:rPr>
+            <w:rStyle w:val="Hyperlink"/>
+          </w:rPr>
+          <w:t xml:space="preserve">Figure 1</w:t>
+        </w:r>
+      </w:hyperlink>
+      <w:r>
+        <w:t xml:space="preserve">).</w:t>
+      </w:r>
+      <w:r>
+        <w:t xml:space="preserve"> </w:t>
+      </w:r>
+      <w:r>
+        <w:t xml:space="preserve">Saponins and carbohydrates were ubiquitous (8 of 8 combinations) while</w:t>
+      </w:r>
+      <w:r>
+        <w:t xml:space="preserve"> </w:t>
+      </w:r>
+      <w:r>
+        <w:t xml:space="preserve">anthraquinones, phlobatannins, oxalates and phytates were uniformly absent,</w:t>
+      </w:r>
+      <w:r>
+        <w:t xml:space="preserve"> </w:t>
+      </w:r>
+      <w:r>
+        <w:t xml:space="preserve">so neither group discriminates the plants; tannins showed the sharpest part</w:t>
+      </w:r>
+      <w:r>
+        <w:t xml:space="preserve"> </w:t>
+      </w:r>
+      <w:r>
+        <w:t xml:space="preserve">pattern, present everywhere except seeds in both species (</w:t>
+      </w:r>
+      <w:hyperlink w:anchor="fig-phyto-hm">
+        <w:r>
+          <w:rPr>
+            <w:rStyle w:val="Hyperlink"/>
+          </w:rPr>
+          <w:t xml:space="preserve">Figure 2</w:t>
+        </w:r>
+      </w:hyperlink>
+      <w:r>
+        <w:t xml:space="preserve">). The</w:t>
+      </w:r>
+      <w:r>
+        <w:t xml:space="preserve"> </w:t>
+      </w:r>
+      <w:r>
+        <w:t xml:space="preserve">few differentiating classes were part-specific rather than species-specific:</w:t>
+      </w:r>
+      <w:r>
+        <w:t xml:space="preserve"> </w:t>
+      </w:r>
+      <w:r>
+        <w:t xml:space="preserve">steroids (only</w:t>
+      </w:r>
+      <w:r>
+        <w:t xml:space="preserve"> </w:t>
+      </w:r>
+      <w:r>
+        <w:rPr>
+          <w:i/>
+          <w:iCs/>
+        </w:rPr>
+        <w:t xml:space="preserve">A. indica</w:t>
+      </w:r>
+      <w:r>
+        <w:t xml:space="preserve"> </w:t>
+      </w:r>
+      <w:r>
+        <w:t xml:space="preserve">leaves and seeds), terpenoids (only</w:t>
+      </w:r>
+      <w:r>
+        <w:t xml:space="preserve"> </w:t>
+      </w:r>
+      <w:r>
+        <w:rPr>
+          <w:i/>
+          <w:iCs/>
+        </w:rPr>
+        <w:t xml:space="preserve">M. oleifera</w:t>
+      </w:r>
+      <w:r>
+        <w:t xml:space="preserve"> </w:t>
+      </w:r>
+      <w:r>
+        <w:t xml:space="preserve">stem bark), and alkaloids, flavonoids and glucosides in asymmetric but</w:t>
+      </w:r>
+      <w:r>
+        <w:t xml:space="preserve"> </w:t>
+      </w:r>
+      <w:r>
+        <w:t xml:space="preserve">overlapping distributions — the two leaf profiles share six classes apiece</w:t>
+      </w:r>
+      <w:r>
+        <w:t xml:space="preserve"> </w:t>
+      </w:r>
+      <w:r>
+        <w:t xml:space="preserve">with only the steroid/glucoside entries swapped. With eight combinations,</w:t>
+      </w:r>
+      <w:r>
+        <w:t xml:space="preserve"> </w:t>
+      </w:r>
+      <w:r>
+        <w:t xml:space="preserve">these data admit description only; compound–efficacy overlays are tabulated</w:t>
+      </w:r>
+      <w:r>
+        <w:t xml:space="preserve"> </w:t>
+      </w:r>
+      <w:r>
+        <w:t xml:space="preserve">without tests. The substantive point for Section 7 is the extent of chemical overlap</w:t>
+      </w:r>
+      <w:r>
+        <w:t xml:space="preserve"> </w:t>
+      </w:r>
+      <w:r>
+        <w:t xml:space="preserve">between the species, which leaves little phytochemical basis for expecting</w:t>
+      </w:r>
+      <w:r>
+        <w:t xml:space="preserve"> </w:t>
+      </w:r>
+      <w:r>
+        <w:t xml:space="preserve">divergent efficacy.</w:t>
+      </w:r>
+    </w:p>
+    <w:tbl>
+      <w:tblPr>
+        <w:tblStyle w:val="Table"/>
+        <w:tblW w:type="pct" w:w="5000"/>
+        <w:tblLayout w:type="fixed"/>
+        <w:tblLook w:firstRow="0" w:lastRow="0" w:firstColumn="0" w:lastColumn="0" w:noHBand="0" w:noVBand="0" w:val="0000"/>
+      </w:tblPr>
+      <w:tblGrid>
+        <w:gridCol w:w="7920"/>
+      </w:tblGrid>
+      <w:tr>
+        <w:tc>
+          <w:tcPr/>
+          <w:bookmarkStart w:id="16" w:name="tbl-phyto"/>
+          <w:p>
+            <w:pPr>
+              <w:jc w:val="center"/>
+            </w:pPr>
+            <w:pPr>
+              <w:jc w:val="left"/>
+              <w:spacing w:before="200"/>
+              <w:pStyle w:val="ImageCaption"/>
+            </w:pPr>
+            <w:r>
+              <w:t xml:space="preserve">Table 2: Phytochemical richness per plant and part (descriptive).</w:t>
             </w:r>
           </w:p>
           <w:tbl>
@@ -931,46 +1526,46 @@
                     <w:jc w:val="center"/>
                   </w:pPr>
                   <w:r>
-                    <w:t xml:space="preserve">plant</w:t>
-                  </w:r>
-                </w:p>
-              </w:tc>
-              <w:tc>
-                <w:tcPr/>
-                <w:p>
-                  <w:pPr>
-                    <w:pStyle w:val="Compact"/>
-                    <w:jc w:val="left"/>
-                    <w:jc w:val="center"/>
-                  </w:pPr>
-                  <w:r>
-                    <w:t xml:space="preserve">part</w:t>
-                  </w:r>
-                </w:p>
-              </w:tc>
-              <w:tc>
-                <w:tcPr/>
-                <w:p>
-                  <w:pPr>
-                    <w:pStyle w:val="Compact"/>
-                    <w:jc w:val="right"/>
-                    <w:jc w:val="center"/>
-                  </w:pPr>
-                  <w:r>
-                    <w:t xml:space="preserve">n_present</w:t>
-                  </w:r>
-                </w:p>
-              </w:tc>
-              <w:tc>
-                <w:tcPr/>
-                <w:p>
-                  <w:pPr>
-                    <w:pStyle w:val="Compact"/>
-                    <w:jc w:val="right"/>
-                    <w:jc w:val="center"/>
-                  </w:pPr>
-                  <w:r>
-                    <w:t xml:space="preserve">n_absent</w:t>
+                    <w:t xml:space="preserve">Plant</w:t>
+                  </w:r>
+                </w:p>
+              </w:tc>
+              <w:tc>
+                <w:tcPr/>
+                <w:p>
+                  <w:pPr>
+                    <w:pStyle w:val="Compact"/>
+                    <w:jc w:val="left"/>
+                    <w:jc w:val="center"/>
+                  </w:pPr>
+                  <w:r>
+                    <w:t xml:space="preserve">Part</w:t>
+                  </w:r>
+                </w:p>
+              </w:tc>
+              <w:tc>
+                <w:tcPr/>
+                <w:p>
+                  <w:pPr>
+                    <w:pStyle w:val="Compact"/>
+                    <w:jc w:val="right"/>
+                    <w:jc w:val="center"/>
+                  </w:pPr>
+                  <w:r>
+                    <w:t xml:space="preserve">n Present</w:t>
+                  </w:r>
+                </w:p>
+              </w:tc>
+              <w:tc>
+                <w:tcPr/>
+                <w:p>
+                  <w:pPr>
+                    <w:pStyle w:val="Compact"/>
+                    <w:jc w:val="right"/>
+                    <w:jc w:val="center"/>
+                  </w:pPr>
+                  <w:r>
+                    <w:t xml:space="preserve">n Absent</w:t>
                   </w:r>
                 </w:p>
               </w:tc>
@@ -1408,7 +2003,7 @@
               </w:tc>
             </w:tr>
           </w:tbl>
-          <w:bookmarkEnd w:id="15"/>
+          <w:bookmarkEnd w:id="16"/>
           <w:p/>
         </w:tc>
       </w:tr>
@@ -1434,7 +2029,7 @@
       <w:tr>
         <w:tc>
           <w:tcPr/>
-          <w:bookmarkStart w:id="19" w:name="fig-rich"/>
+          <w:bookmarkStart w:id="20" w:name="fig-rich"/>
           <w:p>
             <w:pPr>
               <w:pStyle w:val="Compact"/>
@@ -1445,18 +2040,18 @@
                 <wp:inline>
                   <wp:extent cx="5334000" cy="3610707"/>
                   <wp:effectExtent b="0" l="0" r="0" t="0"/>
-                  <wp:docPr descr="" title="" id="17" name="Picture"/>
+                  <wp:docPr descr="" title="" id="18" name="Picture"/>
                   <a:graphic>
                     <a:graphicData uri="http://schemas.openxmlformats.org/drawingml/2006/picture">
                       <pic:pic>
                         <pic:nvPicPr>
-                          <pic:cNvPr descr="../results/figures/explore_richness_bar.png" id="18" name="Picture"/>
+                          <pic:cNvPr descr="../results/figures/explore_richness_bar.png" id="19" name="Picture"/>
                           <pic:cNvPicPr>
                             <a:picLocks noChangeArrowheads="1" noChangeAspect="1"/>
                           </pic:cNvPicPr>
                         </pic:nvPicPr>
                         <pic:blipFill>
-                          <a:blip r:embed="rId16"/>
+                          <a:blip r:embed="rId17"/>
                           <a:stretch>
                             <a:fillRect/>
                           </a:stretch>
@@ -1496,7 +2091,7 @@
               <w:t xml:space="preserve">Figure 1: Richness: classes present of 12</w:t>
             </w:r>
           </w:p>
-          <w:bookmarkEnd w:id="19"/>
+          <w:bookmarkEnd w:id="20"/>
         </w:tc>
       </w:tr>
     </w:tbl>
@@ -1521,7 +2116,7 @@
       <w:tr>
         <w:tc>
           <w:tcPr/>
-          <w:bookmarkStart w:id="23" w:name="fig-phyto-hm"/>
+          <w:bookmarkStart w:id="24" w:name="fig-phyto-hm"/>
           <w:p>
             <w:pPr>
               <w:pStyle w:val="Compact"/>
@@ -1532,18 +2127,18 @@
                 <wp:inline>
                   <wp:extent cx="5334000" cy="4103076"/>
                   <wp:effectExtent b="0" l="0" r="0" t="0"/>
-                  <wp:docPr descr="" title="" id="21" name="Picture"/>
+                  <wp:docPr descr="" title="" id="22" name="Picture"/>
                   <a:graphic>
                     <a:graphicData uri="http://schemas.openxmlformats.org/drawingml/2006/picture">
                       <pic:pic>
                         <pic:nvPicPr>
-                          <pic:cNvPr descr="../results/figures/phytochemical_heatmap.png" id="22" name="Picture"/>
+                          <pic:cNvPr descr="../results/figures/phytochemical_heatmap.png" id="23" name="Picture"/>
                           <pic:cNvPicPr>
                             <a:picLocks noChangeArrowheads="1" noChangeAspect="1"/>
                           </pic:cNvPicPr>
                         </pic:nvPicPr>
                         <pic:blipFill>
-                          <a:blip r:embed="rId20"/>
+                          <a:blip r:embed="rId21"/>
                           <a:stretch>
                             <a:fillRect/>
                           </a:stretch>
@@ -1583,12 +2178,12 @@
               <w:t xml:space="preserve">Figure 2: Phytochemical presence by plant and part</w:t>
             </w:r>
           </w:p>
-          <w:bookmarkEnd w:id="23"/>
+          <w:bookmarkEnd w:id="24"/>
         </w:tc>
       </w:tr>
     </w:tbl>
-    <w:bookmarkEnd w:id="24"/>
-    <w:bookmarkStart w:id="36" w:name="objective-iii-in-vitro-motility"/>
+    <w:bookmarkEnd w:id="25"/>
+    <w:bookmarkStart w:id="37" w:name="objective-iii-in-vitro-motility"/>
     <w:p>
       <w:pPr>
         <w:pStyle w:val="Heading2"/>
@@ -1682,7 +2277,7 @@
           <w:rPr>
             <w:rStyle w:val="Hyperlink"/>
           </w:rPr>
-          <w:t xml:space="preserve">Table 2</w:t>
+          <w:t xml:space="preserve">Table 3</w:t>
         </w:r>
       </w:hyperlink>
       <w:r>
@@ -1731,7 +2326,7 @@
           <w:rPr>
             <w:rStyle w:val="Hyperlink"/>
           </w:rPr>
-          <w:t xml:space="preserve">Table 3</w:t>
+          <w:t xml:space="preserve">Table 4</w:t>
         </w:r>
       </w:hyperlink>
       <w:r>
@@ -1786,7 +2381,7 @@
           <w:rPr>
             <w:rStyle w:val="Hyperlink"/>
           </w:rPr>
-          <w:t xml:space="preserve">Table 4</w:t>
+          <w:t xml:space="preserve">Table 5</w:t>
         </w:r>
       </w:hyperlink>
       <w:r>
@@ -1848,7 +2443,7 @@
       <w:tr>
         <w:tc>
           <w:tcPr/>
-          <w:bookmarkStart w:id="25" w:name="tbl-tti"/>
+          <w:bookmarkStart w:id="26" w:name="tbl-tti"/>
           <w:p>
             <w:pPr>
               <w:jc w:val="center"/>
@@ -1859,7 +2454,7 @@
               <w:pStyle w:val="ImageCaption"/>
             </w:pPr>
             <w:r>
-              <w:t xml:space="preserve">Table 2: TTI and t120 summaries per dose (medians; censored groups never immobilise).</w:t>
+              <w:t xml:space="preserve">Table 3: TTI and t120 summaries per dose (medians; censored groups never immobilise).</w:t>
             </w:r>
           </w:p>
           <w:tbl>
@@ -1890,72 +2485,72 @@
                     <w:jc w:val="center"/>
                   </w:pPr>
                   <w:r>
-                    <w:t xml:space="preserve">parasite</w:t>
-                  </w:r>
-                </w:p>
-              </w:tc>
-              <w:tc>
-                <w:tcPr/>
-                <w:p>
-                  <w:pPr>
-                    <w:pStyle w:val="Compact"/>
-                    <w:jc w:val="left"/>
-                    <w:jc w:val="center"/>
-                  </w:pPr>
-                  <w:r>
-                    <w:t xml:space="preserve">group</w:t>
-                  </w:r>
-                </w:p>
-              </w:tc>
-              <w:tc>
-                <w:tcPr/>
-                <w:p>
-                  <w:pPr>
-                    <w:pStyle w:val="Compact"/>
-                    <w:jc w:val="right"/>
-                    <w:jc w:val="center"/>
-                  </w:pPr>
-                  <w:r>
-                    <w:t xml:space="preserve">n_groups</w:t>
-                  </w:r>
-                </w:p>
-              </w:tc>
-              <w:tc>
-                <w:tcPr/>
-                <w:p>
-                  <w:pPr>
-                    <w:pStyle w:val="Compact"/>
-                    <w:jc w:val="right"/>
-                    <w:jc w:val="center"/>
-                  </w:pPr>
-                  <w:r>
-                    <w:t xml:space="preserve">median_tti</w:t>
-                  </w:r>
-                </w:p>
-              </w:tc>
-              <w:tc>
-                <w:tcPr/>
-                <w:p>
-                  <w:pPr>
-                    <w:pStyle w:val="Compact"/>
-                    <w:jc w:val="right"/>
-                    <w:jc w:val="center"/>
-                  </w:pPr>
-                  <w:r>
-                    <w:t xml:space="preserve">n_never_immobilised</w:t>
-                  </w:r>
-                </w:p>
-              </w:tc>
-              <w:tc>
-                <w:tcPr/>
-                <w:p>
-                  <w:pPr>
-                    <w:pStyle w:val="Compact"/>
-                    <w:jc w:val="right"/>
-                    <w:jc w:val="center"/>
-                  </w:pPr>
-                  <w:r>
-                    <w:t xml:space="preserve">mean_t120</w:t>
+                    <w:t xml:space="preserve">Parasite</w:t>
+                  </w:r>
+                </w:p>
+              </w:tc>
+              <w:tc>
+                <w:tcPr/>
+                <w:p>
+                  <w:pPr>
+                    <w:pStyle w:val="Compact"/>
+                    <w:jc w:val="left"/>
+                    <w:jc w:val="center"/>
+                  </w:pPr>
+                  <w:r>
+                    <w:t xml:space="preserve">Group</w:t>
+                  </w:r>
+                </w:p>
+              </w:tc>
+              <w:tc>
+                <w:tcPr/>
+                <w:p>
+                  <w:pPr>
+                    <w:pStyle w:val="Compact"/>
+                    <w:jc w:val="right"/>
+                    <w:jc w:val="center"/>
+                  </w:pPr>
+                  <w:r>
+                    <w:t xml:space="preserve">n Groups</w:t>
+                  </w:r>
+                </w:p>
+              </w:tc>
+              <w:tc>
+                <w:tcPr/>
+                <w:p>
+                  <w:pPr>
+                    <w:pStyle w:val="Compact"/>
+                    <w:jc w:val="right"/>
+                    <w:jc w:val="center"/>
+                  </w:pPr>
+                  <w:r>
+                    <w:t xml:space="preserve">Median TTI</w:t>
+                  </w:r>
+                </w:p>
+              </w:tc>
+              <w:tc>
+                <w:tcPr/>
+                <w:p>
+                  <w:pPr>
+                    <w:pStyle w:val="Compact"/>
+                    <w:jc w:val="right"/>
+                    <w:jc w:val="center"/>
+                  </w:pPr>
+                  <w:r>
+                    <w:t xml:space="preserve">n Never Immobilised</w:t>
+                  </w:r>
+                </w:p>
+              </w:tc>
+              <w:tc>
+                <w:tcPr/>
+                <w:p>
+                  <w:pPr>
+                    <w:pStyle w:val="Compact"/>
+                    <w:jc w:val="right"/>
+                    <w:jc w:val="center"/>
+                  </w:pPr>
+                  <w:r>
+                    <w:t xml:space="preserve">Mean T120</w:t>
                   </w:r>
                 </w:p>
               </w:tc>
@@ -3081,7 +3676,7 @@
               </w:tc>
             </w:tr>
           </w:tbl>
-          <w:bookmarkEnd w:id="25"/>
+          <w:bookmarkEnd w:id="26"/>
           <w:p/>
         </w:tc>
       </w:tr>
@@ -3107,7 +3702,7 @@
       <w:tr>
         <w:tc>
           <w:tcPr/>
-          <w:bookmarkStart w:id="29" w:name="fig-tti"/>
+          <w:bookmarkStart w:id="30" w:name="fig-tti"/>
           <w:p>
             <w:pPr>
               <w:pStyle w:val="Compact"/>
@@ -3118,18 +3713,18 @@
                 <wp:inline>
                   <wp:extent cx="5334000" cy="4103076"/>
                   <wp:effectExtent b="0" l="0" r="0" t="0"/>
-                  <wp:docPr descr="" title="" id="27" name="Picture"/>
+                  <wp:docPr descr="" title="" id="28" name="Picture"/>
                   <a:graphic>
                     <a:graphicData uri="http://schemas.openxmlformats.org/drawingml/2006/picture">
                       <pic:pic>
                         <pic:nvPicPr>
-                          <pic:cNvPr descr="../results/figures/explore_tti_dose.png" id="28" name="Picture"/>
+                          <pic:cNvPr descr="../results/figures/explore_tti_dose.png" id="29" name="Picture"/>
                           <pic:cNvPicPr>
                             <a:picLocks noChangeArrowheads="1" noChangeAspect="1"/>
                           </pic:cNvPicPr>
                         </pic:nvPicPr>
                         <pic:blipFill>
-                          <a:blip r:embed="rId26"/>
+                          <a:blip r:embed="rId27"/>
                           <a:stretch>
                             <a:fillRect/>
                           </a:stretch>
@@ -3169,7 +3764,7 @@
               <w:t xml:space="preserve">Figure 3: Time to immobilisation by dose (black = median; x = censored)</w:t>
             </w:r>
           </w:p>
-          <w:bookmarkEnd w:id="29"/>
+          <w:bookmarkEnd w:id="30"/>
         </w:tc>
       </w:tr>
     </w:tbl>
@@ -3194,7 +3789,7 @@
       <w:tr>
         <w:tc>
           <w:tcPr/>
-          <w:bookmarkStart w:id="33" w:name="fig-curves"/>
+          <w:bookmarkStart w:id="34" w:name="fig-curves"/>
           <w:p>
             <w:pPr>
               <w:pStyle w:val="Compact"/>
@@ -3205,18 +3800,18 @@
                 <wp:inline>
                   <wp:extent cx="5334000" cy="4103076"/>
                   <wp:effectExtent b="0" l="0" r="0" t="0"/>
-                  <wp:docPr descr="" title="" id="31" name="Picture"/>
+                  <wp:docPr descr="" title="" id="32" name="Picture"/>
                   <a:graphic>
                     <a:graphicData uri="http://schemas.openxmlformats.org/drawingml/2006/picture">
                       <pic:pic>
                         <pic:nvPicPr>
-                          <pic:cNvPr descr="../results/figures/motility_summary_curves.png" id="32" name="Picture"/>
+                          <pic:cNvPr descr="../results/figures/motility_summary_curves.png" id="33" name="Picture"/>
                           <pic:cNvPicPr>
                             <a:picLocks noChangeArrowheads="1" noChangeAspect="1"/>
                           </pic:cNvPicPr>
                         </pic:nvPicPr>
                         <pic:blipFill>
-                          <a:blip r:embed="rId30"/>
+                          <a:blip r:embed="rId31"/>
                           <a:stretch>
                             <a:fillRect/>
                           </a:stretch>
@@ -3256,7 +3851,7 @@
               <w:t xml:space="preserve">Figure 4: Mean proportion motile over time, by dose</w:t>
             </w:r>
           </w:p>
-          <w:bookmarkEnd w:id="33"/>
+          <w:bookmarkEnd w:id="34"/>
         </w:tc>
       </w:tr>
     </w:tbl>
@@ -3281,7 +3876,7 @@
       <w:tr>
         <w:tc>
           <w:tcPr/>
-          <w:bookmarkStart w:id="34" w:name="tbl-mot-dose"/>
+          <w:bookmarkStart w:id="35" w:name="tbl-mot-dose"/>
           <w:p>
             <w:pPr>
               <w:jc w:val="center"/>
@@ -3292,7 +3887,7 @@
               <w:pStyle w:val="ImageCaption"/>
             </w:pPr>
             <w:r>
-              <w:t xml:space="preserve">Table 3: Motility dose-response on mean proportion motile (Friedman blocked by block; Spearman on log10 dose).</w:t>
+              <w:t xml:space="preserve">Table 4: Motility dose-response on mean proportion motile (Friedman blocked by block; Spearman on log10 dose).</w:t>
             </w:r>
           </w:p>
           <w:tbl>
@@ -3323,72 +3918,72 @@
                     <w:jc w:val="center"/>
                   </w:pPr>
                   <w:r>
-                    <w:t xml:space="preserve">parasite</w:t>
-                  </w:r>
-                </w:p>
-              </w:tc>
-              <w:tc>
-                <w:tcPr/>
-                <w:p>
-                  <w:pPr>
-                    <w:pStyle w:val="Compact"/>
-                    <w:jc w:val="right"/>
-                    <w:jc w:val="center"/>
-                  </w:pPr>
-                  <w:r>
-                    <w:t xml:space="preserve">n_blocks</w:t>
-                  </w:r>
-                </w:p>
-              </w:tc>
-              <w:tc>
-                <w:tcPr/>
-                <w:p>
-                  <w:pPr>
-                    <w:pStyle w:val="Compact"/>
-                    <w:jc w:val="right"/>
-                    <w:jc w:val="center"/>
-                  </w:pPr>
-                  <w:r>
-                    <w:t xml:space="preserve">friedman_Q</w:t>
-                  </w:r>
-                </w:p>
-              </w:tc>
-              <w:tc>
-                <w:tcPr/>
-                <w:p>
-                  <w:pPr>
-                    <w:pStyle w:val="Compact"/>
-                    <w:jc w:val="right"/>
-                    <w:jc w:val="center"/>
-                  </w:pPr>
-                  <w:r>
-                    <w:t xml:space="preserve">friedman_p</w:t>
-                  </w:r>
-                </w:p>
-              </w:tc>
-              <w:tc>
-                <w:tcPr/>
-                <w:p>
-                  <w:pPr>
-                    <w:pStyle w:val="Compact"/>
-                    <w:jc w:val="right"/>
-                    <w:jc w:val="center"/>
-                  </w:pPr>
-                  <w:r>
-                    <w:t xml:space="preserve">spearman_rho_pooled</w:t>
-                  </w:r>
-                </w:p>
-              </w:tc>
-              <w:tc>
-                <w:tcPr/>
-                <w:p>
-                  <w:pPr>
-                    <w:pStyle w:val="Compact"/>
-                    <w:jc w:val="right"/>
-                    <w:jc w:val="center"/>
-                  </w:pPr>
-                  <w:r>
-                    <w:t xml:space="preserve">spearman_p</w:t>
+                    <w:t xml:space="preserve">Parasite</w:t>
+                  </w:r>
+                </w:p>
+              </w:tc>
+              <w:tc>
+                <w:tcPr/>
+                <w:p>
+                  <w:pPr>
+                    <w:pStyle w:val="Compact"/>
+                    <w:jc w:val="right"/>
+                    <w:jc w:val="center"/>
+                  </w:pPr>
+                  <w:r>
+                    <w:t xml:space="preserve">n Blocks</w:t>
+                  </w:r>
+                </w:p>
+              </w:tc>
+              <w:tc>
+                <w:tcPr/>
+                <w:p>
+                  <w:pPr>
+                    <w:pStyle w:val="Compact"/>
+                    <w:jc w:val="right"/>
+                    <w:jc w:val="center"/>
+                  </w:pPr>
+                  <w:r>
+                    <w:t xml:space="preserve">Friedman Q</w:t>
+                  </w:r>
+                </w:p>
+              </w:tc>
+              <w:tc>
+                <w:tcPr/>
+                <w:p>
+                  <w:pPr>
+                    <w:pStyle w:val="Compact"/>
+                    <w:jc w:val="right"/>
+                    <w:jc w:val="center"/>
+                  </w:pPr>
+                  <w:r>
+                    <w:t xml:space="preserve">Friedman p</w:t>
+                  </w:r>
+                </w:p>
+              </w:tc>
+              <w:tc>
+                <w:tcPr/>
+                <w:p>
+                  <w:pPr>
+                    <w:pStyle w:val="Compact"/>
+                    <w:jc w:val="right"/>
+                    <w:jc w:val="center"/>
+                  </w:pPr>
+                  <w:r>
+                    <w:t xml:space="preserve">Spearman Rho Pooled</w:t>
+                  </w:r>
+                </w:p>
+              </w:tc>
+              <w:tc>
+                <w:tcPr/>
+                <w:p>
+                  <w:pPr>
+                    <w:pStyle w:val="Compact"/>
+                    <w:jc w:val="right"/>
+                    <w:jc w:val="center"/>
+                  </w:pPr>
+                  <w:r>
+                    <w:t xml:space="preserve">Spearman p</w:t>
                   </w:r>
                 </w:p>
               </w:tc>
@@ -3554,7 +4149,7 @@
               </w:tc>
             </w:tr>
           </w:tbl>
-          <w:bookmarkEnd w:id="34"/>
+          <w:bookmarkEnd w:id="35"/>
           <w:p/>
         </w:tc>
       </w:tr>
@@ -3580,7 +4175,7 @@
       <w:tr>
         <w:tc>
           <w:tcPr/>
-          <w:bookmarkStart w:id="35" w:name="tbl-mot-posthoc"/>
+          <w:bookmarkStart w:id="36" w:name="tbl-mot-posthoc"/>
           <w:p>
             <w:pPr>
               <w:jc w:val="center"/>
@@ -3591,7 +4186,7 @@
               <w:pStyle w:val="ImageCaption"/>
             </w:pPr>
             <w:r>
-              <w:t xml:space="preserve">Table 4: Post-hoc motility contrasts vs Negative Control (paired Wilcoxon; Holm per parasite).</w:t>
+              <w:t xml:space="preserve">Table 5: Post-hoc motility contrasts vs Negative Control (paired Wilcoxon; Holm per parasite).</w:t>
             </w:r>
           </w:p>
           <w:tbl>
@@ -4781,13 +5376,13 @@
               </w:tc>
             </w:tr>
           </w:tbl>
-          <w:bookmarkEnd w:id="35"/>
+          <w:bookmarkEnd w:id="36"/>
           <w:p/>
         </w:tc>
       </w:tr>
     </w:tbl>
-    <w:bookmarkEnd w:id="36"/>
-    <w:bookmarkStart w:id="72" w:name="objective-iv-in-vivo-infectivity"/>
+    <w:bookmarkEnd w:id="37"/>
+    <w:bookmarkStart w:id="73" w:name="objective-iv-in-vivo-infectivity"/>
     <w:p>
       <w:pPr>
         <w:pStyle w:val="Heading2"/>
@@ -4796,7 +5391,7 @@
         <w:t xml:space="preserve">9 5.4. Objective iv — in-vivo infectivity</w:t>
       </w:r>
     </w:p>
-    <w:bookmarkStart w:id="56" w:name="parasitaemia"/>
+    <w:bookmarkStart w:id="57" w:name="parasitaemia"/>
     <w:p>
       <w:pPr>
         <w:pStyle w:val="Heading3"/>
@@ -4835,7 +5430,7 @@
           <w:rPr>
             <w:rStyle w:val="Hyperlink"/>
           </w:rPr>
-          <w:t xml:space="preserve">Table 5</w:t>
+          <w:t xml:space="preserve">Table 6</w:t>
         </w:r>
       </w:hyperlink>
       <w:r>
@@ -4916,7 +5511,7 @@
           <w:rPr>
             <w:rStyle w:val="Hyperlink"/>
           </w:rPr>
-          <w:t xml:space="preserve">Table 6</w:t>
+          <w:t xml:space="preserve">Table 7</w:t>
         </w:r>
       </w:hyperlink>
       <w:r>
@@ -4982,7 +5577,7 @@
           <w:rPr>
             <w:rStyle w:val="Hyperlink"/>
           </w:rPr>
-          <w:t xml:space="preserve">Table 7</w:t>
+          <w:t xml:space="preserve">Table 8</w:t>
         </w:r>
       </w:hyperlink>
       <w:r>
@@ -5016,7 +5611,7 @@
           <w:rPr>
             <w:rStyle w:val="Hyperlink"/>
           </w:rPr>
-          <w:t xml:space="preserve">Table 9</w:t>
+          <w:t xml:space="preserve">Table 10</w:t>
         </w:r>
       </w:hyperlink>
       <w:r>
@@ -5042,7 +5637,7 @@
       <w:tr>
         <w:tc>
           <w:tcPr/>
-          <w:bookmarkStart w:id="37" w:name="tbl-peak"/>
+          <w:bookmarkStart w:id="38" w:name="tbl-peak"/>
           <w:p>
             <w:pPr>
               <w:jc w:val="center"/>
@@ -5053,7 +5648,7 @@
               <w:pStyle w:val="ImageCaption"/>
             </w:pPr>
             <w:r>
-              <w:t xml:space="preserve">Table 5: Peak, clearance and mortality per dose (means/medians over 8 blocks).</w:t>
+              <w:t xml:space="preserve">Table 6: Peak, clearance and mortality per dose (means/medians over 8 blocks).</w:t>
             </w:r>
           </w:p>
           <w:tbl>
@@ -5085,85 +5680,85 @@
                     <w:jc w:val="center"/>
                   </w:pPr>
                   <w:r>
-                    <w:t xml:space="preserve">parasite</w:t>
-                  </w:r>
-                </w:p>
-              </w:tc>
-              <w:tc>
-                <w:tcPr/>
-                <w:p>
-                  <w:pPr>
-                    <w:pStyle w:val="Compact"/>
-                    <w:jc w:val="left"/>
-                    <w:jc w:val="center"/>
-                  </w:pPr>
-                  <w:r>
-                    <w:t xml:space="preserve">group</w:t>
-                  </w:r>
-                </w:p>
-              </w:tc>
-              <w:tc>
-                <w:tcPr/>
-                <w:p>
-                  <w:pPr>
-                    <w:pStyle w:val="Compact"/>
-                    <w:jc w:val="right"/>
-                    <w:jc w:val="center"/>
-                  </w:pPr>
-                  <w:r>
-                    <w:t xml:space="preserve">n_groups</w:t>
-                  </w:r>
-                </w:p>
-              </w:tc>
-              <w:tc>
-                <w:tcPr/>
-                <w:p>
-                  <w:pPr>
-                    <w:pStyle w:val="Compact"/>
-                    <w:jc w:val="right"/>
-                    <w:jc w:val="center"/>
-                  </w:pPr>
-                  <w:r>
-                    <w:t xml:space="preserve">mean_peak</w:t>
-                  </w:r>
-                </w:p>
-              </w:tc>
-              <w:tc>
-                <w:tcPr/>
-                <w:p>
-                  <w:pPr>
-                    <w:pStyle w:val="Compact"/>
-                    <w:jc w:val="right"/>
-                    <w:jc w:val="center"/>
-                  </w:pPr>
-                  <w:r>
-                    <w:t xml:space="preserve">median_clear_day</w:t>
-                  </w:r>
-                </w:p>
-              </w:tc>
-              <w:tc>
-                <w:tcPr/>
-                <w:p>
-                  <w:pPr>
-                    <w:pStyle w:val="Compact"/>
-                    <w:jc w:val="right"/>
-                    <w:jc w:val="center"/>
-                  </w:pPr>
-                  <w:r>
-                    <w:t xml:space="preserve">pct_died</w:t>
-                  </w:r>
-                </w:p>
-              </w:tc>
-              <w:tc>
-                <w:tcPr/>
-                <w:p>
-                  <w:pPr>
-                    <w:pStyle w:val="Compact"/>
-                    <w:jc w:val="right"/>
-                    <w:jc w:val="center"/>
-                  </w:pPr>
-                  <w:r>
-                    <w:t xml:space="preserve">pct_day40_zero</w:t>
+                    <w:t xml:space="preserve">Parasite</w:t>
+                  </w:r>
+                </w:p>
+              </w:tc>
+              <w:tc>
+                <w:tcPr/>
+                <w:p>
+                  <w:pPr>
+                    <w:pStyle w:val="Compact"/>
+                    <w:jc w:val="left"/>
+                    <w:jc w:val="center"/>
+                  </w:pPr>
+                  <w:r>
+                    <w:t xml:space="preserve">Group</w:t>
+                  </w:r>
+                </w:p>
+              </w:tc>
+              <w:tc>
+                <w:tcPr/>
+                <w:p>
+                  <w:pPr>
+                    <w:pStyle w:val="Compact"/>
+                    <w:jc w:val="right"/>
+                    <w:jc w:val="center"/>
+                  </w:pPr>
+                  <w:r>
+                    <w:t xml:space="preserve">n Groups</w:t>
+                  </w:r>
+                </w:p>
+              </w:tc>
+              <w:tc>
+                <w:tcPr/>
+                <w:p>
+                  <w:pPr>
+                    <w:pStyle w:val="Compact"/>
+                    <w:jc w:val="right"/>
+                    <w:jc w:val="center"/>
+                  </w:pPr>
+                  <w:r>
+                    <w:t xml:space="preserve">Mean Peak</w:t>
+                  </w:r>
+                </w:p>
+              </w:tc>
+              <w:tc>
+                <w:tcPr/>
+                <w:p>
+                  <w:pPr>
+                    <w:pStyle w:val="Compact"/>
+                    <w:jc w:val="right"/>
+                    <w:jc w:val="center"/>
+                  </w:pPr>
+                  <w:r>
+                    <w:t xml:space="preserve">Median Clear Day</w:t>
+                  </w:r>
+                </w:p>
+              </w:tc>
+              <w:tc>
+                <w:tcPr/>
+                <w:p>
+                  <w:pPr>
+                    <w:pStyle w:val="Compact"/>
+                    <w:jc w:val="right"/>
+                    <w:jc w:val="center"/>
+                  </w:pPr>
+                  <w:r>
+                    <w:t xml:space="preserve">Pct Died</w:t>
+                  </w:r>
+                </w:p>
+              </w:tc>
+              <w:tc>
+                <w:tcPr/>
+                <w:p>
+                  <w:pPr>
+                    <w:pStyle w:val="Compact"/>
+                    <w:jc w:val="right"/>
+                    <w:jc w:val="center"/>
+                  </w:pPr>
+                  <w:r>
+                    <w:t xml:space="preserve">Pct Day40 Zero</w:t>
                   </w:r>
                 </w:p>
               </w:tc>
@@ -6471,7 +7066,7 @@
               </w:tc>
             </w:tr>
           </w:tbl>
-          <w:bookmarkEnd w:id="37"/>
+          <w:bookmarkEnd w:id="38"/>
           <w:p/>
         </w:tc>
       </w:tr>
@@ -6497,7 +7092,7 @@
       <w:tr>
         <w:tc>
           <w:tcPr/>
-          <w:bookmarkStart w:id="41" w:name="fig-peak"/>
+          <w:bookmarkStart w:id="42" w:name="fig-peak"/>
           <w:p>
             <w:pPr>
               <w:pStyle w:val="Compact"/>
@@ -6508,18 +7103,18 @@
                 <wp:inline>
                   <wp:extent cx="5334000" cy="3610707"/>
                   <wp:effectExtent b="0" l="0" r="0" t="0"/>
-                  <wp:docPr descr="" title="" id="39" name="Picture"/>
+                  <wp:docPr descr="" title="" id="40" name="Picture"/>
                   <a:graphic>
                     <a:graphicData uri="http://schemas.openxmlformats.org/drawingml/2006/picture">
                       <pic:pic>
                         <pic:nvPicPr>
-                          <pic:cNvPr descr="../results/figures/explore_peak_dose.png" id="40" name="Picture"/>
+                          <pic:cNvPr descr="../results/figures/explore_peak_dose.png" id="41" name="Picture"/>
                           <pic:cNvPicPr>
                             <a:picLocks noChangeArrowheads="1" noChangeAspect="1"/>
                           </pic:cNvPicPr>
                         </pic:nvPicPr>
                         <pic:blipFill>
-                          <a:blip r:embed="rId38"/>
+                          <a:blip r:embed="rId39"/>
                           <a:stretch>
                             <a:fillRect/>
                           </a:stretch>
@@ -6559,7 +7154,7 @@
               <w:t xml:space="preserve">Figure 5: Peak LEV by dose (black = mean)</w:t>
             </w:r>
           </w:p>
-          <w:bookmarkEnd w:id="41"/>
+          <w:bookmarkEnd w:id="42"/>
         </w:tc>
       </w:tr>
     </w:tbl>
@@ -6584,7 +7179,7 @@
       <w:tr>
         <w:tc>
           <w:tcPr/>
-          <w:bookmarkStart w:id="45" w:name="fig-mort"/>
+          <w:bookmarkStart w:id="46" w:name="fig-mort"/>
           <w:p>
             <w:pPr>
               <w:pStyle w:val="Compact"/>
@@ -6595,18 +7190,18 @@
                 <wp:inline>
                   <wp:extent cx="5334000" cy="3610707"/>
                   <wp:effectExtent b="0" l="0" r="0" t="0"/>
-                  <wp:docPr descr="" title="" id="43" name="Picture"/>
+                  <wp:docPr descr="" title="" id="44" name="Picture"/>
                   <a:graphic>
                     <a:graphicData uri="http://schemas.openxmlformats.org/drawingml/2006/picture">
                       <pic:pic>
                         <pic:nvPicPr>
-                          <pic:cNvPr descr="../results/figures/explore_mortality.png" id="44" name="Picture"/>
+                          <pic:cNvPr descr="../results/figures/explore_mortality.png" id="45" name="Picture"/>
                           <pic:cNvPicPr>
                             <a:picLocks noChangeArrowheads="1" noChangeAspect="1"/>
                           </pic:cNvPicPr>
                         </pic:nvPicPr>
                         <pic:blipFill>
-                          <a:blip r:embed="rId42"/>
+                          <a:blip r:embed="rId43"/>
                           <a:stretch>
                             <a:fillRect/>
                           </a:stretch>
@@ -6646,7 +7241,7 @@
               <w:t xml:space="preserve">Figure 6: Groups with any death, by dose</w:t>
             </w:r>
           </w:p>
-          <w:bookmarkEnd w:id="45"/>
+          <w:bookmarkEnd w:id="46"/>
         </w:tc>
       </w:tr>
     </w:tbl>
@@ -6671,7 +7266,7 @@
       <w:tr>
         <w:tc>
           <w:tcPr/>
-          <w:bookmarkStart w:id="46" w:name="tbl-dose"/>
+          <w:bookmarkStart w:id="47" w:name="tbl-dose"/>
           <w:p>
             <w:pPr>
               <w:jc w:val="center"/>
@@ -6682,7 +7277,7 @@
               <w:pStyle w:val="ImageCaption"/>
             </w:pPr>
             <w:r>
-              <w:t xml:space="preserve">Table 6: Parasitaemia dose-response on AUC (Friedman blocked by block; Spearman on log10 dose).</w:t>
+              <w:t xml:space="preserve">Table 7: Parasitaemia dose-response on AUC (Friedman blocked by block; Spearman on log10 dose).</w:t>
             </w:r>
           </w:p>
           <w:tbl>
@@ -6715,98 +7310,98 @@
                     <w:jc w:val="center"/>
                   </w:pPr>
                   <w:r>
-                    <w:t xml:space="preserve">parasite</w:t>
-                  </w:r>
-                </w:p>
-              </w:tc>
-              <w:tc>
-                <w:tcPr/>
-                <w:p>
-                  <w:pPr>
-                    <w:pStyle w:val="Compact"/>
-                    <w:jc w:val="right"/>
-                    <w:jc w:val="center"/>
-                  </w:pPr>
-                  <w:r>
-                    <w:t xml:space="preserve">n_blocks</w:t>
-                  </w:r>
-                </w:p>
-              </w:tc>
-              <w:tc>
-                <w:tcPr/>
-                <w:p>
-                  <w:pPr>
-                    <w:pStyle w:val="Compact"/>
-                    <w:jc w:val="right"/>
-                    <w:jc w:val="center"/>
-                  </w:pPr>
-                  <w:r>
-                    <w:t xml:space="preserve">friedman_Q</w:t>
-                  </w:r>
-                </w:p>
-              </w:tc>
-              <w:tc>
-                <w:tcPr/>
-                <w:p>
-                  <w:pPr>
-                    <w:pStyle w:val="Compact"/>
-                    <w:jc w:val="right"/>
-                    <w:jc w:val="center"/>
-                  </w:pPr>
-                  <w:r>
-                    <w:t xml:space="preserve">friedman_df</w:t>
-                  </w:r>
-                </w:p>
-              </w:tc>
-              <w:tc>
-                <w:tcPr/>
-                <w:p>
-                  <w:pPr>
-                    <w:pStyle w:val="Compact"/>
-                    <w:jc w:val="right"/>
-                    <w:jc w:val="center"/>
-                  </w:pPr>
-                  <w:r>
-                    <w:t xml:space="preserve">friedman_p</w:t>
-                  </w:r>
-                </w:p>
-              </w:tc>
-              <w:tc>
-                <w:tcPr/>
-                <w:p>
-                  <w:pPr>
-                    <w:pStyle w:val="Compact"/>
-                    <w:jc w:val="right"/>
-                    <w:jc w:val="center"/>
-                  </w:pPr>
-                  <w:r>
-                    <w:t xml:space="preserve">spearman_rho_pooled</w:t>
-                  </w:r>
-                </w:p>
-              </w:tc>
-              <w:tc>
-                <w:tcPr/>
-                <w:p>
-                  <w:pPr>
-                    <w:pStyle w:val="Compact"/>
-                    <w:jc w:val="right"/>
-                    <w:jc w:val="center"/>
-                  </w:pPr>
-                  <w:r>
-                    <w:t xml:space="preserve">spearman_p</w:t>
-                  </w:r>
-                </w:p>
-              </w:tc>
-              <w:tc>
-                <w:tcPr/>
-                <w:p>
-                  <w:pPr>
-                    <w:pStyle w:val="Compact"/>
-                    <w:jc w:val="right"/>
-                    <w:jc w:val="center"/>
-                  </w:pPr>
-                  <w:r>
-                    <w:t xml:space="preserve">mean_rho_perblock</w:t>
+                    <w:t xml:space="preserve">Parasite</w:t>
+                  </w:r>
+                </w:p>
+              </w:tc>
+              <w:tc>
+                <w:tcPr/>
+                <w:p>
+                  <w:pPr>
+                    <w:pStyle w:val="Compact"/>
+                    <w:jc w:val="right"/>
+                    <w:jc w:val="center"/>
+                  </w:pPr>
+                  <w:r>
+                    <w:t xml:space="preserve">n Blocks</w:t>
+                  </w:r>
+                </w:p>
+              </w:tc>
+              <w:tc>
+                <w:tcPr/>
+                <w:p>
+                  <w:pPr>
+                    <w:pStyle w:val="Compact"/>
+                    <w:jc w:val="right"/>
+                    <w:jc w:val="center"/>
+                  </w:pPr>
+                  <w:r>
+                    <w:t xml:space="preserve">Friedman Q</w:t>
+                  </w:r>
+                </w:p>
+              </w:tc>
+              <w:tc>
+                <w:tcPr/>
+                <w:p>
+                  <w:pPr>
+                    <w:pStyle w:val="Compact"/>
+                    <w:jc w:val="right"/>
+                    <w:jc w:val="center"/>
+                  </w:pPr>
+                  <w:r>
+                    <w:t xml:space="preserve">Friedman Df</w:t>
+                  </w:r>
+                </w:p>
+              </w:tc>
+              <w:tc>
+                <w:tcPr/>
+                <w:p>
+                  <w:pPr>
+                    <w:pStyle w:val="Compact"/>
+                    <w:jc w:val="right"/>
+                    <w:jc w:val="center"/>
+                  </w:pPr>
+                  <w:r>
+                    <w:t xml:space="preserve">Friedman p</w:t>
+                  </w:r>
+                </w:p>
+              </w:tc>
+              <w:tc>
+                <w:tcPr/>
+                <w:p>
+                  <w:pPr>
+                    <w:pStyle w:val="Compact"/>
+                    <w:jc w:val="right"/>
+                    <w:jc w:val="center"/>
+                  </w:pPr>
+                  <w:r>
+                    <w:t xml:space="preserve">Spearman Rho Pooled</w:t>
+                  </w:r>
+                </w:p>
+              </w:tc>
+              <w:tc>
+                <w:tcPr/>
+                <w:p>
+                  <w:pPr>
+                    <w:pStyle w:val="Compact"/>
+                    <w:jc w:val="right"/>
+                    <w:jc w:val="center"/>
+                  </w:pPr>
+                  <w:r>
+                    <w:t xml:space="preserve">Spearman p</w:t>
+                  </w:r>
+                </w:p>
+              </w:tc>
+              <w:tc>
+                <w:tcPr/>
+                <w:p>
+                  <w:pPr>
+                    <w:pStyle w:val="Compact"/>
+                    <w:jc w:val="right"/>
+                    <w:jc w:val="center"/>
+                  </w:pPr>
+                  <w:r>
+                    <w:t xml:space="preserve">Mean Rho Perblock</w:t>
                   </w:r>
                 </w:p>
               </w:tc>
@@ -7024,7 +7619,7 @@
               </w:tc>
             </w:tr>
           </w:tbl>
-          <w:bookmarkEnd w:id="46"/>
+          <w:bookmarkEnd w:id="47"/>
           <w:p/>
         </w:tc>
       </w:tr>
@@ -7050,7 +7645,7 @@
       <w:tr>
         <w:tc>
           <w:tcPr/>
-          <w:bookmarkStart w:id="47" w:name="tbl-para-posthoc"/>
+          <w:bookmarkStart w:id="48" w:name="tbl-para-posthoc"/>
           <w:p>
             <w:pPr>
               <w:jc w:val="center"/>
@@ -7061,7 +7656,7 @@
               <w:pStyle w:val="ImageCaption"/>
             </w:pPr>
             <w:r>
-              <w:t xml:space="preserve">Table 7: Post-hoc parasitaemia contrasts vs Negative Control on AUC (paired Wilcoxon; Holm per parasite).</w:t>
+              <w:t xml:space="preserve">Table 8: Post-hoc parasitaemia contrasts vs Negative Control on AUC (paired Wilcoxon; Holm per parasite).</w:t>
             </w:r>
           </w:p>
           <w:tbl>
@@ -8251,7 +8846,7 @@
               </w:tc>
             </w:tr>
           </w:tbl>
-          <w:bookmarkEnd w:id="47"/>
+          <w:bookmarkEnd w:id="48"/>
           <w:p/>
         </w:tc>
       </w:tr>
@@ -8277,7 +8872,7 @@
       <w:tr>
         <w:tc>
           <w:tcPr/>
-          <w:bookmarkStart w:id="51" w:name="fig-auc"/>
+          <w:bookmarkStart w:id="52" w:name="fig-auc"/>
           <w:p>
             <w:pPr>
               <w:pStyle w:val="Compact"/>
@@ -8288,18 +8883,18 @@
                 <wp:inline>
                   <wp:extent cx="5334000" cy="3610707"/>
                   <wp:effectExtent b="0" l="0" r="0" t="0"/>
-                  <wp:docPr descr="" title="" id="49" name="Picture"/>
+                  <wp:docPr descr="" title="" id="50" name="Picture"/>
                   <a:graphic>
                     <a:graphicData uri="http://schemas.openxmlformats.org/drawingml/2006/picture">
                       <pic:pic>
                         <pic:nvPicPr>
-                          <pic:cNvPr descr="../results/figures/auc_dose_response.png" id="50" name="Picture"/>
+                          <pic:cNvPr descr="../results/figures/auc_dose_response.png" id="51" name="Picture"/>
                           <pic:cNvPicPr>
                             <a:picLocks noChangeArrowheads="1" noChangeAspect="1"/>
                           </pic:cNvPicPr>
                         </pic:nvPicPr>
                         <pic:blipFill>
-                          <a:blip r:embed="rId48"/>
+                          <a:blip r:embed="rId49"/>
                           <a:stretch>
                             <a:fillRect/>
                           </a:stretch>
@@ -8339,7 +8934,7 @@
               <w:t xml:space="preserve">Figure 7: Mean AUC vs log10(concentration)</w:t>
             </w:r>
           </w:p>
-          <w:bookmarkEnd w:id="51"/>
+          <w:bookmarkEnd w:id="52"/>
         </w:tc>
       </w:tr>
     </w:tbl>
@@ -8364,7 +8959,7 @@
       <w:tr>
         <w:tc>
           <w:tcPr/>
-          <w:bookmarkStart w:id="55" w:name="fig-para-traj"/>
+          <w:bookmarkStart w:id="56" w:name="fig-para-traj"/>
           <w:p>
             <w:pPr>
               <w:pStyle w:val="Compact"/>
@@ -8375,18 +8970,18 @@
                 <wp:inline>
                   <wp:extent cx="5334000" cy="7385538"/>
                   <wp:effectExtent b="0" l="0" r="0" t="0"/>
-                  <wp:docPr descr="" title="" id="53" name="Picture"/>
+                  <wp:docPr descr="" title="" id="54" name="Picture"/>
                   <a:graphic>
                     <a:graphicData uri="http://schemas.openxmlformats.org/drawingml/2006/picture">
                       <pic:pic>
                         <pic:nvPicPr>
-                          <pic:cNvPr descr="../results/figures/parasitemia_trajectories_faceted.png" id="54" name="Picture"/>
+                          <pic:cNvPr descr="../results/figures/parasitemia_trajectories_faceted.png" id="55" name="Picture"/>
                           <pic:cNvPicPr>
                             <a:picLocks noChangeArrowheads="1" noChangeAspect="1"/>
                           </pic:cNvPicPr>
                         </pic:nvPicPr>
                         <pic:blipFill>
-                          <a:blip r:embed="rId52"/>
+                          <a:blip r:embed="rId53"/>
                           <a:stretch>
                             <a:fillRect/>
                           </a:stretch>
@@ -8426,12 +9021,12 @@
               <w:t xml:space="preserve">Figure 8: Parasitaemia trajectories by block</w:t>
             </w:r>
           </w:p>
-          <w:bookmarkEnd w:id="55"/>
+          <w:bookmarkEnd w:id="56"/>
         </w:tc>
       </w:tr>
     </w:tbl>
-    <w:bookmarkEnd w:id="56"/>
-    <w:bookmarkStart w:id="71" w:name="body-weight-and-pcv"/>
+    <w:bookmarkEnd w:id="57"/>
+    <w:bookmarkStart w:id="72" w:name="body-weight-and-pcv"/>
     <w:p>
       <w:pPr>
         <w:pStyle w:val="Heading3"/>
@@ -8506,7 +9101,7 @@
           <w:rPr>
             <w:rStyle w:val="Hyperlink"/>
           </w:rPr>
-          <w:t xml:space="preserve">Table 9</w:t>
+          <w:t xml:space="preserve">Table 10</w:t>
         </w:r>
       </w:hyperlink>
       <w:r>
@@ -8523,7 +9118,7 @@
           <w:rPr>
             <w:rStyle w:val="Hyperlink"/>
           </w:rPr>
-          <w:t xml:space="preserve">Table 8</w:t>
+          <w:t xml:space="preserve">Table 9</w:t>
         </w:r>
       </w:hyperlink>
       <w:r>
@@ -8649,7 +9244,7 @@
       <w:tr>
         <w:tc>
           <w:tcPr/>
-          <w:bookmarkStart w:id="57" w:name="tbl-flags"/>
+          <w:bookmarkStart w:id="58" w:name="tbl-flags"/>
           <w:p>
             <w:pPr>
               <w:jc w:val="center"/>
@@ -8660,7 +9255,7 @@
               <w:pStyle w:val="ImageCaption"/>
             </w:pPr>
             <w:r>
-              <w:t xml:space="preserve">Table 8: Toxicity/anaemia flag counts (descriptive).</w:t>
+              <w:t xml:space="preserve">Table 9: Toxicity/anaemia flag counts (descriptive).</w:t>
             </w:r>
           </w:p>
           <w:tbl>
@@ -8690,59 +9285,59 @@
                     <w:jc w:val="center"/>
                   </w:pPr>
                   <w:r>
-                    <w:t xml:space="preserve">dataset</w:t>
-                  </w:r>
-                </w:p>
-              </w:tc>
-              <w:tc>
-                <w:tcPr/>
-                <w:p>
-                  <w:pPr>
-                    <w:pStyle w:val="Compact"/>
-                    <w:jc w:val="left"/>
-                    <w:jc w:val="center"/>
-                  </w:pPr>
-                  <w:r>
-                    <w:t xml:space="preserve">plant</w:t>
-                  </w:r>
-                </w:p>
-              </w:tc>
-              <w:tc>
-                <w:tcPr/>
-                <w:p>
-                  <w:pPr>
-                    <w:pStyle w:val="Compact"/>
-                    <w:jc w:val="left"/>
-                    <w:jc w:val="center"/>
-                  </w:pPr>
-                  <w:r>
-                    <w:t xml:space="preserve">parasite</w:t>
-                  </w:r>
-                </w:p>
-              </w:tc>
-              <w:tc>
-                <w:tcPr/>
-                <w:p>
-                  <w:pPr>
-                    <w:pStyle w:val="Compact"/>
-                    <w:jc w:val="left"/>
-                    <w:jc w:val="center"/>
-                  </w:pPr>
-                  <w:r>
-                    <w:t xml:space="preserve">flag</w:t>
-                  </w:r>
-                </w:p>
-              </w:tc>
-              <w:tc>
-                <w:tcPr/>
-                <w:p>
-                  <w:pPr>
-                    <w:pStyle w:val="Compact"/>
-                    <w:jc w:val="right"/>
-                    <w:jc w:val="center"/>
-                  </w:pPr>
-                  <w:r>
-                    <w:t xml:space="preserve">n_groups</w:t>
+                    <w:t xml:space="preserve">Dataset</w:t>
+                  </w:r>
+                </w:p>
+              </w:tc>
+              <w:tc>
+                <w:tcPr/>
+                <w:p>
+                  <w:pPr>
+                    <w:pStyle w:val="Compact"/>
+                    <w:jc w:val="left"/>
+                    <w:jc w:val="center"/>
+                  </w:pPr>
+                  <w:r>
+                    <w:t xml:space="preserve">Plant</w:t>
+                  </w:r>
+                </w:p>
+              </w:tc>
+              <w:tc>
+                <w:tcPr/>
+                <w:p>
+                  <w:pPr>
+                    <w:pStyle w:val="Compact"/>
+                    <w:jc w:val="left"/>
+                    <w:jc w:val="center"/>
+                  </w:pPr>
+                  <w:r>
+                    <w:t xml:space="preserve">Parasite</w:t>
+                  </w:r>
+                </w:p>
+              </w:tc>
+              <w:tc>
+                <w:tcPr/>
+                <w:p>
+                  <w:pPr>
+                    <w:pStyle w:val="Compact"/>
+                    <w:jc w:val="left"/>
+                    <w:jc w:val="center"/>
+                  </w:pPr>
+                  <w:r>
+                    <w:t xml:space="preserve">Flag</w:t>
+                  </w:r>
+                </w:p>
+              </w:tc>
+              <w:tc>
+                <w:tcPr/>
+                <w:p>
+                  <w:pPr>
+                    <w:pStyle w:val="Compact"/>
+                    <w:jc w:val="right"/>
+                    <w:jc w:val="center"/>
+                  </w:pPr>
+                  <w:r>
+                    <w:t xml:space="preserve">n Groups</w:t>
                   </w:r>
                 </w:p>
               </w:tc>
@@ -9820,7 +10415,7 @@
               </w:tc>
             </w:tr>
           </w:tbl>
-          <w:bookmarkEnd w:id="57"/>
+          <w:bookmarkEnd w:id="58"/>
           <w:p/>
         </w:tc>
       </w:tr>
@@ -9846,7 +10441,7 @@
       <w:tr>
         <w:tc>
           <w:tcPr/>
-          <w:bookmarkStart w:id="61" w:name="fig-wp-traj"/>
+          <w:bookmarkStart w:id="62" w:name="fig-wp-traj"/>
           <w:p>
             <w:pPr>
               <w:pStyle w:val="Compact"/>
@@ -9857,18 +10452,18 @@
                 <wp:inline>
                   <wp:extent cx="5334000" cy="3610707"/>
                   <wp:effectExtent b="0" l="0" r="0" t="0"/>
-                  <wp:docPr descr="" title="" id="59" name="Picture"/>
+                  <wp:docPr descr="" title="" id="60" name="Picture"/>
                   <a:graphic>
                     <a:graphicData uri="http://schemas.openxmlformats.org/drawingml/2006/picture">
                       <pic:pic>
                         <pic:nvPicPr>
-                          <pic:cNvPr descr="../results/figures/explore_weight_pcv_traj.png" id="60" name="Picture"/>
+                          <pic:cNvPr descr="../results/figures/explore_weight_pcv_traj.png" id="61" name="Picture"/>
                           <pic:cNvPicPr>
                             <a:picLocks noChangeArrowheads="1" noChangeAspect="1"/>
                           </pic:cNvPicPr>
                         </pic:nvPicPr>
                         <pic:blipFill>
-                          <a:blip r:embed="rId58"/>
+                          <a:blip r:embed="rId59"/>
                           <a:stretch>
                             <a:fillRect/>
                           </a:stretch>
@@ -9908,7 +10503,7 @@
               <w:t xml:space="preserve">Figure 9: Mean weight and PCV across timepoints</w:t>
             </w:r>
           </w:p>
-          <w:bookmarkEnd w:id="61"/>
+          <w:bookmarkEnd w:id="62"/>
         </w:tc>
       </w:tr>
     </w:tbl>
@@ -9933,7 +10528,7 @@
       <w:tr>
         <w:tc>
           <w:tcPr/>
-          <w:bookmarkStart w:id="62" w:name="tbl-other"/>
+          <w:bookmarkStart w:id="63" w:name="tbl-other"/>
           <w:p>
             <w:pPr>
               <w:jc w:val="center"/>
@@ -9944,7 +10539,7 @@
               <w:pStyle w:val="ImageCaption"/>
             </w:pPr>
             <w:r>
-              <w:t xml:space="preserve">Table 9: Parasite, weight and PCV contrasts (paired Wilcoxon; 8 pairs each).</w:t>
+              <w:t xml:space="preserve">Table 10: Parasite, weight and PCV contrasts (paired Wilcoxon; 8 pairs each).</w:t>
             </w:r>
           </w:p>
           <w:tbl>
@@ -9955,12 +10550,12 @@
               <w:tblLook w:firstRow="1" w:lastRow="0" w:firstColumn="0" w:lastColumn="0" w:noHBand="0" w:noVBand="0" w:val="0020"/>
             </w:tblPr>
             <w:tblGrid>
-              <w:gridCol w:w="4562"/>
-              <w:gridCol w:w="258"/>
-              <w:gridCol w:w="258"/>
-              <w:gridCol w:w="602"/>
-              <w:gridCol w:w="1807"/>
-              <w:gridCol w:w="430"/>
+              <w:gridCol w:w="3240"/>
+              <w:gridCol w:w="360"/>
+              <w:gridCol w:w="360"/>
+              <w:gridCol w:w="840"/>
+              <w:gridCol w:w="2520"/>
+              <w:gridCol w:w="600"/>
             </w:tblGrid>
             <w:tr>
               <w:trPr>
@@ -10055,7 +10650,7 @@
                     <w:jc w:val="center"/>
                   </w:pPr>
                   <w:r>
-                    <w:t xml:space="preserve">T. congolense vs T. evansi (block-mean AUC, 8 pairs)</w:t>
+                    <w:t xml:space="preserve">T. congolense vs T. evansi</w:t>
                   </w:r>
                 </w:p>
               </w:tc>
@@ -10129,17 +10724,16 @@
           <w:tbl>
             <w:tblPr>
               <w:tblStyle w:val="Table"/>
-              <w:tblW w:type="pct" w:w="5000"/>
-              <w:tblLayout w:type="fixed"/>
+              <w:tblW w:type="auto" w:w="0"/>
               <w:tblLook w:firstRow="1" w:lastRow="0" w:firstColumn="0" w:lastColumn="0" w:noHBand="0" w:noVBand="0" w:val="0020"/>
             </w:tblPr>
             <w:tblGrid>
-              <w:gridCol w:w="3681"/>
-              <w:gridCol w:w="334"/>
-              <w:gridCol w:w="334"/>
-              <w:gridCol w:w="780"/>
-              <w:gridCol w:w="2230"/>
-              <w:gridCol w:w="557"/>
+              <w:gridCol w:w="1320"/>
+              <w:gridCol w:w="1320"/>
+              <w:gridCol w:w="1320"/>
+              <w:gridCol w:w="1320"/>
+              <w:gridCol w:w="1320"/>
+              <w:gridCol w:w="1320"/>
             </w:tblGrid>
             <w:tr>
               <w:trPr>
@@ -10234,7 +10828,7 @@
                     <w:jc w:val="center"/>
                   </w:pPr>
                   <w:r>
-                    <w:t xml:space="preserve">weight delta: plant (8 pairs)</w:t>
+                    <w:t xml:space="preserve">weight delta: plant</w:t>
                   </w:r>
                 </w:p>
               </w:tc>
@@ -10314,7 +10908,7 @@
                     <w:jc w:val="center"/>
                   </w:pPr>
                   <w:r>
-                    <w:t xml:space="preserve">weight delta: parasite (8 pairs)</w:t>
+                    <w:t xml:space="preserve">weight delta: parasite</w:t>
                   </w:r>
                 </w:p>
               </w:tc>
@@ -10388,17 +10982,16 @@
           <w:tbl>
             <w:tblPr>
               <w:tblStyle w:val="Table"/>
-              <w:tblW w:type="pct" w:w="5000"/>
-              <w:tblLayout w:type="fixed"/>
+              <w:tblW w:type="auto" w:w="0"/>
               <w:tblLook w:firstRow="1" w:lastRow="0" w:firstColumn="0" w:lastColumn="0" w:noHBand="0" w:noVBand="0" w:val="0020"/>
             </w:tblPr>
             <w:tblGrid>
-              <w:gridCol w:w="3546"/>
-              <w:gridCol w:w="354"/>
-              <w:gridCol w:w="354"/>
-              <w:gridCol w:w="827"/>
-              <w:gridCol w:w="2245"/>
-              <w:gridCol w:w="591"/>
+              <w:gridCol w:w="1320"/>
+              <w:gridCol w:w="1320"/>
+              <w:gridCol w:w="1320"/>
+              <w:gridCol w:w="1320"/>
+              <w:gridCol w:w="1320"/>
+              <w:gridCol w:w="1320"/>
             </w:tblGrid>
             <w:tr>
               <w:trPr>
@@ -10493,7 +11086,7 @@
                     <w:jc w:val="center"/>
                   </w:pPr>
                   <w:r>
-                    <w:t xml:space="preserve">pcv delta: plant (8 pairs)</w:t>
+                    <w:t xml:space="preserve">pcv delta: plant</w:t>
                   </w:r>
                 </w:p>
               </w:tc>
@@ -10573,7 +11166,7 @@
                     <w:jc w:val="center"/>
                   </w:pPr>
                   <w:r>
-                    <w:t xml:space="preserve">pcv delta: parasite (8 pairs)</w:t>
+                    <w:t xml:space="preserve">pcv delta: parasite</w:t>
                   </w:r>
                 </w:p>
               </w:tc>
@@ -10644,7 +11237,7 @@
               </w:tc>
             </w:tr>
           </w:tbl>
-          <w:bookmarkEnd w:id="62"/>
+          <w:bookmarkEnd w:id="63"/>
           <w:p/>
         </w:tc>
       </w:tr>
@@ -10670,7 +11263,7 @@
       <w:tr>
         <w:tc>
           <w:tcPr/>
-          <w:bookmarkStart w:id="66" w:name="fig-wt"/>
+          <w:bookmarkStart w:id="67" w:name="fig-wt"/>
           <w:p>
             <w:pPr>
               <w:pStyle w:val="Compact"/>
@@ -10681,18 +11274,18 @@
                 <wp:inline>
                   <wp:extent cx="5334000" cy="3610707"/>
                   <wp:effectExtent b="0" l="0" r="0" t="0"/>
-                  <wp:docPr descr="" title="" id="64" name="Picture"/>
+                  <wp:docPr descr="" title="" id="65" name="Picture"/>
                   <a:graphic>
                     <a:graphicData uri="http://schemas.openxmlformats.org/drawingml/2006/picture">
                       <pic:pic>
                         <pic:nvPicPr>
-                          <pic:cNvPr descr="../results/figures/weight_delta_boxplot.png" id="65" name="Picture"/>
+                          <pic:cNvPr descr="../results/figures/weight_delta_boxplot.png" id="66" name="Picture"/>
                           <pic:cNvPicPr>
                             <a:picLocks noChangeArrowheads="1" noChangeAspect="1"/>
                           </pic:cNvPicPr>
                         </pic:nvPicPr>
                         <pic:blipFill>
-                          <a:blip r:embed="rId63"/>
+                          <a:blip r:embed="rId64"/>
                           <a:stretch>
                             <a:fillRect/>
                           </a:stretch>
@@ -10732,7 +11325,7 @@
               <w:t xml:space="preserve">Figure 10: Body-weight change Post−Pre (g)</w:t>
             </w:r>
           </w:p>
-          <w:bookmarkEnd w:id="66"/>
+          <w:bookmarkEnd w:id="67"/>
         </w:tc>
       </w:tr>
     </w:tbl>
@@ -10757,7 +11350,7 @@
       <w:tr>
         <w:tc>
           <w:tcPr/>
-          <w:bookmarkStart w:id="70" w:name="fig-pcv"/>
+          <w:bookmarkStart w:id="71" w:name="fig-pcv"/>
           <w:p>
             <w:pPr>
               <w:pStyle w:val="Compact"/>
@@ -10768,18 +11361,18 @@
                 <wp:inline>
                   <wp:extent cx="5334000" cy="3610707"/>
                   <wp:effectExtent b="0" l="0" r="0" t="0"/>
-                  <wp:docPr descr="" title="" id="68" name="Picture"/>
+                  <wp:docPr descr="" title="" id="69" name="Picture"/>
                   <a:graphic>
                     <a:graphicData uri="http://schemas.openxmlformats.org/drawingml/2006/picture">
                       <pic:pic>
                         <pic:nvPicPr>
-                          <pic:cNvPr descr="../results/figures/pcv_delta_boxplot.png" id="69" name="Picture"/>
+                          <pic:cNvPr descr="../results/figures/pcv_delta_boxplot.png" id="70" name="Picture"/>
                           <pic:cNvPicPr>
                             <a:picLocks noChangeArrowheads="1" noChangeAspect="1"/>
                           </pic:cNvPicPr>
                         </pic:nvPicPr>
                         <pic:blipFill>
-                          <a:blip r:embed="rId67"/>
+                          <a:blip r:embed="rId68"/>
                           <a:stretch>
                             <a:fillRect/>
                           </a:stretch>
@@ -10819,13 +11412,13 @@
               <w:t xml:space="preserve">Figure 11: PCV change Post−Pre (pp)</w:t>
             </w:r>
           </w:p>
-          <w:bookmarkEnd w:id="70"/>
+          <w:bookmarkEnd w:id="71"/>
         </w:tc>
       </w:tr>
     </w:tbl>
-    <w:bookmarkEnd w:id="71"/>
     <w:bookmarkEnd w:id="72"/>
-    <w:bookmarkStart w:id="82" w:name="objective-v-comparative-superiority"/>
+    <w:bookmarkEnd w:id="73"/>
+    <w:bookmarkStart w:id="83" w:name="objective-v-comparative-superiority"/>
     <w:p>
       <w:pPr>
         <w:pStyle w:val="Heading2"/>
@@ -10938,7 +11531,7 @@
           <w:rPr>
             <w:rStyle w:val="Hyperlink"/>
           </w:rPr>
-          <w:t xml:space="preserve">Table 10</w:t>
+          <w:t xml:space="preserve">Table 11</w:t>
         </w:r>
       </w:hyperlink>
       <w:r>
@@ -10966,7 +11559,7 @@
         <w:t xml:space="preserve"> </w:t>
       </w:r>
       <w:r>
-        <w:t xml:space="preserve">(§6).</w:t>
+        <w:t xml:space="preserve">(Section 6).</w:t>
       </w:r>
     </w:p>
     <w:tbl>
@@ -10982,7 +11575,7 @@
       <w:tr>
         <w:tc>
           <w:tcPr/>
-          <w:bookmarkStart w:id="73" w:name="tbl-sup"/>
+          <w:bookmarkStart w:id="74" w:name="tbl-sup"/>
           <w:p>
             <w:pPr>
               <w:jc w:val="center"/>
@@ -10993,23 +11586,22 @@
               <w:pStyle w:val="ImageCaption"/>
             </w:pPr>
             <w:r>
-              <w:t xml:space="preserve">Table 10: Plant superiority contrasts (paired Wilcoxon; 8 pairs each).</w:t>
+              <w:t xml:space="preserve">Table 11: Plant superiority contrasts (paired Wilcoxon; 8 pairs each).</w:t>
             </w:r>
           </w:p>
           <w:tbl>
             <w:tblPr>
               <w:tblStyle w:val="Table"/>
-              <w:tblW w:type="pct" w:w="5000"/>
-              <w:tblLayout w:type="fixed"/>
+              <w:tblW w:type="auto" w:w="0"/>
               <w:tblLook w:firstRow="1" w:lastRow="0" w:firstColumn="0" w:lastColumn="0" w:noHBand="0" w:noVBand="0" w:val="0020"/>
             </w:tblPr>
             <w:tblGrid>
-              <w:gridCol w:w="4538"/>
-              <w:gridCol w:w="266"/>
-              <w:gridCol w:w="266"/>
-              <w:gridCol w:w="266"/>
-              <w:gridCol w:w="1868"/>
-              <w:gridCol w:w="711"/>
+              <w:gridCol w:w="1320"/>
+              <w:gridCol w:w="1320"/>
+              <w:gridCol w:w="1320"/>
+              <w:gridCol w:w="1320"/>
+              <w:gridCol w:w="1320"/>
+              <w:gridCol w:w="1320"/>
             </w:tblGrid>
             <w:tr>
               <w:trPr>
@@ -11104,7 +11696,7 @@
                     <w:jc w:val="center"/>
                   </w:pPr>
                   <w:r>
-                    <w:t xml:space="preserve">A. indica vs M. oleifera (block-mean AUC, 8 pairs)</w:t>
+                    <w:t xml:space="preserve">A. indica vs M. oleifera</w:t>
                   </w:r>
                 </w:p>
               </w:tc>
@@ -11178,17 +11770,16 @@
           <w:tbl>
             <w:tblPr>
               <w:tblStyle w:val="Table"/>
-              <w:tblW w:type="pct" w:w="5000"/>
-              <w:tblLayout w:type="fixed"/>
+              <w:tblW w:type="auto" w:w="0"/>
               <w:tblLook w:firstRow="1" w:lastRow="0" w:firstColumn="0" w:lastColumn="0" w:noHBand="0" w:noVBand="0" w:val="0020"/>
             </w:tblPr>
             <w:tblGrid>
-              <w:gridCol w:w="4512"/>
-              <w:gridCol w:w="276"/>
-              <w:gridCol w:w="276"/>
-              <w:gridCol w:w="644"/>
-              <w:gridCol w:w="1749"/>
-              <w:gridCol w:w="460"/>
+              <w:gridCol w:w="1320"/>
+              <w:gridCol w:w="1320"/>
+              <w:gridCol w:w="1320"/>
+              <w:gridCol w:w="1320"/>
+              <w:gridCol w:w="1320"/>
+              <w:gridCol w:w="1320"/>
             </w:tblGrid>
             <w:tr>
               <w:trPr>
@@ -11283,7 +11874,7 @@
                     <w:jc w:val="center"/>
                   </w:pPr>
                   <w:r>
-                    <w:t xml:space="preserve">A. indica vs M. oleifera (mean %motile, 8 pairs)</w:t>
+                    <w:t xml:space="preserve">A. indica vs M. oleifera</w:t>
                   </w:r>
                 </w:p>
               </w:tc>
@@ -11354,7 +11945,7 @@
               </w:tc>
             </w:tr>
           </w:tbl>
-          <w:bookmarkEnd w:id="73"/>
+          <w:bookmarkEnd w:id="74"/>
           <w:p/>
         </w:tc>
       </w:tr>
@@ -11380,7 +11971,7 @@
       <w:tr>
         <w:tc>
           <w:tcPr/>
-          <w:bookmarkStart w:id="77" w:name="fig-forest"/>
+          <w:bookmarkStart w:id="78" w:name="fig-forest"/>
           <w:p>
             <w:pPr>
               <w:pStyle w:val="Compact"/>
@@ -11391,18 +11982,18 @@
                 <wp:inline>
                   <wp:extent cx="5334000" cy="4103076"/>
                   <wp:effectExtent b="0" l="0" r="0" t="0"/>
-                  <wp:docPr descr="" title="" id="75" name="Picture"/>
+                  <wp:docPr descr="" title="" id="76" name="Picture"/>
                   <a:graphic>
                     <a:graphicData uri="http://schemas.openxmlformats.org/drawingml/2006/picture">
                       <pic:pic>
                         <pic:nvPicPr>
-                          <pic:cNvPr descr="../results/figures/plant_forest.png" id="76" name="Picture"/>
+                          <pic:cNvPr descr="../results/figures/plant_forest.png" id="77" name="Picture"/>
                           <pic:cNvPicPr>
                             <a:picLocks noChangeArrowheads="1" noChangeAspect="1"/>
                           </pic:cNvPicPr>
                         </pic:nvPicPr>
                         <pic:blipFill>
-                          <a:blip r:embed="rId74"/>
+                          <a:blip r:embed="rId75"/>
                           <a:stretch>
                             <a:fillRect/>
                           </a:stretch>
@@ -11442,7 +12033,7 @@
               <w:t xml:space="preserve">Figure 12: Paired AUC difference per block with overall HL estimate</w:t>
             </w:r>
           </w:p>
-          <w:bookmarkEnd w:id="77"/>
+          <w:bookmarkEnd w:id="78"/>
         </w:tc>
       </w:tr>
     </w:tbl>
@@ -11467,7 +12058,7 @@
       <w:tr>
         <w:tc>
           <w:tcPr/>
-          <w:bookmarkStart w:id="81" w:name="fig-paired"/>
+          <w:bookmarkStart w:id="82" w:name="fig-paired"/>
           <w:p>
             <w:pPr>
               <w:pStyle w:val="Compact"/>
@@ -11478,18 +12069,18 @@
                 <wp:inline>
                   <wp:extent cx="5334000" cy="4513384"/>
                   <wp:effectExtent b="0" l="0" r="0" t="0"/>
-                  <wp:docPr descr="" title="" id="79" name="Picture"/>
+                  <wp:docPr descr="" title="" id="80" name="Picture"/>
                   <a:graphic>
                     <a:graphicData uri="http://schemas.openxmlformats.org/drawingml/2006/picture">
                       <pic:pic>
                         <pic:nvPicPr>
-                          <pic:cNvPr descr="../results/figures/plant_paired_auc.png" id="80" name="Picture"/>
+                          <pic:cNvPr descr="../results/figures/plant_paired_auc.png" id="81" name="Picture"/>
                           <pic:cNvPicPr>
                             <a:picLocks noChangeArrowheads="1" noChangeAspect="1"/>
                           </pic:cNvPicPr>
                         </pic:nvPicPr>
                         <pic:blipFill>
-                          <a:blip r:embed="rId78"/>
+                          <a:blip r:embed="rId79"/>
                           <a:stretch>
                             <a:fillRect/>
                           </a:stretch>
@@ -11529,12 +12120,12 @@
               <w:t xml:space="preserve">Figure 13: Paired block-mean AUC scatter</w:t>
             </w:r>
           </w:p>
-          <w:bookmarkEnd w:id="81"/>
+          <w:bookmarkEnd w:id="82"/>
         </w:tc>
       </w:tr>
     </w:tbl>
-    <w:bookmarkEnd w:id="82"/>
-    <w:bookmarkStart w:id="88" w:name="diagnostics-sensitivity-and-refits"/>
+    <w:bookmarkEnd w:id="83"/>
+    <w:bookmarkStart w:id="89" w:name="diagnostics-sensitivity-and-refits"/>
     <w:p>
       <w:pPr>
         <w:pStyle w:val="Heading2"/>
@@ -11639,7 +12230,7 @@
           <w:rPr>
             <w:rStyle w:val="Hyperlink"/>
           </w:rPr>
-          <w:t xml:space="preserve">Table 11</w:t>
+          <w:t xml:space="preserve">Table 12</w:t>
         </w:r>
       </w:hyperlink>
       <w:r>
@@ -11671,7 +12262,7 @@
       <w:tr>
         <w:tc>
           <w:tcPr/>
-          <w:bookmarkStart w:id="83" w:name="tbl-loo"/>
+          <w:bookmarkStart w:id="84" w:name="tbl-loo"/>
           <w:p>
             <w:pPr>
               <w:jc w:val="center"/>
@@ -11682,7 +12273,7 @@
               <w:pStyle w:val="ImageCaption"/>
             </w:pPr>
             <w:r>
-              <w:t xml:space="preserve">Table 11: Leave-one-block-out sensitivity (stable = no single block flips the conclusion).</w:t>
+              <w:t xml:space="preserve">Table 12: Leave-one-block-out sensitivity (stable = no single block flips the conclusion).</w:t>
             </w:r>
           </w:p>
           <w:tbl>
@@ -11714,85 +12305,85 @@
                     <w:jc w:val="center"/>
                   </w:pPr>
                   <w:r>
-                    <w:t xml:space="preserve">contrast</w:t>
-                  </w:r>
-                </w:p>
-              </w:tc>
-              <w:tc>
-                <w:tcPr/>
-                <w:p>
-                  <w:pPr>
-                    <w:pStyle w:val="Compact"/>
-                    <w:jc w:val="right"/>
-                    <w:jc w:val="center"/>
-                  </w:pPr>
-                  <w:r>
-                    <w:t xml:space="preserve">full_p</w:t>
-                  </w:r>
-                </w:p>
-              </w:tc>
-              <w:tc>
-                <w:tcPr/>
-                <w:p>
-                  <w:pPr>
-                    <w:pStyle w:val="Compact"/>
-                    <w:jc w:val="right"/>
-                    <w:jc w:val="center"/>
-                  </w:pPr>
-                  <w:r>
-                    <w:t xml:space="preserve">loo_p_min</w:t>
-                  </w:r>
-                </w:p>
-              </w:tc>
-              <w:tc>
-                <w:tcPr/>
-                <w:p>
-                  <w:pPr>
-                    <w:pStyle w:val="Compact"/>
-                    <w:jc w:val="right"/>
-                    <w:jc w:val="center"/>
-                  </w:pPr>
-                  <w:r>
-                    <w:t xml:space="preserve">loo_p_max</w:t>
-                  </w:r>
-                </w:p>
-              </w:tc>
-              <w:tc>
-                <w:tcPr/>
-                <w:p>
-                  <w:pPr>
-                    <w:pStyle w:val="Compact"/>
-                    <w:jc w:val="right"/>
-                    <w:jc w:val="center"/>
-                  </w:pPr>
-                  <w:r>
-                    <w:t xml:space="preserve">loo_significant</w:t>
-                  </w:r>
-                </w:p>
-              </w:tc>
-              <w:tc>
-                <w:tcPr/>
-                <w:p>
-                  <w:pPr>
-                    <w:pStyle w:val="Compact"/>
-                    <w:jc w:val="right"/>
-                    <w:jc w:val="center"/>
-                  </w:pPr>
-                  <w:r>
-                    <w:t xml:space="preserve">loo_runs</w:t>
-                  </w:r>
-                </w:p>
-              </w:tc>
-              <w:tc>
-                <w:tcPr/>
-                <w:p>
-                  <w:pPr>
-                    <w:pStyle w:val="Compact"/>
-                    <w:jc w:val="left"/>
-                    <w:jc w:val="center"/>
-                  </w:pPr>
-                  <w:r>
-                    <w:t xml:space="preserve">stable</w:t>
+                    <w:t xml:space="preserve">Contrast</w:t>
+                  </w:r>
+                </w:p>
+              </w:tc>
+              <w:tc>
+                <w:tcPr/>
+                <w:p>
+                  <w:pPr>
+                    <w:pStyle w:val="Compact"/>
+                    <w:jc w:val="right"/>
+                    <w:jc w:val="center"/>
+                  </w:pPr>
+                  <w:r>
+                    <w:t xml:space="preserve">Full p</w:t>
+                  </w:r>
+                </w:p>
+              </w:tc>
+              <w:tc>
+                <w:tcPr/>
+                <w:p>
+                  <w:pPr>
+                    <w:pStyle w:val="Compact"/>
+                    <w:jc w:val="right"/>
+                    <w:jc w:val="center"/>
+                  </w:pPr>
+                  <w:r>
+                    <w:t xml:space="preserve">LOO p Min</w:t>
+                  </w:r>
+                </w:p>
+              </w:tc>
+              <w:tc>
+                <w:tcPr/>
+                <w:p>
+                  <w:pPr>
+                    <w:pStyle w:val="Compact"/>
+                    <w:jc w:val="right"/>
+                    <w:jc w:val="center"/>
+                  </w:pPr>
+                  <w:r>
+                    <w:t xml:space="preserve">LOO p Max</w:t>
+                  </w:r>
+                </w:p>
+              </w:tc>
+              <w:tc>
+                <w:tcPr/>
+                <w:p>
+                  <w:pPr>
+                    <w:pStyle w:val="Compact"/>
+                    <w:jc w:val="right"/>
+                    <w:jc w:val="center"/>
+                  </w:pPr>
+                  <w:r>
+                    <w:t xml:space="preserve">LOO Significant</w:t>
+                  </w:r>
+                </w:p>
+              </w:tc>
+              <w:tc>
+                <w:tcPr/>
+                <w:p>
+                  <w:pPr>
+                    <w:pStyle w:val="Compact"/>
+                    <w:jc w:val="right"/>
+                    <w:jc w:val="center"/>
+                  </w:pPr>
+                  <w:r>
+                    <w:t xml:space="preserve">LOO Runs</w:t>
+                  </w:r>
+                </w:p>
+              </w:tc>
+              <w:tc>
+                <w:tcPr/>
+                <w:p>
+                  <w:pPr>
+                    <w:pStyle w:val="Compact"/>
+                    <w:jc w:val="left"/>
+                    <w:jc w:val="center"/>
+                  </w:pPr>
+                  <w:r>
+                    <w:t xml:space="preserve">Stable</w:t>
                   </w:r>
                 </w:p>
               </w:tc>
@@ -12263,7 +12854,7 @@
               </w:tc>
             </w:tr>
           </w:tbl>
-          <w:bookmarkEnd w:id="83"/>
+          <w:bookmarkEnd w:id="84"/>
           <w:p/>
         </w:tc>
       </w:tr>
@@ -12289,7 +12880,7 @@
       <w:tr>
         <w:tc>
           <w:tcPr/>
-          <w:bookmarkStart w:id="87" w:name="fig-sym"/>
+          <w:bookmarkStart w:id="88" w:name="fig-sym"/>
           <w:p>
             <w:pPr>
               <w:pStyle w:val="Compact"/>
@@ -12300,18 +12891,18 @@
                 <wp:inline>
                   <wp:extent cx="5334000" cy="3282461"/>
                   <wp:effectExtent b="0" l="0" r="0" t="0"/>
-                  <wp:docPr descr="" title="" id="85" name="Picture"/>
+                  <wp:docPr descr="" title="" id="86" name="Picture"/>
                   <a:graphic>
                     <a:graphicData uri="http://schemas.openxmlformats.org/drawingml/2006/picture">
                       <pic:pic>
                         <pic:nvPicPr>
-                          <pic:cNvPr descr="../results/figures/diagnostic_paired_diffs.png" id="86" name="Picture"/>
+                          <pic:cNvPr descr="../results/figures/diagnostic_paired_diffs.png" id="87" name="Picture"/>
                           <pic:cNvPicPr>
                             <a:picLocks noChangeArrowheads="1" noChangeAspect="1"/>
                           </pic:cNvPicPr>
                         </pic:nvPicPr>
                         <pic:blipFill>
-                          <a:blip r:embed="rId84"/>
+                          <a:blip r:embed="rId85"/>
                           <a:stretch>
                             <a:fillRect/>
                           </a:stretch>
@@ -12351,12 +12942,12 @@
               <w:t xml:space="preserve">Figure 14: Paired differences: symmetry check (red = median)</w:t>
             </w:r>
           </w:p>
-          <w:bookmarkEnd w:id="87"/>
+          <w:bookmarkEnd w:id="88"/>
         </w:tc>
       </w:tr>
     </w:tbl>
-    <w:bookmarkEnd w:id="88"/>
-    <w:bookmarkStart w:id="89" w:name="discussion"/>
+    <w:bookmarkEnd w:id="89"/>
+    <w:bookmarkStart w:id="90" w:name="discussion"/>
     <w:p>
       <w:pPr>
         <w:pStyle w:val="Heading2"/>
@@ -13027,8 +13618,8 @@
         <w:t xml:space="preserve">toward the compound level.</w:t>
       </w:r>
     </w:p>
-    <w:bookmarkEnd w:id="89"/>
-    <w:bookmarkStart w:id="90" w:name="limitations"/>
+    <w:bookmarkEnd w:id="90"/>
+    <w:bookmarkStart w:id="91" w:name="limitations"/>
     <w:p>
       <w:pPr>
         <w:pStyle w:val="Heading2"/>
@@ -13081,8 +13672,8 @@
         <w:t xml:space="preserve">confirmatory.</w:t>
       </w:r>
     </w:p>
-    <w:bookmarkEnd w:id="90"/>
-    <w:bookmarkStart w:id="91" w:name="references"/>
+    <w:bookmarkEnd w:id="91"/>
+    <w:bookmarkStart w:id="92" w:name="references"/>
     <w:p>
       <w:pPr>
         <w:pStyle w:val="Heading2"/>
@@ -14181,7 +14772,7 @@
         <w:t xml:space="preserve">1(1): 86–89.</w:t>
       </w:r>
     </w:p>
-    <w:bookmarkEnd w:id="91"/>
+    <w:bookmarkEnd w:id="92"/>
     <w:sectPr>
       <w:footnotePr>
         <w:numRestart w:val="eachSect"/>

</xml_diff>

<commit_message>
fix: merged single-header display tables for stacked contrasts
other_contrasts.csv + superiority_combined.csv carry an Endpoint column so Word shows one header row instead of three stacked tables with repeated headers. fmt_contrast names columns by identity (merged tables lack p_holm).
</commit_message>
<xml_diff>
--- a/analysis/reports/report.docx
+++ b/analysis/reports/report.docx
@@ -10550,12 +10550,13 @@
               <w:tblLook w:firstRow="1" w:lastRow="0" w:firstColumn="0" w:lastColumn="0" w:noHBand="0" w:noVBand="0" w:val="0020"/>
             </w:tblPr>
             <w:tblGrid>
-              <w:gridCol w:w="3240"/>
-              <w:gridCol w:w="360"/>
-              <w:gridCol w:w="360"/>
-              <w:gridCol w:w="840"/>
-              <w:gridCol w:w="2520"/>
-              <w:gridCol w:w="600"/>
+              <w:gridCol w:w="1287"/>
+              <w:gridCol w:w="2673"/>
+              <w:gridCol w:w="297"/>
+              <w:gridCol w:w="297"/>
+              <w:gridCol w:w="693"/>
+              <w:gridCol w:w="2079"/>
+              <w:gridCol w:w="594"/>
             </w:tblGrid>
             <w:tr>
               <w:trPr>
@@ -10570,6 +10571,19 @@
                     <w:jc w:val="center"/>
                   </w:pPr>
                   <w:r>
+                    <w:t xml:space="preserve">Endpoint</w:t>
+                  </w:r>
+                </w:p>
+              </w:tc>
+              <w:tc>
+                <w:tcPr/>
+                <w:p>
+                  <w:pPr>
+                    <w:pStyle w:val="Compact"/>
+                    <w:jc w:val="left"/>
+                    <w:jc w:val="center"/>
+                  </w:pPr>
+                  <w:r>
                     <w:t xml:space="preserve">Contrast</w:t>
                   </w:r>
                 </w:p>
@@ -10650,6 +10664,19 @@
                     <w:jc w:val="center"/>
                   </w:pPr>
                   <w:r>
+                    <w:t xml:space="preserve">AUC</w:t>
+                  </w:r>
+                </w:p>
+              </w:tc>
+              <w:tc>
+                <w:tcPr/>
+                <w:p>
+                  <w:pPr>
+                    <w:pStyle w:val="Compact"/>
+                    <w:jc w:val="left"/>
+                    <w:jc w:val="center"/>
+                  </w:pPr>
+                  <w:r>
                     <w:t xml:space="preserve">T. congolense vs T. evansi</w:t>
                   </w:r>
                 </w:p>
@@ -10716,104 +10743,6 @@
                   </w:pPr>
                   <w:r>
                     <w:t xml:space="preserve">0.25</w:t>
-                  </w:r>
-                </w:p>
-              </w:tc>
-            </w:tr>
-          </w:tbl>
-          <w:tbl>
-            <w:tblPr>
-              <w:tblStyle w:val="Table"/>
-              <w:tblW w:type="auto" w:w="0"/>
-              <w:tblLook w:firstRow="1" w:lastRow="0" w:firstColumn="0" w:lastColumn="0" w:noHBand="0" w:noVBand="0" w:val="0020"/>
-            </w:tblPr>
-            <w:tblGrid>
-              <w:gridCol w:w="1320"/>
-              <w:gridCol w:w="1320"/>
-              <w:gridCol w:w="1320"/>
-              <w:gridCol w:w="1320"/>
-              <w:gridCol w:w="1320"/>
-              <w:gridCol w:w="1320"/>
-            </w:tblGrid>
-            <w:tr>
-              <w:trPr>
-                <w:tblHeader w:val="on"/>
-              </w:trPr>
-              <w:tc>
-                <w:tcPr/>
-                <w:p>
-                  <w:pPr>
-                    <w:pStyle w:val="Compact"/>
-                    <w:jc w:val="left"/>
-                    <w:jc w:val="center"/>
-                  </w:pPr>
-                  <w:r>
-                    <w:t xml:space="preserve">Contrast</w:t>
-                  </w:r>
-                </w:p>
-              </w:tc>
-              <w:tc>
-                <w:tcPr/>
-                <w:p>
-                  <w:pPr>
-                    <w:pStyle w:val="Compact"/>
-                    <w:jc w:val="right"/>
-                    <w:jc w:val="center"/>
-                  </w:pPr>
-                  <w:r>
-                    <w:t xml:space="preserve">n</w:t>
-                  </w:r>
-                </w:p>
-              </w:tc>
-              <w:tc>
-                <w:tcPr/>
-                <w:p>
-                  <w:pPr>
-                    <w:pStyle w:val="Compact"/>
-                    <w:jc w:val="right"/>
-                    <w:jc w:val="center"/>
-                  </w:pPr>
-                  <w:r>
-                    <w:t xml:space="preserve">W</w:t>
-                  </w:r>
-                </w:p>
-              </w:tc>
-              <w:tc>
-                <w:tcPr/>
-                <w:p>
-                  <w:pPr>
-                    <w:pStyle w:val="Compact"/>
-                    <w:jc w:val="right"/>
-                    <w:jc w:val="center"/>
-                  </w:pPr>
-                  <w:r>
-                    <w:t xml:space="preserve">p</w:t>
-                  </w:r>
-                </w:p>
-              </w:tc>
-              <w:tc>
-                <w:tcPr/>
-                <w:p>
-                  <w:pPr>
-                    <w:pStyle w:val="Compact"/>
-                    <w:jc w:val="left"/>
-                    <w:jc w:val="center"/>
-                  </w:pPr>
-                  <w:r>
-                    <w:t xml:space="preserve">HL [95% CI]</w:t>
-                  </w:r>
-                </w:p>
-              </w:tc>
-              <w:tc>
-                <w:tcPr/>
-                <w:p>
-                  <w:pPr>
-                    <w:pStyle w:val="Compact"/>
-                    <w:jc w:val="right"/>
-                    <w:jc w:val="center"/>
-                  </w:pPr>
-                  <w:r>
-                    <w:t xml:space="preserve">r</w:t>
                   </w:r>
                 </w:p>
               </w:tc>
@@ -10828,6 +10757,19 @@
                     <w:jc w:val="center"/>
                   </w:pPr>
                   <w:r>
+                    <w:t xml:space="preserve">Weight delta</w:t>
+                  </w:r>
+                </w:p>
+              </w:tc>
+              <w:tc>
+                <w:tcPr/>
+                <w:p>
+                  <w:pPr>
+                    <w:pStyle w:val="Compact"/>
+                    <w:jc w:val="left"/>
+                    <w:jc w:val="center"/>
+                  </w:pPr>
+                  <w:r>
                     <w:t xml:space="preserve">weight delta: plant</w:t>
                   </w:r>
                 </w:p>
@@ -10893,7 +10835,7 @@
                     <w:jc w:val="center"/>
                   </w:pPr>
                   <w:r>
-                    <w:t xml:space="preserve">0.0</w:t>
+                    <w:t xml:space="preserve">0.00</w:t>
                   </w:r>
                 </w:p>
               </w:tc>
@@ -10908,6 +10850,19 @@
                     <w:jc w:val="center"/>
                   </w:pPr>
                   <w:r>
+                    <w:t xml:space="preserve">Weight delta</w:t>
+                  </w:r>
+                </w:p>
+              </w:tc>
+              <w:tc>
+                <w:tcPr/>
+                <w:p>
+                  <w:pPr>
+                    <w:pStyle w:val="Compact"/>
+                    <w:jc w:val="left"/>
+                    <w:jc w:val="center"/>
+                  </w:pPr>
+                  <w:r>
                     <w:t xml:space="preserve">weight delta: parasite</w:t>
                   </w:r>
                 </w:p>
@@ -10973,105 +10928,7 @@
                     <w:jc w:val="center"/>
                   </w:pPr>
                   <w:r>
-                    <w:t xml:space="preserve">-0.5</w:t>
-                  </w:r>
-                </w:p>
-              </w:tc>
-            </w:tr>
-          </w:tbl>
-          <w:tbl>
-            <w:tblPr>
-              <w:tblStyle w:val="Table"/>
-              <w:tblW w:type="auto" w:w="0"/>
-              <w:tblLook w:firstRow="1" w:lastRow="0" w:firstColumn="0" w:lastColumn="0" w:noHBand="0" w:noVBand="0" w:val="0020"/>
-            </w:tblPr>
-            <w:tblGrid>
-              <w:gridCol w:w="1320"/>
-              <w:gridCol w:w="1320"/>
-              <w:gridCol w:w="1320"/>
-              <w:gridCol w:w="1320"/>
-              <w:gridCol w:w="1320"/>
-              <w:gridCol w:w="1320"/>
-            </w:tblGrid>
-            <w:tr>
-              <w:trPr>
-                <w:tblHeader w:val="on"/>
-              </w:trPr>
-              <w:tc>
-                <w:tcPr/>
-                <w:p>
-                  <w:pPr>
-                    <w:pStyle w:val="Compact"/>
-                    <w:jc w:val="left"/>
-                    <w:jc w:val="center"/>
-                  </w:pPr>
-                  <w:r>
-                    <w:t xml:space="preserve">Contrast</w:t>
-                  </w:r>
-                </w:p>
-              </w:tc>
-              <w:tc>
-                <w:tcPr/>
-                <w:p>
-                  <w:pPr>
-                    <w:pStyle w:val="Compact"/>
-                    <w:jc w:val="right"/>
-                    <w:jc w:val="center"/>
-                  </w:pPr>
-                  <w:r>
-                    <w:t xml:space="preserve">n</w:t>
-                  </w:r>
-                </w:p>
-              </w:tc>
-              <w:tc>
-                <w:tcPr/>
-                <w:p>
-                  <w:pPr>
-                    <w:pStyle w:val="Compact"/>
-                    <w:jc w:val="right"/>
-                    <w:jc w:val="center"/>
-                  </w:pPr>
-                  <w:r>
-                    <w:t xml:space="preserve">W</w:t>
-                  </w:r>
-                </w:p>
-              </w:tc>
-              <w:tc>
-                <w:tcPr/>
-                <w:p>
-                  <w:pPr>
-                    <w:pStyle w:val="Compact"/>
-                    <w:jc w:val="right"/>
-                    <w:jc w:val="center"/>
-                  </w:pPr>
-                  <w:r>
-                    <w:t xml:space="preserve">p</w:t>
-                  </w:r>
-                </w:p>
-              </w:tc>
-              <w:tc>
-                <w:tcPr/>
-                <w:p>
-                  <w:pPr>
-                    <w:pStyle w:val="Compact"/>
-                    <w:jc w:val="left"/>
-                    <w:jc w:val="center"/>
-                  </w:pPr>
-                  <w:r>
-                    <w:t xml:space="preserve">HL [95% CI]</w:t>
-                  </w:r>
-                </w:p>
-              </w:tc>
-              <w:tc>
-                <w:tcPr/>
-                <w:p>
-                  <w:pPr>
-                    <w:pStyle w:val="Compact"/>
-                    <w:jc w:val="right"/>
-                    <w:jc w:val="center"/>
-                  </w:pPr>
-                  <w:r>
-                    <w:t xml:space="preserve">r</w:t>
+                    <w:t xml:space="preserve">-0.50</w:t>
                   </w:r>
                 </w:p>
               </w:tc>
@@ -11086,6 +10943,19 @@
                     <w:jc w:val="center"/>
                   </w:pPr>
                   <w:r>
+                    <w:t xml:space="preserve">PCV delta</w:t>
+                  </w:r>
+                </w:p>
+              </w:tc>
+              <w:tc>
+                <w:tcPr/>
+                <w:p>
+                  <w:pPr>
+                    <w:pStyle w:val="Compact"/>
+                    <w:jc w:val="left"/>
+                    <w:jc w:val="center"/>
+                  </w:pPr>
+                  <w:r>
                     <w:t xml:space="preserve">pcv delta: plant</w:t>
                   </w:r>
                 </w:p>
@@ -11157,6 +11027,19 @@
               </w:tc>
             </w:tr>
             <w:tr>
+              <w:tc>
+                <w:tcPr/>
+                <w:p>
+                  <w:pPr>
+                    <w:pStyle w:val="Compact"/>
+                    <w:jc w:val="left"/>
+                    <w:jc w:val="center"/>
+                  </w:pPr>
+                  <w:r>
+                    <w:t xml:space="preserve">PCV delta</w:t>
+                  </w:r>
+                </w:p>
+              </w:tc>
               <w:tc>
                 <w:tcPr/>
                 <w:p>
@@ -11592,16 +11475,18 @@
           <w:tbl>
             <w:tblPr>
               <w:tblStyle w:val="Table"/>
-              <w:tblW w:type="auto" w:w="0"/>
+              <w:tblW w:type="pct" w:w="5000"/>
+              <w:tblLayout w:type="fixed"/>
               <w:tblLook w:firstRow="1" w:lastRow="0" w:firstColumn="0" w:lastColumn="0" w:noHBand="0" w:noVBand="0" w:val="0020"/>
             </w:tblPr>
             <w:tblGrid>
-              <w:gridCol w:w="1320"/>
-              <w:gridCol w:w="1320"/>
-              <w:gridCol w:w="1320"/>
-              <w:gridCol w:w="1320"/>
-              <w:gridCol w:w="1320"/>
-              <w:gridCol w:w="1320"/>
+              <w:gridCol w:w="937"/>
+              <w:gridCol w:w="2605"/>
+              <w:gridCol w:w="312"/>
+              <w:gridCol w:w="312"/>
+              <w:gridCol w:w="729"/>
+              <w:gridCol w:w="2188"/>
+              <w:gridCol w:w="833"/>
             </w:tblGrid>
             <w:tr>
               <w:trPr>
@@ -11616,6 +11501,19 @@
                     <w:jc w:val="center"/>
                   </w:pPr>
                   <w:r>
+                    <w:t xml:space="preserve">Endpoint</w:t>
+                  </w:r>
+                </w:p>
+              </w:tc>
+              <w:tc>
+                <w:tcPr/>
+                <w:p>
+                  <w:pPr>
+                    <w:pStyle w:val="Compact"/>
+                    <w:jc w:val="left"/>
+                    <w:jc w:val="center"/>
+                  </w:pPr>
+                  <w:r>
                     <w:t xml:space="preserve">Contrast</w:t>
                   </w:r>
                 </w:p>
@@ -11696,6 +11594,19 @@
                     <w:jc w:val="center"/>
                   </w:pPr>
                   <w:r>
+                    <w:t xml:space="preserve">AUC</w:t>
+                  </w:r>
+                </w:p>
+              </w:tc>
+              <w:tc>
+                <w:tcPr/>
+                <w:p>
+                  <w:pPr>
+                    <w:pStyle w:val="Compact"/>
+                    <w:jc w:val="left"/>
+                    <w:jc w:val="center"/>
+                  </w:pPr>
+                  <w:r>
                     <w:t xml:space="preserve">A. indica vs M. oleifera</w:t>
                   </w:r>
                 </w:p>
@@ -11735,7 +11646,7 @@
                     <w:jc w:val="center"/>
                   </w:pPr>
                   <w:r>
-                    <w:t xml:space="preserve">1</w:t>
+                    <w:t xml:space="preserve">1.0000</w:t>
                   </w:r>
                 </w:p>
               </w:tc>
@@ -11762,104 +11673,6 @@
                   </w:pPr>
                   <w:r>
                     <w:t xml:space="preserve">-0.1429</w:t>
-                  </w:r>
-                </w:p>
-              </w:tc>
-            </w:tr>
-          </w:tbl>
-          <w:tbl>
-            <w:tblPr>
-              <w:tblStyle w:val="Table"/>
-              <w:tblW w:type="auto" w:w="0"/>
-              <w:tblLook w:firstRow="1" w:lastRow="0" w:firstColumn="0" w:lastColumn="0" w:noHBand="0" w:noVBand="0" w:val="0020"/>
-            </w:tblPr>
-            <w:tblGrid>
-              <w:gridCol w:w="1320"/>
-              <w:gridCol w:w="1320"/>
-              <w:gridCol w:w="1320"/>
-              <w:gridCol w:w="1320"/>
-              <w:gridCol w:w="1320"/>
-              <w:gridCol w:w="1320"/>
-            </w:tblGrid>
-            <w:tr>
-              <w:trPr>
-                <w:tblHeader w:val="on"/>
-              </w:trPr>
-              <w:tc>
-                <w:tcPr/>
-                <w:p>
-                  <w:pPr>
-                    <w:pStyle w:val="Compact"/>
-                    <w:jc w:val="left"/>
-                    <w:jc w:val="center"/>
-                  </w:pPr>
-                  <w:r>
-                    <w:t xml:space="preserve">Contrast</w:t>
-                  </w:r>
-                </w:p>
-              </w:tc>
-              <w:tc>
-                <w:tcPr/>
-                <w:p>
-                  <w:pPr>
-                    <w:pStyle w:val="Compact"/>
-                    <w:jc w:val="right"/>
-                    <w:jc w:val="center"/>
-                  </w:pPr>
-                  <w:r>
-                    <w:t xml:space="preserve">n</w:t>
-                  </w:r>
-                </w:p>
-              </w:tc>
-              <w:tc>
-                <w:tcPr/>
-                <w:p>
-                  <w:pPr>
-                    <w:pStyle w:val="Compact"/>
-                    <w:jc w:val="right"/>
-                    <w:jc w:val="center"/>
-                  </w:pPr>
-                  <w:r>
-                    <w:t xml:space="preserve">W</w:t>
-                  </w:r>
-                </w:p>
-              </w:tc>
-              <w:tc>
-                <w:tcPr/>
-                <w:p>
-                  <w:pPr>
-                    <w:pStyle w:val="Compact"/>
-                    <w:jc w:val="right"/>
-                    <w:jc w:val="center"/>
-                  </w:pPr>
-                  <w:r>
-                    <w:t xml:space="preserve">p</w:t>
-                  </w:r>
-                </w:p>
-              </w:tc>
-              <w:tc>
-                <w:tcPr/>
-                <w:p>
-                  <w:pPr>
-                    <w:pStyle w:val="Compact"/>
-                    <w:jc w:val="left"/>
-                    <w:jc w:val="center"/>
-                  </w:pPr>
-                  <w:r>
-                    <w:t xml:space="preserve">HL [95% CI]</w:t>
-                  </w:r>
-                </w:p>
-              </w:tc>
-              <w:tc>
-                <w:tcPr/>
-                <w:p>
-                  <w:pPr>
-                    <w:pStyle w:val="Compact"/>
-                    <w:jc w:val="right"/>
-                    <w:jc w:val="center"/>
-                  </w:pPr>
-                  <w:r>
-                    <w:t xml:space="preserve">r</w:t>
                   </w:r>
                 </w:p>
               </w:tc>
@@ -11874,6 +11687,19 @@
                     <w:jc w:val="center"/>
                   </w:pPr>
                   <w:r>
+                    <w:t xml:space="preserve">Motility</w:t>
+                  </w:r>
+                </w:p>
+              </w:tc>
+              <w:tc>
+                <w:tcPr/>
+                <w:p>
+                  <w:pPr>
+                    <w:pStyle w:val="Compact"/>
+                    <w:jc w:val="left"/>
+                    <w:jc w:val="center"/>
+                  </w:pPr>
+                  <w:r>
                     <w:t xml:space="preserve">A. indica vs M. oleifera</w:t>
                   </w:r>
                 </w:p>
@@ -11939,7 +11765,7 @@
                     <w:jc w:val="center"/>
                   </w:pPr>
                   <w:r>
-                    <w:t xml:space="preserve">0.25</w:t>
+                    <w:t xml:space="preserve">0.2500</w:t>
                   </w:r>
                 </w:p>
               </w:tc>

</xml_diff>